<commit_message>
docs: tambahkan pemahaman analisis kasus soal partisi
</commit_message>
<xml_diff>
--- a/Laporan.docx
+++ b/Laporan.docx
@@ -36,7 +36,7 @@
           </w:tcPr>
           <w:p>
             <w:pPr>
-              <w:spacing w:after="0" w:line="240" w:lineRule="auto"/>
+              <w:spacing w:after="0" w:line="360" w:lineRule="auto"/>
               <w:jc w:val="center"/>
               <w:rPr>
                 <w:rFonts w:ascii="Times New Roman" w:eastAsia="Times New Roman" w:hAnsi="Times New Roman" w:cs="Times New Roman"/>
@@ -79,7 +79,7 @@
           </w:tcPr>
           <w:p>
             <w:pPr>
-              <w:spacing w:after="0" w:line="240" w:lineRule="auto"/>
+              <w:spacing w:after="0" w:line="360" w:lineRule="auto"/>
               <w:jc w:val="center"/>
               <w:rPr>
                 <w:rFonts w:ascii="Times New Roman" w:eastAsia="Times New Roman" w:hAnsi="Times New Roman" w:cs="Times New Roman"/>
@@ -122,7 +122,7 @@
           </w:tcPr>
           <w:p>
             <w:pPr>
-              <w:spacing w:after="0" w:line="240" w:lineRule="auto"/>
+              <w:spacing w:after="0" w:line="360" w:lineRule="auto"/>
               <w:jc w:val="center"/>
               <w:rPr>
                 <w:rFonts w:ascii="Times New Roman" w:eastAsia="Times New Roman" w:hAnsi="Times New Roman" w:cs="Times New Roman"/>
@@ -165,7 +165,7 @@
           </w:tcPr>
           <w:p>
             <w:pPr>
-              <w:spacing w:after="0" w:line="240" w:lineRule="auto"/>
+              <w:spacing w:after="0" w:line="360" w:lineRule="auto"/>
               <w:jc w:val="center"/>
               <w:rPr>
                 <w:rFonts w:ascii="Times New Roman" w:eastAsia="Times New Roman" w:hAnsi="Times New Roman" w:cs="Times New Roman"/>
@@ -208,7 +208,7 @@
           </w:tcPr>
           <w:p>
             <w:pPr>
-              <w:spacing w:after="0" w:line="240" w:lineRule="auto"/>
+              <w:spacing w:after="0" w:line="360" w:lineRule="auto"/>
               <w:jc w:val="center"/>
               <w:rPr>
                 <w:rFonts w:ascii="Times New Roman" w:eastAsia="Times New Roman" w:hAnsi="Times New Roman" w:cs="Times New Roman"/>
@@ -251,7 +251,7 @@
           </w:tcPr>
           <w:p>
             <w:pPr>
-              <w:spacing w:after="0" w:line="240" w:lineRule="auto"/>
+              <w:spacing w:after="0" w:line="360" w:lineRule="auto"/>
               <w:jc w:val="center"/>
               <w:rPr>
                 <w:rFonts w:ascii="Times New Roman" w:eastAsia="Times New Roman" w:hAnsi="Times New Roman" w:cs="Times New Roman"/>
@@ -294,7 +294,7 @@
           </w:tcPr>
           <w:p>
             <w:pPr>
-              <w:spacing w:after="0" w:line="240" w:lineRule="auto"/>
+              <w:spacing w:after="0" w:line="360" w:lineRule="auto"/>
               <w:jc w:val="center"/>
               <w:rPr>
                 <w:rFonts w:ascii="Times New Roman" w:eastAsia="Times New Roman" w:hAnsi="Times New Roman" w:cs="Times New Roman"/>
@@ -343,7 +343,7 @@
           </w:tcPr>
           <w:p>
             <w:pPr>
-              <w:spacing w:after="0" w:line="240" w:lineRule="auto"/>
+              <w:spacing w:after="0" w:line="360" w:lineRule="auto"/>
               <w:rPr>
                 <w:rFonts w:ascii="Times New Roman" w:eastAsia="Times New Roman" w:hAnsi="Times New Roman" w:cs="Times New Roman"/>
                 <w:b/>
@@ -406,7 +406,7 @@
           </w:tcPr>
           <w:p>
             <w:pPr>
-              <w:spacing w:after="0" w:line="240" w:lineRule="auto"/>
+              <w:spacing w:after="0" w:line="360" w:lineRule="auto"/>
               <w:jc w:val="center"/>
               <w:rPr>
                 <w:rFonts w:ascii="Times New Roman" w:eastAsia="Times New Roman" w:hAnsi="Times New Roman" w:cs="Times New Roman"/>
@@ -445,7 +445,7 @@
           </w:tcPr>
           <w:p>
             <w:pPr>
-              <w:spacing w:after="0" w:line="240" w:lineRule="auto"/>
+              <w:spacing w:after="0" w:line="360" w:lineRule="auto"/>
               <w:jc w:val="center"/>
               <w:rPr>
                 <w:rFonts w:ascii="Times New Roman" w:eastAsia="Times New Roman" w:hAnsi="Times New Roman" w:cs="Times New Roman"/>
@@ -484,7 +484,7 @@
           </w:tcPr>
           <w:p>
             <w:pPr>
-              <w:spacing w:after="0" w:line="240" w:lineRule="auto"/>
+              <w:spacing w:after="0" w:line="360" w:lineRule="auto"/>
               <w:jc w:val="center"/>
               <w:rPr>
                 <w:rFonts w:ascii="Times New Roman" w:eastAsia="Times New Roman" w:hAnsi="Times New Roman" w:cs="Times New Roman"/>
@@ -523,7 +523,7 @@
           </w:tcPr>
           <w:p>
             <w:pPr>
-              <w:spacing w:after="0" w:line="240" w:lineRule="auto"/>
+              <w:spacing w:after="0" w:line="360" w:lineRule="auto"/>
               <w:jc w:val="center"/>
               <w:rPr>
                 <w:rFonts w:ascii="Times New Roman" w:eastAsia="Times New Roman" w:hAnsi="Times New Roman" w:cs="Times New Roman"/>
@@ -562,7 +562,7 @@
           </w:tcPr>
           <w:p>
             <w:pPr>
-              <w:spacing w:after="0" w:line="240" w:lineRule="auto"/>
+              <w:spacing w:after="0" w:line="360" w:lineRule="auto"/>
               <w:jc w:val="center"/>
               <w:rPr>
                 <w:rFonts w:ascii="Times New Roman" w:eastAsia="Times New Roman" w:hAnsi="Times New Roman" w:cs="Times New Roman"/>
@@ -601,7 +601,7 @@
           </w:tcPr>
           <w:p>
             <w:pPr>
-              <w:spacing w:after="0" w:line="240" w:lineRule="auto"/>
+              <w:spacing w:after="0" w:line="360" w:lineRule="auto"/>
               <w:jc w:val="center"/>
               <w:rPr>
                 <w:rFonts w:ascii="Times New Roman" w:eastAsia="Times New Roman" w:hAnsi="Times New Roman" w:cs="Times New Roman"/>
@@ -640,7 +640,7 @@
           </w:tcPr>
           <w:p>
             <w:pPr>
-              <w:spacing w:after="0" w:line="240" w:lineRule="auto"/>
+              <w:spacing w:after="0" w:line="360" w:lineRule="auto"/>
               <w:jc w:val="center"/>
               <w:rPr>
                 <w:rFonts w:ascii="Times New Roman" w:eastAsia="Times New Roman" w:hAnsi="Times New Roman" w:cs="Times New Roman"/>
@@ -684,34 +684,34 @@
           </w:tcPr>
           <w:p>
             <w:pPr>
-              <w:spacing w:after="0" w:line="240" w:lineRule="auto"/>
-              <w:rPr>
-                <w:rFonts w:ascii="Times New Roman" w:eastAsia="Times New Roman" w:hAnsi="Times New Roman" w:cs="Times New Roman"/>
-                <w:color w:val="000000"/>
-                <w:kern w:val="0"/>
-                <w:szCs w:val="24"/>
-                <w:lang w:bidi="ar-SA"/>
-                <w14:ligatures w14:val="none"/>
-              </w:rPr>
-            </w:pPr>
-          </w:p>
-        </w:tc>
-        <w:tc>
-          <w:tcPr>
-            <w:tcW w:w="960" w:type="dxa"/>
-            <w:tcBorders>
-              <w:top w:val="nil"/>
-              <w:left w:val="nil"/>
-              <w:bottom w:val="single" w:sz="4" w:space="0" w:color="auto"/>
-              <w:right w:val="single" w:sz="4" w:space="0" w:color="auto"/>
-            </w:tcBorders>
-            <w:noWrap/>
-            <w:vAlign w:val="center"/>
-            <w:hideMark/>
-          </w:tcPr>
-          <w:p>
-            <w:pPr>
-              <w:spacing w:after="0" w:line="240" w:lineRule="auto"/>
+              <w:spacing w:after="0" w:line="360" w:lineRule="auto"/>
+              <w:rPr>
+                <w:rFonts w:ascii="Times New Roman" w:eastAsia="Times New Roman" w:hAnsi="Times New Roman" w:cs="Times New Roman"/>
+                <w:color w:val="000000"/>
+                <w:kern w:val="0"/>
+                <w:szCs w:val="24"/>
+                <w:lang w:bidi="ar-SA"/>
+                <w14:ligatures w14:val="none"/>
+              </w:rPr>
+            </w:pPr>
+          </w:p>
+        </w:tc>
+        <w:tc>
+          <w:tcPr>
+            <w:tcW w:w="960" w:type="dxa"/>
+            <w:tcBorders>
+              <w:top w:val="nil"/>
+              <w:left w:val="nil"/>
+              <w:bottom w:val="single" w:sz="4" w:space="0" w:color="auto"/>
+              <w:right w:val="single" w:sz="4" w:space="0" w:color="auto"/>
+            </w:tcBorders>
+            <w:noWrap/>
+            <w:vAlign w:val="center"/>
+            <w:hideMark/>
+          </w:tcPr>
+          <w:p>
+            <w:pPr>
+              <w:spacing w:after="0" w:line="360" w:lineRule="auto"/>
               <w:jc w:val="center"/>
               <w:rPr>
                 <w:rFonts w:ascii="Times New Roman" w:eastAsia="Times New Roman" w:hAnsi="Times New Roman" w:cs="Times New Roman"/>
@@ -750,7 +750,7 @@
           </w:tcPr>
           <w:p>
             <w:pPr>
-              <w:spacing w:after="0" w:line="240" w:lineRule="auto"/>
+              <w:spacing w:after="0" w:line="360" w:lineRule="auto"/>
               <w:jc w:val="center"/>
               <w:rPr>
                 <w:rFonts w:ascii="Times New Roman" w:eastAsia="Times New Roman" w:hAnsi="Times New Roman" w:cs="Times New Roman"/>
@@ -789,7 +789,7 @@
           </w:tcPr>
           <w:p>
             <w:pPr>
-              <w:spacing w:after="0" w:line="240" w:lineRule="auto"/>
+              <w:spacing w:after="0" w:line="360" w:lineRule="auto"/>
               <w:jc w:val="center"/>
               <w:rPr>
                 <w:rFonts w:ascii="Times New Roman" w:eastAsia="Times New Roman" w:hAnsi="Times New Roman" w:cs="Times New Roman"/>
@@ -828,7 +828,7 @@
           </w:tcPr>
           <w:p>
             <w:pPr>
-              <w:spacing w:after="0" w:line="240" w:lineRule="auto"/>
+              <w:spacing w:after="0" w:line="360" w:lineRule="auto"/>
               <w:jc w:val="center"/>
               <w:rPr>
                 <w:rFonts w:ascii="Times New Roman" w:eastAsia="Times New Roman" w:hAnsi="Times New Roman" w:cs="Times New Roman"/>
@@ -867,7 +867,7 @@
           </w:tcPr>
           <w:p>
             <w:pPr>
-              <w:spacing w:after="0" w:line="240" w:lineRule="auto"/>
+              <w:spacing w:after="0" w:line="360" w:lineRule="auto"/>
               <w:jc w:val="center"/>
               <w:rPr>
                 <w:rFonts w:ascii="Times New Roman" w:eastAsia="Times New Roman" w:hAnsi="Times New Roman" w:cs="Times New Roman"/>
@@ -906,7 +906,7 @@
           </w:tcPr>
           <w:p>
             <w:pPr>
-              <w:spacing w:after="0" w:line="240" w:lineRule="auto"/>
+              <w:spacing w:after="0" w:line="360" w:lineRule="auto"/>
               <w:jc w:val="center"/>
               <w:rPr>
                 <w:rFonts w:ascii="Times New Roman" w:eastAsia="Times New Roman" w:hAnsi="Times New Roman" w:cs="Times New Roman"/>
@@ -950,34 +950,34 @@
           </w:tcPr>
           <w:p>
             <w:pPr>
-              <w:spacing w:after="0" w:line="240" w:lineRule="auto"/>
-              <w:rPr>
-                <w:rFonts w:ascii="Times New Roman" w:eastAsia="Times New Roman" w:hAnsi="Times New Roman" w:cs="Times New Roman"/>
-                <w:color w:val="000000"/>
-                <w:kern w:val="0"/>
-                <w:szCs w:val="24"/>
-                <w:lang w:bidi="ar-SA"/>
-                <w14:ligatures w14:val="none"/>
-              </w:rPr>
-            </w:pPr>
-          </w:p>
-        </w:tc>
-        <w:tc>
-          <w:tcPr>
-            <w:tcW w:w="960" w:type="dxa"/>
-            <w:tcBorders>
-              <w:top w:val="nil"/>
-              <w:left w:val="nil"/>
-              <w:bottom w:val="single" w:sz="4" w:space="0" w:color="auto"/>
-              <w:right w:val="single" w:sz="4" w:space="0" w:color="auto"/>
-            </w:tcBorders>
-            <w:noWrap/>
-            <w:vAlign w:val="center"/>
-            <w:hideMark/>
-          </w:tcPr>
-          <w:p>
-            <w:pPr>
-              <w:spacing w:after="0" w:line="240" w:lineRule="auto"/>
+              <w:spacing w:after="0" w:line="360" w:lineRule="auto"/>
+              <w:rPr>
+                <w:rFonts w:ascii="Times New Roman" w:eastAsia="Times New Roman" w:hAnsi="Times New Roman" w:cs="Times New Roman"/>
+                <w:color w:val="000000"/>
+                <w:kern w:val="0"/>
+                <w:szCs w:val="24"/>
+                <w:lang w:bidi="ar-SA"/>
+                <w14:ligatures w14:val="none"/>
+              </w:rPr>
+            </w:pPr>
+          </w:p>
+        </w:tc>
+        <w:tc>
+          <w:tcPr>
+            <w:tcW w:w="960" w:type="dxa"/>
+            <w:tcBorders>
+              <w:top w:val="nil"/>
+              <w:left w:val="nil"/>
+              <w:bottom w:val="single" w:sz="4" w:space="0" w:color="auto"/>
+              <w:right w:val="single" w:sz="4" w:space="0" w:color="auto"/>
+            </w:tcBorders>
+            <w:noWrap/>
+            <w:vAlign w:val="center"/>
+            <w:hideMark/>
+          </w:tcPr>
+          <w:p>
+            <w:pPr>
+              <w:spacing w:after="0" w:line="360" w:lineRule="auto"/>
               <w:jc w:val="center"/>
               <w:rPr>
                 <w:rFonts w:ascii="Times New Roman" w:eastAsia="Times New Roman" w:hAnsi="Times New Roman" w:cs="Times New Roman"/>
@@ -1016,7 +1016,7 @@
           </w:tcPr>
           <w:p>
             <w:pPr>
-              <w:spacing w:after="0" w:line="240" w:lineRule="auto"/>
+              <w:spacing w:after="0" w:line="360" w:lineRule="auto"/>
               <w:jc w:val="center"/>
               <w:rPr>
                 <w:rFonts w:ascii="Times New Roman" w:eastAsia="Times New Roman" w:hAnsi="Times New Roman" w:cs="Times New Roman"/>
@@ -1055,7 +1055,7 @@
           </w:tcPr>
           <w:p>
             <w:pPr>
-              <w:spacing w:after="0" w:line="240" w:lineRule="auto"/>
+              <w:spacing w:after="0" w:line="360" w:lineRule="auto"/>
               <w:jc w:val="center"/>
               <w:rPr>
                 <w:rFonts w:ascii="Times New Roman" w:eastAsia="Times New Roman" w:hAnsi="Times New Roman" w:cs="Times New Roman"/>
@@ -1094,7 +1094,7 @@
           </w:tcPr>
           <w:p>
             <w:pPr>
-              <w:spacing w:after="0" w:line="240" w:lineRule="auto"/>
+              <w:spacing w:after="0" w:line="360" w:lineRule="auto"/>
               <w:jc w:val="center"/>
               <w:rPr>
                 <w:rFonts w:ascii="Times New Roman" w:eastAsia="Times New Roman" w:hAnsi="Times New Roman" w:cs="Times New Roman"/>
@@ -1133,7 +1133,7 @@
           </w:tcPr>
           <w:p>
             <w:pPr>
-              <w:spacing w:after="0" w:line="240" w:lineRule="auto"/>
+              <w:spacing w:after="0" w:line="360" w:lineRule="auto"/>
               <w:jc w:val="center"/>
               <w:rPr>
                 <w:rFonts w:ascii="Times New Roman" w:eastAsia="Times New Roman" w:hAnsi="Times New Roman" w:cs="Times New Roman"/>
@@ -1172,7 +1172,7 @@
           </w:tcPr>
           <w:p>
             <w:pPr>
-              <w:spacing w:after="0" w:line="240" w:lineRule="auto"/>
+              <w:spacing w:after="0" w:line="360" w:lineRule="auto"/>
               <w:jc w:val="center"/>
               <w:rPr>
                 <w:rFonts w:ascii="Times New Roman" w:eastAsia="Times New Roman" w:hAnsi="Times New Roman" w:cs="Times New Roman"/>
@@ -1216,7 +1216,7 @@
           </w:tcPr>
           <w:p>
             <w:pPr>
-              <w:spacing w:after="0" w:line="240" w:lineRule="auto"/>
+              <w:spacing w:after="0" w:line="360" w:lineRule="auto"/>
               <w:jc w:val="center"/>
               <w:rPr>
                 <w:rFonts w:ascii="Times New Roman" w:eastAsia="Times New Roman" w:hAnsi="Times New Roman" w:cs="Times New Roman"/>
@@ -1255,7 +1255,7 @@
           </w:tcPr>
           <w:p>
             <w:pPr>
-              <w:spacing w:after="0" w:line="240" w:lineRule="auto"/>
+              <w:spacing w:after="0" w:line="360" w:lineRule="auto"/>
               <w:jc w:val="center"/>
               <w:rPr>
                 <w:rFonts w:ascii="Times New Roman" w:eastAsia="Times New Roman" w:hAnsi="Times New Roman" w:cs="Times New Roman"/>
@@ -1294,7 +1294,7 @@
           </w:tcPr>
           <w:p>
             <w:pPr>
-              <w:spacing w:after="0" w:line="240" w:lineRule="auto"/>
+              <w:spacing w:after="0" w:line="360" w:lineRule="auto"/>
               <w:jc w:val="center"/>
               <w:rPr>
                 <w:rFonts w:ascii="Times New Roman" w:eastAsia="Times New Roman" w:hAnsi="Times New Roman" w:cs="Times New Roman"/>
@@ -1333,7 +1333,7 @@
           </w:tcPr>
           <w:p>
             <w:pPr>
-              <w:spacing w:after="0" w:line="240" w:lineRule="auto"/>
+              <w:spacing w:after="0" w:line="360" w:lineRule="auto"/>
               <w:jc w:val="center"/>
               <w:rPr>
                 <w:rFonts w:ascii="Times New Roman" w:eastAsia="Times New Roman" w:hAnsi="Times New Roman" w:cs="Times New Roman"/>
@@ -1372,7 +1372,7 @@
           </w:tcPr>
           <w:p>
             <w:pPr>
-              <w:spacing w:after="0" w:line="240" w:lineRule="auto"/>
+              <w:spacing w:after="0" w:line="360" w:lineRule="auto"/>
               <w:jc w:val="center"/>
               <w:rPr>
                 <w:rFonts w:ascii="Times New Roman" w:eastAsia="Times New Roman" w:hAnsi="Times New Roman" w:cs="Times New Roman"/>
@@ -1411,7 +1411,7 @@
           </w:tcPr>
           <w:p>
             <w:pPr>
-              <w:spacing w:after="0" w:line="240" w:lineRule="auto"/>
+              <w:spacing w:after="0" w:line="360" w:lineRule="auto"/>
               <w:jc w:val="center"/>
               <w:rPr>
                 <w:rFonts w:ascii="Times New Roman" w:eastAsia="Times New Roman" w:hAnsi="Times New Roman" w:cs="Times New Roman"/>
@@ -1450,7 +1450,7 @@
           </w:tcPr>
           <w:p>
             <w:pPr>
-              <w:spacing w:after="0" w:line="240" w:lineRule="auto"/>
+              <w:spacing w:after="0" w:line="360" w:lineRule="auto"/>
               <w:jc w:val="center"/>
               <w:rPr>
                 <w:rFonts w:ascii="Times New Roman" w:eastAsia="Times New Roman" w:hAnsi="Times New Roman" w:cs="Times New Roman"/>
@@ -1495,7 +1495,7 @@
           </w:tcPr>
           <w:p>
             <w:pPr>
-              <w:spacing w:after="0" w:line="240" w:lineRule="auto"/>
+              <w:spacing w:after="0" w:line="360" w:lineRule="auto"/>
               <w:rPr>
                 <w:rFonts w:ascii="Times New Roman" w:eastAsia="Times New Roman" w:hAnsi="Times New Roman" w:cs="Times New Roman"/>
                 <w:b/>
@@ -1558,7 +1558,7 @@
           </w:tcPr>
           <w:p>
             <w:pPr>
-              <w:spacing w:after="0" w:line="240" w:lineRule="auto"/>
+              <w:spacing w:after="0" w:line="360" w:lineRule="auto"/>
               <w:jc w:val="center"/>
               <w:rPr>
                 <w:rFonts w:ascii="Times New Roman" w:eastAsia="Times New Roman" w:hAnsi="Times New Roman" w:cs="Times New Roman"/>
@@ -1597,7 +1597,7 @@
           </w:tcPr>
           <w:p>
             <w:pPr>
-              <w:spacing w:after="0" w:line="240" w:lineRule="auto"/>
+              <w:spacing w:after="0" w:line="360" w:lineRule="auto"/>
               <w:jc w:val="center"/>
               <w:rPr>
                 <w:rFonts w:ascii="Times New Roman" w:eastAsia="Times New Roman" w:hAnsi="Times New Roman" w:cs="Times New Roman"/>
@@ -1636,7 +1636,7 @@
           </w:tcPr>
           <w:p>
             <w:pPr>
-              <w:spacing w:after="0" w:line="240" w:lineRule="auto"/>
+              <w:spacing w:after="0" w:line="360" w:lineRule="auto"/>
               <w:jc w:val="center"/>
               <w:rPr>
                 <w:rFonts w:ascii="Times New Roman" w:eastAsia="Times New Roman" w:hAnsi="Times New Roman" w:cs="Times New Roman"/>
@@ -1675,7 +1675,7 @@
           </w:tcPr>
           <w:p>
             <w:pPr>
-              <w:spacing w:after="0" w:line="240" w:lineRule="auto"/>
+              <w:spacing w:after="0" w:line="360" w:lineRule="auto"/>
               <w:jc w:val="center"/>
               <w:rPr>
                 <w:rFonts w:ascii="Times New Roman" w:eastAsia="Times New Roman" w:hAnsi="Times New Roman" w:cs="Times New Roman"/>
@@ -1714,7 +1714,7 @@
           </w:tcPr>
           <w:p>
             <w:pPr>
-              <w:spacing w:after="0" w:line="240" w:lineRule="auto"/>
+              <w:spacing w:after="0" w:line="360" w:lineRule="auto"/>
               <w:jc w:val="center"/>
               <w:rPr>
                 <w:rFonts w:ascii="Times New Roman" w:eastAsia="Times New Roman" w:hAnsi="Times New Roman" w:cs="Times New Roman"/>
@@ -1753,7 +1753,7 @@
           </w:tcPr>
           <w:p>
             <w:pPr>
-              <w:spacing w:after="0" w:line="240" w:lineRule="auto"/>
+              <w:spacing w:after="0" w:line="360" w:lineRule="auto"/>
               <w:jc w:val="center"/>
               <w:rPr>
                 <w:rFonts w:ascii="Times New Roman" w:eastAsia="Times New Roman" w:hAnsi="Times New Roman" w:cs="Times New Roman"/>
@@ -1792,7 +1792,7 @@
           </w:tcPr>
           <w:p>
             <w:pPr>
-              <w:spacing w:after="0" w:line="240" w:lineRule="auto"/>
+              <w:spacing w:after="0" w:line="360" w:lineRule="auto"/>
               <w:jc w:val="center"/>
               <w:rPr>
                 <w:rFonts w:ascii="Times New Roman" w:eastAsia="Times New Roman" w:hAnsi="Times New Roman" w:cs="Times New Roman"/>
@@ -1836,34 +1836,34 @@
           </w:tcPr>
           <w:p>
             <w:pPr>
-              <w:spacing w:after="0" w:line="240" w:lineRule="auto"/>
-              <w:rPr>
-                <w:rFonts w:ascii="Times New Roman" w:eastAsia="Times New Roman" w:hAnsi="Times New Roman" w:cs="Times New Roman"/>
-                <w:color w:val="000000"/>
-                <w:kern w:val="0"/>
-                <w:szCs w:val="24"/>
-                <w:lang w:bidi="ar-SA"/>
-                <w14:ligatures w14:val="none"/>
-              </w:rPr>
-            </w:pPr>
-          </w:p>
-        </w:tc>
-        <w:tc>
-          <w:tcPr>
-            <w:tcW w:w="960" w:type="dxa"/>
-            <w:tcBorders>
-              <w:top w:val="nil"/>
-              <w:left w:val="nil"/>
-              <w:bottom w:val="single" w:sz="4" w:space="0" w:color="auto"/>
-              <w:right w:val="single" w:sz="4" w:space="0" w:color="auto"/>
-            </w:tcBorders>
-            <w:noWrap/>
-            <w:vAlign w:val="center"/>
-            <w:hideMark/>
-          </w:tcPr>
-          <w:p>
-            <w:pPr>
-              <w:spacing w:after="0" w:line="240" w:lineRule="auto"/>
+              <w:spacing w:after="0" w:line="360" w:lineRule="auto"/>
+              <w:rPr>
+                <w:rFonts w:ascii="Times New Roman" w:eastAsia="Times New Roman" w:hAnsi="Times New Roman" w:cs="Times New Roman"/>
+                <w:color w:val="000000"/>
+                <w:kern w:val="0"/>
+                <w:szCs w:val="24"/>
+                <w:lang w:bidi="ar-SA"/>
+                <w14:ligatures w14:val="none"/>
+              </w:rPr>
+            </w:pPr>
+          </w:p>
+        </w:tc>
+        <w:tc>
+          <w:tcPr>
+            <w:tcW w:w="960" w:type="dxa"/>
+            <w:tcBorders>
+              <w:top w:val="nil"/>
+              <w:left w:val="nil"/>
+              <w:bottom w:val="single" w:sz="4" w:space="0" w:color="auto"/>
+              <w:right w:val="single" w:sz="4" w:space="0" w:color="auto"/>
+            </w:tcBorders>
+            <w:noWrap/>
+            <w:vAlign w:val="center"/>
+            <w:hideMark/>
+          </w:tcPr>
+          <w:p>
+            <w:pPr>
+              <w:spacing w:after="0" w:line="360" w:lineRule="auto"/>
               <w:jc w:val="center"/>
               <w:rPr>
                 <w:rFonts w:ascii="Times New Roman" w:eastAsia="Times New Roman" w:hAnsi="Times New Roman" w:cs="Times New Roman"/>
@@ -1902,7 +1902,7 @@
           </w:tcPr>
           <w:p>
             <w:pPr>
-              <w:spacing w:after="0" w:line="240" w:lineRule="auto"/>
+              <w:spacing w:after="0" w:line="360" w:lineRule="auto"/>
               <w:jc w:val="center"/>
               <w:rPr>
                 <w:rFonts w:ascii="Times New Roman" w:eastAsia="Times New Roman" w:hAnsi="Times New Roman" w:cs="Times New Roman"/>
@@ -1941,7 +1941,7 @@
           </w:tcPr>
           <w:p>
             <w:pPr>
-              <w:spacing w:after="0" w:line="240" w:lineRule="auto"/>
+              <w:spacing w:after="0" w:line="360" w:lineRule="auto"/>
               <w:jc w:val="center"/>
               <w:rPr>
                 <w:rFonts w:ascii="Times New Roman" w:eastAsia="Times New Roman" w:hAnsi="Times New Roman" w:cs="Times New Roman"/>
@@ -1980,7 +1980,7 @@
           </w:tcPr>
           <w:p>
             <w:pPr>
-              <w:spacing w:after="0" w:line="240" w:lineRule="auto"/>
+              <w:spacing w:after="0" w:line="360" w:lineRule="auto"/>
               <w:jc w:val="center"/>
               <w:rPr>
                 <w:rFonts w:ascii="Times New Roman" w:eastAsia="Times New Roman" w:hAnsi="Times New Roman" w:cs="Times New Roman"/>
@@ -2019,7 +2019,7 @@
           </w:tcPr>
           <w:p>
             <w:pPr>
-              <w:spacing w:after="0" w:line="240" w:lineRule="auto"/>
+              <w:spacing w:after="0" w:line="360" w:lineRule="auto"/>
               <w:jc w:val="center"/>
               <w:rPr>
                 <w:rFonts w:ascii="Times New Roman" w:eastAsia="Times New Roman" w:hAnsi="Times New Roman" w:cs="Times New Roman"/>
@@ -2058,7 +2058,7 @@
           </w:tcPr>
           <w:p>
             <w:pPr>
-              <w:spacing w:after="0" w:line="240" w:lineRule="auto"/>
+              <w:spacing w:after="0" w:line="360" w:lineRule="auto"/>
               <w:jc w:val="center"/>
               <w:rPr>
                 <w:rFonts w:ascii="Times New Roman" w:eastAsia="Times New Roman" w:hAnsi="Times New Roman" w:cs="Times New Roman"/>
@@ -2103,7 +2103,7 @@
           </w:tcPr>
           <w:p>
             <w:pPr>
-              <w:spacing w:after="0" w:line="240" w:lineRule="auto"/>
+              <w:spacing w:after="0" w:line="360" w:lineRule="auto"/>
               <w:jc w:val="center"/>
               <w:rPr>
                 <w:rFonts w:ascii="Times New Roman" w:eastAsia="Times New Roman" w:hAnsi="Times New Roman" w:cs="Times New Roman"/>
@@ -2142,7 +2142,7 @@
           </w:tcPr>
           <w:p>
             <w:pPr>
-              <w:spacing w:after="0" w:line="240" w:lineRule="auto"/>
+              <w:spacing w:after="0" w:line="360" w:lineRule="auto"/>
               <w:jc w:val="center"/>
               <w:rPr>
                 <w:rFonts w:ascii="Times New Roman" w:eastAsia="Times New Roman" w:hAnsi="Times New Roman" w:cs="Times New Roman"/>
@@ -2181,7 +2181,7 @@
           </w:tcPr>
           <w:p>
             <w:pPr>
-              <w:spacing w:after="0" w:line="240" w:lineRule="auto"/>
+              <w:spacing w:after="0" w:line="360" w:lineRule="auto"/>
               <w:jc w:val="center"/>
               <w:rPr>
                 <w:rFonts w:ascii="Times New Roman" w:eastAsia="Times New Roman" w:hAnsi="Times New Roman" w:cs="Times New Roman"/>
@@ -2220,7 +2220,7 @@
           </w:tcPr>
           <w:p>
             <w:pPr>
-              <w:spacing w:after="0" w:line="240" w:lineRule="auto"/>
+              <w:spacing w:after="0" w:line="360" w:lineRule="auto"/>
               <w:jc w:val="center"/>
               <w:rPr>
                 <w:rFonts w:ascii="Times New Roman" w:eastAsia="Times New Roman" w:hAnsi="Times New Roman" w:cs="Times New Roman"/>
@@ -2259,7 +2259,7 @@
           </w:tcPr>
           <w:p>
             <w:pPr>
-              <w:spacing w:after="0" w:line="240" w:lineRule="auto"/>
+              <w:spacing w:after="0" w:line="360" w:lineRule="auto"/>
               <w:jc w:val="center"/>
               <w:rPr>
                 <w:rFonts w:ascii="Times New Roman" w:eastAsia="Times New Roman" w:hAnsi="Times New Roman" w:cs="Times New Roman"/>
@@ -2298,7 +2298,7 @@
           </w:tcPr>
           <w:p>
             <w:pPr>
-              <w:spacing w:after="0" w:line="240" w:lineRule="auto"/>
+              <w:spacing w:after="0" w:line="360" w:lineRule="auto"/>
               <w:jc w:val="center"/>
               <w:rPr>
                 <w:rFonts w:ascii="Times New Roman" w:eastAsia="Times New Roman" w:hAnsi="Times New Roman" w:cs="Times New Roman"/>
@@ -2337,7 +2337,7 @@
           </w:tcPr>
           <w:p>
             <w:pPr>
-              <w:spacing w:after="0" w:line="240" w:lineRule="auto"/>
+              <w:spacing w:after="0" w:line="360" w:lineRule="auto"/>
               <w:jc w:val="center"/>
               <w:rPr>
                 <w:rFonts w:ascii="Times New Roman" w:eastAsia="Times New Roman" w:hAnsi="Times New Roman" w:cs="Times New Roman"/>
@@ -2381,7 +2381,7 @@
           </w:tcPr>
           <w:p>
             <w:pPr>
-              <w:spacing w:after="0" w:line="240" w:lineRule="auto"/>
+              <w:spacing w:after="0" w:line="360" w:lineRule="auto"/>
               <w:rPr>
                 <w:rFonts w:ascii="Times New Roman" w:eastAsia="Times New Roman" w:hAnsi="Times New Roman" w:cs="Times New Roman"/>
                 <w:color w:val="000000"/>
@@ -2408,7 +2408,7 @@
           </w:tcPr>
           <w:p>
             <w:pPr>
-              <w:spacing w:after="0" w:line="240" w:lineRule="auto"/>
+              <w:spacing w:after="0" w:line="360" w:lineRule="auto"/>
               <w:rPr>
                 <w:rFonts w:ascii="Times New Roman" w:eastAsia="Times New Roman" w:hAnsi="Times New Roman" w:cs="Times New Roman"/>
                 <w:color w:val="000000"/>
@@ -2446,7 +2446,7 @@
           </w:tcPr>
           <w:p>
             <w:pPr>
-              <w:spacing w:after="0" w:line="240" w:lineRule="auto"/>
+              <w:spacing w:after="0" w:line="360" w:lineRule="auto"/>
               <w:jc w:val="center"/>
               <w:rPr>
                 <w:rFonts w:ascii="Times New Roman" w:eastAsia="Times New Roman" w:hAnsi="Times New Roman" w:cs="Times New Roman"/>
@@ -2485,7 +2485,7 @@
           </w:tcPr>
           <w:p>
             <w:pPr>
-              <w:spacing w:after="0" w:line="240" w:lineRule="auto"/>
+              <w:spacing w:after="0" w:line="360" w:lineRule="auto"/>
               <w:jc w:val="center"/>
               <w:rPr>
                 <w:rFonts w:ascii="Times New Roman" w:eastAsia="Times New Roman" w:hAnsi="Times New Roman" w:cs="Times New Roman"/>
@@ -2524,7 +2524,7 @@
           </w:tcPr>
           <w:p>
             <w:pPr>
-              <w:spacing w:after="0" w:line="240" w:lineRule="auto"/>
+              <w:spacing w:after="0" w:line="360" w:lineRule="auto"/>
               <w:jc w:val="center"/>
               <w:rPr>
                 <w:rFonts w:ascii="Times New Roman" w:eastAsia="Times New Roman" w:hAnsi="Times New Roman" w:cs="Times New Roman"/>
@@ -2563,7 +2563,7 @@
           </w:tcPr>
           <w:p>
             <w:pPr>
-              <w:spacing w:after="0" w:line="240" w:lineRule="auto"/>
+              <w:spacing w:after="0" w:line="360" w:lineRule="auto"/>
               <w:jc w:val="center"/>
               <w:rPr>
                 <w:rFonts w:ascii="Times New Roman" w:eastAsia="Times New Roman" w:hAnsi="Times New Roman" w:cs="Times New Roman"/>
@@ -2602,7 +2602,7 @@
           </w:tcPr>
           <w:p>
             <w:pPr>
-              <w:spacing w:after="0" w:line="240" w:lineRule="auto"/>
+              <w:spacing w:after="0" w:line="360" w:lineRule="auto"/>
               <w:rPr>
                 <w:rFonts w:ascii="Times New Roman" w:eastAsia="Times New Roman" w:hAnsi="Times New Roman" w:cs="Times New Roman"/>
                 <w:color w:val="000000"/>
@@ -2646,7 +2646,7 @@
           </w:tcPr>
           <w:p>
             <w:pPr>
-              <w:spacing w:after="0" w:line="240" w:lineRule="auto"/>
+              <w:spacing w:after="0" w:line="360" w:lineRule="auto"/>
               <w:rPr>
                 <w:rFonts w:ascii="Times New Roman" w:eastAsia="Times New Roman" w:hAnsi="Times New Roman" w:cs="Times New Roman"/>
                 <w:b/>
@@ -2709,7 +2709,7 @@
           </w:tcPr>
           <w:p>
             <w:pPr>
-              <w:spacing w:after="0" w:line="240" w:lineRule="auto"/>
+              <w:spacing w:after="0" w:line="360" w:lineRule="auto"/>
               <w:jc w:val="center"/>
               <w:rPr>
                 <w:rFonts w:ascii="Times New Roman" w:eastAsia="Times New Roman" w:hAnsi="Times New Roman" w:cs="Times New Roman"/>
@@ -2748,7 +2748,7 @@
           </w:tcPr>
           <w:p>
             <w:pPr>
-              <w:spacing w:after="0" w:line="240" w:lineRule="auto"/>
+              <w:spacing w:after="0" w:line="360" w:lineRule="auto"/>
               <w:jc w:val="center"/>
               <w:rPr>
                 <w:rFonts w:ascii="Times New Roman" w:eastAsia="Times New Roman" w:hAnsi="Times New Roman" w:cs="Times New Roman"/>
@@ -2787,7 +2787,7 @@
           </w:tcPr>
           <w:p>
             <w:pPr>
-              <w:spacing w:after="0" w:line="240" w:lineRule="auto"/>
+              <w:spacing w:after="0" w:line="360" w:lineRule="auto"/>
               <w:jc w:val="center"/>
               <w:rPr>
                 <w:rFonts w:ascii="Times New Roman" w:eastAsia="Times New Roman" w:hAnsi="Times New Roman" w:cs="Times New Roman"/>
@@ -2826,7 +2826,7 @@
           </w:tcPr>
           <w:p>
             <w:pPr>
-              <w:spacing w:after="0" w:line="240" w:lineRule="auto"/>
+              <w:spacing w:after="0" w:line="360" w:lineRule="auto"/>
               <w:jc w:val="center"/>
               <w:rPr>
                 <w:rFonts w:ascii="Times New Roman" w:eastAsia="Times New Roman" w:hAnsi="Times New Roman" w:cs="Times New Roman"/>
@@ -2865,7 +2865,7 @@
           </w:tcPr>
           <w:p>
             <w:pPr>
-              <w:spacing w:after="0" w:line="240" w:lineRule="auto"/>
+              <w:spacing w:after="0" w:line="360" w:lineRule="auto"/>
               <w:jc w:val="center"/>
               <w:rPr>
                 <w:rFonts w:ascii="Times New Roman" w:eastAsia="Times New Roman" w:hAnsi="Times New Roman" w:cs="Times New Roman"/>
@@ -2904,7 +2904,7 @@
           </w:tcPr>
           <w:p>
             <w:pPr>
-              <w:spacing w:after="0" w:line="240" w:lineRule="auto"/>
+              <w:spacing w:after="0" w:line="360" w:lineRule="auto"/>
               <w:jc w:val="center"/>
               <w:rPr>
                 <w:rFonts w:ascii="Times New Roman" w:eastAsia="Times New Roman" w:hAnsi="Times New Roman" w:cs="Times New Roman"/>
@@ -2943,7 +2943,7 @@
           </w:tcPr>
           <w:p>
             <w:pPr>
-              <w:spacing w:after="0" w:line="240" w:lineRule="auto"/>
+              <w:spacing w:after="0" w:line="360" w:lineRule="auto"/>
               <w:jc w:val="center"/>
               <w:rPr>
                 <w:rFonts w:ascii="Times New Roman" w:eastAsia="Times New Roman" w:hAnsi="Times New Roman" w:cs="Times New Roman"/>
@@ -2987,34 +2987,34 @@
           </w:tcPr>
           <w:p>
             <w:pPr>
-              <w:spacing w:after="0" w:line="240" w:lineRule="auto"/>
-              <w:rPr>
-                <w:rFonts w:ascii="Times New Roman" w:eastAsia="Times New Roman" w:hAnsi="Times New Roman" w:cs="Times New Roman"/>
-                <w:color w:val="000000"/>
-                <w:kern w:val="0"/>
-                <w:szCs w:val="24"/>
-                <w:lang w:bidi="ar-SA"/>
-                <w14:ligatures w14:val="none"/>
-              </w:rPr>
-            </w:pPr>
-          </w:p>
-        </w:tc>
-        <w:tc>
-          <w:tcPr>
-            <w:tcW w:w="960" w:type="dxa"/>
-            <w:tcBorders>
-              <w:top w:val="nil"/>
-              <w:left w:val="nil"/>
-              <w:bottom w:val="single" w:sz="4" w:space="0" w:color="auto"/>
-              <w:right w:val="single" w:sz="4" w:space="0" w:color="auto"/>
-            </w:tcBorders>
-            <w:noWrap/>
-            <w:vAlign w:val="center"/>
-            <w:hideMark/>
-          </w:tcPr>
-          <w:p>
-            <w:pPr>
-              <w:spacing w:after="0" w:line="240" w:lineRule="auto"/>
+              <w:spacing w:after="0" w:line="360" w:lineRule="auto"/>
+              <w:rPr>
+                <w:rFonts w:ascii="Times New Roman" w:eastAsia="Times New Roman" w:hAnsi="Times New Roman" w:cs="Times New Roman"/>
+                <w:color w:val="000000"/>
+                <w:kern w:val="0"/>
+                <w:szCs w:val="24"/>
+                <w:lang w:bidi="ar-SA"/>
+                <w14:ligatures w14:val="none"/>
+              </w:rPr>
+            </w:pPr>
+          </w:p>
+        </w:tc>
+        <w:tc>
+          <w:tcPr>
+            <w:tcW w:w="960" w:type="dxa"/>
+            <w:tcBorders>
+              <w:top w:val="nil"/>
+              <w:left w:val="nil"/>
+              <w:bottom w:val="single" w:sz="4" w:space="0" w:color="auto"/>
+              <w:right w:val="single" w:sz="4" w:space="0" w:color="auto"/>
+            </w:tcBorders>
+            <w:noWrap/>
+            <w:vAlign w:val="center"/>
+            <w:hideMark/>
+          </w:tcPr>
+          <w:p>
+            <w:pPr>
+              <w:spacing w:after="0" w:line="360" w:lineRule="auto"/>
               <w:jc w:val="center"/>
               <w:rPr>
                 <w:rFonts w:ascii="Times New Roman" w:eastAsia="Times New Roman" w:hAnsi="Times New Roman" w:cs="Times New Roman"/>
@@ -3053,7 +3053,7 @@
           </w:tcPr>
           <w:p>
             <w:pPr>
-              <w:spacing w:after="0" w:line="240" w:lineRule="auto"/>
+              <w:spacing w:after="0" w:line="360" w:lineRule="auto"/>
               <w:jc w:val="center"/>
               <w:rPr>
                 <w:rFonts w:ascii="Times New Roman" w:eastAsia="Times New Roman" w:hAnsi="Times New Roman" w:cs="Times New Roman"/>
@@ -3092,7 +3092,7 @@
           </w:tcPr>
           <w:p>
             <w:pPr>
-              <w:spacing w:after="0" w:line="240" w:lineRule="auto"/>
+              <w:spacing w:after="0" w:line="360" w:lineRule="auto"/>
               <w:jc w:val="center"/>
               <w:rPr>
                 <w:rFonts w:ascii="Times New Roman" w:eastAsia="Times New Roman" w:hAnsi="Times New Roman" w:cs="Times New Roman"/>
@@ -3131,7 +3131,7 @@
           </w:tcPr>
           <w:p>
             <w:pPr>
-              <w:spacing w:after="0" w:line="240" w:lineRule="auto"/>
+              <w:spacing w:after="0" w:line="360" w:lineRule="auto"/>
               <w:jc w:val="center"/>
               <w:rPr>
                 <w:rFonts w:ascii="Times New Roman" w:eastAsia="Times New Roman" w:hAnsi="Times New Roman" w:cs="Times New Roman"/>
@@ -3170,7 +3170,7 @@
           </w:tcPr>
           <w:p>
             <w:pPr>
-              <w:spacing w:after="0" w:line="240" w:lineRule="auto"/>
+              <w:spacing w:after="0" w:line="360" w:lineRule="auto"/>
               <w:jc w:val="center"/>
               <w:rPr>
                 <w:rFonts w:ascii="Times New Roman" w:eastAsia="Times New Roman" w:hAnsi="Times New Roman" w:cs="Times New Roman"/>
@@ -3209,7 +3209,7 @@
           </w:tcPr>
           <w:p>
             <w:pPr>
-              <w:spacing w:after="0" w:line="240" w:lineRule="auto"/>
+              <w:spacing w:after="0" w:line="360" w:lineRule="auto"/>
               <w:jc w:val="center"/>
               <w:rPr>
                 <w:rFonts w:ascii="Times New Roman" w:eastAsia="Times New Roman" w:hAnsi="Times New Roman" w:cs="Times New Roman"/>
@@ -3253,7 +3253,7 @@
           </w:tcPr>
           <w:p>
             <w:pPr>
-              <w:spacing w:after="0" w:line="240" w:lineRule="auto"/>
+              <w:spacing w:after="0" w:line="360" w:lineRule="auto"/>
               <w:jc w:val="center"/>
               <w:rPr>
                 <w:rFonts w:ascii="Times New Roman" w:eastAsia="Times New Roman" w:hAnsi="Times New Roman" w:cs="Times New Roman"/>
@@ -3292,7 +3292,7 @@
           </w:tcPr>
           <w:p>
             <w:pPr>
-              <w:spacing w:after="0" w:line="240" w:lineRule="auto"/>
+              <w:spacing w:after="0" w:line="360" w:lineRule="auto"/>
               <w:jc w:val="center"/>
               <w:rPr>
                 <w:rFonts w:ascii="Times New Roman" w:eastAsia="Times New Roman" w:hAnsi="Times New Roman" w:cs="Times New Roman"/>
@@ -3331,7 +3331,7 @@
           </w:tcPr>
           <w:p>
             <w:pPr>
-              <w:spacing w:after="0" w:line="240" w:lineRule="auto"/>
+              <w:spacing w:after="0" w:line="360" w:lineRule="auto"/>
               <w:jc w:val="center"/>
               <w:rPr>
                 <w:rFonts w:ascii="Times New Roman" w:eastAsia="Times New Roman" w:hAnsi="Times New Roman" w:cs="Times New Roman"/>
@@ -3370,7 +3370,7 @@
           </w:tcPr>
           <w:p>
             <w:pPr>
-              <w:spacing w:after="0" w:line="240" w:lineRule="auto"/>
+              <w:spacing w:after="0" w:line="360" w:lineRule="auto"/>
               <w:jc w:val="center"/>
               <w:rPr>
                 <w:rFonts w:ascii="Times New Roman" w:eastAsia="Times New Roman" w:hAnsi="Times New Roman" w:cs="Times New Roman"/>
@@ -3409,7 +3409,7 @@
           </w:tcPr>
           <w:p>
             <w:pPr>
-              <w:spacing w:after="0" w:line="240" w:lineRule="auto"/>
+              <w:spacing w:after="0" w:line="360" w:lineRule="auto"/>
               <w:jc w:val="center"/>
               <w:rPr>
                 <w:rFonts w:ascii="Times New Roman" w:eastAsia="Times New Roman" w:hAnsi="Times New Roman" w:cs="Times New Roman"/>
@@ -3448,7 +3448,7 @@
           </w:tcPr>
           <w:p>
             <w:pPr>
-              <w:spacing w:after="0" w:line="240" w:lineRule="auto"/>
+              <w:spacing w:after="0" w:line="360" w:lineRule="auto"/>
               <w:jc w:val="center"/>
               <w:rPr>
                 <w:rFonts w:ascii="Times New Roman" w:eastAsia="Times New Roman" w:hAnsi="Times New Roman" w:cs="Times New Roman"/>
@@ -3487,7 +3487,7 @@
           </w:tcPr>
           <w:p>
             <w:pPr>
-              <w:spacing w:after="0" w:line="240" w:lineRule="auto"/>
+              <w:spacing w:after="0" w:line="360" w:lineRule="auto"/>
               <w:jc w:val="center"/>
               <w:rPr>
                 <w:rFonts w:ascii="Times New Roman" w:eastAsia="Times New Roman" w:hAnsi="Times New Roman" w:cs="Times New Roman"/>
@@ -3532,7 +3532,7 @@
           </w:tcPr>
           <w:p>
             <w:pPr>
-              <w:spacing w:after="0" w:line="240" w:lineRule="auto"/>
+              <w:spacing w:after="0" w:line="360" w:lineRule="auto"/>
               <w:rPr>
                 <w:rFonts w:ascii="Times New Roman" w:eastAsia="Times New Roman" w:hAnsi="Times New Roman" w:cs="Times New Roman"/>
                 <w:b/>
@@ -3595,7 +3595,7 @@
           </w:tcPr>
           <w:p>
             <w:pPr>
-              <w:spacing w:after="0" w:line="240" w:lineRule="auto"/>
+              <w:spacing w:after="0" w:line="360" w:lineRule="auto"/>
               <w:jc w:val="center"/>
               <w:rPr>
                 <w:rFonts w:ascii="Times New Roman" w:eastAsia="Times New Roman" w:hAnsi="Times New Roman" w:cs="Times New Roman"/>
@@ -3634,7 +3634,7 @@
           </w:tcPr>
           <w:p>
             <w:pPr>
-              <w:spacing w:after="0" w:line="240" w:lineRule="auto"/>
+              <w:spacing w:after="0" w:line="360" w:lineRule="auto"/>
               <w:jc w:val="center"/>
               <w:rPr>
                 <w:rFonts w:ascii="Times New Roman" w:eastAsia="Times New Roman" w:hAnsi="Times New Roman" w:cs="Times New Roman"/>
@@ -3673,7 +3673,7 @@
           </w:tcPr>
           <w:p>
             <w:pPr>
-              <w:spacing w:after="0" w:line="240" w:lineRule="auto"/>
+              <w:spacing w:after="0" w:line="360" w:lineRule="auto"/>
               <w:jc w:val="center"/>
               <w:rPr>
                 <w:rFonts w:ascii="Times New Roman" w:eastAsia="Times New Roman" w:hAnsi="Times New Roman" w:cs="Times New Roman"/>
@@ -3712,7 +3712,7 @@
           </w:tcPr>
           <w:p>
             <w:pPr>
-              <w:spacing w:after="0" w:line="240" w:lineRule="auto"/>
+              <w:spacing w:after="0" w:line="360" w:lineRule="auto"/>
               <w:jc w:val="center"/>
               <w:rPr>
                 <w:rFonts w:ascii="Times New Roman" w:eastAsia="Times New Roman" w:hAnsi="Times New Roman" w:cs="Times New Roman"/>
@@ -3751,7 +3751,7 @@
           </w:tcPr>
           <w:p>
             <w:pPr>
-              <w:spacing w:after="0" w:line="240" w:lineRule="auto"/>
+              <w:spacing w:after="0" w:line="360" w:lineRule="auto"/>
               <w:jc w:val="center"/>
               <w:rPr>
                 <w:rFonts w:ascii="Times New Roman" w:eastAsia="Times New Roman" w:hAnsi="Times New Roman" w:cs="Times New Roman"/>
@@ -3790,7 +3790,7 @@
           </w:tcPr>
           <w:p>
             <w:pPr>
-              <w:spacing w:after="0" w:line="240" w:lineRule="auto"/>
+              <w:spacing w:after="0" w:line="360" w:lineRule="auto"/>
               <w:jc w:val="center"/>
               <w:rPr>
                 <w:rFonts w:ascii="Times New Roman" w:eastAsia="Times New Roman" w:hAnsi="Times New Roman" w:cs="Times New Roman"/>
@@ -3829,7 +3829,7 @@
           </w:tcPr>
           <w:p>
             <w:pPr>
-              <w:spacing w:after="0" w:line="240" w:lineRule="auto"/>
+              <w:spacing w:after="0" w:line="360" w:lineRule="auto"/>
               <w:jc w:val="center"/>
               <w:rPr>
                 <w:rFonts w:ascii="Times New Roman" w:eastAsia="Times New Roman" w:hAnsi="Times New Roman" w:cs="Times New Roman"/>
@@ -3873,34 +3873,34 @@
           </w:tcPr>
           <w:p>
             <w:pPr>
-              <w:spacing w:after="0" w:line="240" w:lineRule="auto"/>
-              <w:rPr>
-                <w:rFonts w:ascii="Times New Roman" w:eastAsia="Times New Roman" w:hAnsi="Times New Roman" w:cs="Times New Roman"/>
-                <w:color w:val="000000"/>
-                <w:kern w:val="0"/>
-                <w:szCs w:val="24"/>
-                <w:lang w:bidi="ar-SA"/>
-                <w14:ligatures w14:val="none"/>
-              </w:rPr>
-            </w:pPr>
-          </w:p>
-        </w:tc>
-        <w:tc>
-          <w:tcPr>
-            <w:tcW w:w="960" w:type="dxa"/>
-            <w:tcBorders>
-              <w:top w:val="nil"/>
-              <w:left w:val="nil"/>
-              <w:bottom w:val="single" w:sz="4" w:space="0" w:color="auto"/>
-              <w:right w:val="single" w:sz="4" w:space="0" w:color="auto"/>
-            </w:tcBorders>
-            <w:noWrap/>
-            <w:vAlign w:val="center"/>
-            <w:hideMark/>
-          </w:tcPr>
-          <w:p>
-            <w:pPr>
-              <w:spacing w:after="0" w:line="240" w:lineRule="auto"/>
+              <w:spacing w:after="0" w:line="360" w:lineRule="auto"/>
+              <w:rPr>
+                <w:rFonts w:ascii="Times New Roman" w:eastAsia="Times New Roman" w:hAnsi="Times New Roman" w:cs="Times New Roman"/>
+                <w:color w:val="000000"/>
+                <w:kern w:val="0"/>
+                <w:szCs w:val="24"/>
+                <w:lang w:bidi="ar-SA"/>
+                <w14:ligatures w14:val="none"/>
+              </w:rPr>
+            </w:pPr>
+          </w:p>
+        </w:tc>
+        <w:tc>
+          <w:tcPr>
+            <w:tcW w:w="960" w:type="dxa"/>
+            <w:tcBorders>
+              <w:top w:val="nil"/>
+              <w:left w:val="nil"/>
+              <w:bottom w:val="single" w:sz="4" w:space="0" w:color="auto"/>
+              <w:right w:val="single" w:sz="4" w:space="0" w:color="auto"/>
+            </w:tcBorders>
+            <w:noWrap/>
+            <w:vAlign w:val="center"/>
+            <w:hideMark/>
+          </w:tcPr>
+          <w:p>
+            <w:pPr>
+              <w:spacing w:after="0" w:line="360" w:lineRule="auto"/>
               <w:jc w:val="center"/>
               <w:rPr>
                 <w:rFonts w:ascii="Times New Roman" w:eastAsia="Times New Roman" w:hAnsi="Times New Roman" w:cs="Times New Roman"/>
@@ -3939,7 +3939,7 @@
           </w:tcPr>
           <w:p>
             <w:pPr>
-              <w:spacing w:after="0" w:line="240" w:lineRule="auto"/>
+              <w:spacing w:after="0" w:line="360" w:lineRule="auto"/>
               <w:jc w:val="center"/>
               <w:rPr>
                 <w:rFonts w:ascii="Times New Roman" w:eastAsia="Times New Roman" w:hAnsi="Times New Roman" w:cs="Times New Roman"/>
@@ -3978,7 +3978,7 @@
           </w:tcPr>
           <w:p>
             <w:pPr>
-              <w:spacing w:after="0" w:line="240" w:lineRule="auto"/>
+              <w:spacing w:after="0" w:line="360" w:lineRule="auto"/>
               <w:jc w:val="center"/>
               <w:rPr>
                 <w:rFonts w:ascii="Times New Roman" w:eastAsia="Times New Roman" w:hAnsi="Times New Roman" w:cs="Times New Roman"/>
@@ -4017,7 +4017,7 @@
           </w:tcPr>
           <w:p>
             <w:pPr>
-              <w:spacing w:after="0" w:line="240" w:lineRule="auto"/>
+              <w:spacing w:after="0" w:line="360" w:lineRule="auto"/>
               <w:jc w:val="center"/>
               <w:rPr>
                 <w:rFonts w:ascii="Times New Roman" w:eastAsia="Times New Roman" w:hAnsi="Times New Roman" w:cs="Times New Roman"/>
@@ -4056,7 +4056,7 @@
           </w:tcPr>
           <w:p>
             <w:pPr>
-              <w:spacing w:after="0" w:line="240" w:lineRule="auto"/>
+              <w:spacing w:after="0" w:line="360" w:lineRule="auto"/>
               <w:jc w:val="center"/>
               <w:rPr>
                 <w:rFonts w:ascii="Times New Roman" w:eastAsia="Times New Roman" w:hAnsi="Times New Roman" w:cs="Times New Roman"/>
@@ -4084,7 +4084,7 @@
           </w:tcPr>
           <w:p>
             <w:pPr>
-              <w:spacing w:after="0" w:line="240" w:lineRule="auto"/>
+              <w:spacing w:after="0" w:line="360" w:lineRule="auto"/>
               <w:jc w:val="center"/>
               <w:rPr>
                 <w:rFonts w:ascii="Times New Roman" w:eastAsia="Times New Roman" w:hAnsi="Times New Roman" w:cs="Times New Roman"/>
@@ -4128,7 +4128,7 @@
           </w:tcPr>
           <w:p>
             <w:pPr>
-              <w:spacing w:after="0" w:line="240" w:lineRule="auto"/>
+              <w:spacing w:after="0" w:line="360" w:lineRule="auto"/>
               <w:jc w:val="center"/>
               <w:rPr>
                 <w:rFonts w:ascii="Times New Roman" w:eastAsia="Times New Roman" w:hAnsi="Times New Roman" w:cs="Times New Roman"/>
@@ -4167,7 +4167,7 @@
           </w:tcPr>
           <w:p>
             <w:pPr>
-              <w:spacing w:after="0" w:line="240" w:lineRule="auto"/>
+              <w:spacing w:after="0" w:line="360" w:lineRule="auto"/>
               <w:jc w:val="center"/>
               <w:rPr>
                 <w:rFonts w:ascii="Times New Roman" w:eastAsia="Times New Roman" w:hAnsi="Times New Roman" w:cs="Times New Roman"/>
@@ -4206,7 +4206,7 @@
           </w:tcPr>
           <w:p>
             <w:pPr>
-              <w:spacing w:after="0" w:line="240" w:lineRule="auto"/>
+              <w:spacing w:after="0" w:line="360" w:lineRule="auto"/>
               <w:jc w:val="center"/>
               <w:rPr>
                 <w:rFonts w:ascii="Times New Roman" w:eastAsia="Times New Roman" w:hAnsi="Times New Roman" w:cs="Times New Roman"/>
@@ -4245,7 +4245,7 @@
           </w:tcPr>
           <w:p>
             <w:pPr>
-              <w:spacing w:after="0" w:line="240" w:lineRule="auto"/>
+              <w:spacing w:after="0" w:line="360" w:lineRule="auto"/>
               <w:jc w:val="center"/>
               <w:rPr>
                 <w:rFonts w:ascii="Times New Roman" w:eastAsia="Times New Roman" w:hAnsi="Times New Roman" w:cs="Times New Roman"/>
@@ -4284,7 +4284,7 @@
           </w:tcPr>
           <w:p>
             <w:pPr>
-              <w:spacing w:after="0" w:line="240" w:lineRule="auto"/>
+              <w:spacing w:after="0" w:line="360" w:lineRule="auto"/>
               <w:jc w:val="center"/>
               <w:rPr>
                 <w:rFonts w:ascii="Times New Roman" w:eastAsia="Times New Roman" w:hAnsi="Times New Roman" w:cs="Times New Roman"/>
@@ -4323,7 +4323,7 @@
           </w:tcPr>
           <w:p>
             <w:pPr>
-              <w:spacing w:after="0" w:line="240" w:lineRule="auto"/>
+              <w:spacing w:after="0" w:line="360" w:lineRule="auto"/>
               <w:jc w:val="center"/>
               <w:rPr>
                 <w:rFonts w:ascii="Times New Roman" w:eastAsia="Times New Roman" w:hAnsi="Times New Roman" w:cs="Times New Roman"/>
@@ -4362,7 +4362,7 @@
           </w:tcPr>
           <w:p>
             <w:pPr>
-              <w:spacing w:after="0" w:line="240" w:lineRule="auto"/>
+              <w:spacing w:after="0" w:line="360" w:lineRule="auto"/>
               <w:jc w:val="center"/>
               <w:rPr>
                 <w:rFonts w:ascii="Times New Roman" w:eastAsia="Times New Roman" w:hAnsi="Times New Roman" w:cs="Times New Roman"/>
@@ -4407,7 +4407,7 @@
           </w:tcPr>
           <w:p>
             <w:pPr>
-              <w:spacing w:after="0" w:line="240" w:lineRule="auto"/>
+              <w:spacing w:after="0" w:line="360" w:lineRule="auto"/>
               <w:rPr>
                 <w:rFonts w:ascii="Times New Roman" w:eastAsia="Times New Roman" w:hAnsi="Times New Roman" w:cs="Times New Roman"/>
                 <w:b/>
@@ -4470,7 +4470,7 @@
           </w:tcPr>
           <w:p>
             <w:pPr>
-              <w:spacing w:after="0" w:line="240" w:lineRule="auto"/>
+              <w:spacing w:after="0" w:line="360" w:lineRule="auto"/>
               <w:jc w:val="center"/>
               <w:rPr>
                 <w:rFonts w:ascii="Times New Roman" w:eastAsia="Times New Roman" w:hAnsi="Times New Roman" w:cs="Times New Roman"/>
@@ -4509,7 +4509,7 @@
           </w:tcPr>
           <w:p>
             <w:pPr>
-              <w:spacing w:after="0" w:line="240" w:lineRule="auto"/>
+              <w:spacing w:after="0" w:line="360" w:lineRule="auto"/>
               <w:jc w:val="center"/>
               <w:rPr>
                 <w:rFonts w:ascii="Times New Roman" w:eastAsia="Times New Roman" w:hAnsi="Times New Roman" w:cs="Times New Roman"/>
@@ -4548,7 +4548,7 @@
           </w:tcPr>
           <w:p>
             <w:pPr>
-              <w:spacing w:after="0" w:line="240" w:lineRule="auto"/>
+              <w:spacing w:after="0" w:line="360" w:lineRule="auto"/>
               <w:jc w:val="center"/>
               <w:rPr>
                 <w:rFonts w:ascii="Times New Roman" w:eastAsia="Times New Roman" w:hAnsi="Times New Roman" w:cs="Times New Roman"/>
@@ -4587,7 +4587,7 @@
           </w:tcPr>
           <w:p>
             <w:pPr>
-              <w:spacing w:after="0" w:line="240" w:lineRule="auto"/>
+              <w:spacing w:after="0" w:line="360" w:lineRule="auto"/>
               <w:jc w:val="center"/>
               <w:rPr>
                 <w:rFonts w:ascii="Times New Roman" w:eastAsia="Times New Roman" w:hAnsi="Times New Roman" w:cs="Times New Roman"/>
@@ -4626,7 +4626,7 @@
           </w:tcPr>
           <w:p>
             <w:pPr>
-              <w:spacing w:after="0" w:line="240" w:lineRule="auto"/>
+              <w:spacing w:after="0" w:line="360" w:lineRule="auto"/>
               <w:jc w:val="center"/>
               <w:rPr>
                 <w:rFonts w:ascii="Times New Roman" w:eastAsia="Times New Roman" w:hAnsi="Times New Roman" w:cs="Times New Roman"/>
@@ -4665,7 +4665,7 @@
           </w:tcPr>
           <w:p>
             <w:pPr>
-              <w:spacing w:after="0" w:line="240" w:lineRule="auto"/>
+              <w:spacing w:after="0" w:line="360" w:lineRule="auto"/>
               <w:jc w:val="center"/>
               <w:rPr>
                 <w:rFonts w:ascii="Times New Roman" w:eastAsia="Times New Roman" w:hAnsi="Times New Roman" w:cs="Times New Roman"/>
@@ -4704,7 +4704,7 @@
           </w:tcPr>
           <w:p>
             <w:pPr>
-              <w:spacing w:after="0" w:line="240" w:lineRule="auto"/>
+              <w:spacing w:after="0" w:line="360" w:lineRule="auto"/>
               <w:jc w:val="center"/>
               <w:rPr>
                 <w:rFonts w:ascii="Times New Roman" w:eastAsia="Times New Roman" w:hAnsi="Times New Roman" w:cs="Times New Roman"/>
@@ -4748,34 +4748,34 @@
           </w:tcPr>
           <w:p>
             <w:pPr>
-              <w:spacing w:after="0" w:line="240" w:lineRule="auto"/>
-              <w:rPr>
-                <w:rFonts w:ascii="Times New Roman" w:eastAsia="Times New Roman" w:hAnsi="Times New Roman" w:cs="Times New Roman"/>
-                <w:color w:val="000000"/>
-                <w:kern w:val="0"/>
-                <w:szCs w:val="24"/>
-                <w:lang w:bidi="ar-SA"/>
-                <w14:ligatures w14:val="none"/>
-              </w:rPr>
-            </w:pPr>
-          </w:p>
-        </w:tc>
-        <w:tc>
-          <w:tcPr>
-            <w:tcW w:w="960" w:type="dxa"/>
-            <w:tcBorders>
-              <w:top w:val="nil"/>
-              <w:left w:val="nil"/>
-              <w:bottom w:val="single" w:sz="4" w:space="0" w:color="auto"/>
-              <w:right w:val="single" w:sz="4" w:space="0" w:color="auto"/>
-            </w:tcBorders>
-            <w:noWrap/>
-            <w:vAlign w:val="center"/>
-            <w:hideMark/>
-          </w:tcPr>
-          <w:p>
-            <w:pPr>
-              <w:spacing w:after="0" w:line="240" w:lineRule="auto"/>
+              <w:spacing w:after="0" w:line="360" w:lineRule="auto"/>
+              <w:rPr>
+                <w:rFonts w:ascii="Times New Roman" w:eastAsia="Times New Roman" w:hAnsi="Times New Roman" w:cs="Times New Roman"/>
+                <w:color w:val="000000"/>
+                <w:kern w:val="0"/>
+                <w:szCs w:val="24"/>
+                <w:lang w:bidi="ar-SA"/>
+                <w14:ligatures w14:val="none"/>
+              </w:rPr>
+            </w:pPr>
+          </w:p>
+        </w:tc>
+        <w:tc>
+          <w:tcPr>
+            <w:tcW w:w="960" w:type="dxa"/>
+            <w:tcBorders>
+              <w:top w:val="nil"/>
+              <w:left w:val="nil"/>
+              <w:bottom w:val="single" w:sz="4" w:space="0" w:color="auto"/>
+              <w:right w:val="single" w:sz="4" w:space="0" w:color="auto"/>
+            </w:tcBorders>
+            <w:noWrap/>
+            <w:vAlign w:val="center"/>
+            <w:hideMark/>
+          </w:tcPr>
+          <w:p>
+            <w:pPr>
+              <w:spacing w:after="0" w:line="360" w:lineRule="auto"/>
               <w:jc w:val="center"/>
               <w:rPr>
                 <w:rFonts w:ascii="Times New Roman" w:eastAsia="Times New Roman" w:hAnsi="Times New Roman" w:cs="Times New Roman"/>
@@ -4814,7 +4814,7 @@
           </w:tcPr>
           <w:p>
             <w:pPr>
-              <w:spacing w:after="0" w:line="240" w:lineRule="auto"/>
+              <w:spacing w:after="0" w:line="360" w:lineRule="auto"/>
               <w:jc w:val="center"/>
               <w:rPr>
                 <w:rFonts w:ascii="Times New Roman" w:eastAsia="Times New Roman" w:hAnsi="Times New Roman" w:cs="Times New Roman"/>
@@ -4853,7 +4853,7 @@
           </w:tcPr>
           <w:p>
             <w:pPr>
-              <w:spacing w:after="0" w:line="240" w:lineRule="auto"/>
+              <w:spacing w:after="0" w:line="360" w:lineRule="auto"/>
               <w:rPr>
                 <w:rFonts w:ascii="Times New Roman" w:eastAsia="Times New Roman" w:hAnsi="Times New Roman" w:cs="Times New Roman"/>
                 <w:color w:val="000000"/>
@@ -4891,7 +4891,7 @@
           </w:tcPr>
           <w:p>
             <w:pPr>
-              <w:spacing w:after="0" w:line="240" w:lineRule="auto"/>
+              <w:spacing w:after="0" w:line="360" w:lineRule="auto"/>
               <w:rPr>
                 <w:rFonts w:ascii="Times New Roman" w:eastAsia="Times New Roman" w:hAnsi="Times New Roman" w:cs="Times New Roman"/>
                 <w:color w:val="000000"/>
@@ -4929,7 +4929,7 @@
           </w:tcPr>
           <w:p>
             <w:pPr>
-              <w:spacing w:after="0" w:line="240" w:lineRule="auto"/>
+              <w:spacing w:after="0" w:line="360" w:lineRule="auto"/>
               <w:rPr>
                 <w:rFonts w:ascii="Times New Roman" w:eastAsia="Times New Roman" w:hAnsi="Times New Roman" w:cs="Times New Roman"/>
                 <w:color w:val="000000"/>
@@ -4967,7 +4967,7 @@
           </w:tcPr>
           <w:p>
             <w:pPr>
-              <w:spacing w:after="0" w:line="240" w:lineRule="auto"/>
+              <w:spacing w:after="0" w:line="360" w:lineRule="auto"/>
               <w:jc w:val="center"/>
               <w:rPr>
                 <w:rFonts w:ascii="Times New Roman" w:eastAsia="Times New Roman" w:hAnsi="Times New Roman" w:cs="Times New Roman"/>
@@ -5011,7 +5011,7 @@
           </w:tcPr>
           <w:p>
             <w:pPr>
-              <w:spacing w:after="0" w:line="240" w:lineRule="auto"/>
+              <w:spacing w:after="0" w:line="360" w:lineRule="auto"/>
               <w:jc w:val="center"/>
               <w:rPr>
                 <w:rFonts w:ascii="Times New Roman" w:eastAsia="Times New Roman" w:hAnsi="Times New Roman" w:cs="Times New Roman"/>
@@ -5050,7 +5050,7 @@
           </w:tcPr>
           <w:p>
             <w:pPr>
-              <w:spacing w:after="0" w:line="240" w:lineRule="auto"/>
+              <w:spacing w:after="0" w:line="360" w:lineRule="auto"/>
               <w:jc w:val="center"/>
               <w:rPr>
                 <w:rFonts w:ascii="Times New Roman" w:eastAsia="Times New Roman" w:hAnsi="Times New Roman" w:cs="Times New Roman"/>
@@ -5089,7 +5089,7 @@
           </w:tcPr>
           <w:p>
             <w:pPr>
-              <w:spacing w:after="0" w:line="240" w:lineRule="auto"/>
+              <w:spacing w:after="0" w:line="360" w:lineRule="auto"/>
               <w:jc w:val="center"/>
               <w:rPr>
                 <w:rFonts w:ascii="Times New Roman" w:eastAsia="Times New Roman" w:hAnsi="Times New Roman" w:cs="Times New Roman"/>
@@ -5128,7 +5128,7 @@
           </w:tcPr>
           <w:p>
             <w:pPr>
-              <w:spacing w:after="0" w:line="240" w:lineRule="auto"/>
+              <w:spacing w:after="0" w:line="360" w:lineRule="auto"/>
               <w:jc w:val="center"/>
               <w:rPr>
                 <w:rFonts w:ascii="Times New Roman" w:eastAsia="Times New Roman" w:hAnsi="Times New Roman" w:cs="Times New Roman"/>
@@ -5167,7 +5167,7 @@
           </w:tcPr>
           <w:p>
             <w:pPr>
-              <w:spacing w:after="0" w:line="240" w:lineRule="auto"/>
+              <w:spacing w:after="0" w:line="360" w:lineRule="auto"/>
               <w:jc w:val="center"/>
               <w:rPr>
                 <w:rFonts w:ascii="Times New Roman" w:eastAsia="Times New Roman" w:hAnsi="Times New Roman" w:cs="Times New Roman"/>
@@ -5206,7 +5206,7 @@
           </w:tcPr>
           <w:p>
             <w:pPr>
-              <w:spacing w:after="0" w:line="240" w:lineRule="auto"/>
+              <w:spacing w:after="0" w:line="360" w:lineRule="auto"/>
               <w:jc w:val="center"/>
               <w:rPr>
                 <w:rFonts w:ascii="Times New Roman" w:eastAsia="Times New Roman" w:hAnsi="Times New Roman" w:cs="Times New Roman"/>
@@ -5245,7 +5245,7 @@
           </w:tcPr>
           <w:p>
             <w:pPr>
-              <w:spacing w:after="0" w:line="240" w:lineRule="auto"/>
+              <w:spacing w:after="0" w:line="360" w:lineRule="auto"/>
               <w:jc w:val="center"/>
               <w:rPr>
                 <w:rFonts w:ascii="Times New Roman" w:eastAsia="Times New Roman" w:hAnsi="Times New Roman" w:cs="Times New Roman"/>
@@ -5290,7 +5290,7 @@
           </w:tcPr>
           <w:p>
             <w:pPr>
-              <w:spacing w:after="0" w:line="240" w:lineRule="auto"/>
+              <w:spacing w:after="0" w:line="360" w:lineRule="auto"/>
               <w:rPr>
                 <w:rFonts w:ascii="Times New Roman" w:eastAsia="Times New Roman" w:hAnsi="Times New Roman" w:cs="Times New Roman"/>
                 <w:b/>
@@ -5353,7 +5353,7 @@
           </w:tcPr>
           <w:p>
             <w:pPr>
-              <w:spacing w:after="0" w:line="240" w:lineRule="auto"/>
+              <w:spacing w:after="0" w:line="360" w:lineRule="auto"/>
               <w:jc w:val="center"/>
               <w:rPr>
                 <w:rFonts w:ascii="Times New Roman" w:eastAsia="Times New Roman" w:hAnsi="Times New Roman" w:cs="Times New Roman"/>
@@ -5392,7 +5392,7 @@
           </w:tcPr>
           <w:p>
             <w:pPr>
-              <w:spacing w:after="0" w:line="240" w:lineRule="auto"/>
+              <w:spacing w:after="0" w:line="360" w:lineRule="auto"/>
               <w:jc w:val="center"/>
               <w:rPr>
                 <w:rFonts w:ascii="Times New Roman" w:eastAsia="Times New Roman" w:hAnsi="Times New Roman" w:cs="Times New Roman"/>
@@ -5431,7 +5431,7 @@
           </w:tcPr>
           <w:p>
             <w:pPr>
-              <w:spacing w:after="0" w:line="240" w:lineRule="auto"/>
+              <w:spacing w:after="0" w:line="360" w:lineRule="auto"/>
               <w:jc w:val="center"/>
               <w:rPr>
                 <w:rFonts w:ascii="Times New Roman" w:eastAsia="Times New Roman" w:hAnsi="Times New Roman" w:cs="Times New Roman"/>
@@ -5470,7 +5470,7 @@
           </w:tcPr>
           <w:p>
             <w:pPr>
-              <w:spacing w:after="0" w:line="240" w:lineRule="auto"/>
+              <w:spacing w:after="0" w:line="360" w:lineRule="auto"/>
               <w:jc w:val="center"/>
               <w:rPr>
                 <w:rFonts w:ascii="Times New Roman" w:eastAsia="Times New Roman" w:hAnsi="Times New Roman" w:cs="Times New Roman"/>
@@ -5509,7 +5509,7 @@
           </w:tcPr>
           <w:p>
             <w:pPr>
-              <w:spacing w:after="0" w:line="240" w:lineRule="auto"/>
+              <w:spacing w:after="0" w:line="360" w:lineRule="auto"/>
               <w:jc w:val="center"/>
               <w:rPr>
                 <w:rFonts w:ascii="Times New Roman" w:eastAsia="Times New Roman" w:hAnsi="Times New Roman" w:cs="Times New Roman"/>
@@ -5548,7 +5548,7 @@
           </w:tcPr>
           <w:p>
             <w:pPr>
-              <w:spacing w:after="0" w:line="240" w:lineRule="auto"/>
+              <w:spacing w:after="0" w:line="360" w:lineRule="auto"/>
               <w:jc w:val="center"/>
               <w:rPr>
                 <w:rFonts w:ascii="Times New Roman" w:eastAsia="Times New Roman" w:hAnsi="Times New Roman" w:cs="Times New Roman"/>
@@ -5587,7 +5587,7 @@
           </w:tcPr>
           <w:p>
             <w:pPr>
-              <w:spacing w:after="0" w:line="240" w:lineRule="auto"/>
+              <w:spacing w:after="0" w:line="360" w:lineRule="auto"/>
               <w:jc w:val="center"/>
               <w:rPr>
                 <w:rFonts w:ascii="Times New Roman" w:eastAsia="Times New Roman" w:hAnsi="Times New Roman" w:cs="Times New Roman"/>
@@ -5631,34 +5631,34 @@
           </w:tcPr>
           <w:p>
             <w:pPr>
-              <w:spacing w:after="0" w:line="240" w:lineRule="auto"/>
-              <w:rPr>
-                <w:rFonts w:ascii="Times New Roman" w:eastAsia="Times New Roman" w:hAnsi="Times New Roman" w:cs="Times New Roman"/>
-                <w:color w:val="000000"/>
-                <w:kern w:val="0"/>
-                <w:szCs w:val="24"/>
-                <w:lang w:bidi="ar-SA"/>
-                <w14:ligatures w14:val="none"/>
-              </w:rPr>
-            </w:pPr>
-          </w:p>
-        </w:tc>
-        <w:tc>
-          <w:tcPr>
-            <w:tcW w:w="960" w:type="dxa"/>
-            <w:tcBorders>
-              <w:top w:val="nil"/>
-              <w:left w:val="nil"/>
-              <w:bottom w:val="single" w:sz="4" w:space="0" w:color="auto"/>
-              <w:right w:val="single" w:sz="4" w:space="0" w:color="auto"/>
-            </w:tcBorders>
-            <w:noWrap/>
-            <w:vAlign w:val="center"/>
-            <w:hideMark/>
-          </w:tcPr>
-          <w:p>
-            <w:pPr>
-              <w:spacing w:after="0" w:line="240" w:lineRule="auto"/>
+              <w:spacing w:after="0" w:line="360" w:lineRule="auto"/>
+              <w:rPr>
+                <w:rFonts w:ascii="Times New Roman" w:eastAsia="Times New Roman" w:hAnsi="Times New Roman" w:cs="Times New Roman"/>
+                <w:color w:val="000000"/>
+                <w:kern w:val="0"/>
+                <w:szCs w:val="24"/>
+                <w:lang w:bidi="ar-SA"/>
+                <w14:ligatures w14:val="none"/>
+              </w:rPr>
+            </w:pPr>
+          </w:p>
+        </w:tc>
+        <w:tc>
+          <w:tcPr>
+            <w:tcW w:w="960" w:type="dxa"/>
+            <w:tcBorders>
+              <w:top w:val="nil"/>
+              <w:left w:val="nil"/>
+              <w:bottom w:val="single" w:sz="4" w:space="0" w:color="auto"/>
+              <w:right w:val="single" w:sz="4" w:space="0" w:color="auto"/>
+            </w:tcBorders>
+            <w:noWrap/>
+            <w:vAlign w:val="center"/>
+            <w:hideMark/>
+          </w:tcPr>
+          <w:p>
+            <w:pPr>
+              <w:spacing w:after="0" w:line="360" w:lineRule="auto"/>
               <w:jc w:val="center"/>
               <w:rPr>
                 <w:rFonts w:ascii="Times New Roman" w:eastAsia="Times New Roman" w:hAnsi="Times New Roman" w:cs="Times New Roman"/>
@@ -5697,7 +5697,7 @@
           </w:tcPr>
           <w:p>
             <w:pPr>
-              <w:spacing w:after="0" w:line="240" w:lineRule="auto"/>
+              <w:spacing w:after="0" w:line="360" w:lineRule="auto"/>
               <w:jc w:val="center"/>
               <w:rPr>
                 <w:rFonts w:ascii="Times New Roman" w:eastAsia="Times New Roman" w:hAnsi="Times New Roman" w:cs="Times New Roman"/>
@@ -5736,7 +5736,7 @@
           </w:tcPr>
           <w:p>
             <w:pPr>
-              <w:spacing w:after="0" w:line="240" w:lineRule="auto"/>
+              <w:spacing w:after="0" w:line="360" w:lineRule="auto"/>
               <w:rPr>
                 <w:rFonts w:ascii="Times New Roman" w:eastAsia="Times New Roman" w:hAnsi="Times New Roman" w:cs="Times New Roman"/>
                 <w:color w:val="000000"/>
@@ -5774,7 +5774,7 @@
           </w:tcPr>
           <w:p>
             <w:pPr>
-              <w:spacing w:after="0" w:line="240" w:lineRule="auto"/>
+              <w:spacing w:after="0" w:line="360" w:lineRule="auto"/>
               <w:rPr>
                 <w:rFonts w:ascii="Times New Roman" w:eastAsia="Times New Roman" w:hAnsi="Times New Roman" w:cs="Times New Roman"/>
                 <w:color w:val="000000"/>
@@ -5812,7 +5812,7 @@
           </w:tcPr>
           <w:p>
             <w:pPr>
-              <w:spacing w:after="0" w:line="240" w:lineRule="auto"/>
+              <w:spacing w:after="0" w:line="360" w:lineRule="auto"/>
               <w:rPr>
                 <w:rFonts w:ascii="Times New Roman" w:eastAsia="Times New Roman" w:hAnsi="Times New Roman" w:cs="Times New Roman"/>
                 <w:color w:val="000000"/>
@@ -5850,7 +5850,7 @@
           </w:tcPr>
           <w:p>
             <w:pPr>
-              <w:spacing w:after="0" w:line="240" w:lineRule="auto"/>
+              <w:spacing w:after="0" w:line="360" w:lineRule="auto"/>
               <w:jc w:val="center"/>
               <w:rPr>
                 <w:rFonts w:ascii="Times New Roman" w:eastAsia="Times New Roman" w:hAnsi="Times New Roman" w:cs="Times New Roman"/>
@@ -5894,7 +5894,7 @@
           </w:tcPr>
           <w:p>
             <w:pPr>
-              <w:spacing w:after="0" w:line="240" w:lineRule="auto"/>
+              <w:spacing w:after="0" w:line="360" w:lineRule="auto"/>
               <w:jc w:val="center"/>
               <w:rPr>
                 <w:rFonts w:ascii="Times New Roman" w:eastAsia="Times New Roman" w:hAnsi="Times New Roman" w:cs="Times New Roman"/>
@@ -5933,7 +5933,7 @@
           </w:tcPr>
           <w:p>
             <w:pPr>
-              <w:spacing w:after="0" w:line="240" w:lineRule="auto"/>
+              <w:spacing w:after="0" w:line="360" w:lineRule="auto"/>
               <w:jc w:val="center"/>
               <w:rPr>
                 <w:rFonts w:ascii="Times New Roman" w:eastAsia="Times New Roman" w:hAnsi="Times New Roman" w:cs="Times New Roman"/>
@@ -5972,7 +5972,7 @@
           </w:tcPr>
           <w:p>
             <w:pPr>
-              <w:spacing w:after="0" w:line="240" w:lineRule="auto"/>
+              <w:spacing w:after="0" w:line="360" w:lineRule="auto"/>
               <w:jc w:val="center"/>
               <w:rPr>
                 <w:rFonts w:ascii="Times New Roman" w:eastAsia="Times New Roman" w:hAnsi="Times New Roman" w:cs="Times New Roman"/>
@@ -6011,7 +6011,7 @@
           </w:tcPr>
           <w:p>
             <w:pPr>
-              <w:spacing w:after="0" w:line="240" w:lineRule="auto"/>
+              <w:spacing w:after="0" w:line="360" w:lineRule="auto"/>
               <w:jc w:val="center"/>
               <w:rPr>
                 <w:rFonts w:ascii="Times New Roman" w:eastAsia="Times New Roman" w:hAnsi="Times New Roman" w:cs="Times New Roman"/>
@@ -6050,7 +6050,7 @@
           </w:tcPr>
           <w:p>
             <w:pPr>
-              <w:spacing w:after="0" w:line="240" w:lineRule="auto"/>
+              <w:spacing w:after="0" w:line="360" w:lineRule="auto"/>
               <w:jc w:val="center"/>
               <w:rPr>
                 <w:rFonts w:ascii="Times New Roman" w:eastAsia="Times New Roman" w:hAnsi="Times New Roman" w:cs="Times New Roman"/>
@@ -6089,7 +6089,7 @@
           </w:tcPr>
           <w:p>
             <w:pPr>
-              <w:spacing w:after="0" w:line="240" w:lineRule="auto"/>
+              <w:spacing w:after="0" w:line="360" w:lineRule="auto"/>
               <w:jc w:val="center"/>
               <w:rPr>
                 <w:rFonts w:ascii="Times New Roman" w:eastAsia="Times New Roman" w:hAnsi="Times New Roman" w:cs="Times New Roman"/>
@@ -6128,7 +6128,7 @@
           </w:tcPr>
           <w:p>
             <w:pPr>
-              <w:spacing w:after="0" w:line="240" w:lineRule="auto"/>
+              <w:spacing w:after="0" w:line="360" w:lineRule="auto"/>
               <w:jc w:val="center"/>
               <w:rPr>
                 <w:rFonts w:ascii="Times New Roman" w:eastAsia="Times New Roman" w:hAnsi="Times New Roman" w:cs="Times New Roman"/>
@@ -6164,6 +6164,1865 @@
     </w:p>
     <w:p>
       <w:pPr>
+        <w:spacing w:line="360" w:lineRule="auto"/>
+        <w:jc w:val="both"/>
+        <w:rPr>
+          <w:rFonts w:ascii="Times New Roman" w:hAnsi="Times New Roman" w:cs="Times New Roman"/>
+          <w:b/>
+          <w:bCs/>
+          <w:szCs w:val="24"/>
+        </w:rPr>
+      </w:pPr>
+    </w:p>
+    <w:p>
+      <w:pPr>
+        <w:spacing w:line="360" w:lineRule="auto"/>
+        <w:jc w:val="both"/>
+        <w:rPr>
+          <w:rFonts w:ascii="Times New Roman" w:hAnsi="Times New Roman" w:cs="Times New Roman"/>
+          <w:b/>
+          <w:bCs/>
+          <w:szCs w:val="24"/>
+        </w:rPr>
+      </w:pPr>
+    </w:p>
+    <w:p>
+      <w:pPr>
+        <w:spacing w:line="360" w:lineRule="auto"/>
+        <w:jc w:val="both"/>
+        <w:rPr>
+          <w:rFonts w:ascii="Times New Roman" w:hAnsi="Times New Roman" w:cs="Times New Roman"/>
+          <w:b/>
+          <w:bCs/>
+          <w:szCs w:val="24"/>
+        </w:rPr>
+      </w:pPr>
+    </w:p>
+    <w:p>
+      <w:pPr>
+        <w:spacing w:line="360" w:lineRule="auto"/>
+        <w:jc w:val="both"/>
+        <w:rPr>
+          <w:rFonts w:ascii="Times New Roman" w:hAnsi="Times New Roman" w:cs="Times New Roman"/>
+          <w:b/>
+          <w:bCs/>
+          <w:szCs w:val="24"/>
+        </w:rPr>
+      </w:pPr>
+      <w:proofErr w:type="spellStart"/>
+      <w:r>
+        <w:rPr>
+          <w:rFonts w:ascii="Times New Roman" w:hAnsi="Times New Roman" w:cs="Times New Roman"/>
+          <w:b/>
+          <w:bCs/>
+          <w:szCs w:val="24"/>
+        </w:rPr>
+        <w:lastRenderedPageBreak/>
+        <w:t>Analisis</w:t>
+      </w:r>
+      <w:proofErr w:type="spellEnd"/>
+      <w:r>
+        <w:rPr>
+          <w:rFonts w:ascii="Times New Roman" w:hAnsi="Times New Roman" w:cs="Times New Roman"/>
+          <w:b/>
+          <w:bCs/>
+          <w:szCs w:val="24"/>
+        </w:rPr>
+        <w:t xml:space="preserve"> Tabel </w:t>
+      </w:r>
+      <w:proofErr w:type="spellStart"/>
+      <w:r>
+        <w:rPr>
+          <w:rFonts w:ascii="Times New Roman" w:hAnsi="Times New Roman" w:cs="Times New Roman"/>
+          <w:b/>
+          <w:bCs/>
+          <w:szCs w:val="24"/>
+        </w:rPr>
+        <w:t>Simulasi</w:t>
+      </w:r>
+      <w:proofErr w:type="spellEnd"/>
+      <w:r>
+        <w:rPr>
+          <w:rFonts w:ascii="Times New Roman" w:hAnsi="Times New Roman" w:cs="Times New Roman"/>
+          <w:b/>
+          <w:bCs/>
+          <w:szCs w:val="24"/>
+        </w:rPr>
+        <w:t xml:space="preserve"> Quick Sort</w:t>
+      </w:r>
+    </w:p>
+    <w:p>
+      <w:pPr>
+        <w:spacing w:line="360" w:lineRule="auto"/>
+        <w:jc w:val="both"/>
+        <w:rPr>
+          <w:rFonts w:ascii="Times New Roman" w:hAnsi="Times New Roman" w:cs="Times New Roman"/>
+          <w:szCs w:val="24"/>
+        </w:rPr>
+      </w:pPr>
+      <w:r>
+        <w:rPr>
+          <w:rFonts w:ascii="Times New Roman" w:hAnsi="Times New Roman" w:cs="Times New Roman"/>
+          <w:szCs w:val="24"/>
+        </w:rPr>
+        <w:t xml:space="preserve">Tabel </w:t>
+      </w:r>
+      <w:proofErr w:type="spellStart"/>
+      <w:r>
+        <w:rPr>
+          <w:rFonts w:ascii="Times New Roman" w:hAnsi="Times New Roman" w:cs="Times New Roman"/>
+          <w:szCs w:val="24"/>
+        </w:rPr>
+        <w:t>tersebut</w:t>
+      </w:r>
+      <w:proofErr w:type="spellEnd"/>
+      <w:r>
+        <w:rPr>
+          <w:rFonts w:ascii="Times New Roman" w:hAnsi="Times New Roman" w:cs="Times New Roman"/>
+          <w:szCs w:val="24"/>
+        </w:rPr>
+        <w:t xml:space="preserve"> </w:t>
+      </w:r>
+      <w:proofErr w:type="spellStart"/>
+      <w:r>
+        <w:rPr>
+          <w:rFonts w:ascii="Times New Roman" w:hAnsi="Times New Roman" w:cs="Times New Roman"/>
+          <w:szCs w:val="24"/>
+        </w:rPr>
+        <w:t>mendokumentasikan</w:t>
+      </w:r>
+      <w:proofErr w:type="spellEnd"/>
+      <w:r>
+        <w:rPr>
+          <w:rFonts w:ascii="Times New Roman" w:hAnsi="Times New Roman" w:cs="Times New Roman"/>
+          <w:szCs w:val="24"/>
+        </w:rPr>
+        <w:t xml:space="preserve"> proses </w:t>
+      </w:r>
+      <w:proofErr w:type="spellStart"/>
+      <w:r>
+        <w:rPr>
+          <w:rFonts w:ascii="Times New Roman" w:hAnsi="Times New Roman" w:cs="Times New Roman"/>
+          <w:szCs w:val="24"/>
+        </w:rPr>
+        <w:t>pengurutan</w:t>
+      </w:r>
+      <w:proofErr w:type="spellEnd"/>
+      <w:r>
+        <w:rPr>
+          <w:rFonts w:ascii="Times New Roman" w:hAnsi="Times New Roman" w:cs="Times New Roman"/>
+          <w:szCs w:val="24"/>
+        </w:rPr>
+        <w:t xml:space="preserve"> array [22, 10, 15, 3, 8, 2] </w:t>
+      </w:r>
+      <w:proofErr w:type="spellStart"/>
+      <w:r>
+        <w:rPr>
+          <w:rFonts w:ascii="Times New Roman" w:hAnsi="Times New Roman" w:cs="Times New Roman"/>
+          <w:szCs w:val="24"/>
+        </w:rPr>
+        <w:t>menggunakan</w:t>
+      </w:r>
+      <w:proofErr w:type="spellEnd"/>
+      <w:r>
+        <w:rPr>
+          <w:rFonts w:ascii="Times New Roman" w:hAnsi="Times New Roman" w:cs="Times New Roman"/>
+          <w:szCs w:val="24"/>
+        </w:rPr>
+        <w:t xml:space="preserve"> </w:t>
+      </w:r>
+      <w:proofErr w:type="spellStart"/>
+      <w:r>
+        <w:rPr>
+          <w:rFonts w:ascii="Times New Roman" w:hAnsi="Times New Roman" w:cs="Times New Roman"/>
+          <w:szCs w:val="24"/>
+        </w:rPr>
+        <w:t>metode</w:t>
+      </w:r>
+      <w:proofErr w:type="spellEnd"/>
+      <w:r>
+        <w:rPr>
+          <w:rFonts w:ascii="Times New Roman" w:hAnsi="Times New Roman" w:cs="Times New Roman"/>
+          <w:szCs w:val="24"/>
+        </w:rPr>
+        <w:t xml:space="preserve"> </w:t>
+      </w:r>
+      <w:proofErr w:type="spellStart"/>
+      <w:r>
+        <w:rPr>
+          <w:rFonts w:ascii="Times New Roman" w:hAnsi="Times New Roman" w:cs="Times New Roman"/>
+          <w:szCs w:val="24"/>
+        </w:rPr>
+        <w:t>partisi</w:t>
+      </w:r>
+      <w:proofErr w:type="spellEnd"/>
+      <w:r>
+        <w:rPr>
+          <w:rFonts w:ascii="Times New Roman" w:hAnsi="Times New Roman" w:cs="Times New Roman"/>
+          <w:szCs w:val="24"/>
+        </w:rPr>
+        <w:t xml:space="preserve">. </w:t>
+      </w:r>
+      <w:proofErr w:type="spellStart"/>
+      <w:r>
+        <w:rPr>
+          <w:rFonts w:ascii="Times New Roman" w:hAnsi="Times New Roman" w:cs="Times New Roman"/>
+          <w:szCs w:val="24"/>
+        </w:rPr>
+        <w:t>Berikut</w:t>
+      </w:r>
+      <w:proofErr w:type="spellEnd"/>
+      <w:r>
+        <w:rPr>
+          <w:rFonts w:ascii="Times New Roman" w:hAnsi="Times New Roman" w:cs="Times New Roman"/>
+          <w:szCs w:val="24"/>
+        </w:rPr>
+        <w:t xml:space="preserve"> </w:t>
+      </w:r>
+      <w:proofErr w:type="spellStart"/>
+      <w:r>
+        <w:rPr>
+          <w:rFonts w:ascii="Times New Roman" w:hAnsi="Times New Roman" w:cs="Times New Roman"/>
+          <w:szCs w:val="24"/>
+        </w:rPr>
+        <w:t>poin-poin</w:t>
+      </w:r>
+      <w:proofErr w:type="spellEnd"/>
+      <w:r>
+        <w:rPr>
+          <w:rFonts w:ascii="Times New Roman" w:hAnsi="Times New Roman" w:cs="Times New Roman"/>
+          <w:szCs w:val="24"/>
+        </w:rPr>
+        <w:t xml:space="preserve"> </w:t>
+      </w:r>
+      <w:proofErr w:type="spellStart"/>
+      <w:r>
+        <w:rPr>
+          <w:rFonts w:ascii="Times New Roman" w:hAnsi="Times New Roman" w:cs="Times New Roman"/>
+          <w:szCs w:val="24"/>
+        </w:rPr>
+        <w:t>penjelasannya</w:t>
+      </w:r>
+      <w:proofErr w:type="spellEnd"/>
+      <w:r>
+        <w:rPr>
+          <w:rFonts w:ascii="Times New Roman" w:hAnsi="Times New Roman" w:cs="Times New Roman"/>
+          <w:szCs w:val="24"/>
+        </w:rPr>
+        <w:t>:</w:t>
+      </w:r>
+    </w:p>
+    <w:p>
+      <w:pPr>
+        <w:numPr>
+          <w:ilvl w:val="0"/>
+          <w:numId w:val="4"/>
+        </w:numPr>
+        <w:spacing w:line="360" w:lineRule="auto"/>
+        <w:jc w:val="both"/>
+        <w:rPr>
+          <w:rFonts w:ascii="Times New Roman" w:hAnsi="Times New Roman" w:cs="Times New Roman"/>
+          <w:szCs w:val="24"/>
+        </w:rPr>
+      </w:pPr>
+      <w:proofErr w:type="spellStart"/>
+      <w:r>
+        <w:rPr>
+          <w:rFonts w:ascii="Times New Roman" w:hAnsi="Times New Roman" w:cs="Times New Roman"/>
+          <w:b/>
+          <w:bCs/>
+          <w:szCs w:val="24"/>
+        </w:rPr>
+        <w:t>Fungsi</w:t>
+      </w:r>
+      <w:proofErr w:type="spellEnd"/>
+      <w:r>
+        <w:rPr>
+          <w:rFonts w:ascii="Times New Roman" w:hAnsi="Times New Roman" w:cs="Times New Roman"/>
+          <w:b/>
+          <w:bCs/>
+          <w:szCs w:val="24"/>
+        </w:rPr>
+        <w:t xml:space="preserve"> LB dan UB</w:t>
+      </w:r>
+      <w:r>
+        <w:rPr>
+          <w:rFonts w:ascii="Times New Roman" w:hAnsi="Times New Roman" w:cs="Times New Roman"/>
+          <w:szCs w:val="24"/>
+        </w:rPr>
+        <w:t xml:space="preserve">: LB (Lower Bound) </w:t>
+      </w:r>
+      <w:proofErr w:type="spellStart"/>
+      <w:r>
+        <w:rPr>
+          <w:rFonts w:ascii="Times New Roman" w:hAnsi="Times New Roman" w:cs="Times New Roman"/>
+          <w:szCs w:val="24"/>
+        </w:rPr>
+        <w:t>menandakan</w:t>
+      </w:r>
+      <w:proofErr w:type="spellEnd"/>
+      <w:r>
+        <w:rPr>
+          <w:rFonts w:ascii="Times New Roman" w:hAnsi="Times New Roman" w:cs="Times New Roman"/>
+          <w:szCs w:val="24"/>
+        </w:rPr>
+        <w:t xml:space="preserve"> batas </w:t>
+      </w:r>
+      <w:proofErr w:type="spellStart"/>
+      <w:r>
+        <w:rPr>
+          <w:rFonts w:ascii="Times New Roman" w:hAnsi="Times New Roman" w:cs="Times New Roman"/>
+          <w:szCs w:val="24"/>
+        </w:rPr>
+        <w:t>awal</w:t>
+      </w:r>
+      <w:proofErr w:type="spellEnd"/>
+      <w:r>
+        <w:rPr>
+          <w:rFonts w:ascii="Times New Roman" w:hAnsi="Times New Roman" w:cs="Times New Roman"/>
+          <w:szCs w:val="24"/>
+        </w:rPr>
+        <w:t xml:space="preserve"> sub-array yang </w:t>
+      </w:r>
+      <w:proofErr w:type="spellStart"/>
+      <w:r>
+        <w:rPr>
+          <w:rFonts w:ascii="Times New Roman" w:hAnsi="Times New Roman" w:cs="Times New Roman"/>
+          <w:szCs w:val="24"/>
+        </w:rPr>
+        <w:t>sedang</w:t>
+      </w:r>
+      <w:proofErr w:type="spellEnd"/>
+      <w:r>
+        <w:rPr>
+          <w:rFonts w:ascii="Times New Roman" w:hAnsi="Times New Roman" w:cs="Times New Roman"/>
+          <w:szCs w:val="24"/>
+        </w:rPr>
+        <w:t xml:space="preserve"> </w:t>
+      </w:r>
+      <w:proofErr w:type="spellStart"/>
+      <w:r>
+        <w:rPr>
+          <w:rFonts w:ascii="Times New Roman" w:hAnsi="Times New Roman" w:cs="Times New Roman"/>
+          <w:szCs w:val="24"/>
+        </w:rPr>
+        <w:t>diproses</w:t>
+      </w:r>
+      <w:proofErr w:type="spellEnd"/>
+      <w:r>
+        <w:rPr>
+          <w:rFonts w:ascii="Times New Roman" w:hAnsi="Times New Roman" w:cs="Times New Roman"/>
+          <w:szCs w:val="24"/>
+        </w:rPr>
+        <w:t xml:space="preserve">, </w:t>
+      </w:r>
+      <w:proofErr w:type="spellStart"/>
+      <w:r>
+        <w:rPr>
+          <w:rFonts w:ascii="Times New Roman" w:hAnsi="Times New Roman" w:cs="Times New Roman"/>
+          <w:szCs w:val="24"/>
+        </w:rPr>
+        <w:t>sedangkan</w:t>
+      </w:r>
+      <w:proofErr w:type="spellEnd"/>
+      <w:r>
+        <w:rPr>
+          <w:rFonts w:ascii="Times New Roman" w:hAnsi="Times New Roman" w:cs="Times New Roman"/>
+          <w:szCs w:val="24"/>
+        </w:rPr>
+        <w:t xml:space="preserve"> UB (Upper Bound) </w:t>
+      </w:r>
+      <w:proofErr w:type="spellStart"/>
+      <w:r>
+        <w:rPr>
+          <w:rFonts w:ascii="Times New Roman" w:hAnsi="Times New Roman" w:cs="Times New Roman"/>
+          <w:szCs w:val="24"/>
+        </w:rPr>
+        <w:t>adalah</w:t>
+      </w:r>
+      <w:proofErr w:type="spellEnd"/>
+      <w:r>
+        <w:rPr>
+          <w:rFonts w:ascii="Times New Roman" w:hAnsi="Times New Roman" w:cs="Times New Roman"/>
+          <w:szCs w:val="24"/>
+        </w:rPr>
+        <w:t xml:space="preserve"> batas </w:t>
+      </w:r>
+      <w:proofErr w:type="spellStart"/>
+      <w:r>
+        <w:rPr>
+          <w:rFonts w:ascii="Times New Roman" w:hAnsi="Times New Roman" w:cs="Times New Roman"/>
+          <w:szCs w:val="24"/>
+        </w:rPr>
+        <w:t>akhirnya</w:t>
+      </w:r>
+      <w:proofErr w:type="spellEnd"/>
+      <w:r>
+        <w:rPr>
+          <w:rFonts w:ascii="Times New Roman" w:hAnsi="Times New Roman" w:cs="Times New Roman"/>
+          <w:szCs w:val="24"/>
+        </w:rPr>
+        <w:t>.</w:t>
+      </w:r>
+    </w:p>
+    <w:p>
+      <w:pPr>
+        <w:numPr>
+          <w:ilvl w:val="0"/>
+          <w:numId w:val="4"/>
+        </w:numPr>
+        <w:spacing w:line="360" w:lineRule="auto"/>
+        <w:jc w:val="both"/>
+        <w:rPr>
+          <w:rFonts w:ascii="Times New Roman" w:hAnsi="Times New Roman" w:cs="Times New Roman"/>
+          <w:szCs w:val="24"/>
+        </w:rPr>
+      </w:pPr>
+      <w:r>
+        <w:rPr>
+          <w:rFonts w:ascii="Times New Roman" w:hAnsi="Times New Roman" w:cs="Times New Roman"/>
+          <w:b/>
+          <w:bCs/>
+          <w:szCs w:val="24"/>
+        </w:rPr>
+        <w:t xml:space="preserve">Proses </w:t>
+      </w:r>
+      <w:proofErr w:type="spellStart"/>
+      <w:r>
+        <w:rPr>
+          <w:rFonts w:ascii="Times New Roman" w:hAnsi="Times New Roman" w:cs="Times New Roman"/>
+          <w:b/>
+          <w:bCs/>
+          <w:szCs w:val="24"/>
+        </w:rPr>
+        <w:t>Iterasi</w:t>
+      </w:r>
+      <w:proofErr w:type="spellEnd"/>
+      <w:r>
+        <w:rPr>
+          <w:rFonts w:ascii="Times New Roman" w:hAnsi="Times New Roman" w:cs="Times New Roman"/>
+          <w:szCs w:val="24"/>
+        </w:rPr>
+        <w:t>:</w:t>
+      </w:r>
+    </w:p>
+    <w:p>
+      <w:pPr>
+        <w:numPr>
+          <w:ilvl w:val="1"/>
+          <w:numId w:val="4"/>
+        </w:numPr>
+        <w:spacing w:line="360" w:lineRule="auto"/>
+        <w:jc w:val="both"/>
+        <w:rPr>
+          <w:rFonts w:ascii="Times New Roman" w:hAnsi="Times New Roman" w:cs="Times New Roman"/>
+          <w:szCs w:val="24"/>
+        </w:rPr>
+      </w:pPr>
+      <w:proofErr w:type="spellStart"/>
+      <w:r>
+        <w:rPr>
+          <w:rFonts w:ascii="Times New Roman" w:hAnsi="Times New Roman" w:cs="Times New Roman"/>
+          <w:b/>
+          <w:bCs/>
+          <w:szCs w:val="24"/>
+        </w:rPr>
+        <w:t>Iterasi</w:t>
+      </w:r>
+      <w:proofErr w:type="spellEnd"/>
+      <w:r>
+        <w:rPr>
+          <w:rFonts w:ascii="Times New Roman" w:hAnsi="Times New Roman" w:cs="Times New Roman"/>
+          <w:b/>
+          <w:bCs/>
+          <w:szCs w:val="24"/>
+        </w:rPr>
+        <w:t xml:space="preserve"> 1</w:t>
+      </w:r>
+      <w:r>
+        <w:rPr>
+          <w:rFonts w:ascii="Times New Roman" w:hAnsi="Times New Roman" w:cs="Times New Roman"/>
+          <w:szCs w:val="24"/>
+        </w:rPr>
+        <w:t xml:space="preserve">: </w:t>
+      </w:r>
+      <w:proofErr w:type="spellStart"/>
+      <w:r>
+        <w:rPr>
+          <w:rFonts w:ascii="Times New Roman" w:hAnsi="Times New Roman" w:cs="Times New Roman"/>
+          <w:szCs w:val="24"/>
+        </w:rPr>
+        <w:t>Elemen</w:t>
+      </w:r>
+      <w:proofErr w:type="spellEnd"/>
+      <w:r>
+        <w:rPr>
+          <w:rFonts w:ascii="Times New Roman" w:hAnsi="Times New Roman" w:cs="Times New Roman"/>
+          <w:szCs w:val="24"/>
+        </w:rPr>
+        <w:t xml:space="preserve"> </w:t>
+      </w:r>
+      <w:proofErr w:type="spellStart"/>
+      <w:r>
+        <w:rPr>
+          <w:rFonts w:ascii="Times New Roman" w:hAnsi="Times New Roman" w:cs="Times New Roman"/>
+          <w:szCs w:val="24"/>
+        </w:rPr>
+        <w:t>pertama</w:t>
+      </w:r>
+      <w:proofErr w:type="spellEnd"/>
+      <w:r>
+        <w:rPr>
+          <w:rFonts w:ascii="Times New Roman" w:hAnsi="Times New Roman" w:cs="Times New Roman"/>
+          <w:szCs w:val="24"/>
+        </w:rPr>
+        <w:t xml:space="preserve"> (</w:t>
+      </w:r>
+      <w:r>
+        <w:rPr>
+          <w:rFonts w:ascii="Times New Roman" w:hAnsi="Times New Roman" w:cs="Times New Roman"/>
+          <w:b/>
+          <w:bCs/>
+          <w:szCs w:val="24"/>
+        </w:rPr>
+        <w:t>22</w:t>
+      </w:r>
+      <w:r>
+        <w:rPr>
+          <w:rFonts w:ascii="Times New Roman" w:hAnsi="Times New Roman" w:cs="Times New Roman"/>
+          <w:szCs w:val="24"/>
+        </w:rPr>
+        <w:t xml:space="preserve">) </w:t>
+      </w:r>
+      <w:proofErr w:type="spellStart"/>
+      <w:r>
+        <w:rPr>
+          <w:rFonts w:ascii="Times New Roman" w:hAnsi="Times New Roman" w:cs="Times New Roman"/>
+          <w:szCs w:val="24"/>
+        </w:rPr>
+        <w:t>ditetapkan</w:t>
+      </w:r>
+      <w:proofErr w:type="spellEnd"/>
+      <w:r>
+        <w:rPr>
+          <w:rFonts w:ascii="Times New Roman" w:hAnsi="Times New Roman" w:cs="Times New Roman"/>
+          <w:szCs w:val="24"/>
+        </w:rPr>
+        <w:t xml:space="preserve"> </w:t>
+      </w:r>
+      <w:proofErr w:type="spellStart"/>
+      <w:r>
+        <w:rPr>
+          <w:rFonts w:ascii="Times New Roman" w:hAnsi="Times New Roman" w:cs="Times New Roman"/>
+          <w:szCs w:val="24"/>
+        </w:rPr>
+        <w:t>sebagai</w:t>
+      </w:r>
+      <w:proofErr w:type="spellEnd"/>
+      <w:r>
+        <w:rPr>
+          <w:rFonts w:ascii="Times New Roman" w:hAnsi="Times New Roman" w:cs="Times New Roman"/>
+          <w:szCs w:val="24"/>
+        </w:rPr>
+        <w:t xml:space="preserve"> pivot. </w:t>
+      </w:r>
+      <w:proofErr w:type="spellStart"/>
+      <w:r>
+        <w:rPr>
+          <w:rFonts w:ascii="Times New Roman" w:hAnsi="Times New Roman" w:cs="Times New Roman"/>
+          <w:szCs w:val="24"/>
+        </w:rPr>
+        <w:t>Algoritma</w:t>
+      </w:r>
+      <w:proofErr w:type="spellEnd"/>
+      <w:r>
+        <w:rPr>
+          <w:rFonts w:ascii="Times New Roman" w:hAnsi="Times New Roman" w:cs="Times New Roman"/>
+          <w:szCs w:val="24"/>
+        </w:rPr>
+        <w:t xml:space="preserve"> </w:t>
+      </w:r>
+      <w:proofErr w:type="spellStart"/>
+      <w:r>
+        <w:rPr>
+          <w:rFonts w:ascii="Times New Roman" w:hAnsi="Times New Roman" w:cs="Times New Roman"/>
+          <w:szCs w:val="24"/>
+        </w:rPr>
+        <w:t>melakukan</w:t>
+      </w:r>
+      <w:proofErr w:type="spellEnd"/>
+      <w:r>
+        <w:rPr>
+          <w:rFonts w:ascii="Times New Roman" w:hAnsi="Times New Roman" w:cs="Times New Roman"/>
+          <w:szCs w:val="24"/>
+        </w:rPr>
+        <w:t xml:space="preserve"> </w:t>
+      </w:r>
+      <w:proofErr w:type="spellStart"/>
+      <w:r>
+        <w:rPr>
+          <w:rFonts w:ascii="Times New Roman" w:hAnsi="Times New Roman" w:cs="Times New Roman"/>
+          <w:szCs w:val="24"/>
+        </w:rPr>
+        <w:t>pengecekan</w:t>
+      </w:r>
+      <w:proofErr w:type="spellEnd"/>
+      <w:r>
+        <w:rPr>
+          <w:rFonts w:ascii="Times New Roman" w:hAnsi="Times New Roman" w:cs="Times New Roman"/>
+          <w:szCs w:val="24"/>
+        </w:rPr>
+        <w:t xml:space="preserve"> </w:t>
+      </w:r>
+      <w:proofErr w:type="spellStart"/>
+      <w:r>
+        <w:rPr>
+          <w:rFonts w:ascii="Times New Roman" w:hAnsi="Times New Roman" w:cs="Times New Roman"/>
+          <w:szCs w:val="24"/>
+        </w:rPr>
+        <w:t>dari</w:t>
+      </w:r>
+      <w:proofErr w:type="spellEnd"/>
+      <w:r>
+        <w:rPr>
+          <w:rFonts w:ascii="Times New Roman" w:hAnsi="Times New Roman" w:cs="Times New Roman"/>
+          <w:szCs w:val="24"/>
+        </w:rPr>
+        <w:t xml:space="preserve"> </w:t>
+      </w:r>
+      <w:proofErr w:type="spellStart"/>
+      <w:r>
+        <w:rPr>
+          <w:rFonts w:ascii="Times New Roman" w:hAnsi="Times New Roman" w:cs="Times New Roman"/>
+          <w:szCs w:val="24"/>
+        </w:rPr>
+        <w:t>kedua</w:t>
+      </w:r>
+      <w:proofErr w:type="spellEnd"/>
+      <w:r>
+        <w:rPr>
+          <w:rFonts w:ascii="Times New Roman" w:hAnsi="Times New Roman" w:cs="Times New Roman"/>
+          <w:szCs w:val="24"/>
+        </w:rPr>
+        <w:t xml:space="preserve"> </w:t>
+      </w:r>
+      <w:proofErr w:type="spellStart"/>
+      <w:r>
+        <w:rPr>
+          <w:rFonts w:ascii="Times New Roman" w:hAnsi="Times New Roman" w:cs="Times New Roman"/>
+          <w:szCs w:val="24"/>
+        </w:rPr>
+        <w:t>arah</w:t>
+      </w:r>
+      <w:proofErr w:type="spellEnd"/>
+      <w:r>
+        <w:rPr>
+          <w:rFonts w:ascii="Times New Roman" w:hAnsi="Times New Roman" w:cs="Times New Roman"/>
+          <w:szCs w:val="24"/>
+        </w:rPr>
+        <w:t xml:space="preserve"> </w:t>
+      </w:r>
+      <w:proofErr w:type="spellStart"/>
+      <w:r>
+        <w:rPr>
+          <w:rFonts w:ascii="Times New Roman" w:hAnsi="Times New Roman" w:cs="Times New Roman"/>
+          <w:szCs w:val="24"/>
+        </w:rPr>
+        <w:t>untuk</w:t>
+      </w:r>
+      <w:proofErr w:type="spellEnd"/>
+      <w:r>
+        <w:rPr>
+          <w:rFonts w:ascii="Times New Roman" w:hAnsi="Times New Roman" w:cs="Times New Roman"/>
+          <w:szCs w:val="24"/>
+        </w:rPr>
+        <w:t xml:space="preserve"> </w:t>
+      </w:r>
+      <w:proofErr w:type="spellStart"/>
+      <w:r>
+        <w:rPr>
+          <w:rFonts w:ascii="Times New Roman" w:hAnsi="Times New Roman" w:cs="Times New Roman"/>
+          <w:szCs w:val="24"/>
+        </w:rPr>
+        <w:t>menempatkan</w:t>
+      </w:r>
+      <w:proofErr w:type="spellEnd"/>
+      <w:r>
+        <w:rPr>
+          <w:rFonts w:ascii="Times New Roman" w:hAnsi="Times New Roman" w:cs="Times New Roman"/>
+          <w:szCs w:val="24"/>
+        </w:rPr>
+        <w:t xml:space="preserve"> </w:t>
+      </w:r>
+      <w:proofErr w:type="spellStart"/>
+      <w:r>
+        <w:rPr>
+          <w:rFonts w:ascii="Times New Roman" w:hAnsi="Times New Roman" w:cs="Times New Roman"/>
+          <w:szCs w:val="24"/>
+        </w:rPr>
+        <w:t>elemen</w:t>
+      </w:r>
+      <w:proofErr w:type="spellEnd"/>
+      <w:r>
+        <w:rPr>
+          <w:rFonts w:ascii="Times New Roman" w:hAnsi="Times New Roman" w:cs="Times New Roman"/>
+          <w:szCs w:val="24"/>
+        </w:rPr>
+        <w:t xml:space="preserve"> </w:t>
+      </w:r>
+      <w:proofErr w:type="spellStart"/>
+      <w:r>
+        <w:rPr>
+          <w:rFonts w:ascii="Times New Roman" w:hAnsi="Times New Roman" w:cs="Times New Roman"/>
+          <w:szCs w:val="24"/>
+        </w:rPr>
+        <w:t>sesuai</w:t>
+      </w:r>
+      <w:proofErr w:type="spellEnd"/>
+      <w:r>
+        <w:rPr>
+          <w:rFonts w:ascii="Times New Roman" w:hAnsi="Times New Roman" w:cs="Times New Roman"/>
+          <w:szCs w:val="24"/>
+        </w:rPr>
+        <w:t xml:space="preserve"> </w:t>
+      </w:r>
+      <w:proofErr w:type="spellStart"/>
+      <w:r>
+        <w:rPr>
+          <w:rFonts w:ascii="Times New Roman" w:hAnsi="Times New Roman" w:cs="Times New Roman"/>
+          <w:szCs w:val="24"/>
+        </w:rPr>
+        <w:t>urutan</w:t>
+      </w:r>
+      <w:proofErr w:type="spellEnd"/>
+      <w:r>
+        <w:rPr>
+          <w:rFonts w:ascii="Times New Roman" w:hAnsi="Times New Roman" w:cs="Times New Roman"/>
+          <w:szCs w:val="24"/>
+        </w:rPr>
+        <w:t xml:space="preserve">. Hasil </w:t>
+      </w:r>
+      <w:proofErr w:type="spellStart"/>
+      <w:r>
+        <w:rPr>
+          <w:rFonts w:ascii="Times New Roman" w:hAnsi="Times New Roman" w:cs="Times New Roman"/>
+          <w:szCs w:val="24"/>
+        </w:rPr>
+        <w:t>akhirnya</w:t>
+      </w:r>
+      <w:proofErr w:type="spellEnd"/>
+      <w:r>
+        <w:rPr>
+          <w:rFonts w:ascii="Times New Roman" w:hAnsi="Times New Roman" w:cs="Times New Roman"/>
+          <w:szCs w:val="24"/>
+        </w:rPr>
+        <w:t xml:space="preserve">, </w:t>
+      </w:r>
+      <w:proofErr w:type="spellStart"/>
+      <w:r>
+        <w:rPr>
+          <w:rFonts w:ascii="Times New Roman" w:hAnsi="Times New Roman" w:cs="Times New Roman"/>
+          <w:szCs w:val="24"/>
+        </w:rPr>
+        <w:t>angka</w:t>
+      </w:r>
+      <w:proofErr w:type="spellEnd"/>
+      <w:r>
+        <w:rPr>
+          <w:rFonts w:ascii="Times New Roman" w:hAnsi="Times New Roman" w:cs="Times New Roman"/>
+          <w:szCs w:val="24"/>
+        </w:rPr>
+        <w:t xml:space="preserve"> </w:t>
+      </w:r>
+      <w:r>
+        <w:rPr>
+          <w:rFonts w:ascii="Times New Roman" w:hAnsi="Times New Roman" w:cs="Times New Roman"/>
+          <w:b/>
+          <w:bCs/>
+          <w:szCs w:val="24"/>
+        </w:rPr>
+        <w:t>22</w:t>
+      </w:r>
+      <w:r>
+        <w:rPr>
+          <w:rFonts w:ascii="Times New Roman" w:hAnsi="Times New Roman" w:cs="Times New Roman"/>
+          <w:szCs w:val="24"/>
+        </w:rPr>
+        <w:t xml:space="preserve"> </w:t>
+      </w:r>
+      <w:proofErr w:type="spellStart"/>
+      <w:r>
+        <w:rPr>
+          <w:rFonts w:ascii="Times New Roman" w:hAnsi="Times New Roman" w:cs="Times New Roman"/>
+          <w:szCs w:val="24"/>
+        </w:rPr>
+        <w:t>dipindah</w:t>
+      </w:r>
+      <w:proofErr w:type="spellEnd"/>
+      <w:r>
+        <w:rPr>
+          <w:rFonts w:ascii="Times New Roman" w:hAnsi="Times New Roman" w:cs="Times New Roman"/>
+          <w:szCs w:val="24"/>
+        </w:rPr>
+        <w:t xml:space="preserve"> </w:t>
+      </w:r>
+      <w:proofErr w:type="spellStart"/>
+      <w:r>
+        <w:rPr>
+          <w:rFonts w:ascii="Times New Roman" w:hAnsi="Times New Roman" w:cs="Times New Roman"/>
+          <w:szCs w:val="24"/>
+        </w:rPr>
+        <w:t>ke</w:t>
+      </w:r>
+      <w:proofErr w:type="spellEnd"/>
+      <w:r>
+        <w:rPr>
+          <w:rFonts w:ascii="Times New Roman" w:hAnsi="Times New Roman" w:cs="Times New Roman"/>
+          <w:szCs w:val="24"/>
+        </w:rPr>
+        <w:t xml:space="preserve"> </w:t>
+      </w:r>
+      <w:proofErr w:type="spellStart"/>
+      <w:r>
+        <w:rPr>
+          <w:rFonts w:ascii="Times New Roman" w:hAnsi="Times New Roman" w:cs="Times New Roman"/>
+          <w:szCs w:val="24"/>
+        </w:rPr>
+        <w:t>posisi</w:t>
+      </w:r>
+      <w:proofErr w:type="spellEnd"/>
+      <w:r>
+        <w:rPr>
+          <w:rFonts w:ascii="Times New Roman" w:hAnsi="Times New Roman" w:cs="Times New Roman"/>
+          <w:szCs w:val="24"/>
+        </w:rPr>
+        <w:t xml:space="preserve"> paling </w:t>
+      </w:r>
+      <w:proofErr w:type="spellStart"/>
+      <w:r>
+        <w:rPr>
+          <w:rFonts w:ascii="Times New Roman" w:hAnsi="Times New Roman" w:cs="Times New Roman"/>
+          <w:szCs w:val="24"/>
+        </w:rPr>
+        <w:t>kanan</w:t>
+      </w:r>
+      <w:proofErr w:type="spellEnd"/>
+      <w:r>
+        <w:rPr>
+          <w:rFonts w:ascii="Times New Roman" w:hAnsi="Times New Roman" w:cs="Times New Roman"/>
+          <w:szCs w:val="24"/>
+        </w:rPr>
+        <w:t xml:space="preserve"> (</w:t>
+      </w:r>
+      <w:proofErr w:type="spellStart"/>
+      <w:r>
+        <w:rPr>
+          <w:rFonts w:ascii="Times New Roman" w:hAnsi="Times New Roman" w:cs="Times New Roman"/>
+          <w:szCs w:val="24"/>
+        </w:rPr>
+        <w:t>posisi</w:t>
+      </w:r>
+      <w:proofErr w:type="spellEnd"/>
+      <w:r>
+        <w:rPr>
+          <w:rFonts w:ascii="Times New Roman" w:hAnsi="Times New Roman" w:cs="Times New Roman"/>
+          <w:szCs w:val="24"/>
+        </w:rPr>
+        <w:t xml:space="preserve"> ke-6) </w:t>
+      </w:r>
+      <w:proofErr w:type="spellStart"/>
+      <w:r>
+        <w:rPr>
+          <w:rFonts w:ascii="Times New Roman" w:hAnsi="Times New Roman" w:cs="Times New Roman"/>
+          <w:szCs w:val="24"/>
+        </w:rPr>
+        <w:t>karena</w:t>
+      </w:r>
+      <w:proofErr w:type="spellEnd"/>
+      <w:r>
+        <w:rPr>
+          <w:rFonts w:ascii="Times New Roman" w:hAnsi="Times New Roman" w:cs="Times New Roman"/>
+          <w:szCs w:val="24"/>
+        </w:rPr>
+        <w:t xml:space="preserve"> </w:t>
+      </w:r>
+      <w:proofErr w:type="spellStart"/>
+      <w:r>
+        <w:rPr>
+          <w:rFonts w:ascii="Times New Roman" w:hAnsi="Times New Roman" w:cs="Times New Roman"/>
+          <w:szCs w:val="24"/>
+        </w:rPr>
+        <w:t>merupakan</w:t>
+      </w:r>
+      <w:proofErr w:type="spellEnd"/>
+      <w:r>
+        <w:rPr>
+          <w:rFonts w:ascii="Times New Roman" w:hAnsi="Times New Roman" w:cs="Times New Roman"/>
+          <w:szCs w:val="24"/>
+        </w:rPr>
+        <w:t xml:space="preserve"> </w:t>
+      </w:r>
+      <w:proofErr w:type="spellStart"/>
+      <w:r>
+        <w:rPr>
+          <w:rFonts w:ascii="Times New Roman" w:hAnsi="Times New Roman" w:cs="Times New Roman"/>
+          <w:szCs w:val="24"/>
+        </w:rPr>
+        <w:t>nilai</w:t>
+      </w:r>
+      <w:proofErr w:type="spellEnd"/>
+      <w:r>
+        <w:rPr>
+          <w:rFonts w:ascii="Times New Roman" w:hAnsi="Times New Roman" w:cs="Times New Roman"/>
+          <w:szCs w:val="24"/>
+        </w:rPr>
+        <w:t xml:space="preserve"> </w:t>
+      </w:r>
+      <w:proofErr w:type="spellStart"/>
+      <w:r>
+        <w:rPr>
+          <w:rFonts w:ascii="Times New Roman" w:hAnsi="Times New Roman" w:cs="Times New Roman"/>
+          <w:szCs w:val="24"/>
+        </w:rPr>
+        <w:t>terbesar</w:t>
+      </w:r>
+      <w:proofErr w:type="spellEnd"/>
+      <w:r>
+        <w:rPr>
+          <w:rFonts w:ascii="Times New Roman" w:hAnsi="Times New Roman" w:cs="Times New Roman"/>
+          <w:szCs w:val="24"/>
+        </w:rPr>
+        <w:t>.</w:t>
+      </w:r>
+    </w:p>
+    <w:p>
+      <w:pPr>
+        <w:numPr>
+          <w:ilvl w:val="1"/>
+          <w:numId w:val="4"/>
+        </w:numPr>
+        <w:spacing w:line="360" w:lineRule="auto"/>
+        <w:jc w:val="both"/>
+        <w:rPr>
+          <w:rFonts w:ascii="Times New Roman" w:hAnsi="Times New Roman" w:cs="Times New Roman"/>
+          <w:szCs w:val="24"/>
+        </w:rPr>
+      </w:pPr>
+      <w:proofErr w:type="spellStart"/>
+      <w:r>
+        <w:rPr>
+          <w:rFonts w:ascii="Times New Roman" w:hAnsi="Times New Roman" w:cs="Times New Roman"/>
+          <w:b/>
+          <w:bCs/>
+          <w:szCs w:val="24"/>
+        </w:rPr>
+        <w:t>Iterasi</w:t>
+      </w:r>
+      <w:proofErr w:type="spellEnd"/>
+      <w:r>
+        <w:rPr>
+          <w:rFonts w:ascii="Times New Roman" w:hAnsi="Times New Roman" w:cs="Times New Roman"/>
+          <w:b/>
+          <w:bCs/>
+          <w:szCs w:val="24"/>
+        </w:rPr>
+        <w:t xml:space="preserve"> 2 </w:t>
+      </w:r>
+      <w:proofErr w:type="spellStart"/>
+      <w:r>
+        <w:rPr>
+          <w:rFonts w:ascii="Times New Roman" w:hAnsi="Times New Roman" w:cs="Times New Roman"/>
+          <w:b/>
+          <w:bCs/>
+          <w:szCs w:val="24"/>
+        </w:rPr>
+        <w:t>hingga</w:t>
+      </w:r>
+      <w:proofErr w:type="spellEnd"/>
+      <w:r>
+        <w:rPr>
+          <w:rFonts w:ascii="Times New Roman" w:hAnsi="Times New Roman" w:cs="Times New Roman"/>
+          <w:b/>
+          <w:bCs/>
+          <w:szCs w:val="24"/>
+        </w:rPr>
+        <w:t xml:space="preserve"> 6</w:t>
+      </w:r>
+      <w:r>
+        <w:rPr>
+          <w:rFonts w:ascii="Times New Roman" w:hAnsi="Times New Roman" w:cs="Times New Roman"/>
+          <w:szCs w:val="24"/>
+        </w:rPr>
+        <w:t xml:space="preserve">: </w:t>
+      </w:r>
+      <w:proofErr w:type="spellStart"/>
+      <w:r>
+        <w:rPr>
+          <w:rFonts w:ascii="Times New Roman" w:hAnsi="Times New Roman" w:cs="Times New Roman"/>
+          <w:szCs w:val="24"/>
+        </w:rPr>
+        <w:t>Algoritma</w:t>
+      </w:r>
+      <w:proofErr w:type="spellEnd"/>
+      <w:r>
+        <w:rPr>
+          <w:rFonts w:ascii="Times New Roman" w:hAnsi="Times New Roman" w:cs="Times New Roman"/>
+          <w:szCs w:val="24"/>
+        </w:rPr>
+        <w:t xml:space="preserve"> </w:t>
+      </w:r>
+      <w:proofErr w:type="spellStart"/>
+      <w:r>
+        <w:rPr>
+          <w:rFonts w:ascii="Times New Roman" w:hAnsi="Times New Roman" w:cs="Times New Roman"/>
+          <w:szCs w:val="24"/>
+        </w:rPr>
+        <w:t>masuk</w:t>
+      </w:r>
+      <w:proofErr w:type="spellEnd"/>
+      <w:r>
+        <w:rPr>
+          <w:rFonts w:ascii="Times New Roman" w:hAnsi="Times New Roman" w:cs="Times New Roman"/>
+          <w:szCs w:val="24"/>
+        </w:rPr>
+        <w:t xml:space="preserve"> </w:t>
+      </w:r>
+      <w:proofErr w:type="spellStart"/>
+      <w:r>
+        <w:rPr>
+          <w:rFonts w:ascii="Times New Roman" w:hAnsi="Times New Roman" w:cs="Times New Roman"/>
+          <w:szCs w:val="24"/>
+        </w:rPr>
+        <w:t>ke</w:t>
+      </w:r>
+      <w:proofErr w:type="spellEnd"/>
+      <w:r>
+        <w:rPr>
+          <w:rFonts w:ascii="Times New Roman" w:hAnsi="Times New Roman" w:cs="Times New Roman"/>
+          <w:szCs w:val="24"/>
+        </w:rPr>
+        <w:t xml:space="preserve"> proses </w:t>
+      </w:r>
+      <w:proofErr w:type="spellStart"/>
+      <w:r>
+        <w:rPr>
+          <w:rFonts w:ascii="Times New Roman" w:hAnsi="Times New Roman" w:cs="Times New Roman"/>
+          <w:szCs w:val="24"/>
+        </w:rPr>
+        <w:t>rekursif</w:t>
+      </w:r>
+      <w:proofErr w:type="spellEnd"/>
+      <w:r>
+        <w:rPr>
+          <w:rFonts w:ascii="Times New Roman" w:hAnsi="Times New Roman" w:cs="Times New Roman"/>
+          <w:szCs w:val="24"/>
+        </w:rPr>
+        <w:t xml:space="preserve"> pada sub-array yang </w:t>
+      </w:r>
+      <w:proofErr w:type="spellStart"/>
+      <w:r>
+        <w:rPr>
+          <w:rFonts w:ascii="Times New Roman" w:hAnsi="Times New Roman" w:cs="Times New Roman"/>
+          <w:szCs w:val="24"/>
+        </w:rPr>
+        <w:t>tersisa</w:t>
+      </w:r>
+      <w:proofErr w:type="spellEnd"/>
+      <w:r>
+        <w:rPr>
+          <w:rFonts w:ascii="Times New Roman" w:hAnsi="Times New Roman" w:cs="Times New Roman"/>
+          <w:szCs w:val="24"/>
+        </w:rPr>
+        <w:t xml:space="preserve"> (</w:t>
+      </w:r>
+      <w:proofErr w:type="spellStart"/>
+      <w:r>
+        <w:rPr>
+          <w:rFonts w:ascii="Times New Roman" w:hAnsi="Times New Roman" w:cs="Times New Roman"/>
+          <w:szCs w:val="24"/>
+        </w:rPr>
+        <w:t>posisi</w:t>
+      </w:r>
+      <w:proofErr w:type="spellEnd"/>
+      <w:r>
+        <w:rPr>
+          <w:rFonts w:ascii="Times New Roman" w:hAnsi="Times New Roman" w:cs="Times New Roman"/>
+          <w:szCs w:val="24"/>
+        </w:rPr>
+        <w:t xml:space="preserve"> 1 </w:t>
+      </w:r>
+      <w:proofErr w:type="spellStart"/>
+      <w:r>
+        <w:rPr>
+          <w:rFonts w:ascii="Times New Roman" w:hAnsi="Times New Roman" w:cs="Times New Roman"/>
+          <w:szCs w:val="24"/>
+        </w:rPr>
+        <w:t>sampai</w:t>
+      </w:r>
+      <w:proofErr w:type="spellEnd"/>
+      <w:r>
+        <w:rPr>
+          <w:rFonts w:ascii="Times New Roman" w:hAnsi="Times New Roman" w:cs="Times New Roman"/>
+          <w:szCs w:val="24"/>
+        </w:rPr>
+        <w:t xml:space="preserve"> 5). </w:t>
+      </w:r>
+      <w:proofErr w:type="spellStart"/>
+      <w:r>
+        <w:rPr>
+          <w:rFonts w:ascii="Times New Roman" w:hAnsi="Times New Roman" w:cs="Times New Roman"/>
+          <w:szCs w:val="24"/>
+        </w:rPr>
+        <w:t>Fokusnya</w:t>
+      </w:r>
+      <w:proofErr w:type="spellEnd"/>
+      <w:r>
+        <w:rPr>
+          <w:rFonts w:ascii="Times New Roman" w:hAnsi="Times New Roman" w:cs="Times New Roman"/>
+          <w:szCs w:val="24"/>
+        </w:rPr>
+        <w:t xml:space="preserve"> </w:t>
+      </w:r>
+      <w:proofErr w:type="spellStart"/>
+      <w:r>
+        <w:rPr>
+          <w:rFonts w:ascii="Times New Roman" w:hAnsi="Times New Roman" w:cs="Times New Roman"/>
+          <w:szCs w:val="24"/>
+        </w:rPr>
+        <w:t>adalah</w:t>
+      </w:r>
+      <w:proofErr w:type="spellEnd"/>
+      <w:r>
+        <w:rPr>
+          <w:rFonts w:ascii="Times New Roman" w:hAnsi="Times New Roman" w:cs="Times New Roman"/>
+          <w:szCs w:val="24"/>
+        </w:rPr>
+        <w:t xml:space="preserve"> </w:t>
+      </w:r>
+      <w:proofErr w:type="spellStart"/>
+      <w:r>
+        <w:rPr>
+          <w:rFonts w:ascii="Times New Roman" w:hAnsi="Times New Roman" w:cs="Times New Roman"/>
+          <w:szCs w:val="24"/>
+        </w:rPr>
+        <w:t>memecah</w:t>
+      </w:r>
+      <w:proofErr w:type="spellEnd"/>
+      <w:r>
+        <w:rPr>
+          <w:rFonts w:ascii="Times New Roman" w:hAnsi="Times New Roman" w:cs="Times New Roman"/>
+          <w:szCs w:val="24"/>
+        </w:rPr>
+        <w:t xml:space="preserve"> </w:t>
+      </w:r>
+      <w:proofErr w:type="spellStart"/>
+      <w:r>
+        <w:rPr>
+          <w:rFonts w:ascii="Times New Roman" w:hAnsi="Times New Roman" w:cs="Times New Roman"/>
+          <w:szCs w:val="24"/>
+        </w:rPr>
+        <w:t>bagian</w:t>
+      </w:r>
+      <w:proofErr w:type="spellEnd"/>
+      <w:r>
+        <w:rPr>
+          <w:rFonts w:ascii="Times New Roman" w:hAnsi="Times New Roman" w:cs="Times New Roman"/>
+          <w:szCs w:val="24"/>
+        </w:rPr>
+        <w:t xml:space="preserve"> yang </w:t>
+      </w:r>
+      <w:proofErr w:type="spellStart"/>
+      <w:r>
+        <w:rPr>
+          <w:rFonts w:ascii="Times New Roman" w:hAnsi="Times New Roman" w:cs="Times New Roman"/>
+          <w:szCs w:val="24"/>
+        </w:rPr>
+        <w:t>belum</w:t>
+      </w:r>
+      <w:proofErr w:type="spellEnd"/>
+      <w:r>
+        <w:rPr>
+          <w:rFonts w:ascii="Times New Roman" w:hAnsi="Times New Roman" w:cs="Times New Roman"/>
+          <w:szCs w:val="24"/>
+        </w:rPr>
+        <w:t xml:space="preserve"> </w:t>
+      </w:r>
+      <w:proofErr w:type="spellStart"/>
+      <w:r>
+        <w:rPr>
+          <w:rFonts w:ascii="Times New Roman" w:hAnsi="Times New Roman" w:cs="Times New Roman"/>
+          <w:szCs w:val="24"/>
+        </w:rPr>
+        <w:t>terurut</w:t>
+      </w:r>
+      <w:proofErr w:type="spellEnd"/>
+      <w:r>
+        <w:rPr>
+          <w:rFonts w:ascii="Times New Roman" w:hAnsi="Times New Roman" w:cs="Times New Roman"/>
+          <w:szCs w:val="24"/>
+        </w:rPr>
+        <w:t xml:space="preserve"> </w:t>
+      </w:r>
+      <w:proofErr w:type="spellStart"/>
+      <w:r>
+        <w:rPr>
+          <w:rFonts w:ascii="Times New Roman" w:hAnsi="Times New Roman" w:cs="Times New Roman"/>
+          <w:szCs w:val="24"/>
+        </w:rPr>
+        <w:t>hingga</w:t>
+      </w:r>
+      <w:proofErr w:type="spellEnd"/>
+      <w:r>
+        <w:rPr>
+          <w:rFonts w:ascii="Times New Roman" w:hAnsi="Times New Roman" w:cs="Times New Roman"/>
+          <w:szCs w:val="24"/>
+        </w:rPr>
+        <w:t xml:space="preserve"> </w:t>
+      </w:r>
+      <w:proofErr w:type="spellStart"/>
+      <w:r>
+        <w:rPr>
+          <w:rFonts w:ascii="Times New Roman" w:hAnsi="Times New Roman" w:cs="Times New Roman"/>
+          <w:szCs w:val="24"/>
+        </w:rPr>
+        <w:t>semua</w:t>
+      </w:r>
+      <w:proofErr w:type="spellEnd"/>
+      <w:r>
+        <w:rPr>
+          <w:rFonts w:ascii="Times New Roman" w:hAnsi="Times New Roman" w:cs="Times New Roman"/>
+          <w:szCs w:val="24"/>
+        </w:rPr>
+        <w:t xml:space="preserve"> </w:t>
+      </w:r>
+      <w:proofErr w:type="spellStart"/>
+      <w:r>
+        <w:rPr>
+          <w:rFonts w:ascii="Times New Roman" w:hAnsi="Times New Roman" w:cs="Times New Roman"/>
+          <w:szCs w:val="24"/>
+        </w:rPr>
+        <w:t>elemen</w:t>
+      </w:r>
+      <w:proofErr w:type="spellEnd"/>
+      <w:r>
+        <w:rPr>
+          <w:rFonts w:ascii="Times New Roman" w:hAnsi="Times New Roman" w:cs="Times New Roman"/>
+          <w:szCs w:val="24"/>
+        </w:rPr>
+        <w:t xml:space="preserve"> </w:t>
+      </w:r>
+      <w:proofErr w:type="spellStart"/>
+      <w:r>
+        <w:rPr>
+          <w:rFonts w:ascii="Times New Roman" w:hAnsi="Times New Roman" w:cs="Times New Roman"/>
+          <w:szCs w:val="24"/>
+        </w:rPr>
+        <w:t>berada</w:t>
+      </w:r>
+      <w:proofErr w:type="spellEnd"/>
+      <w:r>
+        <w:rPr>
+          <w:rFonts w:ascii="Times New Roman" w:hAnsi="Times New Roman" w:cs="Times New Roman"/>
+          <w:szCs w:val="24"/>
+        </w:rPr>
+        <w:t xml:space="preserve"> di </w:t>
+      </w:r>
+      <w:proofErr w:type="spellStart"/>
+      <w:r>
+        <w:rPr>
+          <w:rFonts w:ascii="Times New Roman" w:hAnsi="Times New Roman" w:cs="Times New Roman"/>
+          <w:szCs w:val="24"/>
+        </w:rPr>
+        <w:t>posisi</w:t>
+      </w:r>
+      <w:proofErr w:type="spellEnd"/>
+      <w:r>
+        <w:rPr>
+          <w:rFonts w:ascii="Times New Roman" w:hAnsi="Times New Roman" w:cs="Times New Roman"/>
+          <w:szCs w:val="24"/>
+        </w:rPr>
+        <w:t xml:space="preserve"> yang </w:t>
+      </w:r>
+      <w:proofErr w:type="spellStart"/>
+      <w:r>
+        <w:rPr>
+          <w:rFonts w:ascii="Times New Roman" w:hAnsi="Times New Roman" w:cs="Times New Roman"/>
+          <w:szCs w:val="24"/>
+        </w:rPr>
+        <w:t>benar</w:t>
+      </w:r>
+      <w:proofErr w:type="spellEnd"/>
+      <w:r>
+        <w:rPr>
+          <w:rFonts w:ascii="Times New Roman" w:hAnsi="Times New Roman" w:cs="Times New Roman"/>
+          <w:szCs w:val="24"/>
+        </w:rPr>
+        <w:t>.</w:t>
+      </w:r>
+    </w:p>
+    <w:p>
+      <w:pPr>
+        <w:numPr>
+          <w:ilvl w:val="0"/>
+          <w:numId w:val="4"/>
+        </w:numPr>
+        <w:spacing w:line="360" w:lineRule="auto"/>
+        <w:jc w:val="both"/>
+        <w:rPr>
+          <w:rFonts w:ascii="Times New Roman" w:hAnsi="Times New Roman" w:cs="Times New Roman"/>
+          <w:szCs w:val="24"/>
+        </w:rPr>
+      </w:pPr>
+      <w:r>
+        <w:rPr>
+          <w:rFonts w:ascii="Times New Roman" w:hAnsi="Times New Roman" w:cs="Times New Roman"/>
+          <w:b/>
+          <w:bCs/>
+          <w:szCs w:val="24"/>
+        </w:rPr>
+        <w:t>Hasil Akhir</w:t>
+      </w:r>
+      <w:r>
+        <w:rPr>
+          <w:rFonts w:ascii="Times New Roman" w:hAnsi="Times New Roman" w:cs="Times New Roman"/>
+          <w:szCs w:val="24"/>
+        </w:rPr>
+        <w:t xml:space="preserve">: </w:t>
+      </w:r>
+      <w:proofErr w:type="spellStart"/>
+      <w:r>
+        <w:rPr>
+          <w:rFonts w:ascii="Times New Roman" w:hAnsi="Times New Roman" w:cs="Times New Roman"/>
+          <w:szCs w:val="24"/>
+        </w:rPr>
+        <w:t>Setelah</w:t>
+      </w:r>
+      <w:proofErr w:type="spellEnd"/>
+      <w:r>
+        <w:rPr>
+          <w:rFonts w:ascii="Times New Roman" w:hAnsi="Times New Roman" w:cs="Times New Roman"/>
+          <w:szCs w:val="24"/>
+        </w:rPr>
+        <w:t xml:space="preserve"> 6 </w:t>
+      </w:r>
+      <w:proofErr w:type="spellStart"/>
+      <w:r>
+        <w:rPr>
+          <w:rFonts w:ascii="Times New Roman" w:hAnsi="Times New Roman" w:cs="Times New Roman"/>
+          <w:szCs w:val="24"/>
+        </w:rPr>
+        <w:t>iterasi</w:t>
+      </w:r>
+      <w:proofErr w:type="spellEnd"/>
+      <w:r>
+        <w:rPr>
+          <w:rFonts w:ascii="Times New Roman" w:hAnsi="Times New Roman" w:cs="Times New Roman"/>
+          <w:szCs w:val="24"/>
+        </w:rPr>
+        <w:t xml:space="preserve">, data </w:t>
+      </w:r>
+      <w:proofErr w:type="spellStart"/>
+      <w:r>
+        <w:rPr>
+          <w:rFonts w:ascii="Times New Roman" w:hAnsi="Times New Roman" w:cs="Times New Roman"/>
+          <w:szCs w:val="24"/>
+        </w:rPr>
+        <w:t>berhasil</w:t>
+      </w:r>
+      <w:proofErr w:type="spellEnd"/>
+      <w:r>
+        <w:rPr>
+          <w:rFonts w:ascii="Times New Roman" w:hAnsi="Times New Roman" w:cs="Times New Roman"/>
+          <w:szCs w:val="24"/>
+        </w:rPr>
+        <w:t xml:space="preserve"> </w:t>
+      </w:r>
+      <w:proofErr w:type="spellStart"/>
+      <w:r>
+        <w:rPr>
+          <w:rFonts w:ascii="Times New Roman" w:hAnsi="Times New Roman" w:cs="Times New Roman"/>
+          <w:szCs w:val="24"/>
+        </w:rPr>
+        <w:t>disusun</w:t>
+      </w:r>
+      <w:proofErr w:type="spellEnd"/>
+      <w:r>
+        <w:rPr>
+          <w:rFonts w:ascii="Times New Roman" w:hAnsi="Times New Roman" w:cs="Times New Roman"/>
+          <w:szCs w:val="24"/>
+        </w:rPr>
+        <w:t xml:space="preserve"> </w:t>
+      </w:r>
+      <w:proofErr w:type="spellStart"/>
+      <w:r>
+        <w:rPr>
+          <w:rFonts w:ascii="Times New Roman" w:hAnsi="Times New Roman" w:cs="Times New Roman"/>
+          <w:szCs w:val="24"/>
+        </w:rPr>
+        <w:t>ulang</w:t>
+      </w:r>
+      <w:proofErr w:type="spellEnd"/>
+      <w:r>
+        <w:rPr>
+          <w:rFonts w:ascii="Times New Roman" w:hAnsi="Times New Roman" w:cs="Times New Roman"/>
+          <w:szCs w:val="24"/>
+        </w:rPr>
+        <w:t xml:space="preserve"> </w:t>
+      </w:r>
+      <w:proofErr w:type="spellStart"/>
+      <w:r>
+        <w:rPr>
+          <w:rFonts w:ascii="Times New Roman" w:hAnsi="Times New Roman" w:cs="Times New Roman"/>
+          <w:szCs w:val="24"/>
+        </w:rPr>
+        <w:t>dari</w:t>
+      </w:r>
+      <w:proofErr w:type="spellEnd"/>
+      <w:r>
+        <w:rPr>
+          <w:rFonts w:ascii="Times New Roman" w:hAnsi="Times New Roman" w:cs="Times New Roman"/>
+          <w:szCs w:val="24"/>
+        </w:rPr>
+        <w:t xml:space="preserve"> [22, 10, 15, 3, 8, 2] </w:t>
+      </w:r>
+      <w:proofErr w:type="spellStart"/>
+      <w:r>
+        <w:rPr>
+          <w:rFonts w:ascii="Times New Roman" w:hAnsi="Times New Roman" w:cs="Times New Roman"/>
+          <w:szCs w:val="24"/>
+        </w:rPr>
+        <w:t>menjadi</w:t>
+      </w:r>
+      <w:proofErr w:type="spellEnd"/>
+      <w:r>
+        <w:rPr>
+          <w:rFonts w:ascii="Times New Roman" w:hAnsi="Times New Roman" w:cs="Times New Roman"/>
+          <w:szCs w:val="24"/>
+        </w:rPr>
+        <w:t xml:space="preserve"> </w:t>
+      </w:r>
+      <w:proofErr w:type="spellStart"/>
+      <w:r>
+        <w:rPr>
+          <w:rFonts w:ascii="Times New Roman" w:hAnsi="Times New Roman" w:cs="Times New Roman"/>
+          <w:szCs w:val="24"/>
+        </w:rPr>
+        <w:t>urutan</w:t>
+      </w:r>
+      <w:proofErr w:type="spellEnd"/>
+      <w:r>
+        <w:rPr>
+          <w:rFonts w:ascii="Times New Roman" w:hAnsi="Times New Roman" w:cs="Times New Roman"/>
+          <w:szCs w:val="24"/>
+        </w:rPr>
+        <w:t xml:space="preserve"> </w:t>
+      </w:r>
+      <w:r>
+        <w:rPr>
+          <w:rFonts w:ascii="Times New Roman" w:hAnsi="Times New Roman" w:cs="Times New Roman"/>
+          <w:i/>
+          <w:iCs/>
+          <w:szCs w:val="24"/>
+        </w:rPr>
+        <w:t>ascending</w:t>
+      </w:r>
+      <w:r>
+        <w:rPr>
+          <w:rFonts w:ascii="Times New Roman" w:hAnsi="Times New Roman" w:cs="Times New Roman"/>
+          <w:szCs w:val="24"/>
+        </w:rPr>
+        <w:t xml:space="preserve"> </w:t>
+      </w:r>
+      <w:proofErr w:type="spellStart"/>
+      <w:r>
+        <w:rPr>
+          <w:rFonts w:ascii="Times New Roman" w:hAnsi="Times New Roman" w:cs="Times New Roman"/>
+          <w:szCs w:val="24"/>
+        </w:rPr>
+        <w:t>yaitu</w:t>
+      </w:r>
+      <w:proofErr w:type="spellEnd"/>
+      <w:r>
+        <w:rPr>
+          <w:rFonts w:ascii="Times New Roman" w:hAnsi="Times New Roman" w:cs="Times New Roman"/>
+          <w:szCs w:val="24"/>
+        </w:rPr>
+        <w:t xml:space="preserve"> [2, 3, 8, 10, 15, 22].</w:t>
+      </w:r>
+    </w:p>
+    <w:p>
+      <w:pPr>
+        <w:spacing w:line="360" w:lineRule="auto"/>
+        <w:jc w:val="both"/>
+        <w:rPr>
+          <w:rFonts w:ascii="Times New Roman" w:hAnsi="Times New Roman" w:cs="Times New Roman"/>
+          <w:szCs w:val="24"/>
+        </w:rPr>
+      </w:pPr>
+      <w:r>
+        <w:rPr>
+          <w:rFonts w:ascii="Times New Roman" w:hAnsi="Times New Roman" w:cs="Times New Roman"/>
+          <w:szCs w:val="24"/>
+        </w:rPr>
+        <w:t xml:space="preserve">Tabel </w:t>
+      </w:r>
+      <w:proofErr w:type="spellStart"/>
+      <w:r>
+        <w:rPr>
+          <w:rFonts w:ascii="Times New Roman" w:hAnsi="Times New Roman" w:cs="Times New Roman"/>
+          <w:szCs w:val="24"/>
+        </w:rPr>
+        <w:t>ini</w:t>
+      </w:r>
+      <w:proofErr w:type="spellEnd"/>
+      <w:r>
+        <w:rPr>
+          <w:rFonts w:ascii="Times New Roman" w:hAnsi="Times New Roman" w:cs="Times New Roman"/>
+          <w:szCs w:val="24"/>
+        </w:rPr>
+        <w:t xml:space="preserve"> </w:t>
+      </w:r>
+      <w:proofErr w:type="spellStart"/>
+      <w:r>
+        <w:rPr>
+          <w:rFonts w:ascii="Times New Roman" w:hAnsi="Times New Roman" w:cs="Times New Roman"/>
+          <w:szCs w:val="24"/>
+        </w:rPr>
+        <w:t>menunjukkan</w:t>
+      </w:r>
+      <w:proofErr w:type="spellEnd"/>
+      <w:r>
+        <w:rPr>
+          <w:rFonts w:ascii="Times New Roman" w:hAnsi="Times New Roman" w:cs="Times New Roman"/>
+          <w:szCs w:val="24"/>
+        </w:rPr>
+        <w:t xml:space="preserve"> </w:t>
+      </w:r>
+      <w:proofErr w:type="spellStart"/>
+      <w:r>
+        <w:rPr>
+          <w:rFonts w:ascii="Times New Roman" w:hAnsi="Times New Roman" w:cs="Times New Roman"/>
+          <w:szCs w:val="24"/>
+        </w:rPr>
+        <w:t>cara</w:t>
+      </w:r>
+      <w:proofErr w:type="spellEnd"/>
+      <w:r>
+        <w:rPr>
+          <w:rFonts w:ascii="Times New Roman" w:hAnsi="Times New Roman" w:cs="Times New Roman"/>
+          <w:szCs w:val="24"/>
+        </w:rPr>
+        <w:t xml:space="preserve"> </w:t>
+      </w:r>
+      <w:proofErr w:type="spellStart"/>
+      <w:r>
+        <w:rPr>
+          <w:rFonts w:ascii="Times New Roman" w:hAnsi="Times New Roman" w:cs="Times New Roman"/>
+          <w:szCs w:val="24"/>
+        </w:rPr>
+        <w:t>kerja</w:t>
+      </w:r>
+      <w:proofErr w:type="spellEnd"/>
+      <w:r>
+        <w:rPr>
+          <w:rFonts w:ascii="Times New Roman" w:hAnsi="Times New Roman" w:cs="Times New Roman"/>
+          <w:szCs w:val="24"/>
+        </w:rPr>
+        <w:t xml:space="preserve"> </w:t>
+      </w:r>
+      <w:proofErr w:type="spellStart"/>
+      <w:r>
+        <w:rPr>
+          <w:rFonts w:ascii="Times New Roman" w:hAnsi="Times New Roman" w:cs="Times New Roman"/>
+          <w:szCs w:val="24"/>
+        </w:rPr>
+        <w:t>partisi</w:t>
+      </w:r>
+      <w:proofErr w:type="spellEnd"/>
+      <w:r>
+        <w:rPr>
+          <w:rFonts w:ascii="Times New Roman" w:hAnsi="Times New Roman" w:cs="Times New Roman"/>
+          <w:szCs w:val="24"/>
+        </w:rPr>
+        <w:t xml:space="preserve"> di mana </w:t>
+      </w:r>
+      <w:proofErr w:type="spellStart"/>
+      <w:r>
+        <w:rPr>
+          <w:rFonts w:ascii="Times New Roman" w:hAnsi="Times New Roman" w:cs="Times New Roman"/>
+          <w:szCs w:val="24"/>
+        </w:rPr>
+        <w:t>setiap</w:t>
+      </w:r>
+      <w:proofErr w:type="spellEnd"/>
+      <w:r>
+        <w:rPr>
+          <w:rFonts w:ascii="Times New Roman" w:hAnsi="Times New Roman" w:cs="Times New Roman"/>
+          <w:szCs w:val="24"/>
+        </w:rPr>
+        <w:t xml:space="preserve"> </w:t>
+      </w:r>
+      <w:proofErr w:type="spellStart"/>
+      <w:r>
+        <w:rPr>
+          <w:rFonts w:ascii="Times New Roman" w:hAnsi="Times New Roman" w:cs="Times New Roman"/>
+          <w:szCs w:val="24"/>
+        </w:rPr>
+        <w:t>langkah</w:t>
+      </w:r>
+      <w:proofErr w:type="spellEnd"/>
+      <w:r>
+        <w:rPr>
+          <w:rFonts w:ascii="Times New Roman" w:hAnsi="Times New Roman" w:cs="Times New Roman"/>
+          <w:szCs w:val="24"/>
+        </w:rPr>
+        <w:t xml:space="preserve"> </w:t>
+      </w:r>
+      <w:proofErr w:type="spellStart"/>
+      <w:r>
+        <w:rPr>
+          <w:rFonts w:ascii="Times New Roman" w:hAnsi="Times New Roman" w:cs="Times New Roman"/>
+          <w:szCs w:val="24"/>
+        </w:rPr>
+        <w:t>bertujuan</w:t>
+      </w:r>
+      <w:proofErr w:type="spellEnd"/>
+      <w:r>
+        <w:rPr>
+          <w:rFonts w:ascii="Times New Roman" w:hAnsi="Times New Roman" w:cs="Times New Roman"/>
+          <w:szCs w:val="24"/>
+        </w:rPr>
+        <w:t xml:space="preserve"> </w:t>
+      </w:r>
+      <w:proofErr w:type="spellStart"/>
+      <w:r>
+        <w:rPr>
+          <w:rFonts w:ascii="Times New Roman" w:hAnsi="Times New Roman" w:cs="Times New Roman"/>
+          <w:szCs w:val="24"/>
+        </w:rPr>
+        <w:t>untuk</w:t>
+      </w:r>
+      <w:proofErr w:type="spellEnd"/>
+      <w:r>
+        <w:rPr>
+          <w:rFonts w:ascii="Times New Roman" w:hAnsi="Times New Roman" w:cs="Times New Roman"/>
+          <w:szCs w:val="24"/>
+        </w:rPr>
+        <w:t xml:space="preserve"> </w:t>
+      </w:r>
+      <w:proofErr w:type="spellStart"/>
+      <w:r>
+        <w:rPr>
+          <w:rFonts w:ascii="Times New Roman" w:hAnsi="Times New Roman" w:cs="Times New Roman"/>
+          <w:szCs w:val="24"/>
+        </w:rPr>
+        <w:t>menempatkan</w:t>
+      </w:r>
+      <w:proofErr w:type="spellEnd"/>
+      <w:r>
+        <w:rPr>
+          <w:rFonts w:ascii="Times New Roman" w:hAnsi="Times New Roman" w:cs="Times New Roman"/>
+          <w:szCs w:val="24"/>
+        </w:rPr>
+        <w:t xml:space="preserve"> </w:t>
+      </w:r>
+      <w:proofErr w:type="spellStart"/>
+      <w:r>
+        <w:rPr>
+          <w:rFonts w:ascii="Times New Roman" w:hAnsi="Times New Roman" w:cs="Times New Roman"/>
+          <w:szCs w:val="24"/>
+        </w:rPr>
+        <w:t>satu</w:t>
+      </w:r>
+      <w:proofErr w:type="spellEnd"/>
+      <w:r>
+        <w:rPr>
+          <w:rFonts w:ascii="Times New Roman" w:hAnsi="Times New Roman" w:cs="Times New Roman"/>
+          <w:szCs w:val="24"/>
+        </w:rPr>
+        <w:t xml:space="preserve"> </w:t>
+      </w:r>
+      <w:proofErr w:type="spellStart"/>
+      <w:r>
+        <w:rPr>
+          <w:rFonts w:ascii="Times New Roman" w:hAnsi="Times New Roman" w:cs="Times New Roman"/>
+          <w:szCs w:val="24"/>
+        </w:rPr>
+        <w:t>atau</w:t>
+      </w:r>
+      <w:proofErr w:type="spellEnd"/>
+      <w:r>
+        <w:rPr>
+          <w:rFonts w:ascii="Times New Roman" w:hAnsi="Times New Roman" w:cs="Times New Roman"/>
+          <w:szCs w:val="24"/>
+        </w:rPr>
+        <w:t xml:space="preserve"> </w:t>
+      </w:r>
+      <w:proofErr w:type="spellStart"/>
+      <w:r>
+        <w:rPr>
+          <w:rFonts w:ascii="Times New Roman" w:hAnsi="Times New Roman" w:cs="Times New Roman"/>
+          <w:szCs w:val="24"/>
+        </w:rPr>
+        <w:t>lebih</w:t>
+      </w:r>
+      <w:proofErr w:type="spellEnd"/>
+      <w:r>
+        <w:rPr>
+          <w:rFonts w:ascii="Times New Roman" w:hAnsi="Times New Roman" w:cs="Times New Roman"/>
+          <w:szCs w:val="24"/>
+        </w:rPr>
+        <w:t xml:space="preserve"> </w:t>
+      </w:r>
+      <w:proofErr w:type="spellStart"/>
+      <w:r>
+        <w:rPr>
+          <w:rFonts w:ascii="Times New Roman" w:hAnsi="Times New Roman" w:cs="Times New Roman"/>
+          <w:szCs w:val="24"/>
+        </w:rPr>
+        <w:t>elemen</w:t>
+      </w:r>
+      <w:proofErr w:type="spellEnd"/>
+      <w:r>
+        <w:rPr>
+          <w:rFonts w:ascii="Times New Roman" w:hAnsi="Times New Roman" w:cs="Times New Roman"/>
+          <w:szCs w:val="24"/>
+        </w:rPr>
+        <w:t xml:space="preserve"> </w:t>
+      </w:r>
+      <w:proofErr w:type="spellStart"/>
+      <w:r>
+        <w:rPr>
+          <w:rFonts w:ascii="Times New Roman" w:hAnsi="Times New Roman" w:cs="Times New Roman"/>
+          <w:szCs w:val="24"/>
+        </w:rPr>
+        <w:t>ke</w:t>
+      </w:r>
+      <w:proofErr w:type="spellEnd"/>
+      <w:r>
+        <w:rPr>
+          <w:rFonts w:ascii="Times New Roman" w:hAnsi="Times New Roman" w:cs="Times New Roman"/>
+          <w:szCs w:val="24"/>
+        </w:rPr>
+        <w:t xml:space="preserve"> </w:t>
+      </w:r>
+      <w:proofErr w:type="spellStart"/>
+      <w:r>
+        <w:rPr>
+          <w:rFonts w:ascii="Times New Roman" w:hAnsi="Times New Roman" w:cs="Times New Roman"/>
+          <w:szCs w:val="24"/>
+        </w:rPr>
+        <w:t>posisi</w:t>
+      </w:r>
+      <w:proofErr w:type="spellEnd"/>
+      <w:r>
+        <w:rPr>
+          <w:rFonts w:ascii="Times New Roman" w:hAnsi="Times New Roman" w:cs="Times New Roman"/>
+          <w:szCs w:val="24"/>
+        </w:rPr>
+        <w:t xml:space="preserve"> yang </w:t>
+      </w:r>
+      <w:proofErr w:type="spellStart"/>
+      <w:r>
+        <w:rPr>
+          <w:rFonts w:ascii="Times New Roman" w:hAnsi="Times New Roman" w:cs="Times New Roman"/>
+          <w:szCs w:val="24"/>
+        </w:rPr>
+        <w:t>tepat</w:t>
+      </w:r>
+      <w:proofErr w:type="spellEnd"/>
+      <w:r>
+        <w:rPr>
+          <w:rFonts w:ascii="Times New Roman" w:hAnsi="Times New Roman" w:cs="Times New Roman"/>
+          <w:szCs w:val="24"/>
+        </w:rPr>
+        <w:t xml:space="preserve"> </w:t>
+      </w:r>
+      <w:proofErr w:type="spellStart"/>
+      <w:r>
+        <w:rPr>
+          <w:rFonts w:ascii="Times New Roman" w:hAnsi="Times New Roman" w:cs="Times New Roman"/>
+          <w:szCs w:val="24"/>
+        </w:rPr>
+        <w:t>sebelum</w:t>
+      </w:r>
+      <w:proofErr w:type="spellEnd"/>
+      <w:r>
+        <w:rPr>
+          <w:rFonts w:ascii="Times New Roman" w:hAnsi="Times New Roman" w:cs="Times New Roman"/>
+          <w:szCs w:val="24"/>
+        </w:rPr>
+        <w:t xml:space="preserve"> </w:t>
+      </w:r>
+      <w:proofErr w:type="spellStart"/>
+      <w:r>
+        <w:rPr>
+          <w:rFonts w:ascii="Times New Roman" w:hAnsi="Times New Roman" w:cs="Times New Roman"/>
+          <w:szCs w:val="24"/>
+        </w:rPr>
+        <w:t>memproses</w:t>
+      </w:r>
+      <w:proofErr w:type="spellEnd"/>
+      <w:r>
+        <w:rPr>
+          <w:rFonts w:ascii="Times New Roman" w:hAnsi="Times New Roman" w:cs="Times New Roman"/>
+          <w:szCs w:val="24"/>
+        </w:rPr>
+        <w:t xml:space="preserve"> </w:t>
+      </w:r>
+      <w:proofErr w:type="spellStart"/>
+      <w:r>
+        <w:rPr>
+          <w:rFonts w:ascii="Times New Roman" w:hAnsi="Times New Roman" w:cs="Times New Roman"/>
+          <w:szCs w:val="24"/>
+        </w:rPr>
+        <w:t>bagian</w:t>
+      </w:r>
+      <w:proofErr w:type="spellEnd"/>
+      <w:r>
+        <w:rPr>
+          <w:rFonts w:ascii="Times New Roman" w:hAnsi="Times New Roman" w:cs="Times New Roman"/>
+          <w:szCs w:val="24"/>
+        </w:rPr>
+        <w:t xml:space="preserve"> array yang </w:t>
+      </w:r>
+      <w:proofErr w:type="spellStart"/>
+      <w:r>
+        <w:rPr>
+          <w:rFonts w:ascii="Times New Roman" w:hAnsi="Times New Roman" w:cs="Times New Roman"/>
+          <w:szCs w:val="24"/>
+        </w:rPr>
+        <w:t>lebih</w:t>
+      </w:r>
+      <w:proofErr w:type="spellEnd"/>
+      <w:r>
+        <w:rPr>
+          <w:rFonts w:ascii="Times New Roman" w:hAnsi="Times New Roman" w:cs="Times New Roman"/>
+          <w:szCs w:val="24"/>
+        </w:rPr>
+        <w:t xml:space="preserve"> </w:t>
+      </w:r>
+      <w:proofErr w:type="spellStart"/>
+      <w:r>
+        <w:rPr>
+          <w:rFonts w:ascii="Times New Roman" w:hAnsi="Times New Roman" w:cs="Times New Roman"/>
+          <w:szCs w:val="24"/>
+        </w:rPr>
+        <w:t>kecil</w:t>
+      </w:r>
+      <w:proofErr w:type="spellEnd"/>
+      <w:r>
+        <w:rPr>
+          <w:rFonts w:ascii="Times New Roman" w:hAnsi="Times New Roman" w:cs="Times New Roman"/>
+          <w:szCs w:val="24"/>
+        </w:rPr>
+        <w:t>.</w:t>
+      </w:r>
+    </w:p>
+    <w:p>
+      <w:pPr>
+        <w:spacing w:line="360" w:lineRule="auto"/>
+        <w:jc w:val="both"/>
         <w:rPr>
           <w:rFonts w:ascii="Times New Roman" w:hAnsi="Times New Roman" w:cs="Times New Roman"/>
           <w:szCs w:val="24"/>
@@ -6178,6 +8037,619 @@
     </w:sectPr>
   </w:body>
 </w:document>
+</file>
+
+<file path=word/numbering.xml><?xml version="1.0" encoding="utf-8"?>
+<w:numbering xmlns:wpc="http://schemas.microsoft.com/office/word/2010/wordprocessingCanvas" xmlns:cx="http://schemas.microsoft.com/office/drawing/2014/chartex" xmlns:cx1="http://schemas.microsoft.com/office/drawing/2015/9/8/chartex" xmlns:cx2="http://schemas.microsoft.com/office/drawing/2015/10/21/chartex" xmlns:cx3="http://schemas.microsoft.com/office/drawing/2016/5/9/chartex" xmlns:cx4="http://schemas.microsoft.com/office/drawing/2016/5/10/chartex" xmlns:cx5="http://schemas.microsoft.com/office/drawing/2016/5/11/chartex" xmlns:cx6="http://schemas.microsoft.com/office/drawing/2016/5/12/chartex" xmlns:cx7="http://schemas.microsoft.com/office/drawing/2016/5/13/chartex" xmlns:cx8="http://schemas.microsoft.com/office/drawing/2016/5/14/chartex" xmlns:mc="http://schemas.openxmlformats.org/markup-compatibility/2006" xmlns:aink="http://schemas.microsoft.com/office/drawing/2016/ink" xmlns:am3d="http://schemas.microsoft.com/office/drawing/2017/model3d" xmlns:o="urn:schemas-microsoft-com:office:office" xmlns:oel="http://schemas.microsoft.com/office/2019/extlst" xmlns:r="http://schemas.openxmlformats.org/officeDocument/2006/relationships" xmlns:m="http://schemas.openxmlformats.org/officeDocument/2006/math" xmlns:v="urn:schemas-microsoft-com:vml" xmlns:wp14="http://schemas.microsoft.com/office/word/2010/wordprocessingDrawing" xmlns:wp="http://schemas.openxmlformats.org/drawingml/2006/wordprocessingDrawing" xmlns:w10="urn:schemas-microsoft-com:office:word" xmlns:w="http://schemas.openxmlformats.org/wordprocessingml/2006/main" xmlns:w14="http://schemas.microsoft.com/office/word/2010/wordml" xmlns:w15="http://schemas.microsoft.com/office/word/2012/wordml" xmlns:w16cex="http://schemas.microsoft.com/office/word/2018/wordml/cex" xmlns:w16cid="http://schemas.microsoft.com/office/word/2016/wordml/cid" xmlns:w16="http://schemas.microsoft.com/office/word/2018/wordml" xmlns:w16du="http://schemas.microsoft.com/office/word/2023/wordml/word16du" xmlns:w16sdtdh="http://schemas.microsoft.com/office/word/2020/wordml/sdtdatahash" xmlns:w16sdtfl="http://schemas.microsoft.com/office/word/2024/wordml/sdtformatlock" xmlns:w16se="http://schemas.microsoft.com/office/word/2015/wordml/symex" xmlns:wpg="http://schemas.microsoft.com/office/word/2010/wordprocessingGroup" xmlns:wpi="http://schemas.microsoft.com/office/word/2010/wordprocessingInk" xmlns:wne="http://schemas.microsoft.com/office/word/2006/wordml" xmlns:wps="http://schemas.microsoft.com/office/word/2010/wordprocessingShape" mc:Ignorable="w14 w15 w16se w16cid w16 w16cex w16sdtdh w16sdtfl w16du wp14">
+  <w:abstractNum w:abstractNumId="0" w15:restartNumberingAfterBreak="0">
+    <w:nsid w:val="46C24901"/>
+    <w:multiLevelType w:val="multilevel"/>
+    <w:tmpl w:val="F5EC21B2"/>
+    <w:lvl w:ilvl="0">
+      <w:start w:val="1"/>
+      <w:numFmt w:val="bullet"/>
+      <w:lvlText w:val=""/>
+      <w:lvlJc w:val="left"/>
+      <w:pPr>
+        <w:tabs>
+          <w:tab w:val="num" w:pos="720"/>
+        </w:tabs>
+        <w:ind w:left="720" w:hanging="360"/>
+      </w:pPr>
+      <w:rPr>
+        <w:rFonts w:ascii="Symbol" w:hAnsi="Symbol" w:hint="default"/>
+        <w:sz w:val="20"/>
+      </w:rPr>
+    </w:lvl>
+    <w:lvl w:ilvl="1" w:tentative="1">
+      <w:start w:val="1"/>
+      <w:numFmt w:val="bullet"/>
+      <w:lvlText w:val="o"/>
+      <w:lvlJc w:val="left"/>
+      <w:pPr>
+        <w:tabs>
+          <w:tab w:val="num" w:pos="1440"/>
+        </w:tabs>
+        <w:ind w:left="1440" w:hanging="360"/>
+      </w:pPr>
+      <w:rPr>
+        <w:rFonts w:ascii="Courier New" w:hAnsi="Courier New" w:hint="default"/>
+        <w:sz w:val="20"/>
+      </w:rPr>
+    </w:lvl>
+    <w:lvl w:ilvl="2" w:tentative="1">
+      <w:start w:val="1"/>
+      <w:numFmt w:val="bullet"/>
+      <w:lvlText w:val=""/>
+      <w:lvlJc w:val="left"/>
+      <w:pPr>
+        <w:tabs>
+          <w:tab w:val="num" w:pos="2160"/>
+        </w:tabs>
+        <w:ind w:left="2160" w:hanging="360"/>
+      </w:pPr>
+      <w:rPr>
+        <w:rFonts w:ascii="Wingdings" w:hAnsi="Wingdings" w:hint="default"/>
+        <w:sz w:val="20"/>
+      </w:rPr>
+    </w:lvl>
+    <w:lvl w:ilvl="3" w:tentative="1">
+      <w:start w:val="1"/>
+      <w:numFmt w:val="bullet"/>
+      <w:lvlText w:val=""/>
+      <w:lvlJc w:val="left"/>
+      <w:pPr>
+        <w:tabs>
+          <w:tab w:val="num" w:pos="2880"/>
+        </w:tabs>
+        <w:ind w:left="2880" w:hanging="360"/>
+      </w:pPr>
+      <w:rPr>
+        <w:rFonts w:ascii="Wingdings" w:hAnsi="Wingdings" w:hint="default"/>
+        <w:sz w:val="20"/>
+      </w:rPr>
+    </w:lvl>
+    <w:lvl w:ilvl="4" w:tentative="1">
+      <w:start w:val="1"/>
+      <w:numFmt w:val="bullet"/>
+      <w:lvlText w:val=""/>
+      <w:lvlJc w:val="left"/>
+      <w:pPr>
+        <w:tabs>
+          <w:tab w:val="num" w:pos="3600"/>
+        </w:tabs>
+        <w:ind w:left="3600" w:hanging="360"/>
+      </w:pPr>
+      <w:rPr>
+        <w:rFonts w:ascii="Wingdings" w:hAnsi="Wingdings" w:hint="default"/>
+        <w:sz w:val="20"/>
+      </w:rPr>
+    </w:lvl>
+    <w:lvl w:ilvl="5" w:tentative="1">
+      <w:start w:val="1"/>
+      <w:numFmt w:val="bullet"/>
+      <w:lvlText w:val=""/>
+      <w:lvlJc w:val="left"/>
+      <w:pPr>
+        <w:tabs>
+          <w:tab w:val="num" w:pos="4320"/>
+        </w:tabs>
+        <w:ind w:left="4320" w:hanging="360"/>
+      </w:pPr>
+      <w:rPr>
+        <w:rFonts w:ascii="Wingdings" w:hAnsi="Wingdings" w:hint="default"/>
+        <w:sz w:val="20"/>
+      </w:rPr>
+    </w:lvl>
+    <w:lvl w:ilvl="6" w:tentative="1">
+      <w:start w:val="1"/>
+      <w:numFmt w:val="bullet"/>
+      <w:lvlText w:val=""/>
+      <w:lvlJc w:val="left"/>
+      <w:pPr>
+        <w:tabs>
+          <w:tab w:val="num" w:pos="5040"/>
+        </w:tabs>
+        <w:ind w:left="5040" w:hanging="360"/>
+      </w:pPr>
+      <w:rPr>
+        <w:rFonts w:ascii="Wingdings" w:hAnsi="Wingdings" w:hint="default"/>
+        <w:sz w:val="20"/>
+      </w:rPr>
+    </w:lvl>
+    <w:lvl w:ilvl="7" w:tentative="1">
+      <w:start w:val="1"/>
+      <w:numFmt w:val="bullet"/>
+      <w:lvlText w:val=""/>
+      <w:lvlJc w:val="left"/>
+      <w:pPr>
+        <w:tabs>
+          <w:tab w:val="num" w:pos="5760"/>
+        </w:tabs>
+        <w:ind w:left="5760" w:hanging="360"/>
+      </w:pPr>
+      <w:rPr>
+        <w:rFonts w:ascii="Wingdings" w:hAnsi="Wingdings" w:hint="default"/>
+        <w:sz w:val="20"/>
+      </w:rPr>
+    </w:lvl>
+    <w:lvl w:ilvl="8" w:tentative="1">
+      <w:start w:val="1"/>
+      <w:numFmt w:val="bullet"/>
+      <w:lvlText w:val=""/>
+      <w:lvlJc w:val="left"/>
+      <w:pPr>
+        <w:tabs>
+          <w:tab w:val="num" w:pos="6480"/>
+        </w:tabs>
+        <w:ind w:left="6480" w:hanging="360"/>
+      </w:pPr>
+      <w:rPr>
+        <w:rFonts w:ascii="Wingdings" w:hAnsi="Wingdings" w:hint="default"/>
+        <w:sz w:val="20"/>
+      </w:rPr>
+    </w:lvl>
+  </w:abstractNum>
+  <w:abstractNum w:abstractNumId="1" w15:restartNumberingAfterBreak="0">
+    <w:nsid w:val="54353269"/>
+    <w:multiLevelType w:val="multilevel"/>
+    <w:tmpl w:val="4A56448C"/>
+    <w:lvl w:ilvl="0">
+      <w:start w:val="1"/>
+      <w:numFmt w:val="bullet"/>
+      <w:lvlText w:val=""/>
+      <w:lvlJc w:val="left"/>
+      <w:pPr>
+        <w:tabs>
+          <w:tab w:val="num" w:pos="720"/>
+        </w:tabs>
+        <w:ind w:left="720" w:hanging="360"/>
+      </w:pPr>
+      <w:rPr>
+        <w:rFonts w:ascii="Symbol" w:hAnsi="Symbol" w:hint="default"/>
+        <w:sz w:val="20"/>
+      </w:rPr>
+    </w:lvl>
+    <w:lvl w:ilvl="1">
+      <w:start w:val="1"/>
+      <w:numFmt w:val="bullet"/>
+      <w:lvlText w:val="o"/>
+      <w:lvlJc w:val="left"/>
+      <w:pPr>
+        <w:tabs>
+          <w:tab w:val="num" w:pos="1440"/>
+        </w:tabs>
+        <w:ind w:left="1440" w:hanging="360"/>
+      </w:pPr>
+      <w:rPr>
+        <w:rFonts w:ascii="Courier New" w:hAnsi="Courier New" w:hint="default"/>
+        <w:sz w:val="20"/>
+      </w:rPr>
+    </w:lvl>
+    <w:lvl w:ilvl="2" w:tentative="1">
+      <w:start w:val="1"/>
+      <w:numFmt w:val="bullet"/>
+      <w:lvlText w:val=""/>
+      <w:lvlJc w:val="left"/>
+      <w:pPr>
+        <w:tabs>
+          <w:tab w:val="num" w:pos="2160"/>
+        </w:tabs>
+        <w:ind w:left="2160" w:hanging="360"/>
+      </w:pPr>
+      <w:rPr>
+        <w:rFonts w:ascii="Wingdings" w:hAnsi="Wingdings" w:hint="default"/>
+        <w:sz w:val="20"/>
+      </w:rPr>
+    </w:lvl>
+    <w:lvl w:ilvl="3" w:tentative="1">
+      <w:start w:val="1"/>
+      <w:numFmt w:val="bullet"/>
+      <w:lvlText w:val=""/>
+      <w:lvlJc w:val="left"/>
+      <w:pPr>
+        <w:tabs>
+          <w:tab w:val="num" w:pos="2880"/>
+        </w:tabs>
+        <w:ind w:left="2880" w:hanging="360"/>
+      </w:pPr>
+      <w:rPr>
+        <w:rFonts w:ascii="Wingdings" w:hAnsi="Wingdings" w:hint="default"/>
+        <w:sz w:val="20"/>
+      </w:rPr>
+    </w:lvl>
+    <w:lvl w:ilvl="4" w:tentative="1">
+      <w:start w:val="1"/>
+      <w:numFmt w:val="bullet"/>
+      <w:lvlText w:val=""/>
+      <w:lvlJc w:val="left"/>
+      <w:pPr>
+        <w:tabs>
+          <w:tab w:val="num" w:pos="3600"/>
+        </w:tabs>
+        <w:ind w:left="3600" w:hanging="360"/>
+      </w:pPr>
+      <w:rPr>
+        <w:rFonts w:ascii="Wingdings" w:hAnsi="Wingdings" w:hint="default"/>
+        <w:sz w:val="20"/>
+      </w:rPr>
+    </w:lvl>
+    <w:lvl w:ilvl="5" w:tentative="1">
+      <w:start w:val="1"/>
+      <w:numFmt w:val="bullet"/>
+      <w:lvlText w:val=""/>
+      <w:lvlJc w:val="left"/>
+      <w:pPr>
+        <w:tabs>
+          <w:tab w:val="num" w:pos="4320"/>
+        </w:tabs>
+        <w:ind w:left="4320" w:hanging="360"/>
+      </w:pPr>
+      <w:rPr>
+        <w:rFonts w:ascii="Wingdings" w:hAnsi="Wingdings" w:hint="default"/>
+        <w:sz w:val="20"/>
+      </w:rPr>
+    </w:lvl>
+    <w:lvl w:ilvl="6" w:tentative="1">
+      <w:start w:val="1"/>
+      <w:numFmt w:val="bullet"/>
+      <w:lvlText w:val=""/>
+      <w:lvlJc w:val="left"/>
+      <w:pPr>
+        <w:tabs>
+          <w:tab w:val="num" w:pos="5040"/>
+        </w:tabs>
+        <w:ind w:left="5040" w:hanging="360"/>
+      </w:pPr>
+      <w:rPr>
+        <w:rFonts w:ascii="Wingdings" w:hAnsi="Wingdings" w:hint="default"/>
+        <w:sz w:val="20"/>
+      </w:rPr>
+    </w:lvl>
+    <w:lvl w:ilvl="7" w:tentative="1">
+      <w:start w:val="1"/>
+      <w:numFmt w:val="bullet"/>
+      <w:lvlText w:val=""/>
+      <w:lvlJc w:val="left"/>
+      <w:pPr>
+        <w:tabs>
+          <w:tab w:val="num" w:pos="5760"/>
+        </w:tabs>
+        <w:ind w:left="5760" w:hanging="360"/>
+      </w:pPr>
+      <w:rPr>
+        <w:rFonts w:ascii="Wingdings" w:hAnsi="Wingdings" w:hint="default"/>
+        <w:sz w:val="20"/>
+      </w:rPr>
+    </w:lvl>
+    <w:lvl w:ilvl="8" w:tentative="1">
+      <w:start w:val="1"/>
+      <w:numFmt w:val="bullet"/>
+      <w:lvlText w:val=""/>
+      <w:lvlJc w:val="left"/>
+      <w:pPr>
+        <w:tabs>
+          <w:tab w:val="num" w:pos="6480"/>
+        </w:tabs>
+        <w:ind w:left="6480" w:hanging="360"/>
+      </w:pPr>
+      <w:rPr>
+        <w:rFonts w:ascii="Wingdings" w:hAnsi="Wingdings" w:hint="default"/>
+        <w:sz w:val="20"/>
+      </w:rPr>
+    </w:lvl>
+  </w:abstractNum>
+  <w:abstractNum w:abstractNumId="2" w15:restartNumberingAfterBreak="0">
+    <w:nsid w:val="5DAD7B79"/>
+    <w:multiLevelType w:val="multilevel"/>
+    <w:tmpl w:val="5DE817FE"/>
+    <w:lvl w:ilvl="0">
+      <w:start w:val="1"/>
+      <w:numFmt w:val="bullet"/>
+      <w:lvlText w:val=""/>
+      <w:lvlJc w:val="left"/>
+      <w:pPr>
+        <w:tabs>
+          <w:tab w:val="num" w:pos="720"/>
+        </w:tabs>
+        <w:ind w:left="720" w:hanging="360"/>
+      </w:pPr>
+      <w:rPr>
+        <w:rFonts w:ascii="Symbol" w:hAnsi="Symbol" w:hint="default"/>
+        <w:sz w:val="20"/>
+      </w:rPr>
+    </w:lvl>
+    <w:lvl w:ilvl="1" w:tentative="1">
+      <w:start w:val="1"/>
+      <w:numFmt w:val="bullet"/>
+      <w:lvlText w:val="o"/>
+      <w:lvlJc w:val="left"/>
+      <w:pPr>
+        <w:tabs>
+          <w:tab w:val="num" w:pos="1440"/>
+        </w:tabs>
+        <w:ind w:left="1440" w:hanging="360"/>
+      </w:pPr>
+      <w:rPr>
+        <w:rFonts w:ascii="Courier New" w:hAnsi="Courier New" w:hint="default"/>
+        <w:sz w:val="20"/>
+      </w:rPr>
+    </w:lvl>
+    <w:lvl w:ilvl="2" w:tentative="1">
+      <w:start w:val="1"/>
+      <w:numFmt w:val="bullet"/>
+      <w:lvlText w:val=""/>
+      <w:lvlJc w:val="left"/>
+      <w:pPr>
+        <w:tabs>
+          <w:tab w:val="num" w:pos="2160"/>
+        </w:tabs>
+        <w:ind w:left="2160" w:hanging="360"/>
+      </w:pPr>
+      <w:rPr>
+        <w:rFonts w:ascii="Wingdings" w:hAnsi="Wingdings" w:hint="default"/>
+        <w:sz w:val="20"/>
+      </w:rPr>
+    </w:lvl>
+    <w:lvl w:ilvl="3" w:tentative="1">
+      <w:start w:val="1"/>
+      <w:numFmt w:val="bullet"/>
+      <w:lvlText w:val=""/>
+      <w:lvlJc w:val="left"/>
+      <w:pPr>
+        <w:tabs>
+          <w:tab w:val="num" w:pos="2880"/>
+        </w:tabs>
+        <w:ind w:left="2880" w:hanging="360"/>
+      </w:pPr>
+      <w:rPr>
+        <w:rFonts w:ascii="Wingdings" w:hAnsi="Wingdings" w:hint="default"/>
+        <w:sz w:val="20"/>
+      </w:rPr>
+    </w:lvl>
+    <w:lvl w:ilvl="4" w:tentative="1">
+      <w:start w:val="1"/>
+      <w:numFmt w:val="bullet"/>
+      <w:lvlText w:val=""/>
+      <w:lvlJc w:val="left"/>
+      <w:pPr>
+        <w:tabs>
+          <w:tab w:val="num" w:pos="3600"/>
+        </w:tabs>
+        <w:ind w:left="3600" w:hanging="360"/>
+      </w:pPr>
+      <w:rPr>
+        <w:rFonts w:ascii="Wingdings" w:hAnsi="Wingdings" w:hint="default"/>
+        <w:sz w:val="20"/>
+      </w:rPr>
+    </w:lvl>
+    <w:lvl w:ilvl="5" w:tentative="1">
+      <w:start w:val="1"/>
+      <w:numFmt w:val="bullet"/>
+      <w:lvlText w:val=""/>
+      <w:lvlJc w:val="left"/>
+      <w:pPr>
+        <w:tabs>
+          <w:tab w:val="num" w:pos="4320"/>
+        </w:tabs>
+        <w:ind w:left="4320" w:hanging="360"/>
+      </w:pPr>
+      <w:rPr>
+        <w:rFonts w:ascii="Wingdings" w:hAnsi="Wingdings" w:hint="default"/>
+        <w:sz w:val="20"/>
+      </w:rPr>
+    </w:lvl>
+    <w:lvl w:ilvl="6" w:tentative="1">
+      <w:start w:val="1"/>
+      <w:numFmt w:val="bullet"/>
+      <w:lvlText w:val=""/>
+      <w:lvlJc w:val="left"/>
+      <w:pPr>
+        <w:tabs>
+          <w:tab w:val="num" w:pos="5040"/>
+        </w:tabs>
+        <w:ind w:left="5040" w:hanging="360"/>
+      </w:pPr>
+      <w:rPr>
+        <w:rFonts w:ascii="Wingdings" w:hAnsi="Wingdings" w:hint="default"/>
+        <w:sz w:val="20"/>
+      </w:rPr>
+    </w:lvl>
+    <w:lvl w:ilvl="7" w:tentative="1">
+      <w:start w:val="1"/>
+      <w:numFmt w:val="bullet"/>
+      <w:lvlText w:val=""/>
+      <w:lvlJc w:val="left"/>
+      <w:pPr>
+        <w:tabs>
+          <w:tab w:val="num" w:pos="5760"/>
+        </w:tabs>
+        <w:ind w:left="5760" w:hanging="360"/>
+      </w:pPr>
+      <w:rPr>
+        <w:rFonts w:ascii="Wingdings" w:hAnsi="Wingdings" w:hint="default"/>
+        <w:sz w:val="20"/>
+      </w:rPr>
+    </w:lvl>
+    <w:lvl w:ilvl="8" w:tentative="1">
+      <w:start w:val="1"/>
+      <w:numFmt w:val="bullet"/>
+      <w:lvlText w:val=""/>
+      <w:lvlJc w:val="left"/>
+      <w:pPr>
+        <w:tabs>
+          <w:tab w:val="num" w:pos="6480"/>
+        </w:tabs>
+        <w:ind w:left="6480" w:hanging="360"/>
+      </w:pPr>
+      <w:rPr>
+        <w:rFonts w:ascii="Wingdings" w:hAnsi="Wingdings" w:hint="default"/>
+        <w:sz w:val="20"/>
+      </w:rPr>
+    </w:lvl>
+  </w:abstractNum>
+  <w:abstractNum w:abstractNumId="3" w15:restartNumberingAfterBreak="0">
+    <w:nsid w:val="6BA1454F"/>
+    <w:multiLevelType w:val="multilevel"/>
+    <w:tmpl w:val="60306FD0"/>
+    <w:lvl w:ilvl="0">
+      <w:start w:val="1"/>
+      <w:numFmt w:val="bullet"/>
+      <w:lvlText w:val=""/>
+      <w:lvlJc w:val="left"/>
+      <w:pPr>
+        <w:tabs>
+          <w:tab w:val="num" w:pos="720"/>
+        </w:tabs>
+        <w:ind w:left="720" w:hanging="360"/>
+      </w:pPr>
+      <w:rPr>
+        <w:rFonts w:ascii="Symbol" w:hAnsi="Symbol" w:hint="default"/>
+        <w:sz w:val="20"/>
+      </w:rPr>
+    </w:lvl>
+    <w:lvl w:ilvl="1">
+      <w:start w:val="1"/>
+      <w:numFmt w:val="bullet"/>
+      <w:lvlText w:val="o"/>
+      <w:lvlJc w:val="left"/>
+      <w:pPr>
+        <w:tabs>
+          <w:tab w:val="num" w:pos="1440"/>
+        </w:tabs>
+        <w:ind w:left="1440" w:hanging="360"/>
+      </w:pPr>
+      <w:rPr>
+        <w:rFonts w:ascii="Courier New" w:hAnsi="Courier New" w:hint="default"/>
+        <w:sz w:val="20"/>
+      </w:rPr>
+    </w:lvl>
+    <w:lvl w:ilvl="2" w:tentative="1">
+      <w:start w:val="1"/>
+      <w:numFmt w:val="bullet"/>
+      <w:lvlText w:val=""/>
+      <w:lvlJc w:val="left"/>
+      <w:pPr>
+        <w:tabs>
+          <w:tab w:val="num" w:pos="2160"/>
+        </w:tabs>
+        <w:ind w:left="2160" w:hanging="360"/>
+      </w:pPr>
+      <w:rPr>
+        <w:rFonts w:ascii="Wingdings" w:hAnsi="Wingdings" w:hint="default"/>
+        <w:sz w:val="20"/>
+      </w:rPr>
+    </w:lvl>
+    <w:lvl w:ilvl="3" w:tentative="1">
+      <w:start w:val="1"/>
+      <w:numFmt w:val="bullet"/>
+      <w:lvlText w:val=""/>
+      <w:lvlJc w:val="left"/>
+      <w:pPr>
+        <w:tabs>
+          <w:tab w:val="num" w:pos="2880"/>
+        </w:tabs>
+        <w:ind w:left="2880" w:hanging="360"/>
+      </w:pPr>
+      <w:rPr>
+        <w:rFonts w:ascii="Wingdings" w:hAnsi="Wingdings" w:hint="default"/>
+        <w:sz w:val="20"/>
+      </w:rPr>
+    </w:lvl>
+    <w:lvl w:ilvl="4" w:tentative="1">
+      <w:start w:val="1"/>
+      <w:numFmt w:val="bullet"/>
+      <w:lvlText w:val=""/>
+      <w:lvlJc w:val="left"/>
+      <w:pPr>
+        <w:tabs>
+          <w:tab w:val="num" w:pos="3600"/>
+        </w:tabs>
+        <w:ind w:left="3600" w:hanging="360"/>
+      </w:pPr>
+      <w:rPr>
+        <w:rFonts w:ascii="Wingdings" w:hAnsi="Wingdings" w:hint="default"/>
+        <w:sz w:val="20"/>
+      </w:rPr>
+    </w:lvl>
+    <w:lvl w:ilvl="5" w:tentative="1">
+      <w:start w:val="1"/>
+      <w:numFmt w:val="bullet"/>
+      <w:lvlText w:val=""/>
+      <w:lvlJc w:val="left"/>
+      <w:pPr>
+        <w:tabs>
+          <w:tab w:val="num" w:pos="4320"/>
+        </w:tabs>
+        <w:ind w:left="4320" w:hanging="360"/>
+      </w:pPr>
+      <w:rPr>
+        <w:rFonts w:ascii="Wingdings" w:hAnsi="Wingdings" w:hint="default"/>
+        <w:sz w:val="20"/>
+      </w:rPr>
+    </w:lvl>
+    <w:lvl w:ilvl="6" w:tentative="1">
+      <w:start w:val="1"/>
+      <w:numFmt w:val="bullet"/>
+      <w:lvlText w:val=""/>
+      <w:lvlJc w:val="left"/>
+      <w:pPr>
+        <w:tabs>
+          <w:tab w:val="num" w:pos="5040"/>
+        </w:tabs>
+        <w:ind w:left="5040" w:hanging="360"/>
+      </w:pPr>
+      <w:rPr>
+        <w:rFonts w:ascii="Wingdings" w:hAnsi="Wingdings" w:hint="default"/>
+        <w:sz w:val="20"/>
+      </w:rPr>
+    </w:lvl>
+    <w:lvl w:ilvl="7" w:tentative="1">
+      <w:start w:val="1"/>
+      <w:numFmt w:val="bullet"/>
+      <w:lvlText w:val=""/>
+      <w:lvlJc w:val="left"/>
+      <w:pPr>
+        <w:tabs>
+          <w:tab w:val="num" w:pos="5760"/>
+        </w:tabs>
+        <w:ind w:left="5760" w:hanging="360"/>
+      </w:pPr>
+      <w:rPr>
+        <w:rFonts w:ascii="Wingdings" w:hAnsi="Wingdings" w:hint="default"/>
+        <w:sz w:val="20"/>
+      </w:rPr>
+    </w:lvl>
+    <w:lvl w:ilvl="8" w:tentative="1">
+      <w:start w:val="1"/>
+      <w:numFmt w:val="bullet"/>
+      <w:lvlText w:val=""/>
+      <w:lvlJc w:val="left"/>
+      <w:pPr>
+        <w:tabs>
+          <w:tab w:val="num" w:pos="6480"/>
+        </w:tabs>
+        <w:ind w:left="6480" w:hanging="360"/>
+      </w:pPr>
+      <w:rPr>
+        <w:rFonts w:ascii="Wingdings" w:hAnsi="Wingdings" w:hint="default"/>
+        <w:sz w:val="20"/>
+      </w:rPr>
+    </w:lvl>
+  </w:abstractNum>
+  <w:num w:numId="1" w16cid:durableId="440801600">
+    <w:abstractNumId w:val="0"/>
+  </w:num>
+  <w:num w:numId="2" w16cid:durableId="238904428">
+    <w:abstractNumId w:val="3"/>
+  </w:num>
+  <w:num w:numId="3" w16cid:durableId="1902015101">
+    <w:abstractNumId w:val="2"/>
+  </w:num>
+  <w:num w:numId="4" w16cid:durableId="432940936">
+    <w:abstractNumId w:val="1"/>
+  </w:num>
+</w:numbering>
 </file>
 
 <file path=word/styles.xml><?xml version="1.0" encoding="utf-8"?>

</xml_diff>

<commit_message>
docs: menambahkan penjelasan teknis file header sorting.h ke dalam laporan
</commit_message>
<xml_diff>
--- a/Laporan.docx
+++ b/Laporan.docx
@@ -36,7 +36,7 @@
           </w:tcPr>
           <w:p>
             <w:pPr>
-              <w:spacing w:after="0" w:line="360" w:lineRule="auto"/>
+              <w:spacing w:after="0" w:line="240" w:lineRule="auto"/>
               <w:jc w:val="center"/>
               <w:rPr>
                 <w:rFonts w:ascii="Times New Roman" w:eastAsia="Times New Roman" w:hAnsi="Times New Roman" w:cs="Times New Roman"/>
@@ -79,7 +79,7 @@
           </w:tcPr>
           <w:p>
             <w:pPr>
-              <w:spacing w:after="0" w:line="360" w:lineRule="auto"/>
+              <w:spacing w:after="0" w:line="240" w:lineRule="auto"/>
               <w:jc w:val="center"/>
               <w:rPr>
                 <w:rFonts w:ascii="Times New Roman" w:eastAsia="Times New Roman" w:hAnsi="Times New Roman" w:cs="Times New Roman"/>
@@ -122,7 +122,7 @@
           </w:tcPr>
           <w:p>
             <w:pPr>
-              <w:spacing w:after="0" w:line="360" w:lineRule="auto"/>
+              <w:spacing w:after="0" w:line="240" w:lineRule="auto"/>
               <w:jc w:val="center"/>
               <w:rPr>
                 <w:rFonts w:ascii="Times New Roman" w:eastAsia="Times New Roman" w:hAnsi="Times New Roman" w:cs="Times New Roman"/>
@@ -165,7 +165,7 @@
           </w:tcPr>
           <w:p>
             <w:pPr>
-              <w:spacing w:after="0" w:line="360" w:lineRule="auto"/>
+              <w:spacing w:after="0" w:line="240" w:lineRule="auto"/>
               <w:jc w:val="center"/>
               <w:rPr>
                 <w:rFonts w:ascii="Times New Roman" w:eastAsia="Times New Roman" w:hAnsi="Times New Roman" w:cs="Times New Roman"/>
@@ -208,7 +208,7 @@
           </w:tcPr>
           <w:p>
             <w:pPr>
-              <w:spacing w:after="0" w:line="360" w:lineRule="auto"/>
+              <w:spacing w:after="0" w:line="240" w:lineRule="auto"/>
               <w:jc w:val="center"/>
               <w:rPr>
                 <w:rFonts w:ascii="Times New Roman" w:eastAsia="Times New Roman" w:hAnsi="Times New Roman" w:cs="Times New Roman"/>
@@ -251,7 +251,7 @@
           </w:tcPr>
           <w:p>
             <w:pPr>
-              <w:spacing w:after="0" w:line="360" w:lineRule="auto"/>
+              <w:spacing w:after="0" w:line="240" w:lineRule="auto"/>
               <w:jc w:val="center"/>
               <w:rPr>
                 <w:rFonts w:ascii="Times New Roman" w:eastAsia="Times New Roman" w:hAnsi="Times New Roman" w:cs="Times New Roman"/>
@@ -294,7 +294,7 @@
           </w:tcPr>
           <w:p>
             <w:pPr>
-              <w:spacing w:after="0" w:line="360" w:lineRule="auto"/>
+              <w:spacing w:after="0" w:line="240" w:lineRule="auto"/>
               <w:jc w:val="center"/>
               <w:rPr>
                 <w:rFonts w:ascii="Times New Roman" w:eastAsia="Times New Roman" w:hAnsi="Times New Roman" w:cs="Times New Roman"/>
@@ -343,7 +343,7 @@
           </w:tcPr>
           <w:p>
             <w:pPr>
-              <w:spacing w:after="0" w:line="360" w:lineRule="auto"/>
+              <w:spacing w:after="0" w:line="240" w:lineRule="auto"/>
               <w:rPr>
                 <w:rFonts w:ascii="Times New Roman" w:eastAsia="Times New Roman" w:hAnsi="Times New Roman" w:cs="Times New Roman"/>
                 <w:b/>
@@ -355,7 +355,6 @@
                 <w14:ligatures w14:val="none"/>
               </w:rPr>
             </w:pPr>
-            <w:proofErr w:type="spellStart"/>
             <w:r>
               <w:rPr>
                 <w:rFonts w:ascii="Times New Roman" w:eastAsia="Times New Roman" w:hAnsi="Times New Roman" w:cs="Times New Roman"/>
@@ -367,21 +366,7 @@
                 <w:lang w:bidi="ar-SA"/>
                 <w14:ligatures w14:val="none"/>
               </w:rPr>
-              <w:t>Iterasi</w:t>
-            </w:r>
-            <w:proofErr w:type="spellEnd"/>
-            <w:r>
-              <w:rPr>
-                <w:rFonts w:ascii="Times New Roman" w:eastAsia="Times New Roman" w:hAnsi="Times New Roman" w:cs="Times New Roman"/>
-                <w:b/>
-                <w:bCs/>
-                <w:color w:val="000000"/>
-                <w:kern w:val="0"/>
-                <w:szCs w:val="24"/>
-                <w:lang w:bidi="ar-SA"/>
-                <w14:ligatures w14:val="none"/>
-              </w:rPr>
-              <w:t xml:space="preserve"> 1</w:t>
+              <w:t>Iterasi 1</w:t>
             </w:r>
           </w:p>
         </w:tc>
@@ -406,7 +391,7 @@
           </w:tcPr>
           <w:p>
             <w:pPr>
-              <w:spacing w:after="0" w:line="360" w:lineRule="auto"/>
+              <w:spacing w:after="0" w:line="240" w:lineRule="auto"/>
               <w:jc w:val="center"/>
               <w:rPr>
                 <w:rFonts w:ascii="Times New Roman" w:eastAsia="Times New Roman" w:hAnsi="Times New Roman" w:cs="Times New Roman"/>
@@ -445,7 +430,7 @@
           </w:tcPr>
           <w:p>
             <w:pPr>
-              <w:spacing w:after="0" w:line="360" w:lineRule="auto"/>
+              <w:spacing w:after="0" w:line="240" w:lineRule="auto"/>
               <w:jc w:val="center"/>
               <w:rPr>
                 <w:rFonts w:ascii="Times New Roman" w:eastAsia="Times New Roman" w:hAnsi="Times New Roman" w:cs="Times New Roman"/>
@@ -484,7 +469,7 @@
           </w:tcPr>
           <w:p>
             <w:pPr>
-              <w:spacing w:after="0" w:line="360" w:lineRule="auto"/>
+              <w:spacing w:after="0" w:line="240" w:lineRule="auto"/>
               <w:jc w:val="center"/>
               <w:rPr>
                 <w:rFonts w:ascii="Times New Roman" w:eastAsia="Times New Roman" w:hAnsi="Times New Roman" w:cs="Times New Roman"/>
@@ -523,7 +508,7 @@
           </w:tcPr>
           <w:p>
             <w:pPr>
-              <w:spacing w:after="0" w:line="360" w:lineRule="auto"/>
+              <w:spacing w:after="0" w:line="240" w:lineRule="auto"/>
               <w:jc w:val="center"/>
               <w:rPr>
                 <w:rFonts w:ascii="Times New Roman" w:eastAsia="Times New Roman" w:hAnsi="Times New Roman" w:cs="Times New Roman"/>
@@ -562,7 +547,7 @@
           </w:tcPr>
           <w:p>
             <w:pPr>
-              <w:spacing w:after="0" w:line="360" w:lineRule="auto"/>
+              <w:spacing w:after="0" w:line="240" w:lineRule="auto"/>
               <w:jc w:val="center"/>
               <w:rPr>
                 <w:rFonts w:ascii="Times New Roman" w:eastAsia="Times New Roman" w:hAnsi="Times New Roman" w:cs="Times New Roman"/>
@@ -601,7 +586,7 @@
           </w:tcPr>
           <w:p>
             <w:pPr>
-              <w:spacing w:after="0" w:line="360" w:lineRule="auto"/>
+              <w:spacing w:after="0" w:line="240" w:lineRule="auto"/>
               <w:jc w:val="center"/>
               <w:rPr>
                 <w:rFonts w:ascii="Times New Roman" w:eastAsia="Times New Roman" w:hAnsi="Times New Roman" w:cs="Times New Roman"/>
@@ -640,7 +625,7 @@
           </w:tcPr>
           <w:p>
             <w:pPr>
-              <w:spacing w:after="0" w:line="360" w:lineRule="auto"/>
+              <w:spacing w:after="0" w:line="240" w:lineRule="auto"/>
               <w:jc w:val="center"/>
               <w:rPr>
                 <w:rFonts w:ascii="Times New Roman" w:eastAsia="Times New Roman" w:hAnsi="Times New Roman" w:cs="Times New Roman"/>
@@ -684,34 +669,34 @@
           </w:tcPr>
           <w:p>
             <w:pPr>
-              <w:spacing w:after="0" w:line="360" w:lineRule="auto"/>
-              <w:rPr>
-                <w:rFonts w:ascii="Times New Roman" w:eastAsia="Times New Roman" w:hAnsi="Times New Roman" w:cs="Times New Roman"/>
-                <w:color w:val="000000"/>
-                <w:kern w:val="0"/>
-                <w:szCs w:val="24"/>
-                <w:lang w:bidi="ar-SA"/>
-                <w14:ligatures w14:val="none"/>
-              </w:rPr>
-            </w:pPr>
-          </w:p>
-        </w:tc>
-        <w:tc>
-          <w:tcPr>
-            <w:tcW w:w="960" w:type="dxa"/>
-            <w:tcBorders>
-              <w:top w:val="nil"/>
-              <w:left w:val="nil"/>
-              <w:bottom w:val="single" w:sz="4" w:space="0" w:color="auto"/>
-              <w:right w:val="single" w:sz="4" w:space="0" w:color="auto"/>
-            </w:tcBorders>
-            <w:noWrap/>
-            <w:vAlign w:val="center"/>
-            <w:hideMark/>
-          </w:tcPr>
-          <w:p>
-            <w:pPr>
-              <w:spacing w:after="0" w:line="360" w:lineRule="auto"/>
+              <w:spacing w:after="0" w:line="240" w:lineRule="auto"/>
+              <w:rPr>
+                <w:rFonts w:ascii="Times New Roman" w:eastAsia="Times New Roman" w:hAnsi="Times New Roman" w:cs="Times New Roman"/>
+                <w:color w:val="000000"/>
+                <w:kern w:val="0"/>
+                <w:szCs w:val="24"/>
+                <w:lang w:bidi="ar-SA"/>
+                <w14:ligatures w14:val="none"/>
+              </w:rPr>
+            </w:pPr>
+          </w:p>
+        </w:tc>
+        <w:tc>
+          <w:tcPr>
+            <w:tcW w:w="960" w:type="dxa"/>
+            <w:tcBorders>
+              <w:top w:val="nil"/>
+              <w:left w:val="nil"/>
+              <w:bottom w:val="single" w:sz="4" w:space="0" w:color="auto"/>
+              <w:right w:val="single" w:sz="4" w:space="0" w:color="auto"/>
+            </w:tcBorders>
+            <w:noWrap/>
+            <w:vAlign w:val="center"/>
+            <w:hideMark/>
+          </w:tcPr>
+          <w:p>
+            <w:pPr>
+              <w:spacing w:after="0" w:line="240" w:lineRule="auto"/>
               <w:jc w:val="center"/>
               <w:rPr>
                 <w:rFonts w:ascii="Times New Roman" w:eastAsia="Times New Roman" w:hAnsi="Times New Roman" w:cs="Times New Roman"/>
@@ -750,7 +735,7 @@
           </w:tcPr>
           <w:p>
             <w:pPr>
-              <w:spacing w:after="0" w:line="360" w:lineRule="auto"/>
+              <w:spacing w:after="0" w:line="240" w:lineRule="auto"/>
               <w:jc w:val="center"/>
               <w:rPr>
                 <w:rFonts w:ascii="Times New Roman" w:eastAsia="Times New Roman" w:hAnsi="Times New Roman" w:cs="Times New Roman"/>
@@ -789,7 +774,7 @@
           </w:tcPr>
           <w:p>
             <w:pPr>
-              <w:spacing w:after="0" w:line="360" w:lineRule="auto"/>
+              <w:spacing w:after="0" w:line="240" w:lineRule="auto"/>
               <w:jc w:val="center"/>
               <w:rPr>
                 <w:rFonts w:ascii="Times New Roman" w:eastAsia="Times New Roman" w:hAnsi="Times New Roman" w:cs="Times New Roman"/>
@@ -828,7 +813,7 @@
           </w:tcPr>
           <w:p>
             <w:pPr>
-              <w:spacing w:after="0" w:line="360" w:lineRule="auto"/>
+              <w:spacing w:after="0" w:line="240" w:lineRule="auto"/>
               <w:jc w:val="center"/>
               <w:rPr>
                 <w:rFonts w:ascii="Times New Roman" w:eastAsia="Times New Roman" w:hAnsi="Times New Roman" w:cs="Times New Roman"/>
@@ -867,7 +852,7 @@
           </w:tcPr>
           <w:p>
             <w:pPr>
-              <w:spacing w:after="0" w:line="360" w:lineRule="auto"/>
+              <w:spacing w:after="0" w:line="240" w:lineRule="auto"/>
               <w:jc w:val="center"/>
               <w:rPr>
                 <w:rFonts w:ascii="Times New Roman" w:eastAsia="Times New Roman" w:hAnsi="Times New Roman" w:cs="Times New Roman"/>
@@ -906,7 +891,7 @@
           </w:tcPr>
           <w:p>
             <w:pPr>
-              <w:spacing w:after="0" w:line="360" w:lineRule="auto"/>
+              <w:spacing w:after="0" w:line="240" w:lineRule="auto"/>
               <w:jc w:val="center"/>
               <w:rPr>
                 <w:rFonts w:ascii="Times New Roman" w:eastAsia="Times New Roman" w:hAnsi="Times New Roman" w:cs="Times New Roman"/>
@@ -950,34 +935,34 @@
           </w:tcPr>
           <w:p>
             <w:pPr>
-              <w:spacing w:after="0" w:line="360" w:lineRule="auto"/>
-              <w:rPr>
-                <w:rFonts w:ascii="Times New Roman" w:eastAsia="Times New Roman" w:hAnsi="Times New Roman" w:cs="Times New Roman"/>
-                <w:color w:val="000000"/>
-                <w:kern w:val="0"/>
-                <w:szCs w:val="24"/>
-                <w:lang w:bidi="ar-SA"/>
-                <w14:ligatures w14:val="none"/>
-              </w:rPr>
-            </w:pPr>
-          </w:p>
-        </w:tc>
-        <w:tc>
-          <w:tcPr>
-            <w:tcW w:w="960" w:type="dxa"/>
-            <w:tcBorders>
-              <w:top w:val="nil"/>
-              <w:left w:val="nil"/>
-              <w:bottom w:val="single" w:sz="4" w:space="0" w:color="auto"/>
-              <w:right w:val="single" w:sz="4" w:space="0" w:color="auto"/>
-            </w:tcBorders>
-            <w:noWrap/>
-            <w:vAlign w:val="center"/>
-            <w:hideMark/>
-          </w:tcPr>
-          <w:p>
-            <w:pPr>
-              <w:spacing w:after="0" w:line="360" w:lineRule="auto"/>
+              <w:spacing w:after="0" w:line="240" w:lineRule="auto"/>
+              <w:rPr>
+                <w:rFonts w:ascii="Times New Roman" w:eastAsia="Times New Roman" w:hAnsi="Times New Roman" w:cs="Times New Roman"/>
+                <w:color w:val="000000"/>
+                <w:kern w:val="0"/>
+                <w:szCs w:val="24"/>
+                <w:lang w:bidi="ar-SA"/>
+                <w14:ligatures w14:val="none"/>
+              </w:rPr>
+            </w:pPr>
+          </w:p>
+        </w:tc>
+        <w:tc>
+          <w:tcPr>
+            <w:tcW w:w="960" w:type="dxa"/>
+            <w:tcBorders>
+              <w:top w:val="nil"/>
+              <w:left w:val="nil"/>
+              <w:bottom w:val="single" w:sz="4" w:space="0" w:color="auto"/>
+              <w:right w:val="single" w:sz="4" w:space="0" w:color="auto"/>
+            </w:tcBorders>
+            <w:noWrap/>
+            <w:vAlign w:val="center"/>
+            <w:hideMark/>
+          </w:tcPr>
+          <w:p>
+            <w:pPr>
+              <w:spacing w:after="0" w:line="240" w:lineRule="auto"/>
               <w:jc w:val="center"/>
               <w:rPr>
                 <w:rFonts w:ascii="Times New Roman" w:eastAsia="Times New Roman" w:hAnsi="Times New Roman" w:cs="Times New Roman"/>
@@ -1016,7 +1001,7 @@
           </w:tcPr>
           <w:p>
             <w:pPr>
-              <w:spacing w:after="0" w:line="360" w:lineRule="auto"/>
+              <w:spacing w:after="0" w:line="240" w:lineRule="auto"/>
               <w:jc w:val="center"/>
               <w:rPr>
                 <w:rFonts w:ascii="Times New Roman" w:eastAsia="Times New Roman" w:hAnsi="Times New Roman" w:cs="Times New Roman"/>
@@ -1055,7 +1040,7 @@
           </w:tcPr>
           <w:p>
             <w:pPr>
-              <w:spacing w:after="0" w:line="360" w:lineRule="auto"/>
+              <w:spacing w:after="0" w:line="240" w:lineRule="auto"/>
               <w:jc w:val="center"/>
               <w:rPr>
                 <w:rFonts w:ascii="Times New Roman" w:eastAsia="Times New Roman" w:hAnsi="Times New Roman" w:cs="Times New Roman"/>
@@ -1094,7 +1079,7 @@
           </w:tcPr>
           <w:p>
             <w:pPr>
-              <w:spacing w:after="0" w:line="360" w:lineRule="auto"/>
+              <w:spacing w:after="0" w:line="240" w:lineRule="auto"/>
               <w:jc w:val="center"/>
               <w:rPr>
                 <w:rFonts w:ascii="Times New Roman" w:eastAsia="Times New Roman" w:hAnsi="Times New Roman" w:cs="Times New Roman"/>
@@ -1133,7 +1118,7 @@
           </w:tcPr>
           <w:p>
             <w:pPr>
-              <w:spacing w:after="0" w:line="360" w:lineRule="auto"/>
+              <w:spacing w:after="0" w:line="240" w:lineRule="auto"/>
               <w:jc w:val="center"/>
               <w:rPr>
                 <w:rFonts w:ascii="Times New Roman" w:eastAsia="Times New Roman" w:hAnsi="Times New Roman" w:cs="Times New Roman"/>
@@ -1172,7 +1157,7 @@
           </w:tcPr>
           <w:p>
             <w:pPr>
-              <w:spacing w:after="0" w:line="360" w:lineRule="auto"/>
+              <w:spacing w:after="0" w:line="240" w:lineRule="auto"/>
               <w:jc w:val="center"/>
               <w:rPr>
                 <w:rFonts w:ascii="Times New Roman" w:eastAsia="Times New Roman" w:hAnsi="Times New Roman" w:cs="Times New Roman"/>
@@ -1216,7 +1201,7 @@
           </w:tcPr>
           <w:p>
             <w:pPr>
-              <w:spacing w:after="0" w:line="360" w:lineRule="auto"/>
+              <w:spacing w:after="0" w:line="240" w:lineRule="auto"/>
               <w:jc w:val="center"/>
               <w:rPr>
                 <w:rFonts w:ascii="Times New Roman" w:eastAsia="Times New Roman" w:hAnsi="Times New Roman" w:cs="Times New Roman"/>
@@ -1255,7 +1240,7 @@
           </w:tcPr>
           <w:p>
             <w:pPr>
-              <w:spacing w:after="0" w:line="360" w:lineRule="auto"/>
+              <w:spacing w:after="0" w:line="240" w:lineRule="auto"/>
               <w:jc w:val="center"/>
               <w:rPr>
                 <w:rFonts w:ascii="Times New Roman" w:eastAsia="Times New Roman" w:hAnsi="Times New Roman" w:cs="Times New Roman"/>
@@ -1294,7 +1279,7 @@
           </w:tcPr>
           <w:p>
             <w:pPr>
-              <w:spacing w:after="0" w:line="360" w:lineRule="auto"/>
+              <w:spacing w:after="0" w:line="240" w:lineRule="auto"/>
               <w:jc w:val="center"/>
               <w:rPr>
                 <w:rFonts w:ascii="Times New Roman" w:eastAsia="Times New Roman" w:hAnsi="Times New Roman" w:cs="Times New Roman"/>
@@ -1333,7 +1318,7 @@
           </w:tcPr>
           <w:p>
             <w:pPr>
-              <w:spacing w:after="0" w:line="360" w:lineRule="auto"/>
+              <w:spacing w:after="0" w:line="240" w:lineRule="auto"/>
               <w:jc w:val="center"/>
               <w:rPr>
                 <w:rFonts w:ascii="Times New Roman" w:eastAsia="Times New Roman" w:hAnsi="Times New Roman" w:cs="Times New Roman"/>
@@ -1372,7 +1357,7 @@
           </w:tcPr>
           <w:p>
             <w:pPr>
-              <w:spacing w:after="0" w:line="360" w:lineRule="auto"/>
+              <w:spacing w:after="0" w:line="240" w:lineRule="auto"/>
               <w:jc w:val="center"/>
               <w:rPr>
                 <w:rFonts w:ascii="Times New Roman" w:eastAsia="Times New Roman" w:hAnsi="Times New Roman" w:cs="Times New Roman"/>
@@ -1411,7 +1396,7 @@
           </w:tcPr>
           <w:p>
             <w:pPr>
-              <w:spacing w:after="0" w:line="360" w:lineRule="auto"/>
+              <w:spacing w:after="0" w:line="240" w:lineRule="auto"/>
               <w:jc w:val="center"/>
               <w:rPr>
                 <w:rFonts w:ascii="Times New Roman" w:eastAsia="Times New Roman" w:hAnsi="Times New Roman" w:cs="Times New Roman"/>
@@ -1450,7 +1435,7 @@
           </w:tcPr>
           <w:p>
             <w:pPr>
-              <w:spacing w:after="0" w:line="360" w:lineRule="auto"/>
+              <w:spacing w:after="0" w:line="240" w:lineRule="auto"/>
               <w:jc w:val="center"/>
               <w:rPr>
                 <w:rFonts w:ascii="Times New Roman" w:eastAsia="Times New Roman" w:hAnsi="Times New Roman" w:cs="Times New Roman"/>
@@ -1495,7 +1480,7 @@
           </w:tcPr>
           <w:p>
             <w:pPr>
-              <w:spacing w:after="0" w:line="360" w:lineRule="auto"/>
+              <w:spacing w:after="0" w:line="240" w:lineRule="auto"/>
               <w:rPr>
                 <w:rFonts w:ascii="Times New Roman" w:eastAsia="Times New Roman" w:hAnsi="Times New Roman" w:cs="Times New Roman"/>
                 <w:b/>
@@ -1507,7 +1492,6 @@
                 <w14:ligatures w14:val="none"/>
               </w:rPr>
             </w:pPr>
-            <w:proofErr w:type="spellStart"/>
             <w:r>
               <w:rPr>
                 <w:rFonts w:ascii="Times New Roman" w:eastAsia="Times New Roman" w:hAnsi="Times New Roman" w:cs="Times New Roman"/>
@@ -1519,21 +1503,7 @@
                 <w:lang w:bidi="ar-SA"/>
                 <w14:ligatures w14:val="none"/>
               </w:rPr>
-              <w:t>Iterasi</w:t>
-            </w:r>
-            <w:proofErr w:type="spellEnd"/>
-            <w:r>
-              <w:rPr>
-                <w:rFonts w:ascii="Times New Roman" w:eastAsia="Times New Roman" w:hAnsi="Times New Roman" w:cs="Times New Roman"/>
-                <w:b/>
-                <w:bCs/>
-                <w:color w:val="000000"/>
-                <w:kern w:val="0"/>
-                <w:szCs w:val="24"/>
-                <w:lang w:bidi="ar-SA"/>
-                <w14:ligatures w14:val="none"/>
-              </w:rPr>
-              <w:t xml:space="preserve"> 2</w:t>
+              <w:t>Iterasi 2</w:t>
             </w:r>
           </w:p>
         </w:tc>
@@ -1558,7 +1528,7 @@
           </w:tcPr>
           <w:p>
             <w:pPr>
-              <w:spacing w:after="0" w:line="360" w:lineRule="auto"/>
+              <w:spacing w:after="0" w:line="240" w:lineRule="auto"/>
               <w:jc w:val="center"/>
               <w:rPr>
                 <w:rFonts w:ascii="Times New Roman" w:eastAsia="Times New Roman" w:hAnsi="Times New Roman" w:cs="Times New Roman"/>
@@ -1597,7 +1567,7 @@
           </w:tcPr>
           <w:p>
             <w:pPr>
-              <w:spacing w:after="0" w:line="360" w:lineRule="auto"/>
+              <w:spacing w:after="0" w:line="240" w:lineRule="auto"/>
               <w:jc w:val="center"/>
               <w:rPr>
                 <w:rFonts w:ascii="Times New Roman" w:eastAsia="Times New Roman" w:hAnsi="Times New Roman" w:cs="Times New Roman"/>
@@ -1636,7 +1606,7 @@
           </w:tcPr>
           <w:p>
             <w:pPr>
-              <w:spacing w:after="0" w:line="360" w:lineRule="auto"/>
+              <w:spacing w:after="0" w:line="240" w:lineRule="auto"/>
               <w:jc w:val="center"/>
               <w:rPr>
                 <w:rFonts w:ascii="Times New Roman" w:eastAsia="Times New Roman" w:hAnsi="Times New Roman" w:cs="Times New Roman"/>
@@ -1675,7 +1645,7 @@
           </w:tcPr>
           <w:p>
             <w:pPr>
-              <w:spacing w:after="0" w:line="360" w:lineRule="auto"/>
+              <w:spacing w:after="0" w:line="240" w:lineRule="auto"/>
               <w:jc w:val="center"/>
               <w:rPr>
                 <w:rFonts w:ascii="Times New Roman" w:eastAsia="Times New Roman" w:hAnsi="Times New Roman" w:cs="Times New Roman"/>
@@ -1714,7 +1684,7 @@
           </w:tcPr>
           <w:p>
             <w:pPr>
-              <w:spacing w:after="0" w:line="360" w:lineRule="auto"/>
+              <w:spacing w:after="0" w:line="240" w:lineRule="auto"/>
               <w:jc w:val="center"/>
               <w:rPr>
                 <w:rFonts w:ascii="Times New Roman" w:eastAsia="Times New Roman" w:hAnsi="Times New Roman" w:cs="Times New Roman"/>
@@ -1753,7 +1723,7 @@
           </w:tcPr>
           <w:p>
             <w:pPr>
-              <w:spacing w:after="0" w:line="360" w:lineRule="auto"/>
+              <w:spacing w:after="0" w:line="240" w:lineRule="auto"/>
               <w:jc w:val="center"/>
               <w:rPr>
                 <w:rFonts w:ascii="Times New Roman" w:eastAsia="Times New Roman" w:hAnsi="Times New Roman" w:cs="Times New Roman"/>
@@ -1792,7 +1762,7 @@
           </w:tcPr>
           <w:p>
             <w:pPr>
-              <w:spacing w:after="0" w:line="360" w:lineRule="auto"/>
+              <w:spacing w:after="0" w:line="240" w:lineRule="auto"/>
               <w:jc w:val="center"/>
               <w:rPr>
                 <w:rFonts w:ascii="Times New Roman" w:eastAsia="Times New Roman" w:hAnsi="Times New Roman" w:cs="Times New Roman"/>
@@ -1836,34 +1806,34 @@
           </w:tcPr>
           <w:p>
             <w:pPr>
-              <w:spacing w:after="0" w:line="360" w:lineRule="auto"/>
-              <w:rPr>
-                <w:rFonts w:ascii="Times New Roman" w:eastAsia="Times New Roman" w:hAnsi="Times New Roman" w:cs="Times New Roman"/>
-                <w:color w:val="000000"/>
-                <w:kern w:val="0"/>
-                <w:szCs w:val="24"/>
-                <w:lang w:bidi="ar-SA"/>
-                <w14:ligatures w14:val="none"/>
-              </w:rPr>
-            </w:pPr>
-          </w:p>
-        </w:tc>
-        <w:tc>
-          <w:tcPr>
-            <w:tcW w:w="960" w:type="dxa"/>
-            <w:tcBorders>
-              <w:top w:val="nil"/>
-              <w:left w:val="nil"/>
-              <w:bottom w:val="single" w:sz="4" w:space="0" w:color="auto"/>
-              <w:right w:val="single" w:sz="4" w:space="0" w:color="auto"/>
-            </w:tcBorders>
-            <w:noWrap/>
-            <w:vAlign w:val="center"/>
-            <w:hideMark/>
-          </w:tcPr>
-          <w:p>
-            <w:pPr>
-              <w:spacing w:after="0" w:line="360" w:lineRule="auto"/>
+              <w:spacing w:after="0" w:line="240" w:lineRule="auto"/>
+              <w:rPr>
+                <w:rFonts w:ascii="Times New Roman" w:eastAsia="Times New Roman" w:hAnsi="Times New Roman" w:cs="Times New Roman"/>
+                <w:color w:val="000000"/>
+                <w:kern w:val="0"/>
+                <w:szCs w:val="24"/>
+                <w:lang w:bidi="ar-SA"/>
+                <w14:ligatures w14:val="none"/>
+              </w:rPr>
+            </w:pPr>
+          </w:p>
+        </w:tc>
+        <w:tc>
+          <w:tcPr>
+            <w:tcW w:w="960" w:type="dxa"/>
+            <w:tcBorders>
+              <w:top w:val="nil"/>
+              <w:left w:val="nil"/>
+              <w:bottom w:val="single" w:sz="4" w:space="0" w:color="auto"/>
+              <w:right w:val="single" w:sz="4" w:space="0" w:color="auto"/>
+            </w:tcBorders>
+            <w:noWrap/>
+            <w:vAlign w:val="center"/>
+            <w:hideMark/>
+          </w:tcPr>
+          <w:p>
+            <w:pPr>
+              <w:spacing w:after="0" w:line="240" w:lineRule="auto"/>
               <w:jc w:val="center"/>
               <w:rPr>
                 <w:rFonts w:ascii="Times New Roman" w:eastAsia="Times New Roman" w:hAnsi="Times New Roman" w:cs="Times New Roman"/>
@@ -1902,7 +1872,7 @@
           </w:tcPr>
           <w:p>
             <w:pPr>
-              <w:spacing w:after="0" w:line="360" w:lineRule="auto"/>
+              <w:spacing w:after="0" w:line="240" w:lineRule="auto"/>
               <w:jc w:val="center"/>
               <w:rPr>
                 <w:rFonts w:ascii="Times New Roman" w:eastAsia="Times New Roman" w:hAnsi="Times New Roman" w:cs="Times New Roman"/>
@@ -1941,7 +1911,7 @@
           </w:tcPr>
           <w:p>
             <w:pPr>
-              <w:spacing w:after="0" w:line="360" w:lineRule="auto"/>
+              <w:spacing w:after="0" w:line="240" w:lineRule="auto"/>
               <w:jc w:val="center"/>
               <w:rPr>
                 <w:rFonts w:ascii="Times New Roman" w:eastAsia="Times New Roman" w:hAnsi="Times New Roman" w:cs="Times New Roman"/>
@@ -1980,7 +1950,7 @@
           </w:tcPr>
           <w:p>
             <w:pPr>
-              <w:spacing w:after="0" w:line="360" w:lineRule="auto"/>
+              <w:spacing w:after="0" w:line="240" w:lineRule="auto"/>
               <w:jc w:val="center"/>
               <w:rPr>
                 <w:rFonts w:ascii="Times New Roman" w:eastAsia="Times New Roman" w:hAnsi="Times New Roman" w:cs="Times New Roman"/>
@@ -2019,7 +1989,7 @@
           </w:tcPr>
           <w:p>
             <w:pPr>
-              <w:spacing w:after="0" w:line="360" w:lineRule="auto"/>
+              <w:spacing w:after="0" w:line="240" w:lineRule="auto"/>
               <w:jc w:val="center"/>
               <w:rPr>
                 <w:rFonts w:ascii="Times New Roman" w:eastAsia="Times New Roman" w:hAnsi="Times New Roman" w:cs="Times New Roman"/>
@@ -2058,7 +2028,7 @@
           </w:tcPr>
           <w:p>
             <w:pPr>
-              <w:spacing w:after="0" w:line="360" w:lineRule="auto"/>
+              <w:spacing w:after="0" w:line="240" w:lineRule="auto"/>
               <w:jc w:val="center"/>
               <w:rPr>
                 <w:rFonts w:ascii="Times New Roman" w:eastAsia="Times New Roman" w:hAnsi="Times New Roman" w:cs="Times New Roman"/>
@@ -2103,7 +2073,7 @@
           </w:tcPr>
           <w:p>
             <w:pPr>
-              <w:spacing w:after="0" w:line="360" w:lineRule="auto"/>
+              <w:spacing w:after="0" w:line="240" w:lineRule="auto"/>
               <w:jc w:val="center"/>
               <w:rPr>
                 <w:rFonts w:ascii="Times New Roman" w:eastAsia="Times New Roman" w:hAnsi="Times New Roman" w:cs="Times New Roman"/>
@@ -2142,7 +2112,7 @@
           </w:tcPr>
           <w:p>
             <w:pPr>
-              <w:spacing w:after="0" w:line="360" w:lineRule="auto"/>
+              <w:spacing w:after="0" w:line="240" w:lineRule="auto"/>
               <w:jc w:val="center"/>
               <w:rPr>
                 <w:rFonts w:ascii="Times New Roman" w:eastAsia="Times New Roman" w:hAnsi="Times New Roman" w:cs="Times New Roman"/>
@@ -2181,7 +2151,7 @@
           </w:tcPr>
           <w:p>
             <w:pPr>
-              <w:spacing w:after="0" w:line="360" w:lineRule="auto"/>
+              <w:spacing w:after="0" w:line="240" w:lineRule="auto"/>
               <w:jc w:val="center"/>
               <w:rPr>
                 <w:rFonts w:ascii="Times New Roman" w:eastAsia="Times New Roman" w:hAnsi="Times New Roman" w:cs="Times New Roman"/>
@@ -2220,7 +2190,7 @@
           </w:tcPr>
           <w:p>
             <w:pPr>
-              <w:spacing w:after="0" w:line="360" w:lineRule="auto"/>
+              <w:spacing w:after="0" w:line="240" w:lineRule="auto"/>
               <w:jc w:val="center"/>
               <w:rPr>
                 <w:rFonts w:ascii="Times New Roman" w:eastAsia="Times New Roman" w:hAnsi="Times New Roman" w:cs="Times New Roman"/>
@@ -2259,7 +2229,7 @@
           </w:tcPr>
           <w:p>
             <w:pPr>
-              <w:spacing w:after="0" w:line="360" w:lineRule="auto"/>
+              <w:spacing w:after="0" w:line="240" w:lineRule="auto"/>
               <w:jc w:val="center"/>
               <w:rPr>
                 <w:rFonts w:ascii="Times New Roman" w:eastAsia="Times New Roman" w:hAnsi="Times New Roman" w:cs="Times New Roman"/>
@@ -2298,7 +2268,7 @@
           </w:tcPr>
           <w:p>
             <w:pPr>
-              <w:spacing w:after="0" w:line="360" w:lineRule="auto"/>
+              <w:spacing w:after="0" w:line="240" w:lineRule="auto"/>
               <w:jc w:val="center"/>
               <w:rPr>
                 <w:rFonts w:ascii="Times New Roman" w:eastAsia="Times New Roman" w:hAnsi="Times New Roman" w:cs="Times New Roman"/>
@@ -2337,7 +2307,7 @@
           </w:tcPr>
           <w:p>
             <w:pPr>
-              <w:spacing w:after="0" w:line="360" w:lineRule="auto"/>
+              <w:spacing w:after="0" w:line="240" w:lineRule="auto"/>
               <w:jc w:val="center"/>
               <w:rPr>
                 <w:rFonts w:ascii="Times New Roman" w:eastAsia="Times New Roman" w:hAnsi="Times New Roman" w:cs="Times New Roman"/>
@@ -2381,7 +2351,7 @@
           </w:tcPr>
           <w:p>
             <w:pPr>
-              <w:spacing w:after="0" w:line="360" w:lineRule="auto"/>
+              <w:spacing w:after="0" w:line="240" w:lineRule="auto"/>
               <w:rPr>
                 <w:rFonts w:ascii="Times New Roman" w:eastAsia="Times New Roman" w:hAnsi="Times New Roman" w:cs="Times New Roman"/>
                 <w:color w:val="000000"/>
@@ -2408,7 +2378,7 @@
           </w:tcPr>
           <w:p>
             <w:pPr>
-              <w:spacing w:after="0" w:line="360" w:lineRule="auto"/>
+              <w:spacing w:after="0" w:line="240" w:lineRule="auto"/>
               <w:rPr>
                 <w:rFonts w:ascii="Times New Roman" w:eastAsia="Times New Roman" w:hAnsi="Times New Roman" w:cs="Times New Roman"/>
                 <w:color w:val="000000"/>
@@ -2446,7 +2416,7 @@
           </w:tcPr>
           <w:p>
             <w:pPr>
-              <w:spacing w:after="0" w:line="360" w:lineRule="auto"/>
+              <w:spacing w:after="0" w:line="240" w:lineRule="auto"/>
               <w:jc w:val="center"/>
               <w:rPr>
                 <w:rFonts w:ascii="Times New Roman" w:eastAsia="Times New Roman" w:hAnsi="Times New Roman" w:cs="Times New Roman"/>
@@ -2485,7 +2455,7 @@
           </w:tcPr>
           <w:p>
             <w:pPr>
-              <w:spacing w:after="0" w:line="360" w:lineRule="auto"/>
+              <w:spacing w:after="0" w:line="240" w:lineRule="auto"/>
               <w:jc w:val="center"/>
               <w:rPr>
                 <w:rFonts w:ascii="Times New Roman" w:eastAsia="Times New Roman" w:hAnsi="Times New Roman" w:cs="Times New Roman"/>
@@ -2524,7 +2494,7 @@
           </w:tcPr>
           <w:p>
             <w:pPr>
-              <w:spacing w:after="0" w:line="360" w:lineRule="auto"/>
+              <w:spacing w:after="0" w:line="240" w:lineRule="auto"/>
               <w:jc w:val="center"/>
               <w:rPr>
                 <w:rFonts w:ascii="Times New Roman" w:eastAsia="Times New Roman" w:hAnsi="Times New Roman" w:cs="Times New Roman"/>
@@ -2563,7 +2533,7 @@
           </w:tcPr>
           <w:p>
             <w:pPr>
-              <w:spacing w:after="0" w:line="360" w:lineRule="auto"/>
+              <w:spacing w:after="0" w:line="240" w:lineRule="auto"/>
               <w:jc w:val="center"/>
               <w:rPr>
                 <w:rFonts w:ascii="Times New Roman" w:eastAsia="Times New Roman" w:hAnsi="Times New Roman" w:cs="Times New Roman"/>
@@ -2602,7 +2572,7 @@
           </w:tcPr>
           <w:p>
             <w:pPr>
-              <w:spacing w:after="0" w:line="360" w:lineRule="auto"/>
+              <w:spacing w:after="0" w:line="240" w:lineRule="auto"/>
               <w:rPr>
                 <w:rFonts w:ascii="Times New Roman" w:eastAsia="Times New Roman" w:hAnsi="Times New Roman" w:cs="Times New Roman"/>
                 <w:color w:val="000000"/>
@@ -2646,7 +2616,7 @@
           </w:tcPr>
           <w:p>
             <w:pPr>
-              <w:spacing w:after="0" w:line="360" w:lineRule="auto"/>
+              <w:spacing w:after="0" w:line="240" w:lineRule="auto"/>
               <w:rPr>
                 <w:rFonts w:ascii="Times New Roman" w:eastAsia="Times New Roman" w:hAnsi="Times New Roman" w:cs="Times New Roman"/>
                 <w:b/>
@@ -2658,7 +2628,6 @@
                 <w14:ligatures w14:val="none"/>
               </w:rPr>
             </w:pPr>
-            <w:proofErr w:type="spellStart"/>
             <w:r>
               <w:rPr>
                 <w:rFonts w:ascii="Times New Roman" w:eastAsia="Times New Roman" w:hAnsi="Times New Roman" w:cs="Times New Roman"/>
@@ -2670,21 +2639,7 @@
                 <w:lang w:bidi="ar-SA"/>
                 <w14:ligatures w14:val="none"/>
               </w:rPr>
-              <w:t>Iterasi</w:t>
-            </w:r>
-            <w:proofErr w:type="spellEnd"/>
-            <w:r>
-              <w:rPr>
-                <w:rFonts w:ascii="Times New Roman" w:eastAsia="Times New Roman" w:hAnsi="Times New Roman" w:cs="Times New Roman"/>
-                <w:b/>
-                <w:bCs/>
-                <w:color w:val="000000"/>
-                <w:kern w:val="0"/>
-                <w:szCs w:val="24"/>
-                <w:lang w:bidi="ar-SA"/>
-                <w14:ligatures w14:val="none"/>
-              </w:rPr>
-              <w:t xml:space="preserve"> 3</w:t>
+              <w:t>Iterasi 3</w:t>
             </w:r>
           </w:p>
         </w:tc>
@@ -2709,7 +2664,7 @@
           </w:tcPr>
           <w:p>
             <w:pPr>
-              <w:spacing w:after="0" w:line="360" w:lineRule="auto"/>
+              <w:spacing w:after="0" w:line="240" w:lineRule="auto"/>
               <w:jc w:val="center"/>
               <w:rPr>
                 <w:rFonts w:ascii="Times New Roman" w:eastAsia="Times New Roman" w:hAnsi="Times New Roman" w:cs="Times New Roman"/>
@@ -2748,7 +2703,7 @@
           </w:tcPr>
           <w:p>
             <w:pPr>
-              <w:spacing w:after="0" w:line="360" w:lineRule="auto"/>
+              <w:spacing w:after="0" w:line="240" w:lineRule="auto"/>
               <w:jc w:val="center"/>
               <w:rPr>
                 <w:rFonts w:ascii="Times New Roman" w:eastAsia="Times New Roman" w:hAnsi="Times New Roman" w:cs="Times New Roman"/>
@@ -2787,7 +2742,7 @@
           </w:tcPr>
           <w:p>
             <w:pPr>
-              <w:spacing w:after="0" w:line="360" w:lineRule="auto"/>
+              <w:spacing w:after="0" w:line="240" w:lineRule="auto"/>
               <w:jc w:val="center"/>
               <w:rPr>
                 <w:rFonts w:ascii="Times New Roman" w:eastAsia="Times New Roman" w:hAnsi="Times New Roman" w:cs="Times New Roman"/>
@@ -2826,7 +2781,7 @@
           </w:tcPr>
           <w:p>
             <w:pPr>
-              <w:spacing w:after="0" w:line="360" w:lineRule="auto"/>
+              <w:spacing w:after="0" w:line="240" w:lineRule="auto"/>
               <w:jc w:val="center"/>
               <w:rPr>
                 <w:rFonts w:ascii="Times New Roman" w:eastAsia="Times New Roman" w:hAnsi="Times New Roman" w:cs="Times New Roman"/>
@@ -2865,7 +2820,7 @@
           </w:tcPr>
           <w:p>
             <w:pPr>
-              <w:spacing w:after="0" w:line="360" w:lineRule="auto"/>
+              <w:spacing w:after="0" w:line="240" w:lineRule="auto"/>
               <w:jc w:val="center"/>
               <w:rPr>
                 <w:rFonts w:ascii="Times New Roman" w:eastAsia="Times New Roman" w:hAnsi="Times New Roman" w:cs="Times New Roman"/>
@@ -2904,7 +2859,7 @@
           </w:tcPr>
           <w:p>
             <w:pPr>
-              <w:spacing w:after="0" w:line="360" w:lineRule="auto"/>
+              <w:spacing w:after="0" w:line="240" w:lineRule="auto"/>
               <w:jc w:val="center"/>
               <w:rPr>
                 <w:rFonts w:ascii="Times New Roman" w:eastAsia="Times New Roman" w:hAnsi="Times New Roman" w:cs="Times New Roman"/>
@@ -2943,7 +2898,7 @@
           </w:tcPr>
           <w:p>
             <w:pPr>
-              <w:spacing w:after="0" w:line="360" w:lineRule="auto"/>
+              <w:spacing w:after="0" w:line="240" w:lineRule="auto"/>
               <w:jc w:val="center"/>
               <w:rPr>
                 <w:rFonts w:ascii="Times New Roman" w:eastAsia="Times New Roman" w:hAnsi="Times New Roman" w:cs="Times New Roman"/>
@@ -2987,34 +2942,34 @@
           </w:tcPr>
           <w:p>
             <w:pPr>
-              <w:spacing w:after="0" w:line="360" w:lineRule="auto"/>
-              <w:rPr>
-                <w:rFonts w:ascii="Times New Roman" w:eastAsia="Times New Roman" w:hAnsi="Times New Roman" w:cs="Times New Roman"/>
-                <w:color w:val="000000"/>
-                <w:kern w:val="0"/>
-                <w:szCs w:val="24"/>
-                <w:lang w:bidi="ar-SA"/>
-                <w14:ligatures w14:val="none"/>
-              </w:rPr>
-            </w:pPr>
-          </w:p>
-        </w:tc>
-        <w:tc>
-          <w:tcPr>
-            <w:tcW w:w="960" w:type="dxa"/>
-            <w:tcBorders>
-              <w:top w:val="nil"/>
-              <w:left w:val="nil"/>
-              <w:bottom w:val="single" w:sz="4" w:space="0" w:color="auto"/>
-              <w:right w:val="single" w:sz="4" w:space="0" w:color="auto"/>
-            </w:tcBorders>
-            <w:noWrap/>
-            <w:vAlign w:val="center"/>
-            <w:hideMark/>
-          </w:tcPr>
-          <w:p>
-            <w:pPr>
-              <w:spacing w:after="0" w:line="360" w:lineRule="auto"/>
+              <w:spacing w:after="0" w:line="240" w:lineRule="auto"/>
+              <w:rPr>
+                <w:rFonts w:ascii="Times New Roman" w:eastAsia="Times New Roman" w:hAnsi="Times New Roman" w:cs="Times New Roman"/>
+                <w:color w:val="000000"/>
+                <w:kern w:val="0"/>
+                <w:szCs w:val="24"/>
+                <w:lang w:bidi="ar-SA"/>
+                <w14:ligatures w14:val="none"/>
+              </w:rPr>
+            </w:pPr>
+          </w:p>
+        </w:tc>
+        <w:tc>
+          <w:tcPr>
+            <w:tcW w:w="960" w:type="dxa"/>
+            <w:tcBorders>
+              <w:top w:val="nil"/>
+              <w:left w:val="nil"/>
+              <w:bottom w:val="single" w:sz="4" w:space="0" w:color="auto"/>
+              <w:right w:val="single" w:sz="4" w:space="0" w:color="auto"/>
+            </w:tcBorders>
+            <w:noWrap/>
+            <w:vAlign w:val="center"/>
+            <w:hideMark/>
+          </w:tcPr>
+          <w:p>
+            <w:pPr>
+              <w:spacing w:after="0" w:line="240" w:lineRule="auto"/>
               <w:jc w:val="center"/>
               <w:rPr>
                 <w:rFonts w:ascii="Times New Roman" w:eastAsia="Times New Roman" w:hAnsi="Times New Roman" w:cs="Times New Roman"/>
@@ -3053,7 +3008,7 @@
           </w:tcPr>
           <w:p>
             <w:pPr>
-              <w:spacing w:after="0" w:line="360" w:lineRule="auto"/>
+              <w:spacing w:after="0" w:line="240" w:lineRule="auto"/>
               <w:jc w:val="center"/>
               <w:rPr>
                 <w:rFonts w:ascii="Times New Roman" w:eastAsia="Times New Roman" w:hAnsi="Times New Roman" w:cs="Times New Roman"/>
@@ -3092,7 +3047,7 @@
           </w:tcPr>
           <w:p>
             <w:pPr>
-              <w:spacing w:after="0" w:line="360" w:lineRule="auto"/>
+              <w:spacing w:after="0" w:line="240" w:lineRule="auto"/>
               <w:jc w:val="center"/>
               <w:rPr>
                 <w:rFonts w:ascii="Times New Roman" w:eastAsia="Times New Roman" w:hAnsi="Times New Roman" w:cs="Times New Roman"/>
@@ -3131,7 +3086,7 @@
           </w:tcPr>
           <w:p>
             <w:pPr>
-              <w:spacing w:after="0" w:line="360" w:lineRule="auto"/>
+              <w:spacing w:after="0" w:line="240" w:lineRule="auto"/>
               <w:jc w:val="center"/>
               <w:rPr>
                 <w:rFonts w:ascii="Times New Roman" w:eastAsia="Times New Roman" w:hAnsi="Times New Roman" w:cs="Times New Roman"/>
@@ -3170,7 +3125,7 @@
           </w:tcPr>
           <w:p>
             <w:pPr>
-              <w:spacing w:after="0" w:line="360" w:lineRule="auto"/>
+              <w:spacing w:after="0" w:line="240" w:lineRule="auto"/>
               <w:jc w:val="center"/>
               <w:rPr>
                 <w:rFonts w:ascii="Times New Roman" w:eastAsia="Times New Roman" w:hAnsi="Times New Roman" w:cs="Times New Roman"/>
@@ -3209,7 +3164,7 @@
           </w:tcPr>
           <w:p>
             <w:pPr>
-              <w:spacing w:after="0" w:line="360" w:lineRule="auto"/>
+              <w:spacing w:after="0" w:line="240" w:lineRule="auto"/>
               <w:jc w:val="center"/>
               <w:rPr>
                 <w:rFonts w:ascii="Times New Roman" w:eastAsia="Times New Roman" w:hAnsi="Times New Roman" w:cs="Times New Roman"/>
@@ -3253,7 +3208,7 @@
           </w:tcPr>
           <w:p>
             <w:pPr>
-              <w:spacing w:after="0" w:line="360" w:lineRule="auto"/>
+              <w:spacing w:after="0" w:line="240" w:lineRule="auto"/>
               <w:jc w:val="center"/>
               <w:rPr>
                 <w:rFonts w:ascii="Times New Roman" w:eastAsia="Times New Roman" w:hAnsi="Times New Roman" w:cs="Times New Roman"/>
@@ -3292,7 +3247,7 @@
           </w:tcPr>
           <w:p>
             <w:pPr>
-              <w:spacing w:after="0" w:line="360" w:lineRule="auto"/>
+              <w:spacing w:after="0" w:line="240" w:lineRule="auto"/>
               <w:jc w:val="center"/>
               <w:rPr>
                 <w:rFonts w:ascii="Times New Roman" w:eastAsia="Times New Roman" w:hAnsi="Times New Roman" w:cs="Times New Roman"/>
@@ -3331,7 +3286,7 @@
           </w:tcPr>
           <w:p>
             <w:pPr>
-              <w:spacing w:after="0" w:line="360" w:lineRule="auto"/>
+              <w:spacing w:after="0" w:line="240" w:lineRule="auto"/>
               <w:jc w:val="center"/>
               <w:rPr>
                 <w:rFonts w:ascii="Times New Roman" w:eastAsia="Times New Roman" w:hAnsi="Times New Roman" w:cs="Times New Roman"/>
@@ -3370,7 +3325,7 @@
           </w:tcPr>
           <w:p>
             <w:pPr>
-              <w:spacing w:after="0" w:line="360" w:lineRule="auto"/>
+              <w:spacing w:after="0" w:line="240" w:lineRule="auto"/>
               <w:jc w:val="center"/>
               <w:rPr>
                 <w:rFonts w:ascii="Times New Roman" w:eastAsia="Times New Roman" w:hAnsi="Times New Roman" w:cs="Times New Roman"/>
@@ -3409,7 +3364,7 @@
           </w:tcPr>
           <w:p>
             <w:pPr>
-              <w:spacing w:after="0" w:line="360" w:lineRule="auto"/>
+              <w:spacing w:after="0" w:line="240" w:lineRule="auto"/>
               <w:jc w:val="center"/>
               <w:rPr>
                 <w:rFonts w:ascii="Times New Roman" w:eastAsia="Times New Roman" w:hAnsi="Times New Roman" w:cs="Times New Roman"/>
@@ -3448,7 +3403,7 @@
           </w:tcPr>
           <w:p>
             <w:pPr>
-              <w:spacing w:after="0" w:line="360" w:lineRule="auto"/>
+              <w:spacing w:after="0" w:line="240" w:lineRule="auto"/>
               <w:jc w:val="center"/>
               <w:rPr>
                 <w:rFonts w:ascii="Times New Roman" w:eastAsia="Times New Roman" w:hAnsi="Times New Roman" w:cs="Times New Roman"/>
@@ -3487,7 +3442,7 @@
           </w:tcPr>
           <w:p>
             <w:pPr>
-              <w:spacing w:after="0" w:line="360" w:lineRule="auto"/>
+              <w:spacing w:after="0" w:line="240" w:lineRule="auto"/>
               <w:jc w:val="center"/>
               <w:rPr>
                 <w:rFonts w:ascii="Times New Roman" w:eastAsia="Times New Roman" w:hAnsi="Times New Roman" w:cs="Times New Roman"/>
@@ -3532,7 +3487,7 @@
           </w:tcPr>
           <w:p>
             <w:pPr>
-              <w:spacing w:after="0" w:line="360" w:lineRule="auto"/>
+              <w:spacing w:after="0" w:line="240" w:lineRule="auto"/>
               <w:rPr>
                 <w:rFonts w:ascii="Times New Roman" w:eastAsia="Times New Roman" w:hAnsi="Times New Roman" w:cs="Times New Roman"/>
                 <w:b/>
@@ -3544,7 +3499,6 @@
                 <w14:ligatures w14:val="none"/>
               </w:rPr>
             </w:pPr>
-            <w:proofErr w:type="spellStart"/>
             <w:r>
               <w:rPr>
                 <w:rFonts w:ascii="Times New Roman" w:eastAsia="Times New Roman" w:hAnsi="Times New Roman" w:cs="Times New Roman"/>
@@ -3556,21 +3510,7 @@
                 <w:lang w:bidi="ar-SA"/>
                 <w14:ligatures w14:val="none"/>
               </w:rPr>
-              <w:t>Iterasi</w:t>
-            </w:r>
-            <w:proofErr w:type="spellEnd"/>
-            <w:r>
-              <w:rPr>
-                <w:rFonts w:ascii="Times New Roman" w:eastAsia="Times New Roman" w:hAnsi="Times New Roman" w:cs="Times New Roman"/>
-                <w:b/>
-                <w:bCs/>
-                <w:color w:val="000000"/>
-                <w:kern w:val="0"/>
-                <w:szCs w:val="24"/>
-                <w:lang w:bidi="ar-SA"/>
-                <w14:ligatures w14:val="none"/>
-              </w:rPr>
-              <w:t xml:space="preserve"> 4</w:t>
+              <w:t>Iterasi 4</w:t>
             </w:r>
           </w:p>
         </w:tc>
@@ -3595,7 +3535,7 @@
           </w:tcPr>
           <w:p>
             <w:pPr>
-              <w:spacing w:after="0" w:line="360" w:lineRule="auto"/>
+              <w:spacing w:after="0" w:line="240" w:lineRule="auto"/>
               <w:jc w:val="center"/>
               <w:rPr>
                 <w:rFonts w:ascii="Times New Roman" w:eastAsia="Times New Roman" w:hAnsi="Times New Roman" w:cs="Times New Roman"/>
@@ -3634,7 +3574,7 @@
           </w:tcPr>
           <w:p>
             <w:pPr>
-              <w:spacing w:after="0" w:line="360" w:lineRule="auto"/>
+              <w:spacing w:after="0" w:line="240" w:lineRule="auto"/>
               <w:jc w:val="center"/>
               <w:rPr>
                 <w:rFonts w:ascii="Times New Roman" w:eastAsia="Times New Roman" w:hAnsi="Times New Roman" w:cs="Times New Roman"/>
@@ -3673,7 +3613,7 @@
           </w:tcPr>
           <w:p>
             <w:pPr>
-              <w:spacing w:after="0" w:line="360" w:lineRule="auto"/>
+              <w:spacing w:after="0" w:line="240" w:lineRule="auto"/>
               <w:jc w:val="center"/>
               <w:rPr>
                 <w:rFonts w:ascii="Times New Roman" w:eastAsia="Times New Roman" w:hAnsi="Times New Roman" w:cs="Times New Roman"/>
@@ -3712,7 +3652,7 @@
           </w:tcPr>
           <w:p>
             <w:pPr>
-              <w:spacing w:after="0" w:line="360" w:lineRule="auto"/>
+              <w:spacing w:after="0" w:line="240" w:lineRule="auto"/>
               <w:jc w:val="center"/>
               <w:rPr>
                 <w:rFonts w:ascii="Times New Roman" w:eastAsia="Times New Roman" w:hAnsi="Times New Roman" w:cs="Times New Roman"/>
@@ -3751,7 +3691,7 @@
           </w:tcPr>
           <w:p>
             <w:pPr>
-              <w:spacing w:after="0" w:line="360" w:lineRule="auto"/>
+              <w:spacing w:after="0" w:line="240" w:lineRule="auto"/>
               <w:jc w:val="center"/>
               <w:rPr>
                 <w:rFonts w:ascii="Times New Roman" w:eastAsia="Times New Roman" w:hAnsi="Times New Roman" w:cs="Times New Roman"/>
@@ -3790,7 +3730,7 @@
           </w:tcPr>
           <w:p>
             <w:pPr>
-              <w:spacing w:after="0" w:line="360" w:lineRule="auto"/>
+              <w:spacing w:after="0" w:line="240" w:lineRule="auto"/>
               <w:jc w:val="center"/>
               <w:rPr>
                 <w:rFonts w:ascii="Times New Roman" w:eastAsia="Times New Roman" w:hAnsi="Times New Roman" w:cs="Times New Roman"/>
@@ -3829,7 +3769,7 @@
           </w:tcPr>
           <w:p>
             <w:pPr>
-              <w:spacing w:after="0" w:line="360" w:lineRule="auto"/>
+              <w:spacing w:after="0" w:line="240" w:lineRule="auto"/>
               <w:jc w:val="center"/>
               <w:rPr>
                 <w:rFonts w:ascii="Times New Roman" w:eastAsia="Times New Roman" w:hAnsi="Times New Roman" w:cs="Times New Roman"/>
@@ -3873,34 +3813,34 @@
           </w:tcPr>
           <w:p>
             <w:pPr>
-              <w:spacing w:after="0" w:line="360" w:lineRule="auto"/>
-              <w:rPr>
-                <w:rFonts w:ascii="Times New Roman" w:eastAsia="Times New Roman" w:hAnsi="Times New Roman" w:cs="Times New Roman"/>
-                <w:color w:val="000000"/>
-                <w:kern w:val="0"/>
-                <w:szCs w:val="24"/>
-                <w:lang w:bidi="ar-SA"/>
-                <w14:ligatures w14:val="none"/>
-              </w:rPr>
-            </w:pPr>
-          </w:p>
-        </w:tc>
-        <w:tc>
-          <w:tcPr>
-            <w:tcW w:w="960" w:type="dxa"/>
-            <w:tcBorders>
-              <w:top w:val="nil"/>
-              <w:left w:val="nil"/>
-              <w:bottom w:val="single" w:sz="4" w:space="0" w:color="auto"/>
-              <w:right w:val="single" w:sz="4" w:space="0" w:color="auto"/>
-            </w:tcBorders>
-            <w:noWrap/>
-            <w:vAlign w:val="center"/>
-            <w:hideMark/>
-          </w:tcPr>
-          <w:p>
-            <w:pPr>
-              <w:spacing w:after="0" w:line="360" w:lineRule="auto"/>
+              <w:spacing w:after="0" w:line="240" w:lineRule="auto"/>
+              <w:rPr>
+                <w:rFonts w:ascii="Times New Roman" w:eastAsia="Times New Roman" w:hAnsi="Times New Roman" w:cs="Times New Roman"/>
+                <w:color w:val="000000"/>
+                <w:kern w:val="0"/>
+                <w:szCs w:val="24"/>
+                <w:lang w:bidi="ar-SA"/>
+                <w14:ligatures w14:val="none"/>
+              </w:rPr>
+            </w:pPr>
+          </w:p>
+        </w:tc>
+        <w:tc>
+          <w:tcPr>
+            <w:tcW w:w="960" w:type="dxa"/>
+            <w:tcBorders>
+              <w:top w:val="nil"/>
+              <w:left w:val="nil"/>
+              <w:bottom w:val="single" w:sz="4" w:space="0" w:color="auto"/>
+              <w:right w:val="single" w:sz="4" w:space="0" w:color="auto"/>
+            </w:tcBorders>
+            <w:noWrap/>
+            <w:vAlign w:val="center"/>
+            <w:hideMark/>
+          </w:tcPr>
+          <w:p>
+            <w:pPr>
+              <w:spacing w:after="0" w:line="240" w:lineRule="auto"/>
               <w:jc w:val="center"/>
               <w:rPr>
                 <w:rFonts w:ascii="Times New Roman" w:eastAsia="Times New Roman" w:hAnsi="Times New Roman" w:cs="Times New Roman"/>
@@ -3939,7 +3879,7 @@
           </w:tcPr>
           <w:p>
             <w:pPr>
-              <w:spacing w:after="0" w:line="360" w:lineRule="auto"/>
+              <w:spacing w:after="0" w:line="240" w:lineRule="auto"/>
               <w:jc w:val="center"/>
               <w:rPr>
                 <w:rFonts w:ascii="Times New Roman" w:eastAsia="Times New Roman" w:hAnsi="Times New Roman" w:cs="Times New Roman"/>
@@ -3978,7 +3918,7 @@
           </w:tcPr>
           <w:p>
             <w:pPr>
-              <w:spacing w:after="0" w:line="360" w:lineRule="auto"/>
+              <w:spacing w:after="0" w:line="240" w:lineRule="auto"/>
               <w:jc w:val="center"/>
               <w:rPr>
                 <w:rFonts w:ascii="Times New Roman" w:eastAsia="Times New Roman" w:hAnsi="Times New Roman" w:cs="Times New Roman"/>
@@ -4017,7 +3957,7 @@
           </w:tcPr>
           <w:p>
             <w:pPr>
-              <w:spacing w:after="0" w:line="360" w:lineRule="auto"/>
+              <w:spacing w:after="0" w:line="240" w:lineRule="auto"/>
               <w:jc w:val="center"/>
               <w:rPr>
                 <w:rFonts w:ascii="Times New Roman" w:eastAsia="Times New Roman" w:hAnsi="Times New Roman" w:cs="Times New Roman"/>
@@ -4056,7 +3996,7 @@
           </w:tcPr>
           <w:p>
             <w:pPr>
-              <w:spacing w:after="0" w:line="360" w:lineRule="auto"/>
+              <w:spacing w:after="0" w:line="240" w:lineRule="auto"/>
               <w:jc w:val="center"/>
               <w:rPr>
                 <w:rFonts w:ascii="Times New Roman" w:eastAsia="Times New Roman" w:hAnsi="Times New Roman" w:cs="Times New Roman"/>
@@ -4084,7 +4024,7 @@
           </w:tcPr>
           <w:p>
             <w:pPr>
-              <w:spacing w:after="0" w:line="360" w:lineRule="auto"/>
+              <w:spacing w:after="0" w:line="240" w:lineRule="auto"/>
               <w:jc w:val="center"/>
               <w:rPr>
                 <w:rFonts w:ascii="Times New Roman" w:eastAsia="Times New Roman" w:hAnsi="Times New Roman" w:cs="Times New Roman"/>
@@ -4128,7 +4068,7 @@
           </w:tcPr>
           <w:p>
             <w:pPr>
-              <w:spacing w:after="0" w:line="360" w:lineRule="auto"/>
+              <w:spacing w:after="0" w:line="240" w:lineRule="auto"/>
               <w:jc w:val="center"/>
               <w:rPr>
                 <w:rFonts w:ascii="Times New Roman" w:eastAsia="Times New Roman" w:hAnsi="Times New Roman" w:cs="Times New Roman"/>
@@ -4167,7 +4107,7 @@
           </w:tcPr>
           <w:p>
             <w:pPr>
-              <w:spacing w:after="0" w:line="360" w:lineRule="auto"/>
+              <w:spacing w:after="0" w:line="240" w:lineRule="auto"/>
               <w:jc w:val="center"/>
               <w:rPr>
                 <w:rFonts w:ascii="Times New Roman" w:eastAsia="Times New Roman" w:hAnsi="Times New Roman" w:cs="Times New Roman"/>
@@ -4206,7 +4146,7 @@
           </w:tcPr>
           <w:p>
             <w:pPr>
-              <w:spacing w:after="0" w:line="360" w:lineRule="auto"/>
+              <w:spacing w:after="0" w:line="240" w:lineRule="auto"/>
               <w:jc w:val="center"/>
               <w:rPr>
                 <w:rFonts w:ascii="Times New Roman" w:eastAsia="Times New Roman" w:hAnsi="Times New Roman" w:cs="Times New Roman"/>
@@ -4245,7 +4185,7 @@
           </w:tcPr>
           <w:p>
             <w:pPr>
-              <w:spacing w:after="0" w:line="360" w:lineRule="auto"/>
+              <w:spacing w:after="0" w:line="240" w:lineRule="auto"/>
               <w:jc w:val="center"/>
               <w:rPr>
                 <w:rFonts w:ascii="Times New Roman" w:eastAsia="Times New Roman" w:hAnsi="Times New Roman" w:cs="Times New Roman"/>
@@ -4284,7 +4224,7 @@
           </w:tcPr>
           <w:p>
             <w:pPr>
-              <w:spacing w:after="0" w:line="360" w:lineRule="auto"/>
+              <w:spacing w:after="0" w:line="240" w:lineRule="auto"/>
               <w:jc w:val="center"/>
               <w:rPr>
                 <w:rFonts w:ascii="Times New Roman" w:eastAsia="Times New Roman" w:hAnsi="Times New Roman" w:cs="Times New Roman"/>
@@ -4323,7 +4263,7 @@
           </w:tcPr>
           <w:p>
             <w:pPr>
-              <w:spacing w:after="0" w:line="360" w:lineRule="auto"/>
+              <w:spacing w:after="0" w:line="240" w:lineRule="auto"/>
               <w:jc w:val="center"/>
               <w:rPr>
                 <w:rFonts w:ascii="Times New Roman" w:eastAsia="Times New Roman" w:hAnsi="Times New Roman" w:cs="Times New Roman"/>
@@ -4362,7 +4302,7 @@
           </w:tcPr>
           <w:p>
             <w:pPr>
-              <w:spacing w:after="0" w:line="360" w:lineRule="auto"/>
+              <w:spacing w:after="0" w:line="240" w:lineRule="auto"/>
               <w:jc w:val="center"/>
               <w:rPr>
                 <w:rFonts w:ascii="Times New Roman" w:eastAsia="Times New Roman" w:hAnsi="Times New Roman" w:cs="Times New Roman"/>
@@ -4407,7 +4347,7 @@
           </w:tcPr>
           <w:p>
             <w:pPr>
-              <w:spacing w:after="0" w:line="360" w:lineRule="auto"/>
+              <w:spacing w:after="0" w:line="240" w:lineRule="auto"/>
               <w:rPr>
                 <w:rFonts w:ascii="Times New Roman" w:eastAsia="Times New Roman" w:hAnsi="Times New Roman" w:cs="Times New Roman"/>
                 <w:b/>
@@ -4419,7 +4359,6 @@
                 <w14:ligatures w14:val="none"/>
               </w:rPr>
             </w:pPr>
-            <w:proofErr w:type="spellStart"/>
             <w:r>
               <w:rPr>
                 <w:rFonts w:ascii="Times New Roman" w:eastAsia="Times New Roman" w:hAnsi="Times New Roman" w:cs="Times New Roman"/>
@@ -4431,21 +4370,7 @@
                 <w:lang w:bidi="ar-SA"/>
                 <w14:ligatures w14:val="none"/>
               </w:rPr>
-              <w:t>Iterasi</w:t>
-            </w:r>
-            <w:proofErr w:type="spellEnd"/>
-            <w:r>
-              <w:rPr>
-                <w:rFonts w:ascii="Times New Roman" w:eastAsia="Times New Roman" w:hAnsi="Times New Roman" w:cs="Times New Roman"/>
-                <w:b/>
-                <w:bCs/>
-                <w:color w:val="000000"/>
-                <w:kern w:val="0"/>
-                <w:szCs w:val="24"/>
-                <w:lang w:bidi="ar-SA"/>
-                <w14:ligatures w14:val="none"/>
-              </w:rPr>
-              <w:t xml:space="preserve"> 5</w:t>
+              <w:t>Iterasi 5</w:t>
             </w:r>
           </w:p>
         </w:tc>
@@ -4470,7 +4395,7 @@
           </w:tcPr>
           <w:p>
             <w:pPr>
-              <w:spacing w:after="0" w:line="360" w:lineRule="auto"/>
+              <w:spacing w:after="0" w:line="240" w:lineRule="auto"/>
               <w:jc w:val="center"/>
               <w:rPr>
                 <w:rFonts w:ascii="Times New Roman" w:eastAsia="Times New Roman" w:hAnsi="Times New Roman" w:cs="Times New Roman"/>
@@ -4509,7 +4434,7 @@
           </w:tcPr>
           <w:p>
             <w:pPr>
-              <w:spacing w:after="0" w:line="360" w:lineRule="auto"/>
+              <w:spacing w:after="0" w:line="240" w:lineRule="auto"/>
               <w:jc w:val="center"/>
               <w:rPr>
                 <w:rFonts w:ascii="Times New Roman" w:eastAsia="Times New Roman" w:hAnsi="Times New Roman" w:cs="Times New Roman"/>
@@ -4548,7 +4473,7 @@
           </w:tcPr>
           <w:p>
             <w:pPr>
-              <w:spacing w:after="0" w:line="360" w:lineRule="auto"/>
+              <w:spacing w:after="0" w:line="240" w:lineRule="auto"/>
               <w:jc w:val="center"/>
               <w:rPr>
                 <w:rFonts w:ascii="Times New Roman" w:eastAsia="Times New Roman" w:hAnsi="Times New Roman" w:cs="Times New Roman"/>
@@ -4587,7 +4512,7 @@
           </w:tcPr>
           <w:p>
             <w:pPr>
-              <w:spacing w:after="0" w:line="360" w:lineRule="auto"/>
+              <w:spacing w:after="0" w:line="240" w:lineRule="auto"/>
               <w:jc w:val="center"/>
               <w:rPr>
                 <w:rFonts w:ascii="Times New Roman" w:eastAsia="Times New Roman" w:hAnsi="Times New Roman" w:cs="Times New Roman"/>
@@ -4626,7 +4551,7 @@
           </w:tcPr>
           <w:p>
             <w:pPr>
-              <w:spacing w:after="0" w:line="360" w:lineRule="auto"/>
+              <w:spacing w:after="0" w:line="240" w:lineRule="auto"/>
               <w:jc w:val="center"/>
               <w:rPr>
                 <w:rFonts w:ascii="Times New Roman" w:eastAsia="Times New Roman" w:hAnsi="Times New Roman" w:cs="Times New Roman"/>
@@ -4665,7 +4590,7 @@
           </w:tcPr>
           <w:p>
             <w:pPr>
-              <w:spacing w:after="0" w:line="360" w:lineRule="auto"/>
+              <w:spacing w:after="0" w:line="240" w:lineRule="auto"/>
               <w:jc w:val="center"/>
               <w:rPr>
                 <w:rFonts w:ascii="Times New Roman" w:eastAsia="Times New Roman" w:hAnsi="Times New Roman" w:cs="Times New Roman"/>
@@ -4704,7 +4629,7 @@
           </w:tcPr>
           <w:p>
             <w:pPr>
-              <w:spacing w:after="0" w:line="360" w:lineRule="auto"/>
+              <w:spacing w:after="0" w:line="240" w:lineRule="auto"/>
               <w:jc w:val="center"/>
               <w:rPr>
                 <w:rFonts w:ascii="Times New Roman" w:eastAsia="Times New Roman" w:hAnsi="Times New Roman" w:cs="Times New Roman"/>
@@ -4748,34 +4673,34 @@
           </w:tcPr>
           <w:p>
             <w:pPr>
-              <w:spacing w:after="0" w:line="360" w:lineRule="auto"/>
-              <w:rPr>
-                <w:rFonts w:ascii="Times New Roman" w:eastAsia="Times New Roman" w:hAnsi="Times New Roman" w:cs="Times New Roman"/>
-                <w:color w:val="000000"/>
-                <w:kern w:val="0"/>
-                <w:szCs w:val="24"/>
-                <w:lang w:bidi="ar-SA"/>
-                <w14:ligatures w14:val="none"/>
-              </w:rPr>
-            </w:pPr>
-          </w:p>
-        </w:tc>
-        <w:tc>
-          <w:tcPr>
-            <w:tcW w:w="960" w:type="dxa"/>
-            <w:tcBorders>
-              <w:top w:val="nil"/>
-              <w:left w:val="nil"/>
-              <w:bottom w:val="single" w:sz="4" w:space="0" w:color="auto"/>
-              <w:right w:val="single" w:sz="4" w:space="0" w:color="auto"/>
-            </w:tcBorders>
-            <w:noWrap/>
-            <w:vAlign w:val="center"/>
-            <w:hideMark/>
-          </w:tcPr>
-          <w:p>
-            <w:pPr>
-              <w:spacing w:after="0" w:line="360" w:lineRule="auto"/>
+              <w:spacing w:after="0" w:line="240" w:lineRule="auto"/>
+              <w:rPr>
+                <w:rFonts w:ascii="Times New Roman" w:eastAsia="Times New Roman" w:hAnsi="Times New Roman" w:cs="Times New Roman"/>
+                <w:color w:val="000000"/>
+                <w:kern w:val="0"/>
+                <w:szCs w:val="24"/>
+                <w:lang w:bidi="ar-SA"/>
+                <w14:ligatures w14:val="none"/>
+              </w:rPr>
+            </w:pPr>
+          </w:p>
+        </w:tc>
+        <w:tc>
+          <w:tcPr>
+            <w:tcW w:w="960" w:type="dxa"/>
+            <w:tcBorders>
+              <w:top w:val="nil"/>
+              <w:left w:val="nil"/>
+              <w:bottom w:val="single" w:sz="4" w:space="0" w:color="auto"/>
+              <w:right w:val="single" w:sz="4" w:space="0" w:color="auto"/>
+            </w:tcBorders>
+            <w:noWrap/>
+            <w:vAlign w:val="center"/>
+            <w:hideMark/>
+          </w:tcPr>
+          <w:p>
+            <w:pPr>
+              <w:spacing w:after="0" w:line="240" w:lineRule="auto"/>
               <w:jc w:val="center"/>
               <w:rPr>
                 <w:rFonts w:ascii="Times New Roman" w:eastAsia="Times New Roman" w:hAnsi="Times New Roman" w:cs="Times New Roman"/>
@@ -4814,7 +4739,7 @@
           </w:tcPr>
           <w:p>
             <w:pPr>
-              <w:spacing w:after="0" w:line="360" w:lineRule="auto"/>
+              <w:spacing w:after="0" w:line="240" w:lineRule="auto"/>
               <w:jc w:val="center"/>
               <w:rPr>
                 <w:rFonts w:ascii="Times New Roman" w:eastAsia="Times New Roman" w:hAnsi="Times New Roman" w:cs="Times New Roman"/>
@@ -4853,7 +4778,7 @@
           </w:tcPr>
           <w:p>
             <w:pPr>
-              <w:spacing w:after="0" w:line="360" w:lineRule="auto"/>
+              <w:spacing w:after="0" w:line="240" w:lineRule="auto"/>
               <w:rPr>
                 <w:rFonts w:ascii="Times New Roman" w:eastAsia="Times New Roman" w:hAnsi="Times New Roman" w:cs="Times New Roman"/>
                 <w:color w:val="000000"/>
@@ -4891,7 +4816,7 @@
           </w:tcPr>
           <w:p>
             <w:pPr>
-              <w:spacing w:after="0" w:line="360" w:lineRule="auto"/>
+              <w:spacing w:after="0" w:line="240" w:lineRule="auto"/>
               <w:rPr>
                 <w:rFonts w:ascii="Times New Roman" w:eastAsia="Times New Roman" w:hAnsi="Times New Roman" w:cs="Times New Roman"/>
                 <w:color w:val="000000"/>
@@ -4929,7 +4854,7 @@
           </w:tcPr>
           <w:p>
             <w:pPr>
-              <w:spacing w:after="0" w:line="360" w:lineRule="auto"/>
+              <w:spacing w:after="0" w:line="240" w:lineRule="auto"/>
               <w:rPr>
                 <w:rFonts w:ascii="Times New Roman" w:eastAsia="Times New Roman" w:hAnsi="Times New Roman" w:cs="Times New Roman"/>
                 <w:color w:val="000000"/>
@@ -4967,7 +4892,7 @@
           </w:tcPr>
           <w:p>
             <w:pPr>
-              <w:spacing w:after="0" w:line="360" w:lineRule="auto"/>
+              <w:spacing w:after="0" w:line="240" w:lineRule="auto"/>
               <w:jc w:val="center"/>
               <w:rPr>
                 <w:rFonts w:ascii="Times New Roman" w:eastAsia="Times New Roman" w:hAnsi="Times New Roman" w:cs="Times New Roman"/>
@@ -5011,7 +4936,7 @@
           </w:tcPr>
           <w:p>
             <w:pPr>
-              <w:spacing w:after="0" w:line="360" w:lineRule="auto"/>
+              <w:spacing w:after="0" w:line="240" w:lineRule="auto"/>
               <w:jc w:val="center"/>
               <w:rPr>
                 <w:rFonts w:ascii="Times New Roman" w:eastAsia="Times New Roman" w:hAnsi="Times New Roman" w:cs="Times New Roman"/>
@@ -5050,7 +4975,7 @@
           </w:tcPr>
           <w:p>
             <w:pPr>
-              <w:spacing w:after="0" w:line="360" w:lineRule="auto"/>
+              <w:spacing w:after="0" w:line="240" w:lineRule="auto"/>
               <w:jc w:val="center"/>
               <w:rPr>
                 <w:rFonts w:ascii="Times New Roman" w:eastAsia="Times New Roman" w:hAnsi="Times New Roman" w:cs="Times New Roman"/>
@@ -5089,7 +5014,7 @@
           </w:tcPr>
           <w:p>
             <w:pPr>
-              <w:spacing w:after="0" w:line="360" w:lineRule="auto"/>
+              <w:spacing w:after="0" w:line="240" w:lineRule="auto"/>
               <w:jc w:val="center"/>
               <w:rPr>
                 <w:rFonts w:ascii="Times New Roman" w:eastAsia="Times New Roman" w:hAnsi="Times New Roman" w:cs="Times New Roman"/>
@@ -5128,7 +5053,7 @@
           </w:tcPr>
           <w:p>
             <w:pPr>
-              <w:spacing w:after="0" w:line="360" w:lineRule="auto"/>
+              <w:spacing w:after="0" w:line="240" w:lineRule="auto"/>
               <w:jc w:val="center"/>
               <w:rPr>
                 <w:rFonts w:ascii="Times New Roman" w:eastAsia="Times New Roman" w:hAnsi="Times New Roman" w:cs="Times New Roman"/>
@@ -5167,7 +5092,7 @@
           </w:tcPr>
           <w:p>
             <w:pPr>
-              <w:spacing w:after="0" w:line="360" w:lineRule="auto"/>
+              <w:spacing w:after="0" w:line="240" w:lineRule="auto"/>
               <w:jc w:val="center"/>
               <w:rPr>
                 <w:rFonts w:ascii="Times New Roman" w:eastAsia="Times New Roman" w:hAnsi="Times New Roman" w:cs="Times New Roman"/>
@@ -5206,7 +5131,7 @@
           </w:tcPr>
           <w:p>
             <w:pPr>
-              <w:spacing w:after="0" w:line="360" w:lineRule="auto"/>
+              <w:spacing w:after="0" w:line="240" w:lineRule="auto"/>
               <w:jc w:val="center"/>
               <w:rPr>
                 <w:rFonts w:ascii="Times New Roman" w:eastAsia="Times New Roman" w:hAnsi="Times New Roman" w:cs="Times New Roman"/>
@@ -5245,7 +5170,7 @@
           </w:tcPr>
           <w:p>
             <w:pPr>
-              <w:spacing w:after="0" w:line="360" w:lineRule="auto"/>
+              <w:spacing w:after="0" w:line="240" w:lineRule="auto"/>
               <w:jc w:val="center"/>
               <w:rPr>
                 <w:rFonts w:ascii="Times New Roman" w:eastAsia="Times New Roman" w:hAnsi="Times New Roman" w:cs="Times New Roman"/>
@@ -5290,7 +5215,7 @@
           </w:tcPr>
           <w:p>
             <w:pPr>
-              <w:spacing w:after="0" w:line="360" w:lineRule="auto"/>
+              <w:spacing w:after="0" w:line="240" w:lineRule="auto"/>
               <w:rPr>
                 <w:rFonts w:ascii="Times New Roman" w:eastAsia="Times New Roman" w:hAnsi="Times New Roman" w:cs="Times New Roman"/>
                 <w:b/>
@@ -5302,7 +5227,6 @@
                 <w14:ligatures w14:val="none"/>
               </w:rPr>
             </w:pPr>
-            <w:proofErr w:type="spellStart"/>
             <w:r>
               <w:rPr>
                 <w:rFonts w:ascii="Times New Roman" w:eastAsia="Times New Roman" w:hAnsi="Times New Roman" w:cs="Times New Roman"/>
@@ -5314,21 +5238,7 @@
                 <w:lang w:bidi="ar-SA"/>
                 <w14:ligatures w14:val="none"/>
               </w:rPr>
-              <w:t>Iterasi</w:t>
-            </w:r>
-            <w:proofErr w:type="spellEnd"/>
-            <w:r>
-              <w:rPr>
-                <w:rFonts w:ascii="Times New Roman" w:eastAsia="Times New Roman" w:hAnsi="Times New Roman" w:cs="Times New Roman"/>
-                <w:b/>
-                <w:bCs/>
-                <w:color w:val="000000"/>
-                <w:kern w:val="0"/>
-                <w:szCs w:val="24"/>
-                <w:lang w:bidi="ar-SA"/>
-                <w14:ligatures w14:val="none"/>
-              </w:rPr>
-              <w:t xml:space="preserve"> 6</w:t>
+              <w:t>Iterasi 6</w:t>
             </w:r>
           </w:p>
         </w:tc>
@@ -5353,7 +5263,7 @@
           </w:tcPr>
           <w:p>
             <w:pPr>
-              <w:spacing w:after="0" w:line="360" w:lineRule="auto"/>
+              <w:spacing w:after="0" w:line="240" w:lineRule="auto"/>
               <w:jc w:val="center"/>
               <w:rPr>
                 <w:rFonts w:ascii="Times New Roman" w:eastAsia="Times New Roman" w:hAnsi="Times New Roman" w:cs="Times New Roman"/>
@@ -5392,7 +5302,7 @@
           </w:tcPr>
           <w:p>
             <w:pPr>
-              <w:spacing w:after="0" w:line="360" w:lineRule="auto"/>
+              <w:spacing w:after="0" w:line="240" w:lineRule="auto"/>
               <w:jc w:val="center"/>
               <w:rPr>
                 <w:rFonts w:ascii="Times New Roman" w:eastAsia="Times New Roman" w:hAnsi="Times New Roman" w:cs="Times New Roman"/>
@@ -5431,7 +5341,7 @@
           </w:tcPr>
           <w:p>
             <w:pPr>
-              <w:spacing w:after="0" w:line="360" w:lineRule="auto"/>
+              <w:spacing w:after="0" w:line="240" w:lineRule="auto"/>
               <w:jc w:val="center"/>
               <w:rPr>
                 <w:rFonts w:ascii="Times New Roman" w:eastAsia="Times New Roman" w:hAnsi="Times New Roman" w:cs="Times New Roman"/>
@@ -5470,7 +5380,7 @@
           </w:tcPr>
           <w:p>
             <w:pPr>
-              <w:spacing w:after="0" w:line="360" w:lineRule="auto"/>
+              <w:spacing w:after="0" w:line="240" w:lineRule="auto"/>
               <w:jc w:val="center"/>
               <w:rPr>
                 <w:rFonts w:ascii="Times New Roman" w:eastAsia="Times New Roman" w:hAnsi="Times New Roman" w:cs="Times New Roman"/>
@@ -5509,7 +5419,7 @@
           </w:tcPr>
           <w:p>
             <w:pPr>
-              <w:spacing w:after="0" w:line="360" w:lineRule="auto"/>
+              <w:spacing w:after="0" w:line="240" w:lineRule="auto"/>
               <w:jc w:val="center"/>
               <w:rPr>
                 <w:rFonts w:ascii="Times New Roman" w:eastAsia="Times New Roman" w:hAnsi="Times New Roman" w:cs="Times New Roman"/>
@@ -5548,7 +5458,7 @@
           </w:tcPr>
           <w:p>
             <w:pPr>
-              <w:spacing w:after="0" w:line="360" w:lineRule="auto"/>
+              <w:spacing w:after="0" w:line="240" w:lineRule="auto"/>
               <w:jc w:val="center"/>
               <w:rPr>
                 <w:rFonts w:ascii="Times New Roman" w:eastAsia="Times New Roman" w:hAnsi="Times New Roman" w:cs="Times New Roman"/>
@@ -5587,7 +5497,7 @@
           </w:tcPr>
           <w:p>
             <w:pPr>
-              <w:spacing w:after="0" w:line="360" w:lineRule="auto"/>
+              <w:spacing w:after="0" w:line="240" w:lineRule="auto"/>
               <w:jc w:val="center"/>
               <w:rPr>
                 <w:rFonts w:ascii="Times New Roman" w:eastAsia="Times New Roman" w:hAnsi="Times New Roman" w:cs="Times New Roman"/>
@@ -5631,34 +5541,34 @@
           </w:tcPr>
           <w:p>
             <w:pPr>
-              <w:spacing w:after="0" w:line="360" w:lineRule="auto"/>
-              <w:rPr>
-                <w:rFonts w:ascii="Times New Roman" w:eastAsia="Times New Roman" w:hAnsi="Times New Roman" w:cs="Times New Roman"/>
-                <w:color w:val="000000"/>
-                <w:kern w:val="0"/>
-                <w:szCs w:val="24"/>
-                <w:lang w:bidi="ar-SA"/>
-                <w14:ligatures w14:val="none"/>
-              </w:rPr>
-            </w:pPr>
-          </w:p>
-        </w:tc>
-        <w:tc>
-          <w:tcPr>
-            <w:tcW w:w="960" w:type="dxa"/>
-            <w:tcBorders>
-              <w:top w:val="nil"/>
-              <w:left w:val="nil"/>
-              <w:bottom w:val="single" w:sz="4" w:space="0" w:color="auto"/>
-              <w:right w:val="single" w:sz="4" w:space="0" w:color="auto"/>
-            </w:tcBorders>
-            <w:noWrap/>
-            <w:vAlign w:val="center"/>
-            <w:hideMark/>
-          </w:tcPr>
-          <w:p>
-            <w:pPr>
-              <w:spacing w:after="0" w:line="360" w:lineRule="auto"/>
+              <w:spacing w:after="0" w:line="240" w:lineRule="auto"/>
+              <w:rPr>
+                <w:rFonts w:ascii="Times New Roman" w:eastAsia="Times New Roman" w:hAnsi="Times New Roman" w:cs="Times New Roman"/>
+                <w:color w:val="000000"/>
+                <w:kern w:val="0"/>
+                <w:szCs w:val="24"/>
+                <w:lang w:bidi="ar-SA"/>
+                <w14:ligatures w14:val="none"/>
+              </w:rPr>
+            </w:pPr>
+          </w:p>
+        </w:tc>
+        <w:tc>
+          <w:tcPr>
+            <w:tcW w:w="960" w:type="dxa"/>
+            <w:tcBorders>
+              <w:top w:val="nil"/>
+              <w:left w:val="nil"/>
+              <w:bottom w:val="single" w:sz="4" w:space="0" w:color="auto"/>
+              <w:right w:val="single" w:sz="4" w:space="0" w:color="auto"/>
+            </w:tcBorders>
+            <w:noWrap/>
+            <w:vAlign w:val="center"/>
+            <w:hideMark/>
+          </w:tcPr>
+          <w:p>
+            <w:pPr>
+              <w:spacing w:after="0" w:line="240" w:lineRule="auto"/>
               <w:jc w:val="center"/>
               <w:rPr>
                 <w:rFonts w:ascii="Times New Roman" w:eastAsia="Times New Roman" w:hAnsi="Times New Roman" w:cs="Times New Roman"/>
@@ -5697,7 +5607,7 @@
           </w:tcPr>
           <w:p>
             <w:pPr>
-              <w:spacing w:after="0" w:line="360" w:lineRule="auto"/>
+              <w:spacing w:after="0" w:line="240" w:lineRule="auto"/>
               <w:jc w:val="center"/>
               <w:rPr>
                 <w:rFonts w:ascii="Times New Roman" w:eastAsia="Times New Roman" w:hAnsi="Times New Roman" w:cs="Times New Roman"/>
@@ -5736,7 +5646,7 @@
           </w:tcPr>
           <w:p>
             <w:pPr>
-              <w:spacing w:after="0" w:line="360" w:lineRule="auto"/>
+              <w:spacing w:after="0" w:line="240" w:lineRule="auto"/>
               <w:rPr>
                 <w:rFonts w:ascii="Times New Roman" w:eastAsia="Times New Roman" w:hAnsi="Times New Roman" w:cs="Times New Roman"/>
                 <w:color w:val="000000"/>
@@ -5774,7 +5684,7 @@
           </w:tcPr>
           <w:p>
             <w:pPr>
-              <w:spacing w:after="0" w:line="360" w:lineRule="auto"/>
+              <w:spacing w:after="0" w:line="240" w:lineRule="auto"/>
               <w:rPr>
                 <w:rFonts w:ascii="Times New Roman" w:eastAsia="Times New Roman" w:hAnsi="Times New Roman" w:cs="Times New Roman"/>
                 <w:color w:val="000000"/>
@@ -5812,7 +5722,7 @@
           </w:tcPr>
           <w:p>
             <w:pPr>
-              <w:spacing w:after="0" w:line="360" w:lineRule="auto"/>
+              <w:spacing w:after="0" w:line="240" w:lineRule="auto"/>
               <w:rPr>
                 <w:rFonts w:ascii="Times New Roman" w:eastAsia="Times New Roman" w:hAnsi="Times New Roman" w:cs="Times New Roman"/>
                 <w:color w:val="000000"/>
@@ -5850,7 +5760,7 @@
           </w:tcPr>
           <w:p>
             <w:pPr>
-              <w:spacing w:after="0" w:line="360" w:lineRule="auto"/>
+              <w:spacing w:after="0" w:line="240" w:lineRule="auto"/>
               <w:jc w:val="center"/>
               <w:rPr>
                 <w:rFonts w:ascii="Times New Roman" w:eastAsia="Times New Roman" w:hAnsi="Times New Roman" w:cs="Times New Roman"/>
@@ -5894,7 +5804,7 @@
           </w:tcPr>
           <w:p>
             <w:pPr>
-              <w:spacing w:after="0" w:line="360" w:lineRule="auto"/>
+              <w:spacing w:after="0" w:line="240" w:lineRule="auto"/>
               <w:jc w:val="center"/>
               <w:rPr>
                 <w:rFonts w:ascii="Times New Roman" w:eastAsia="Times New Roman" w:hAnsi="Times New Roman" w:cs="Times New Roman"/>
@@ -5933,7 +5843,7 @@
           </w:tcPr>
           <w:p>
             <w:pPr>
-              <w:spacing w:after="0" w:line="360" w:lineRule="auto"/>
+              <w:spacing w:after="0" w:line="240" w:lineRule="auto"/>
               <w:jc w:val="center"/>
               <w:rPr>
                 <w:rFonts w:ascii="Times New Roman" w:eastAsia="Times New Roman" w:hAnsi="Times New Roman" w:cs="Times New Roman"/>
@@ -5972,7 +5882,7 @@
           </w:tcPr>
           <w:p>
             <w:pPr>
-              <w:spacing w:after="0" w:line="360" w:lineRule="auto"/>
+              <w:spacing w:after="0" w:line="240" w:lineRule="auto"/>
               <w:jc w:val="center"/>
               <w:rPr>
                 <w:rFonts w:ascii="Times New Roman" w:eastAsia="Times New Roman" w:hAnsi="Times New Roman" w:cs="Times New Roman"/>
@@ -6011,7 +5921,7 @@
           </w:tcPr>
           <w:p>
             <w:pPr>
-              <w:spacing w:after="0" w:line="360" w:lineRule="auto"/>
+              <w:spacing w:after="0" w:line="240" w:lineRule="auto"/>
               <w:jc w:val="center"/>
               <w:rPr>
                 <w:rFonts w:ascii="Times New Roman" w:eastAsia="Times New Roman" w:hAnsi="Times New Roman" w:cs="Times New Roman"/>
@@ -6050,7 +5960,7 @@
           </w:tcPr>
           <w:p>
             <w:pPr>
-              <w:spacing w:after="0" w:line="360" w:lineRule="auto"/>
+              <w:spacing w:after="0" w:line="240" w:lineRule="auto"/>
               <w:jc w:val="center"/>
               <w:rPr>
                 <w:rFonts w:ascii="Times New Roman" w:eastAsia="Times New Roman" w:hAnsi="Times New Roman" w:cs="Times New Roman"/>
@@ -6089,7 +5999,7 @@
           </w:tcPr>
           <w:p>
             <w:pPr>
-              <w:spacing w:after="0" w:line="360" w:lineRule="auto"/>
+              <w:spacing w:after="0" w:line="240" w:lineRule="auto"/>
               <w:jc w:val="center"/>
               <w:rPr>
                 <w:rFonts w:ascii="Times New Roman" w:eastAsia="Times New Roman" w:hAnsi="Times New Roman" w:cs="Times New Roman"/>
@@ -6128,7 +6038,7 @@
           </w:tcPr>
           <w:p>
             <w:pPr>
-              <w:spacing w:after="0" w:line="360" w:lineRule="auto"/>
+              <w:spacing w:after="0" w:line="240" w:lineRule="auto"/>
               <w:jc w:val="center"/>
               <w:rPr>
                 <w:rFonts w:ascii="Times New Roman" w:eastAsia="Times New Roman" w:hAnsi="Times New Roman" w:cs="Times New Roman"/>
@@ -6154,14 +6064,6 @@
         </w:tc>
       </w:tr>
     </w:tbl>
-    <w:p>
-      <w:pPr>
-        <w:rPr>
-          <w:rFonts w:ascii="Times New Roman" w:hAnsi="Times New Roman" w:cs="Times New Roman"/>
-          <w:szCs w:val="24"/>
-        </w:rPr>
-      </w:pPr>
-    </w:p>
     <w:p>
       <w:pPr>
         <w:spacing w:line="360" w:lineRule="auto"/>
@@ -6185,31 +6087,6 @@
           <w:szCs w:val="24"/>
         </w:rPr>
       </w:pPr>
-    </w:p>
-    <w:p>
-      <w:pPr>
-        <w:spacing w:line="360" w:lineRule="auto"/>
-        <w:jc w:val="both"/>
-        <w:rPr>
-          <w:rFonts w:ascii="Times New Roman" w:hAnsi="Times New Roman" w:cs="Times New Roman"/>
-          <w:b/>
-          <w:bCs/>
-          <w:szCs w:val="24"/>
-        </w:rPr>
-      </w:pPr>
-    </w:p>
-    <w:p>
-      <w:pPr>
-        <w:spacing w:line="360" w:lineRule="auto"/>
-        <w:jc w:val="both"/>
-        <w:rPr>
-          <w:rFonts w:ascii="Times New Roman" w:hAnsi="Times New Roman" w:cs="Times New Roman"/>
-          <w:b/>
-          <w:bCs/>
-          <w:szCs w:val="24"/>
-        </w:rPr>
-      </w:pPr>
-      <w:proofErr w:type="spellStart"/>
       <w:r>
         <w:rPr>
           <w:rFonts w:ascii="Times New Roman" w:hAnsi="Times New Roman" w:cs="Times New Roman"/>
@@ -6217,38 +6094,7 @@
           <w:bCs/>
           <w:szCs w:val="24"/>
         </w:rPr>
-        <w:lastRenderedPageBreak/>
-        <w:t>Analisis</w:t>
-      </w:r>
-      <w:proofErr w:type="spellEnd"/>
-      <w:r>
-        <w:rPr>
-          <w:rFonts w:ascii="Times New Roman" w:hAnsi="Times New Roman" w:cs="Times New Roman"/>
-          <w:b/>
-          <w:bCs/>
-          <w:szCs w:val="24"/>
-        </w:rPr>
-        <w:t xml:space="preserve"> Tabel </w:t>
-      </w:r>
-      <w:proofErr w:type="spellStart"/>
-      <w:r>
-        <w:rPr>
-          <w:rFonts w:ascii="Times New Roman" w:hAnsi="Times New Roman" w:cs="Times New Roman"/>
-          <w:b/>
-          <w:bCs/>
-          <w:szCs w:val="24"/>
-        </w:rPr>
-        <w:t>Simulasi</w:t>
-      </w:r>
-      <w:proofErr w:type="spellEnd"/>
-      <w:r>
-        <w:rPr>
-          <w:rFonts w:ascii="Times New Roman" w:hAnsi="Times New Roman" w:cs="Times New Roman"/>
-          <w:b/>
-          <w:bCs/>
-          <w:szCs w:val="24"/>
-        </w:rPr>
-        <w:t xml:space="preserve"> Quick Sort</w:t>
+        <w:t>Analisis Tabel Simulasi Quick Sort</w:t>
       </w:r>
     </w:p>
     <w:p>
@@ -6265,304 +6111,7 @@
           <w:rFonts w:ascii="Times New Roman" w:hAnsi="Times New Roman" w:cs="Times New Roman"/>
           <w:szCs w:val="24"/>
         </w:rPr>
-        <w:t xml:space="preserve">Tabel </w:t>
-      </w:r>
-      <w:proofErr w:type="spellStart"/>
-      <w:r>
-        <w:rPr>
-          <w:rFonts w:ascii="Times New Roman" w:hAnsi="Times New Roman" w:cs="Times New Roman"/>
-          <w:szCs w:val="24"/>
-        </w:rPr>
-        <w:t>tersebut</w:t>
-      </w:r>
-      <w:proofErr w:type="spellEnd"/>
-      <w:r>
-        <w:rPr>
-          <w:rFonts w:ascii="Times New Roman" w:hAnsi="Times New Roman" w:cs="Times New Roman"/>
-          <w:szCs w:val="24"/>
-        </w:rPr>
-        <w:t xml:space="preserve"> </w:t>
-      </w:r>
-      <w:proofErr w:type="spellStart"/>
-      <w:r>
-        <w:rPr>
-          <w:rFonts w:ascii="Times New Roman" w:hAnsi="Times New Roman" w:cs="Times New Roman"/>
-          <w:szCs w:val="24"/>
-        </w:rPr>
-        <w:t>mendokumentasikan</w:t>
-      </w:r>
-      <w:proofErr w:type="spellEnd"/>
-      <w:r>
-        <w:rPr>
-          <w:rFonts w:ascii="Times New Roman" w:hAnsi="Times New Roman" w:cs="Times New Roman"/>
-          <w:szCs w:val="24"/>
-        </w:rPr>
-        <w:t xml:space="preserve"> proses </w:t>
-      </w:r>
-      <w:proofErr w:type="spellStart"/>
-      <w:r>
-        <w:rPr>
-          <w:rFonts w:ascii="Times New Roman" w:hAnsi="Times New Roman" w:cs="Times New Roman"/>
-          <w:szCs w:val="24"/>
-        </w:rPr>
-        <w:t>pengurutan</w:t>
-      </w:r>
-      <w:proofErr w:type="spellEnd"/>
-      <w:r>
-        <w:rPr>
-          <w:rFonts w:ascii="Times New Roman" w:hAnsi="Times New Roman" w:cs="Times New Roman"/>
-          <w:szCs w:val="24"/>
-        </w:rPr>
-        <w:t xml:space="preserve"> array [22, 10, 15, 3, 8, 2] </w:t>
-      </w:r>
-      <w:proofErr w:type="spellStart"/>
-      <w:r>
-        <w:rPr>
-          <w:rFonts w:ascii="Times New Roman" w:hAnsi="Times New Roman" w:cs="Times New Roman"/>
-          <w:szCs w:val="24"/>
-        </w:rPr>
-        <w:t>menggunakan</w:t>
-      </w:r>
-      <w:proofErr w:type="spellEnd"/>
-      <w:r>
-        <w:rPr>
-          <w:rFonts w:ascii="Times New Roman" w:hAnsi="Times New Roman" w:cs="Times New Roman"/>
-          <w:szCs w:val="24"/>
-        </w:rPr>
-        <w:t xml:space="preserve"> </w:t>
-      </w:r>
-      <w:proofErr w:type="spellStart"/>
-      <w:r>
-        <w:rPr>
-          <w:rFonts w:ascii="Times New Roman" w:hAnsi="Times New Roman" w:cs="Times New Roman"/>
-          <w:szCs w:val="24"/>
-        </w:rPr>
-        <w:t>metode</w:t>
-      </w:r>
-      <w:proofErr w:type="spellEnd"/>
-      <w:r>
-        <w:rPr>
-          <w:rFonts w:ascii="Times New Roman" w:hAnsi="Times New Roman" w:cs="Times New Roman"/>
-          <w:szCs w:val="24"/>
-        </w:rPr>
-        <w:t xml:space="preserve"> </w:t>
-      </w:r>
-      <w:proofErr w:type="spellStart"/>
-      <w:r>
-        <w:rPr>
-          <w:rFonts w:ascii="Times New Roman" w:hAnsi="Times New Roman" w:cs="Times New Roman"/>
-          <w:szCs w:val="24"/>
-        </w:rPr>
-        <w:t>partisi</w:t>
-      </w:r>
-      <w:proofErr w:type="spellEnd"/>
-      <w:r>
-        <w:rPr>
-          <w:rFonts w:ascii="Times New Roman" w:hAnsi="Times New Roman" w:cs="Times New Roman"/>
-          <w:szCs w:val="24"/>
-        </w:rPr>
-        <w:t xml:space="preserve">. </w:t>
-      </w:r>
-      <w:proofErr w:type="spellStart"/>
-      <w:r>
-        <w:rPr>
-          <w:rFonts w:ascii="Times New Roman" w:hAnsi="Times New Roman" w:cs="Times New Roman"/>
-          <w:szCs w:val="24"/>
-        </w:rPr>
-        <w:t>Berikut</w:t>
-      </w:r>
-      <w:proofErr w:type="spellEnd"/>
-      <w:r>
-        <w:rPr>
-          <w:rFonts w:ascii="Times New Roman" w:hAnsi="Times New Roman" w:cs="Times New Roman"/>
-          <w:szCs w:val="24"/>
-        </w:rPr>
-        <w:t xml:space="preserve"> </w:t>
-      </w:r>
-      <w:proofErr w:type="spellStart"/>
-      <w:r>
-        <w:rPr>
-          <w:rFonts w:ascii="Times New Roman" w:hAnsi="Times New Roman" w:cs="Times New Roman"/>
-          <w:szCs w:val="24"/>
-        </w:rPr>
-        <w:t>poin-poin</w:t>
-      </w:r>
-      <w:proofErr w:type="spellEnd"/>
-      <w:r>
-        <w:rPr>
-          <w:rFonts w:ascii="Times New Roman" w:hAnsi="Times New Roman" w:cs="Times New Roman"/>
-          <w:szCs w:val="24"/>
-        </w:rPr>
-        <w:t xml:space="preserve"> </w:t>
-      </w:r>
-      <w:proofErr w:type="spellStart"/>
-      <w:r>
-        <w:rPr>
-          <w:rFonts w:ascii="Times New Roman" w:hAnsi="Times New Roman" w:cs="Times New Roman"/>
-          <w:szCs w:val="24"/>
-        </w:rPr>
-        <w:t>penjelasannya</w:t>
-      </w:r>
-      <w:proofErr w:type="spellEnd"/>
-      <w:r>
-        <w:rPr>
-          <w:rFonts w:ascii="Times New Roman" w:hAnsi="Times New Roman" w:cs="Times New Roman"/>
-          <w:szCs w:val="24"/>
-        </w:rPr>
-        <w:t>:</w:t>
-      </w:r>
-    </w:p>
-    <w:p>
-      <w:pPr>
-        <w:numPr>
-          <w:ilvl w:val="0"/>
-          <w:numId w:val="4"/>
-        </w:numPr>
-        <w:spacing w:line="360" w:lineRule="auto"/>
-        <w:jc w:val="both"/>
-        <w:rPr>
-          <w:rFonts w:ascii="Times New Roman" w:hAnsi="Times New Roman" w:cs="Times New Roman"/>
-          <w:szCs w:val="24"/>
-        </w:rPr>
-      </w:pPr>
-      <w:proofErr w:type="spellStart"/>
-      <w:r>
-        <w:rPr>
-          <w:rFonts w:ascii="Times New Roman" w:hAnsi="Times New Roman" w:cs="Times New Roman"/>
-          <w:b/>
-          <w:bCs/>
-          <w:szCs w:val="24"/>
-        </w:rPr>
-        <w:t>Fungsi</w:t>
-      </w:r>
-      <w:proofErr w:type="spellEnd"/>
-      <w:r>
-        <w:rPr>
-          <w:rFonts w:ascii="Times New Roman" w:hAnsi="Times New Roman" w:cs="Times New Roman"/>
-          <w:b/>
-          <w:bCs/>
-          <w:szCs w:val="24"/>
-        </w:rPr>
-        <w:t xml:space="preserve"> LB dan UB</w:t>
-      </w:r>
-      <w:r>
-        <w:rPr>
-          <w:rFonts w:ascii="Times New Roman" w:hAnsi="Times New Roman" w:cs="Times New Roman"/>
-          <w:szCs w:val="24"/>
-        </w:rPr>
-        <w:t xml:space="preserve">: LB (Lower Bound) </w:t>
-      </w:r>
-      <w:proofErr w:type="spellStart"/>
-      <w:r>
-        <w:rPr>
-          <w:rFonts w:ascii="Times New Roman" w:hAnsi="Times New Roman" w:cs="Times New Roman"/>
-          <w:szCs w:val="24"/>
-        </w:rPr>
-        <w:t>menandakan</w:t>
-      </w:r>
-      <w:proofErr w:type="spellEnd"/>
-      <w:r>
-        <w:rPr>
-          <w:rFonts w:ascii="Times New Roman" w:hAnsi="Times New Roman" w:cs="Times New Roman"/>
-          <w:szCs w:val="24"/>
-        </w:rPr>
-        <w:t xml:space="preserve"> batas </w:t>
-      </w:r>
-      <w:proofErr w:type="spellStart"/>
-      <w:r>
-        <w:rPr>
-          <w:rFonts w:ascii="Times New Roman" w:hAnsi="Times New Roman" w:cs="Times New Roman"/>
-          <w:szCs w:val="24"/>
-        </w:rPr>
-        <w:t>awal</w:t>
-      </w:r>
-      <w:proofErr w:type="spellEnd"/>
-      <w:r>
-        <w:rPr>
-          <w:rFonts w:ascii="Times New Roman" w:hAnsi="Times New Roman" w:cs="Times New Roman"/>
-          <w:szCs w:val="24"/>
-        </w:rPr>
-        <w:t xml:space="preserve"> sub-array yang </w:t>
-      </w:r>
-      <w:proofErr w:type="spellStart"/>
-      <w:r>
-        <w:rPr>
-          <w:rFonts w:ascii="Times New Roman" w:hAnsi="Times New Roman" w:cs="Times New Roman"/>
-          <w:szCs w:val="24"/>
-        </w:rPr>
-        <w:t>sedang</w:t>
-      </w:r>
-      <w:proofErr w:type="spellEnd"/>
-      <w:r>
-        <w:rPr>
-          <w:rFonts w:ascii="Times New Roman" w:hAnsi="Times New Roman" w:cs="Times New Roman"/>
-          <w:szCs w:val="24"/>
-        </w:rPr>
-        <w:t xml:space="preserve"> </w:t>
-      </w:r>
-      <w:proofErr w:type="spellStart"/>
-      <w:r>
-        <w:rPr>
-          <w:rFonts w:ascii="Times New Roman" w:hAnsi="Times New Roman" w:cs="Times New Roman"/>
-          <w:szCs w:val="24"/>
-        </w:rPr>
-        <w:t>diproses</w:t>
-      </w:r>
-      <w:proofErr w:type="spellEnd"/>
-      <w:r>
-        <w:rPr>
-          <w:rFonts w:ascii="Times New Roman" w:hAnsi="Times New Roman" w:cs="Times New Roman"/>
-          <w:szCs w:val="24"/>
-        </w:rPr>
-        <w:t xml:space="preserve">, </w:t>
-      </w:r>
-      <w:proofErr w:type="spellStart"/>
-      <w:r>
-        <w:rPr>
-          <w:rFonts w:ascii="Times New Roman" w:hAnsi="Times New Roman" w:cs="Times New Roman"/>
-          <w:szCs w:val="24"/>
-        </w:rPr>
-        <w:t>sedangkan</w:t>
-      </w:r>
-      <w:proofErr w:type="spellEnd"/>
-      <w:r>
-        <w:rPr>
-          <w:rFonts w:ascii="Times New Roman" w:hAnsi="Times New Roman" w:cs="Times New Roman"/>
-          <w:szCs w:val="24"/>
-        </w:rPr>
-        <w:t xml:space="preserve"> UB (Upper Bound) </w:t>
-      </w:r>
-      <w:proofErr w:type="spellStart"/>
-      <w:r>
-        <w:rPr>
-          <w:rFonts w:ascii="Times New Roman" w:hAnsi="Times New Roman" w:cs="Times New Roman"/>
-          <w:szCs w:val="24"/>
-        </w:rPr>
-        <w:t>adalah</w:t>
-      </w:r>
-      <w:proofErr w:type="spellEnd"/>
-      <w:r>
-        <w:rPr>
-          <w:rFonts w:ascii="Times New Roman" w:hAnsi="Times New Roman" w:cs="Times New Roman"/>
-          <w:szCs w:val="24"/>
-        </w:rPr>
-        <w:t xml:space="preserve"> batas </w:t>
-      </w:r>
-      <w:proofErr w:type="spellStart"/>
-      <w:r>
-        <w:rPr>
-          <w:rFonts w:ascii="Times New Roman" w:hAnsi="Times New Roman" w:cs="Times New Roman"/>
-          <w:szCs w:val="24"/>
-        </w:rPr>
-        <w:t>akhirnya</w:t>
-      </w:r>
-      <w:proofErr w:type="spellEnd"/>
-      <w:r>
-        <w:rPr>
-          <w:rFonts w:ascii="Times New Roman" w:hAnsi="Times New Roman" w:cs="Times New Roman"/>
-          <w:szCs w:val="24"/>
-        </w:rPr>
-        <w:t>.</w:t>
+        <w:t>Tabel tersebut mendokumentasikan proses pengurutan array [22, 10, 15, 3, 8, 2] menggunakan metode partisi. Berikut poin-poin penjelasannya:</w:t>
       </w:r>
     </w:p>
     <w:p>
@@ -6585,9 +6134,29 @@
           <w:bCs/>
           <w:szCs w:val="24"/>
         </w:rPr>
-        <w:t xml:space="preserve">Proses </w:t>
+        <w:t>Fungsi LB dan UB</w:t>
       </w:r>
-      <w:proofErr w:type="spellStart"/>
+      <w:r>
+        <w:rPr>
+          <w:rFonts w:ascii="Times New Roman" w:hAnsi="Times New Roman" w:cs="Times New Roman"/>
+          <w:szCs w:val="24"/>
+        </w:rPr>
+        <w:t>: LB (Lower Bound) menandakan batas awal sub-array yang sedang diproses, sedangkan UB (Upper Bound) adalah batas akhirnya.</w:t>
+      </w:r>
+    </w:p>
+    <w:p>
+      <w:pPr>
+        <w:numPr>
+          <w:ilvl w:val="0"/>
+          <w:numId w:val="4"/>
+        </w:numPr>
+        <w:spacing w:line="360" w:lineRule="auto"/>
+        <w:jc w:val="both"/>
+        <w:rPr>
+          <w:rFonts w:ascii="Times New Roman" w:hAnsi="Times New Roman" w:cs="Times New Roman"/>
+          <w:szCs w:val="24"/>
+        </w:rPr>
+      </w:pPr>
       <w:r>
         <w:rPr>
           <w:rFonts w:ascii="Times New Roman" w:hAnsi="Times New Roman" w:cs="Times New Roman"/>
@@ -6595,9 +6164,8 @@
           <w:bCs/>
           <w:szCs w:val="24"/>
         </w:rPr>
-        <w:t>Iterasi</w:t>
+        <w:t>Proses Iterasi</w:t>
       </w:r>
-      <w:proofErr w:type="spellEnd"/>
       <w:r>
         <w:rPr>
           <w:rFonts w:ascii="Times New Roman" w:hAnsi="Times New Roman" w:cs="Times New Roman"/>
@@ -6619,7 +6187,6 @@
           <w:szCs w:val="24"/>
         </w:rPr>
       </w:pPr>
-      <w:proofErr w:type="spellStart"/>
       <w:r>
         <w:rPr>
           <w:rFonts w:ascii="Times New Roman" w:hAnsi="Times New Roman" w:cs="Times New Roman"/>
@@ -6627,56 +6194,14 @@
           <w:bCs/>
           <w:szCs w:val="24"/>
         </w:rPr>
-        <w:t>Iterasi</w:t>
-      </w:r>
-      <w:proofErr w:type="spellEnd"/>
-      <w:r>
-        <w:rPr>
-          <w:rFonts w:ascii="Times New Roman" w:hAnsi="Times New Roman" w:cs="Times New Roman"/>
-          <w:b/>
-          <w:bCs/>
-          <w:szCs w:val="24"/>
-        </w:rPr>
-        <w:t xml:space="preserve"> 1</w:t>
+        <w:t>Iterasi 1</w:t>
       </w:r>
       <w:r>
         <w:rPr>
           <w:rFonts w:ascii="Times New Roman" w:hAnsi="Times New Roman" w:cs="Times New Roman"/>
           <w:szCs w:val="24"/>
         </w:rPr>
-        <w:t xml:space="preserve">: </w:t>
-      </w:r>
-      <w:proofErr w:type="spellStart"/>
-      <w:r>
-        <w:rPr>
-          <w:rFonts w:ascii="Times New Roman" w:hAnsi="Times New Roman" w:cs="Times New Roman"/>
-          <w:szCs w:val="24"/>
-        </w:rPr>
-        <w:t>Elemen</w:t>
-      </w:r>
-      <w:proofErr w:type="spellEnd"/>
-      <w:r>
-        <w:rPr>
-          <w:rFonts w:ascii="Times New Roman" w:hAnsi="Times New Roman" w:cs="Times New Roman"/>
-          <w:szCs w:val="24"/>
-        </w:rPr>
-        <w:t xml:space="preserve"> </w:t>
-      </w:r>
-      <w:proofErr w:type="spellStart"/>
-      <w:r>
-        <w:rPr>
-          <w:rFonts w:ascii="Times New Roman" w:hAnsi="Times New Roman" w:cs="Times New Roman"/>
-          <w:szCs w:val="24"/>
-        </w:rPr>
-        <w:t>pertama</w:t>
-      </w:r>
-      <w:proofErr w:type="spellEnd"/>
-      <w:r>
-        <w:rPr>
-          <w:rFonts w:ascii="Times New Roman" w:hAnsi="Times New Roman" w:cs="Times New Roman"/>
-          <w:szCs w:val="24"/>
-        </w:rPr>
-        <w:t xml:space="preserve"> (</w:t>
+        <w:t>: Elemen pertama (</w:t>
       </w:r>
       <w:r>
         <w:rPr>
@@ -6692,247 +6217,15 @@
           <w:rFonts w:ascii="Times New Roman" w:hAnsi="Times New Roman" w:cs="Times New Roman"/>
           <w:szCs w:val="24"/>
         </w:rPr>
-        <w:t xml:space="preserve">) </w:t>
+        <w:t xml:space="preserve">) ditetapkan sebagai pivot. Algoritma melakukan pengecekan dari kedua arah untuk menempatkan elemen sesuai </w:t>
       </w:r>
-      <w:proofErr w:type="spellStart"/>
       <w:r>
         <w:rPr>
           <w:rFonts w:ascii="Times New Roman" w:hAnsi="Times New Roman" w:cs="Times New Roman"/>
           <w:szCs w:val="24"/>
         </w:rPr>
-        <w:t>ditetapkan</w:t>
-      </w:r>
-      <w:proofErr w:type="spellEnd"/>
-      <w:r>
-        <w:rPr>
-          <w:rFonts w:ascii="Times New Roman" w:hAnsi="Times New Roman" w:cs="Times New Roman"/>
-          <w:szCs w:val="24"/>
-        </w:rPr>
-        <w:t xml:space="preserve"> </w:t>
-      </w:r>
-      <w:proofErr w:type="spellStart"/>
-      <w:r>
-        <w:rPr>
-          <w:rFonts w:ascii="Times New Roman" w:hAnsi="Times New Roman" w:cs="Times New Roman"/>
-          <w:szCs w:val="24"/>
-        </w:rPr>
-        <w:t>sebagai</w:t>
-      </w:r>
-      <w:proofErr w:type="spellEnd"/>
-      <w:r>
-        <w:rPr>
-          <w:rFonts w:ascii="Times New Roman" w:hAnsi="Times New Roman" w:cs="Times New Roman"/>
-          <w:szCs w:val="24"/>
-        </w:rPr>
-        <w:t xml:space="preserve"> pivot. </w:t>
-      </w:r>
-      <w:proofErr w:type="spellStart"/>
-      <w:r>
-        <w:rPr>
-          <w:rFonts w:ascii="Times New Roman" w:hAnsi="Times New Roman" w:cs="Times New Roman"/>
-          <w:szCs w:val="24"/>
-        </w:rPr>
-        <w:t>Algoritma</w:t>
-      </w:r>
-      <w:proofErr w:type="spellEnd"/>
-      <w:r>
-        <w:rPr>
-          <w:rFonts w:ascii="Times New Roman" w:hAnsi="Times New Roman" w:cs="Times New Roman"/>
-          <w:szCs w:val="24"/>
-        </w:rPr>
-        <w:t xml:space="preserve"> </w:t>
-      </w:r>
-      <w:proofErr w:type="spellStart"/>
-      <w:r>
-        <w:rPr>
-          <w:rFonts w:ascii="Times New Roman" w:hAnsi="Times New Roman" w:cs="Times New Roman"/>
-          <w:szCs w:val="24"/>
-        </w:rPr>
-        <w:t>melakukan</w:t>
-      </w:r>
-      <w:proofErr w:type="spellEnd"/>
-      <w:r>
-        <w:rPr>
-          <w:rFonts w:ascii="Times New Roman" w:hAnsi="Times New Roman" w:cs="Times New Roman"/>
-          <w:szCs w:val="24"/>
-        </w:rPr>
-        <w:t xml:space="preserve"> </w:t>
-      </w:r>
-      <w:proofErr w:type="spellStart"/>
-      <w:r>
-        <w:rPr>
-          <w:rFonts w:ascii="Times New Roman" w:hAnsi="Times New Roman" w:cs="Times New Roman"/>
-          <w:szCs w:val="24"/>
-        </w:rPr>
-        <w:t>pengecekan</w:t>
-      </w:r>
-      <w:proofErr w:type="spellEnd"/>
-      <w:r>
-        <w:rPr>
-          <w:rFonts w:ascii="Times New Roman" w:hAnsi="Times New Roman" w:cs="Times New Roman"/>
-          <w:szCs w:val="24"/>
-        </w:rPr>
-        <w:t xml:space="preserve"> </w:t>
-      </w:r>
-      <w:proofErr w:type="spellStart"/>
-      <w:r>
-        <w:rPr>
-          <w:rFonts w:ascii="Times New Roman" w:hAnsi="Times New Roman" w:cs="Times New Roman"/>
-          <w:szCs w:val="24"/>
-        </w:rPr>
-        <w:t>dari</w:t>
-      </w:r>
-      <w:proofErr w:type="spellEnd"/>
-      <w:r>
-        <w:rPr>
-          <w:rFonts w:ascii="Times New Roman" w:hAnsi="Times New Roman" w:cs="Times New Roman"/>
-          <w:szCs w:val="24"/>
-        </w:rPr>
-        <w:t xml:space="preserve"> </w:t>
-      </w:r>
-      <w:proofErr w:type="spellStart"/>
-      <w:r>
-        <w:rPr>
-          <w:rFonts w:ascii="Times New Roman" w:hAnsi="Times New Roman" w:cs="Times New Roman"/>
-          <w:szCs w:val="24"/>
-        </w:rPr>
-        <w:t>kedua</w:t>
-      </w:r>
-      <w:proofErr w:type="spellEnd"/>
-      <w:r>
-        <w:rPr>
-          <w:rFonts w:ascii="Times New Roman" w:hAnsi="Times New Roman" w:cs="Times New Roman"/>
-          <w:szCs w:val="24"/>
-        </w:rPr>
-        <w:t xml:space="preserve"> </w:t>
-      </w:r>
-      <w:proofErr w:type="spellStart"/>
-      <w:r>
-        <w:rPr>
-          <w:rFonts w:ascii="Times New Roman" w:hAnsi="Times New Roman" w:cs="Times New Roman"/>
-          <w:szCs w:val="24"/>
-        </w:rPr>
-        <w:t>arah</w:t>
-      </w:r>
-      <w:proofErr w:type="spellEnd"/>
-      <w:r>
-        <w:rPr>
-          <w:rFonts w:ascii="Times New Roman" w:hAnsi="Times New Roman" w:cs="Times New Roman"/>
-          <w:szCs w:val="24"/>
-        </w:rPr>
-        <w:t xml:space="preserve"> </w:t>
-      </w:r>
-      <w:proofErr w:type="spellStart"/>
-      <w:r>
-        <w:rPr>
-          <w:rFonts w:ascii="Times New Roman" w:hAnsi="Times New Roman" w:cs="Times New Roman"/>
-          <w:szCs w:val="24"/>
-        </w:rPr>
-        <w:t>untuk</w:t>
-      </w:r>
-      <w:proofErr w:type="spellEnd"/>
-      <w:r>
-        <w:rPr>
-          <w:rFonts w:ascii="Times New Roman" w:hAnsi="Times New Roman" w:cs="Times New Roman"/>
-          <w:szCs w:val="24"/>
-        </w:rPr>
-        <w:t xml:space="preserve"> </w:t>
-      </w:r>
-      <w:proofErr w:type="spellStart"/>
-      <w:r>
-        <w:rPr>
-          <w:rFonts w:ascii="Times New Roman" w:hAnsi="Times New Roman" w:cs="Times New Roman"/>
-          <w:szCs w:val="24"/>
-        </w:rPr>
-        <w:t>menempatkan</w:t>
-      </w:r>
-      <w:proofErr w:type="spellEnd"/>
-      <w:r>
-        <w:rPr>
-          <w:rFonts w:ascii="Times New Roman" w:hAnsi="Times New Roman" w:cs="Times New Roman"/>
-          <w:szCs w:val="24"/>
-        </w:rPr>
-        <w:t xml:space="preserve"> </w:t>
-      </w:r>
-      <w:proofErr w:type="spellStart"/>
-      <w:r>
-        <w:rPr>
-          <w:rFonts w:ascii="Times New Roman" w:hAnsi="Times New Roman" w:cs="Times New Roman"/>
-          <w:szCs w:val="24"/>
-        </w:rPr>
-        <w:t>elemen</w:t>
-      </w:r>
-      <w:proofErr w:type="spellEnd"/>
-      <w:r>
-        <w:rPr>
-          <w:rFonts w:ascii="Times New Roman" w:hAnsi="Times New Roman" w:cs="Times New Roman"/>
-          <w:szCs w:val="24"/>
-        </w:rPr>
-        <w:t xml:space="preserve"> </w:t>
-      </w:r>
-      <w:proofErr w:type="spellStart"/>
-      <w:r>
-        <w:rPr>
-          <w:rFonts w:ascii="Times New Roman" w:hAnsi="Times New Roman" w:cs="Times New Roman"/>
-          <w:szCs w:val="24"/>
-        </w:rPr>
-        <w:t>sesuai</w:t>
-      </w:r>
-      <w:proofErr w:type="spellEnd"/>
-      <w:r>
-        <w:rPr>
-          <w:rFonts w:ascii="Times New Roman" w:hAnsi="Times New Roman" w:cs="Times New Roman"/>
-          <w:szCs w:val="24"/>
-        </w:rPr>
-        <w:t xml:space="preserve"> </w:t>
-      </w:r>
-      <w:proofErr w:type="spellStart"/>
-      <w:r>
-        <w:rPr>
-          <w:rFonts w:ascii="Times New Roman" w:hAnsi="Times New Roman" w:cs="Times New Roman"/>
-          <w:szCs w:val="24"/>
-        </w:rPr>
-        <w:t>urutan</w:t>
-      </w:r>
-      <w:proofErr w:type="spellEnd"/>
-      <w:r>
-        <w:rPr>
-          <w:rFonts w:ascii="Times New Roman" w:hAnsi="Times New Roman" w:cs="Times New Roman"/>
-          <w:szCs w:val="24"/>
-        </w:rPr>
-        <w:t xml:space="preserve">. Hasil </w:t>
-      </w:r>
-      <w:proofErr w:type="spellStart"/>
-      <w:r>
-        <w:rPr>
-          <w:rFonts w:ascii="Times New Roman" w:hAnsi="Times New Roman" w:cs="Times New Roman"/>
-          <w:szCs w:val="24"/>
-        </w:rPr>
-        <w:t>akhirnya</w:t>
-      </w:r>
-      <w:proofErr w:type="spellEnd"/>
-      <w:r>
-        <w:rPr>
-          <w:rFonts w:ascii="Times New Roman" w:hAnsi="Times New Roman" w:cs="Times New Roman"/>
-          <w:szCs w:val="24"/>
-        </w:rPr>
-        <w:t xml:space="preserve">, </w:t>
-      </w:r>
-      <w:proofErr w:type="spellStart"/>
-      <w:r>
-        <w:rPr>
-          <w:rFonts w:ascii="Times New Roman" w:hAnsi="Times New Roman" w:cs="Times New Roman"/>
-          <w:szCs w:val="24"/>
-        </w:rPr>
-        <w:t>angka</w:t>
-      </w:r>
-      <w:proofErr w:type="spellEnd"/>
-      <w:r>
-        <w:rPr>
-          <w:rFonts w:ascii="Times New Roman" w:hAnsi="Times New Roman" w:cs="Times New Roman"/>
-          <w:szCs w:val="24"/>
-        </w:rPr>
-        <w:t xml:space="preserve"> </w:t>
+        <w:lastRenderedPageBreak/>
+        <w:t xml:space="preserve">urutan. Hasil akhirnya, angka </w:t>
       </w:r>
       <w:r>
         <w:rPr>
@@ -6948,151 +6241,7 @@
           <w:rFonts w:ascii="Times New Roman" w:hAnsi="Times New Roman" w:cs="Times New Roman"/>
           <w:szCs w:val="24"/>
         </w:rPr>
-        <w:t xml:space="preserve"> </w:t>
-      </w:r>
-      <w:proofErr w:type="spellStart"/>
-      <w:r>
-        <w:rPr>
-          <w:rFonts w:ascii="Times New Roman" w:hAnsi="Times New Roman" w:cs="Times New Roman"/>
-          <w:szCs w:val="24"/>
-        </w:rPr>
-        <w:t>dipindah</w:t>
-      </w:r>
-      <w:proofErr w:type="spellEnd"/>
-      <w:r>
-        <w:rPr>
-          <w:rFonts w:ascii="Times New Roman" w:hAnsi="Times New Roman" w:cs="Times New Roman"/>
-          <w:szCs w:val="24"/>
-        </w:rPr>
-        <w:t xml:space="preserve"> </w:t>
-      </w:r>
-      <w:proofErr w:type="spellStart"/>
-      <w:r>
-        <w:rPr>
-          <w:rFonts w:ascii="Times New Roman" w:hAnsi="Times New Roman" w:cs="Times New Roman"/>
-          <w:szCs w:val="24"/>
-        </w:rPr>
-        <w:t>ke</w:t>
-      </w:r>
-      <w:proofErr w:type="spellEnd"/>
-      <w:r>
-        <w:rPr>
-          <w:rFonts w:ascii="Times New Roman" w:hAnsi="Times New Roman" w:cs="Times New Roman"/>
-          <w:szCs w:val="24"/>
-        </w:rPr>
-        <w:t xml:space="preserve"> </w:t>
-      </w:r>
-      <w:proofErr w:type="spellStart"/>
-      <w:r>
-        <w:rPr>
-          <w:rFonts w:ascii="Times New Roman" w:hAnsi="Times New Roman" w:cs="Times New Roman"/>
-          <w:szCs w:val="24"/>
-        </w:rPr>
-        <w:t>posisi</w:t>
-      </w:r>
-      <w:proofErr w:type="spellEnd"/>
-      <w:r>
-        <w:rPr>
-          <w:rFonts w:ascii="Times New Roman" w:hAnsi="Times New Roman" w:cs="Times New Roman"/>
-          <w:szCs w:val="24"/>
-        </w:rPr>
-        <w:t xml:space="preserve"> paling </w:t>
-      </w:r>
-      <w:proofErr w:type="spellStart"/>
-      <w:r>
-        <w:rPr>
-          <w:rFonts w:ascii="Times New Roman" w:hAnsi="Times New Roman" w:cs="Times New Roman"/>
-          <w:szCs w:val="24"/>
-        </w:rPr>
-        <w:t>kanan</w:t>
-      </w:r>
-      <w:proofErr w:type="spellEnd"/>
-      <w:r>
-        <w:rPr>
-          <w:rFonts w:ascii="Times New Roman" w:hAnsi="Times New Roman" w:cs="Times New Roman"/>
-          <w:szCs w:val="24"/>
-        </w:rPr>
-        <w:t xml:space="preserve"> (</w:t>
-      </w:r>
-      <w:proofErr w:type="spellStart"/>
-      <w:r>
-        <w:rPr>
-          <w:rFonts w:ascii="Times New Roman" w:hAnsi="Times New Roman" w:cs="Times New Roman"/>
-          <w:szCs w:val="24"/>
-        </w:rPr>
-        <w:t>posisi</w:t>
-      </w:r>
-      <w:proofErr w:type="spellEnd"/>
-      <w:r>
-        <w:rPr>
-          <w:rFonts w:ascii="Times New Roman" w:hAnsi="Times New Roman" w:cs="Times New Roman"/>
-          <w:szCs w:val="24"/>
-        </w:rPr>
-        <w:t xml:space="preserve"> ke-6) </w:t>
-      </w:r>
-      <w:proofErr w:type="spellStart"/>
-      <w:r>
-        <w:rPr>
-          <w:rFonts w:ascii="Times New Roman" w:hAnsi="Times New Roman" w:cs="Times New Roman"/>
-          <w:szCs w:val="24"/>
-        </w:rPr>
-        <w:t>karena</w:t>
-      </w:r>
-      <w:proofErr w:type="spellEnd"/>
-      <w:r>
-        <w:rPr>
-          <w:rFonts w:ascii="Times New Roman" w:hAnsi="Times New Roman" w:cs="Times New Roman"/>
-          <w:szCs w:val="24"/>
-        </w:rPr>
-        <w:t xml:space="preserve"> </w:t>
-      </w:r>
-      <w:proofErr w:type="spellStart"/>
-      <w:r>
-        <w:rPr>
-          <w:rFonts w:ascii="Times New Roman" w:hAnsi="Times New Roman" w:cs="Times New Roman"/>
-          <w:szCs w:val="24"/>
-        </w:rPr>
-        <w:t>merupakan</w:t>
-      </w:r>
-      <w:proofErr w:type="spellEnd"/>
-      <w:r>
-        <w:rPr>
-          <w:rFonts w:ascii="Times New Roman" w:hAnsi="Times New Roman" w:cs="Times New Roman"/>
-          <w:szCs w:val="24"/>
-        </w:rPr>
-        <w:t xml:space="preserve"> </w:t>
-      </w:r>
-      <w:proofErr w:type="spellStart"/>
-      <w:r>
-        <w:rPr>
-          <w:rFonts w:ascii="Times New Roman" w:hAnsi="Times New Roman" w:cs="Times New Roman"/>
-          <w:szCs w:val="24"/>
-        </w:rPr>
-        <w:t>nilai</w:t>
-      </w:r>
-      <w:proofErr w:type="spellEnd"/>
-      <w:r>
-        <w:rPr>
-          <w:rFonts w:ascii="Times New Roman" w:hAnsi="Times New Roman" w:cs="Times New Roman"/>
-          <w:szCs w:val="24"/>
-        </w:rPr>
-        <w:t xml:space="preserve"> </w:t>
-      </w:r>
-      <w:proofErr w:type="spellStart"/>
-      <w:r>
-        <w:rPr>
-          <w:rFonts w:ascii="Times New Roman" w:hAnsi="Times New Roman" w:cs="Times New Roman"/>
-          <w:szCs w:val="24"/>
-        </w:rPr>
-        <w:t>terbesar</w:t>
-      </w:r>
-      <w:proofErr w:type="spellEnd"/>
-      <w:r>
-        <w:rPr>
-          <w:rFonts w:ascii="Times New Roman" w:hAnsi="Times New Roman" w:cs="Times New Roman"/>
-          <w:szCs w:val="24"/>
-        </w:rPr>
-        <w:t>.</w:t>
+        <w:t xml:space="preserve"> dipindah ke posisi paling kanan (posisi ke-6) karena merupakan nilai terbesar.</w:t>
       </w:r>
     </w:p>
     <w:p>
@@ -7108,7 +6257,6 @@
           <w:szCs w:val="24"/>
         </w:rPr>
       </w:pPr>
-      <w:proofErr w:type="spellStart"/>
       <w:r>
         <w:rPr>
           <w:rFonts w:ascii="Times New Roman" w:hAnsi="Times New Roman" w:cs="Times New Roman"/>
@@ -7116,348 +6264,14 @@
           <w:bCs/>
           <w:szCs w:val="24"/>
         </w:rPr>
-        <w:t>Iterasi</w:t>
-      </w:r>
-      <w:proofErr w:type="spellEnd"/>
-      <w:r>
-        <w:rPr>
-          <w:rFonts w:ascii="Times New Roman" w:hAnsi="Times New Roman" w:cs="Times New Roman"/>
-          <w:b/>
-          <w:bCs/>
-          <w:szCs w:val="24"/>
-        </w:rPr>
-        <w:t xml:space="preserve"> 2 </w:t>
-      </w:r>
-      <w:proofErr w:type="spellStart"/>
-      <w:r>
-        <w:rPr>
-          <w:rFonts w:ascii="Times New Roman" w:hAnsi="Times New Roman" w:cs="Times New Roman"/>
-          <w:b/>
-          <w:bCs/>
-          <w:szCs w:val="24"/>
-        </w:rPr>
-        <w:t>hingga</w:t>
-      </w:r>
-      <w:proofErr w:type="spellEnd"/>
-      <w:r>
-        <w:rPr>
-          <w:rFonts w:ascii="Times New Roman" w:hAnsi="Times New Roman" w:cs="Times New Roman"/>
-          <w:b/>
-          <w:bCs/>
-          <w:szCs w:val="24"/>
-        </w:rPr>
-        <w:t xml:space="preserve"> 6</w:t>
+        <w:t>Iterasi 2 hingga 6</w:t>
       </w:r>
       <w:r>
         <w:rPr>
           <w:rFonts w:ascii="Times New Roman" w:hAnsi="Times New Roman" w:cs="Times New Roman"/>
           <w:szCs w:val="24"/>
         </w:rPr>
-        <w:t xml:space="preserve">: </w:t>
-      </w:r>
-      <w:proofErr w:type="spellStart"/>
-      <w:r>
-        <w:rPr>
-          <w:rFonts w:ascii="Times New Roman" w:hAnsi="Times New Roman" w:cs="Times New Roman"/>
-          <w:szCs w:val="24"/>
-        </w:rPr>
-        <w:t>Algoritma</w:t>
-      </w:r>
-      <w:proofErr w:type="spellEnd"/>
-      <w:r>
-        <w:rPr>
-          <w:rFonts w:ascii="Times New Roman" w:hAnsi="Times New Roman" w:cs="Times New Roman"/>
-          <w:szCs w:val="24"/>
-        </w:rPr>
-        <w:t xml:space="preserve"> </w:t>
-      </w:r>
-      <w:proofErr w:type="spellStart"/>
-      <w:r>
-        <w:rPr>
-          <w:rFonts w:ascii="Times New Roman" w:hAnsi="Times New Roman" w:cs="Times New Roman"/>
-          <w:szCs w:val="24"/>
-        </w:rPr>
-        <w:t>masuk</w:t>
-      </w:r>
-      <w:proofErr w:type="spellEnd"/>
-      <w:r>
-        <w:rPr>
-          <w:rFonts w:ascii="Times New Roman" w:hAnsi="Times New Roman" w:cs="Times New Roman"/>
-          <w:szCs w:val="24"/>
-        </w:rPr>
-        <w:t xml:space="preserve"> </w:t>
-      </w:r>
-      <w:proofErr w:type="spellStart"/>
-      <w:r>
-        <w:rPr>
-          <w:rFonts w:ascii="Times New Roman" w:hAnsi="Times New Roman" w:cs="Times New Roman"/>
-          <w:szCs w:val="24"/>
-        </w:rPr>
-        <w:t>ke</w:t>
-      </w:r>
-      <w:proofErr w:type="spellEnd"/>
-      <w:r>
-        <w:rPr>
-          <w:rFonts w:ascii="Times New Roman" w:hAnsi="Times New Roman" w:cs="Times New Roman"/>
-          <w:szCs w:val="24"/>
-        </w:rPr>
-        <w:t xml:space="preserve"> proses </w:t>
-      </w:r>
-      <w:proofErr w:type="spellStart"/>
-      <w:r>
-        <w:rPr>
-          <w:rFonts w:ascii="Times New Roman" w:hAnsi="Times New Roman" w:cs="Times New Roman"/>
-          <w:szCs w:val="24"/>
-        </w:rPr>
-        <w:t>rekursif</w:t>
-      </w:r>
-      <w:proofErr w:type="spellEnd"/>
-      <w:r>
-        <w:rPr>
-          <w:rFonts w:ascii="Times New Roman" w:hAnsi="Times New Roman" w:cs="Times New Roman"/>
-          <w:szCs w:val="24"/>
-        </w:rPr>
-        <w:t xml:space="preserve"> pada sub-array yang </w:t>
-      </w:r>
-      <w:proofErr w:type="spellStart"/>
-      <w:r>
-        <w:rPr>
-          <w:rFonts w:ascii="Times New Roman" w:hAnsi="Times New Roman" w:cs="Times New Roman"/>
-          <w:szCs w:val="24"/>
-        </w:rPr>
-        <w:t>tersisa</w:t>
-      </w:r>
-      <w:proofErr w:type="spellEnd"/>
-      <w:r>
-        <w:rPr>
-          <w:rFonts w:ascii="Times New Roman" w:hAnsi="Times New Roman" w:cs="Times New Roman"/>
-          <w:szCs w:val="24"/>
-        </w:rPr>
-        <w:t xml:space="preserve"> (</w:t>
-      </w:r>
-      <w:proofErr w:type="spellStart"/>
-      <w:r>
-        <w:rPr>
-          <w:rFonts w:ascii="Times New Roman" w:hAnsi="Times New Roman" w:cs="Times New Roman"/>
-          <w:szCs w:val="24"/>
-        </w:rPr>
-        <w:t>posisi</w:t>
-      </w:r>
-      <w:proofErr w:type="spellEnd"/>
-      <w:r>
-        <w:rPr>
-          <w:rFonts w:ascii="Times New Roman" w:hAnsi="Times New Roman" w:cs="Times New Roman"/>
-          <w:szCs w:val="24"/>
-        </w:rPr>
-        <w:t xml:space="preserve"> 1 </w:t>
-      </w:r>
-      <w:proofErr w:type="spellStart"/>
-      <w:r>
-        <w:rPr>
-          <w:rFonts w:ascii="Times New Roman" w:hAnsi="Times New Roman" w:cs="Times New Roman"/>
-          <w:szCs w:val="24"/>
-        </w:rPr>
-        <w:t>sampai</w:t>
-      </w:r>
-      <w:proofErr w:type="spellEnd"/>
-      <w:r>
-        <w:rPr>
-          <w:rFonts w:ascii="Times New Roman" w:hAnsi="Times New Roman" w:cs="Times New Roman"/>
-          <w:szCs w:val="24"/>
-        </w:rPr>
-        <w:t xml:space="preserve"> 5). </w:t>
-      </w:r>
-      <w:proofErr w:type="spellStart"/>
-      <w:r>
-        <w:rPr>
-          <w:rFonts w:ascii="Times New Roman" w:hAnsi="Times New Roman" w:cs="Times New Roman"/>
-          <w:szCs w:val="24"/>
-        </w:rPr>
-        <w:t>Fokusnya</w:t>
-      </w:r>
-      <w:proofErr w:type="spellEnd"/>
-      <w:r>
-        <w:rPr>
-          <w:rFonts w:ascii="Times New Roman" w:hAnsi="Times New Roman" w:cs="Times New Roman"/>
-          <w:szCs w:val="24"/>
-        </w:rPr>
-        <w:t xml:space="preserve"> </w:t>
-      </w:r>
-      <w:proofErr w:type="spellStart"/>
-      <w:r>
-        <w:rPr>
-          <w:rFonts w:ascii="Times New Roman" w:hAnsi="Times New Roman" w:cs="Times New Roman"/>
-          <w:szCs w:val="24"/>
-        </w:rPr>
-        <w:t>adalah</w:t>
-      </w:r>
-      <w:proofErr w:type="spellEnd"/>
-      <w:r>
-        <w:rPr>
-          <w:rFonts w:ascii="Times New Roman" w:hAnsi="Times New Roman" w:cs="Times New Roman"/>
-          <w:szCs w:val="24"/>
-        </w:rPr>
-        <w:t xml:space="preserve"> </w:t>
-      </w:r>
-      <w:proofErr w:type="spellStart"/>
-      <w:r>
-        <w:rPr>
-          <w:rFonts w:ascii="Times New Roman" w:hAnsi="Times New Roman" w:cs="Times New Roman"/>
-          <w:szCs w:val="24"/>
-        </w:rPr>
-        <w:t>memecah</w:t>
-      </w:r>
-      <w:proofErr w:type="spellEnd"/>
-      <w:r>
-        <w:rPr>
-          <w:rFonts w:ascii="Times New Roman" w:hAnsi="Times New Roman" w:cs="Times New Roman"/>
-          <w:szCs w:val="24"/>
-        </w:rPr>
-        <w:t xml:space="preserve"> </w:t>
-      </w:r>
-      <w:proofErr w:type="spellStart"/>
-      <w:r>
-        <w:rPr>
-          <w:rFonts w:ascii="Times New Roman" w:hAnsi="Times New Roman" w:cs="Times New Roman"/>
-          <w:szCs w:val="24"/>
-        </w:rPr>
-        <w:t>bagian</w:t>
-      </w:r>
-      <w:proofErr w:type="spellEnd"/>
-      <w:r>
-        <w:rPr>
-          <w:rFonts w:ascii="Times New Roman" w:hAnsi="Times New Roman" w:cs="Times New Roman"/>
-          <w:szCs w:val="24"/>
-        </w:rPr>
-        <w:t xml:space="preserve"> yang </w:t>
-      </w:r>
-      <w:proofErr w:type="spellStart"/>
-      <w:r>
-        <w:rPr>
-          <w:rFonts w:ascii="Times New Roman" w:hAnsi="Times New Roman" w:cs="Times New Roman"/>
-          <w:szCs w:val="24"/>
-        </w:rPr>
-        <w:t>belum</w:t>
-      </w:r>
-      <w:proofErr w:type="spellEnd"/>
-      <w:r>
-        <w:rPr>
-          <w:rFonts w:ascii="Times New Roman" w:hAnsi="Times New Roman" w:cs="Times New Roman"/>
-          <w:szCs w:val="24"/>
-        </w:rPr>
-        <w:t xml:space="preserve"> </w:t>
-      </w:r>
-      <w:proofErr w:type="spellStart"/>
-      <w:r>
-        <w:rPr>
-          <w:rFonts w:ascii="Times New Roman" w:hAnsi="Times New Roman" w:cs="Times New Roman"/>
-          <w:szCs w:val="24"/>
-        </w:rPr>
-        <w:t>terurut</w:t>
-      </w:r>
-      <w:proofErr w:type="spellEnd"/>
-      <w:r>
-        <w:rPr>
-          <w:rFonts w:ascii="Times New Roman" w:hAnsi="Times New Roman" w:cs="Times New Roman"/>
-          <w:szCs w:val="24"/>
-        </w:rPr>
-        <w:t xml:space="preserve"> </w:t>
-      </w:r>
-      <w:proofErr w:type="spellStart"/>
-      <w:r>
-        <w:rPr>
-          <w:rFonts w:ascii="Times New Roman" w:hAnsi="Times New Roman" w:cs="Times New Roman"/>
-          <w:szCs w:val="24"/>
-        </w:rPr>
-        <w:t>hingga</w:t>
-      </w:r>
-      <w:proofErr w:type="spellEnd"/>
-      <w:r>
-        <w:rPr>
-          <w:rFonts w:ascii="Times New Roman" w:hAnsi="Times New Roman" w:cs="Times New Roman"/>
-          <w:szCs w:val="24"/>
-        </w:rPr>
-        <w:t xml:space="preserve"> </w:t>
-      </w:r>
-      <w:proofErr w:type="spellStart"/>
-      <w:r>
-        <w:rPr>
-          <w:rFonts w:ascii="Times New Roman" w:hAnsi="Times New Roman" w:cs="Times New Roman"/>
-          <w:szCs w:val="24"/>
-        </w:rPr>
-        <w:t>semua</w:t>
-      </w:r>
-      <w:proofErr w:type="spellEnd"/>
-      <w:r>
-        <w:rPr>
-          <w:rFonts w:ascii="Times New Roman" w:hAnsi="Times New Roman" w:cs="Times New Roman"/>
-          <w:szCs w:val="24"/>
-        </w:rPr>
-        <w:t xml:space="preserve"> </w:t>
-      </w:r>
-      <w:proofErr w:type="spellStart"/>
-      <w:r>
-        <w:rPr>
-          <w:rFonts w:ascii="Times New Roman" w:hAnsi="Times New Roman" w:cs="Times New Roman"/>
-          <w:szCs w:val="24"/>
-        </w:rPr>
-        <w:t>elemen</w:t>
-      </w:r>
-      <w:proofErr w:type="spellEnd"/>
-      <w:r>
-        <w:rPr>
-          <w:rFonts w:ascii="Times New Roman" w:hAnsi="Times New Roman" w:cs="Times New Roman"/>
-          <w:szCs w:val="24"/>
-        </w:rPr>
-        <w:t xml:space="preserve"> </w:t>
-      </w:r>
-      <w:proofErr w:type="spellStart"/>
-      <w:r>
-        <w:rPr>
-          <w:rFonts w:ascii="Times New Roman" w:hAnsi="Times New Roman" w:cs="Times New Roman"/>
-          <w:szCs w:val="24"/>
-        </w:rPr>
-        <w:t>berada</w:t>
-      </w:r>
-      <w:proofErr w:type="spellEnd"/>
-      <w:r>
-        <w:rPr>
-          <w:rFonts w:ascii="Times New Roman" w:hAnsi="Times New Roman" w:cs="Times New Roman"/>
-          <w:szCs w:val="24"/>
-        </w:rPr>
-        <w:t xml:space="preserve"> di </w:t>
-      </w:r>
-      <w:proofErr w:type="spellStart"/>
-      <w:r>
-        <w:rPr>
-          <w:rFonts w:ascii="Times New Roman" w:hAnsi="Times New Roman" w:cs="Times New Roman"/>
-          <w:szCs w:val="24"/>
-        </w:rPr>
-        <w:t>posisi</w:t>
-      </w:r>
-      <w:proofErr w:type="spellEnd"/>
-      <w:r>
-        <w:rPr>
-          <w:rFonts w:ascii="Times New Roman" w:hAnsi="Times New Roman" w:cs="Times New Roman"/>
-          <w:szCs w:val="24"/>
-        </w:rPr>
-        <w:t xml:space="preserve"> yang </w:t>
-      </w:r>
-      <w:proofErr w:type="spellStart"/>
-      <w:r>
-        <w:rPr>
-          <w:rFonts w:ascii="Times New Roman" w:hAnsi="Times New Roman" w:cs="Times New Roman"/>
-          <w:szCs w:val="24"/>
-        </w:rPr>
-        <w:t>benar</w:t>
-      </w:r>
-      <w:proofErr w:type="spellEnd"/>
-      <w:r>
-        <w:rPr>
-          <w:rFonts w:ascii="Times New Roman" w:hAnsi="Times New Roman" w:cs="Times New Roman"/>
-          <w:szCs w:val="24"/>
-        </w:rPr>
-        <w:t>.</w:t>
+        <w:t>: Algoritma masuk ke proses rekursif pada sub-array yang tersisa (posisi 1 sampai 5). Fokusnya adalah memecah bagian yang belum terurut hingga semua elemen berada di posisi yang benar.</w:t>
       </w:r>
     </w:p>
     <w:p>
@@ -7487,135 +6301,7 @@
           <w:rFonts w:ascii="Times New Roman" w:hAnsi="Times New Roman" w:cs="Times New Roman"/>
           <w:szCs w:val="24"/>
         </w:rPr>
-        <w:t xml:space="preserve">: </w:t>
-      </w:r>
-      <w:proofErr w:type="spellStart"/>
-      <w:r>
-        <w:rPr>
-          <w:rFonts w:ascii="Times New Roman" w:hAnsi="Times New Roman" w:cs="Times New Roman"/>
-          <w:szCs w:val="24"/>
-        </w:rPr>
-        <w:t>Setelah</w:t>
-      </w:r>
-      <w:proofErr w:type="spellEnd"/>
-      <w:r>
-        <w:rPr>
-          <w:rFonts w:ascii="Times New Roman" w:hAnsi="Times New Roman" w:cs="Times New Roman"/>
-          <w:szCs w:val="24"/>
-        </w:rPr>
-        <w:t xml:space="preserve"> 6 </w:t>
-      </w:r>
-      <w:proofErr w:type="spellStart"/>
-      <w:r>
-        <w:rPr>
-          <w:rFonts w:ascii="Times New Roman" w:hAnsi="Times New Roman" w:cs="Times New Roman"/>
-          <w:szCs w:val="24"/>
-        </w:rPr>
-        <w:t>iterasi</w:t>
-      </w:r>
-      <w:proofErr w:type="spellEnd"/>
-      <w:r>
-        <w:rPr>
-          <w:rFonts w:ascii="Times New Roman" w:hAnsi="Times New Roman" w:cs="Times New Roman"/>
-          <w:szCs w:val="24"/>
-        </w:rPr>
-        <w:t xml:space="preserve">, data </w:t>
-      </w:r>
-      <w:proofErr w:type="spellStart"/>
-      <w:r>
-        <w:rPr>
-          <w:rFonts w:ascii="Times New Roman" w:hAnsi="Times New Roman" w:cs="Times New Roman"/>
-          <w:szCs w:val="24"/>
-        </w:rPr>
-        <w:t>berhasil</w:t>
-      </w:r>
-      <w:proofErr w:type="spellEnd"/>
-      <w:r>
-        <w:rPr>
-          <w:rFonts w:ascii="Times New Roman" w:hAnsi="Times New Roman" w:cs="Times New Roman"/>
-          <w:szCs w:val="24"/>
-        </w:rPr>
-        <w:t xml:space="preserve"> </w:t>
-      </w:r>
-      <w:proofErr w:type="spellStart"/>
-      <w:r>
-        <w:rPr>
-          <w:rFonts w:ascii="Times New Roman" w:hAnsi="Times New Roman" w:cs="Times New Roman"/>
-          <w:szCs w:val="24"/>
-        </w:rPr>
-        <w:t>disusun</w:t>
-      </w:r>
-      <w:proofErr w:type="spellEnd"/>
-      <w:r>
-        <w:rPr>
-          <w:rFonts w:ascii="Times New Roman" w:hAnsi="Times New Roman" w:cs="Times New Roman"/>
-          <w:szCs w:val="24"/>
-        </w:rPr>
-        <w:t xml:space="preserve"> </w:t>
-      </w:r>
-      <w:proofErr w:type="spellStart"/>
-      <w:r>
-        <w:rPr>
-          <w:rFonts w:ascii="Times New Roman" w:hAnsi="Times New Roman" w:cs="Times New Roman"/>
-          <w:szCs w:val="24"/>
-        </w:rPr>
-        <w:t>ulang</w:t>
-      </w:r>
-      <w:proofErr w:type="spellEnd"/>
-      <w:r>
-        <w:rPr>
-          <w:rFonts w:ascii="Times New Roman" w:hAnsi="Times New Roman" w:cs="Times New Roman"/>
-          <w:szCs w:val="24"/>
-        </w:rPr>
-        <w:t xml:space="preserve"> </w:t>
-      </w:r>
-      <w:proofErr w:type="spellStart"/>
-      <w:r>
-        <w:rPr>
-          <w:rFonts w:ascii="Times New Roman" w:hAnsi="Times New Roman" w:cs="Times New Roman"/>
-          <w:szCs w:val="24"/>
-        </w:rPr>
-        <w:t>dari</w:t>
-      </w:r>
-      <w:proofErr w:type="spellEnd"/>
-      <w:r>
-        <w:rPr>
-          <w:rFonts w:ascii="Times New Roman" w:hAnsi="Times New Roman" w:cs="Times New Roman"/>
-          <w:szCs w:val="24"/>
-        </w:rPr>
-        <w:t xml:space="preserve"> [22, 10, 15, 3, 8, 2] </w:t>
-      </w:r>
-      <w:proofErr w:type="spellStart"/>
-      <w:r>
-        <w:rPr>
-          <w:rFonts w:ascii="Times New Roman" w:hAnsi="Times New Roman" w:cs="Times New Roman"/>
-          <w:szCs w:val="24"/>
-        </w:rPr>
-        <w:t>menjadi</w:t>
-      </w:r>
-      <w:proofErr w:type="spellEnd"/>
-      <w:r>
-        <w:rPr>
-          <w:rFonts w:ascii="Times New Roman" w:hAnsi="Times New Roman" w:cs="Times New Roman"/>
-          <w:szCs w:val="24"/>
-        </w:rPr>
-        <w:t xml:space="preserve"> </w:t>
-      </w:r>
-      <w:proofErr w:type="spellStart"/>
-      <w:r>
-        <w:rPr>
-          <w:rFonts w:ascii="Times New Roman" w:hAnsi="Times New Roman" w:cs="Times New Roman"/>
-          <w:szCs w:val="24"/>
-        </w:rPr>
-        <w:t>urutan</w:t>
-      </w:r>
-      <w:proofErr w:type="spellEnd"/>
-      <w:r>
-        <w:rPr>
-          <w:rFonts w:ascii="Times New Roman" w:hAnsi="Times New Roman" w:cs="Times New Roman"/>
-          <w:szCs w:val="24"/>
-        </w:rPr>
-        <w:t xml:space="preserve"> </w:t>
+        <w:t xml:space="preserve">: Setelah 6 iterasi, data berhasil disusun ulang dari [22, 10, 15, 3, 8, 2] menjadi urutan </w:t>
       </w:r>
       <w:r>
         <w:rPr>
@@ -7631,23 +6317,7 @@
           <w:rFonts w:ascii="Times New Roman" w:hAnsi="Times New Roman" w:cs="Times New Roman"/>
           <w:szCs w:val="24"/>
         </w:rPr>
-        <w:t xml:space="preserve"> </w:t>
-      </w:r>
-      <w:proofErr w:type="spellStart"/>
-      <w:r>
-        <w:rPr>
-          <w:rFonts w:ascii="Times New Roman" w:hAnsi="Times New Roman" w:cs="Times New Roman"/>
-          <w:szCs w:val="24"/>
-        </w:rPr>
-        <w:t>yaitu</w:t>
-      </w:r>
-      <w:proofErr w:type="spellEnd"/>
-      <w:r>
-        <w:rPr>
-          <w:rFonts w:ascii="Times New Roman" w:hAnsi="Times New Roman" w:cs="Times New Roman"/>
-          <w:szCs w:val="24"/>
-        </w:rPr>
-        <w:t xml:space="preserve"> [2, 3, 8, 10, 15, 22].</w:t>
+        <w:t xml:space="preserve"> yaitu [2, 3, 8, 10, 15, 22].</w:t>
       </w:r>
     </w:p>
     <w:p>
@@ -7664,360 +6334,594 @@
           <w:rFonts w:ascii="Times New Roman" w:hAnsi="Times New Roman" w:cs="Times New Roman"/>
           <w:szCs w:val="24"/>
         </w:rPr>
-        <w:t xml:space="preserve">Tabel </w:t>
+        <w:t>Tabel ini menunjukkan cara kerja partisi di mana setiap langkah bertujuan untuk menempatkan satu atau lebih elemen ke posisi yang tepat sebelum memproses bagian array yang lebih kecil.</w:t>
       </w:r>
-      <w:proofErr w:type="spellStart"/>
+    </w:p>
+    <w:p>
+      <w:pPr>
+        <w:spacing w:line="360" w:lineRule="auto"/>
+        <w:jc w:val="both"/>
+        <w:rPr>
+          <w:rFonts w:ascii="Times New Roman" w:hAnsi="Times New Roman" w:cs="Times New Roman"/>
+          <w:szCs w:val="24"/>
+        </w:rPr>
+      </w:pPr>
       <w:r>
         <w:rPr>
           <w:rFonts w:ascii="Times New Roman" w:hAnsi="Times New Roman" w:cs="Times New Roman"/>
           <w:szCs w:val="24"/>
         </w:rPr>
-        <w:t>ini</w:t>
+        <w:br w:type="page"/>
       </w:r>
-      <w:proofErr w:type="spellEnd"/>
+    </w:p>
+    <w:p>
+      <w:pPr>
+        <w:spacing w:line="360" w:lineRule="auto"/>
+        <w:jc w:val="both"/>
+        <w:rPr>
+          <w:rFonts w:ascii="Times New Roman" w:hAnsi="Times New Roman" w:cs="Times New Roman"/>
+          <w:szCs w:val="24"/>
+        </w:rPr>
+      </w:pPr>
       <w:r>
         <w:rPr>
           <w:rFonts w:ascii="Times New Roman" w:hAnsi="Times New Roman" w:cs="Times New Roman"/>
           <w:szCs w:val="24"/>
         </w:rPr>
-        <w:t xml:space="preserve"> </w:t>
+        <w:lastRenderedPageBreak/>
+        <w:t xml:space="preserve">PENJELASAN KODE </w:t>
       </w:r>
-      <w:proofErr w:type="spellStart"/>
+      <w:proofErr w:type="gramStart"/>
       <w:r>
         <w:rPr>
           <w:rFonts w:ascii="Times New Roman" w:hAnsi="Times New Roman" w:cs="Times New Roman"/>
           <w:szCs w:val="24"/>
         </w:rPr>
-        <w:t>menunjukkan</w:t>
+        <w:t>PROGRAMNYA :</w:t>
       </w:r>
-      <w:proofErr w:type="spellEnd"/>
+      <w:proofErr w:type="gramEnd"/>
+    </w:p>
+    <w:p>
+      <w:pPr>
+        <w:spacing w:line="360" w:lineRule="auto"/>
+        <w:jc w:val="both"/>
+        <w:rPr>
+          <w:rFonts w:ascii="Times New Roman" w:hAnsi="Times New Roman" w:cs="Times New Roman"/>
+          <w:szCs w:val="24"/>
+        </w:rPr>
+      </w:pPr>
       <w:r>
         <w:rPr>
           <w:rFonts w:ascii="Times New Roman" w:hAnsi="Times New Roman" w:cs="Times New Roman"/>
           <w:szCs w:val="24"/>
         </w:rPr>
-        <w:t xml:space="preserve"> </w:t>
+        <w:t xml:space="preserve">1. </w:t>
       </w:r>
-      <w:proofErr w:type="spellStart"/>
       <w:r>
         <w:rPr>
           <w:rFonts w:ascii="Times New Roman" w:hAnsi="Times New Roman" w:cs="Times New Roman"/>
           <w:szCs w:val="24"/>
         </w:rPr>
-        <w:t>cara</w:t>
+        <w:t>Penjelasan File Header (sorting.h)</w:t>
       </w:r>
-      <w:proofErr w:type="spellEnd"/>
+    </w:p>
+    <w:p>
+      <w:pPr>
+        <w:spacing w:line="360" w:lineRule="auto"/>
+        <w:jc w:val="both"/>
+        <w:rPr>
+          <w:rFonts w:ascii="Times New Roman" w:hAnsi="Times New Roman" w:cs="Times New Roman"/>
+          <w:szCs w:val="24"/>
+        </w:rPr>
+      </w:pPr>
+      <w:r>
+        <w:rPr>
+          <w:noProof/>
+        </w:rPr>
+        <w:drawing>
+          <wp:inline distT="0" distB="0" distL="0" distR="0" wp14:anchorId="791F854C" wp14:editId="6D2F3637">
+            <wp:extent cx="5565775" cy="2319020"/>
+            <wp:effectExtent l="0" t="0" r="0" b="5080"/>
+            <wp:docPr id="479568319" name="Picture 1"/>
+            <wp:cNvGraphicFramePr>
+              <a:graphicFrameLocks xmlns:a="http://schemas.openxmlformats.org/drawingml/2006/main" noChangeAspect="1"/>
+            </wp:cNvGraphicFramePr>
+            <a:graphic xmlns:a="http://schemas.openxmlformats.org/drawingml/2006/main">
+              <a:graphicData uri="http://schemas.openxmlformats.org/drawingml/2006/picture">
+                <pic:pic xmlns:pic="http://schemas.openxmlformats.org/drawingml/2006/picture">
+                  <pic:nvPicPr>
+                    <pic:cNvPr id="0" name="Picture 1"/>
+                    <pic:cNvPicPr>
+                      <a:picLocks noChangeAspect="1" noChangeArrowheads="1"/>
+                    </pic:cNvPicPr>
+                  </pic:nvPicPr>
+                  <pic:blipFill>
+                    <a:blip r:embed="rId5">
+                      <a:extLst>
+                        <a:ext uri="{28A0092B-C50C-407E-A947-70E740481C1C}">
+                          <a14:useLocalDpi xmlns:a14="http://schemas.microsoft.com/office/drawing/2010/main" val="0"/>
+                        </a:ext>
+                      </a:extLst>
+                    </a:blip>
+                    <a:srcRect/>
+                    <a:stretch>
+                      <a:fillRect/>
+                    </a:stretch>
+                  </pic:blipFill>
+                  <pic:spPr bwMode="auto">
+                    <a:xfrm>
+                      <a:off x="0" y="0"/>
+                      <a:ext cx="5565775" cy="2319020"/>
+                    </a:xfrm>
+                    <a:prstGeom prst="rect">
+                      <a:avLst/>
+                    </a:prstGeom>
+                    <a:noFill/>
+                    <a:ln>
+                      <a:noFill/>
+                    </a:ln>
+                  </pic:spPr>
+                </pic:pic>
+              </a:graphicData>
+            </a:graphic>
+          </wp:inline>
+        </w:drawing>
+      </w:r>
+    </w:p>
+    <w:p>
+      <w:pPr>
+        <w:spacing w:line="360" w:lineRule="auto"/>
+        <w:ind w:firstLine="720"/>
+        <w:jc w:val="both"/>
+        <w:rPr>
+          <w:rFonts w:ascii="Times New Roman" w:hAnsi="Times New Roman" w:cs="Times New Roman"/>
+          <w:szCs w:val="24"/>
+        </w:rPr>
+      </w:pPr>
       <w:r>
         <w:rPr>
           <w:rFonts w:ascii="Times New Roman" w:hAnsi="Times New Roman" w:cs="Times New Roman"/>
           <w:szCs w:val="24"/>
         </w:rPr>
-        <w:t xml:space="preserve"> </w:t>
+        <w:t xml:space="preserve">File sorting.h berfungsi sebagai </w:t>
       </w:r>
-      <w:proofErr w:type="spellStart"/>
+      <w:r>
+        <w:rPr>
+          <w:rFonts w:ascii="Times New Roman" w:hAnsi="Times New Roman" w:cs="Times New Roman"/>
+          <w:i/>
+          <w:iCs/>
+          <w:szCs w:val="24"/>
+        </w:rPr>
+        <w:t>header file</w:t>
+      </w:r>
       <w:r>
         <w:rPr>
           <w:rFonts w:ascii="Times New Roman" w:hAnsi="Times New Roman" w:cs="Times New Roman"/>
           <w:szCs w:val="24"/>
         </w:rPr>
-        <w:t>kerja</w:t>
+        <w:t xml:space="preserve"> yang mendefinisikan struktur antarmuka (</w:t>
       </w:r>
-      <w:proofErr w:type="spellEnd"/>
+      <w:r>
+        <w:rPr>
+          <w:rFonts w:ascii="Times New Roman" w:hAnsi="Times New Roman" w:cs="Times New Roman"/>
+          <w:i/>
+          <w:iCs/>
+          <w:szCs w:val="24"/>
+        </w:rPr>
+        <w:t>interface</w:t>
+      </w:r>
       <w:r>
         <w:rPr>
           <w:rFonts w:ascii="Times New Roman" w:hAnsi="Times New Roman" w:cs="Times New Roman"/>
           <w:szCs w:val="24"/>
         </w:rPr>
-        <w:t xml:space="preserve"> </w:t>
+        <w:t>) bagi fungsi-fungsi yang digunakan dalam program ini. Berikut adalah rincian komponen di dalamnya:</w:t>
       </w:r>
-      <w:proofErr w:type="spellStart"/>
+    </w:p>
+    <w:p>
+      <w:pPr>
+        <w:numPr>
+          <w:ilvl w:val="0"/>
+          <w:numId w:val="5"/>
+        </w:numPr>
+        <w:spacing w:line="360" w:lineRule="auto"/>
+        <w:jc w:val="both"/>
+        <w:rPr>
+          <w:rFonts w:ascii="Times New Roman" w:hAnsi="Times New Roman" w:cs="Times New Roman"/>
+          <w:szCs w:val="24"/>
+        </w:rPr>
+      </w:pPr>
+      <w:r>
+        <w:rPr>
+          <w:rFonts w:ascii="Times New Roman" w:hAnsi="Times New Roman" w:cs="Times New Roman"/>
+          <w:b/>
+          <w:bCs/>
+          <w:i/>
+          <w:iCs/>
+          <w:szCs w:val="24"/>
+        </w:rPr>
+        <w:t>Header Guard</w:t>
+      </w:r>
+      <w:r>
+        <w:rPr>
+          <w:rFonts w:ascii="Times New Roman" w:hAnsi="Times New Roman" w:cs="Times New Roman"/>
+          <w:b/>
+          <w:bCs/>
+          <w:szCs w:val="24"/>
+        </w:rPr>
+        <w:t xml:space="preserve"> (#ifndef dan #define):</w:t>
+      </w:r>
       <w:r>
         <w:rPr>
           <w:rFonts w:ascii="Times New Roman" w:hAnsi="Times New Roman" w:cs="Times New Roman"/>
           <w:szCs w:val="24"/>
         </w:rPr>
-        <w:t>partisi</w:t>
+        <w:t xml:space="preserve"> Bagian ini berfungsi untuk mencegah </w:t>
       </w:r>
-      <w:proofErr w:type="spellEnd"/>
+      <w:r>
+        <w:rPr>
+          <w:rFonts w:ascii="Times New Roman" w:hAnsi="Times New Roman" w:cs="Times New Roman"/>
+          <w:i/>
+          <w:iCs/>
+          <w:szCs w:val="24"/>
+        </w:rPr>
+        <w:t>double inclusion</w:t>
+      </w:r>
       <w:r>
         <w:rPr>
           <w:rFonts w:ascii="Times New Roman" w:hAnsi="Times New Roman" w:cs="Times New Roman"/>
           <w:szCs w:val="24"/>
         </w:rPr>
-        <w:t xml:space="preserve"> di mana </w:t>
+        <w:t xml:space="preserve"> atau pemanggilan berulang pada file yang sama selama proses kompilasi, sehingga menjaga stabilitas struktur proyek.</w:t>
       </w:r>
-      <w:proofErr w:type="spellStart"/>
+    </w:p>
+    <w:p>
+      <w:pPr>
+        <w:numPr>
+          <w:ilvl w:val="0"/>
+          <w:numId w:val="5"/>
+        </w:numPr>
+        <w:spacing w:line="360" w:lineRule="auto"/>
+        <w:jc w:val="both"/>
+        <w:rPr>
+          <w:rFonts w:ascii="Times New Roman" w:hAnsi="Times New Roman" w:cs="Times New Roman"/>
+          <w:szCs w:val="24"/>
+        </w:rPr>
+      </w:pPr>
+      <w:r>
+        <w:rPr>
+          <w:rFonts w:ascii="Times New Roman" w:hAnsi="Times New Roman" w:cs="Times New Roman"/>
+          <w:b/>
+          <w:bCs/>
+          <w:szCs w:val="24"/>
+        </w:rPr>
+        <w:t>void tampilkan_</w:t>
+      </w:r>
+      <w:proofErr w:type="gramStart"/>
+      <w:r>
+        <w:rPr>
+          <w:rFonts w:ascii="Times New Roman" w:hAnsi="Times New Roman" w:cs="Times New Roman"/>
+          <w:b/>
+          <w:bCs/>
+          <w:szCs w:val="24"/>
+        </w:rPr>
+        <w:t>larik(</w:t>
+      </w:r>
+      <w:proofErr w:type="gramEnd"/>
+      <w:r>
+        <w:rPr>
+          <w:rFonts w:ascii="Times New Roman" w:hAnsi="Times New Roman" w:cs="Times New Roman"/>
+          <w:b/>
+          <w:bCs/>
+          <w:szCs w:val="24"/>
+        </w:rPr>
+        <w:t xml:space="preserve">int </w:t>
+      </w:r>
+      <w:proofErr w:type="gramStart"/>
+      <w:r>
+        <w:rPr>
+          <w:rFonts w:ascii="Times New Roman" w:hAnsi="Times New Roman" w:cs="Times New Roman"/>
+          <w:b/>
+          <w:bCs/>
+          <w:szCs w:val="24"/>
+        </w:rPr>
+        <w:t>data[</w:t>
+      </w:r>
+      <w:proofErr w:type="gramEnd"/>
+      <w:r>
+        <w:rPr>
+          <w:rFonts w:ascii="Times New Roman" w:hAnsi="Times New Roman" w:cs="Times New Roman"/>
+          <w:b/>
+          <w:bCs/>
+          <w:szCs w:val="24"/>
+        </w:rPr>
+        <w:t>], int n</w:t>
+      </w:r>
+      <w:proofErr w:type="gramStart"/>
+      <w:r>
+        <w:rPr>
+          <w:rFonts w:ascii="Times New Roman" w:hAnsi="Times New Roman" w:cs="Times New Roman"/>
+          <w:b/>
+          <w:bCs/>
+          <w:szCs w:val="24"/>
+        </w:rPr>
+        <w:t>);</w:t>
+      </w:r>
       <w:r>
         <w:rPr>
           <w:rFonts w:ascii="Times New Roman" w:hAnsi="Times New Roman" w:cs="Times New Roman"/>
           <w:szCs w:val="24"/>
         </w:rPr>
-        <w:t>setiap</w:t>
+        <w:t>:</w:t>
       </w:r>
-      <w:proofErr w:type="spellEnd"/>
+      <w:proofErr w:type="gramEnd"/>
       <w:r>
         <w:rPr>
           <w:rFonts w:ascii="Times New Roman" w:hAnsi="Times New Roman" w:cs="Times New Roman"/>
           <w:szCs w:val="24"/>
         </w:rPr>
-        <w:t xml:space="preserve"> </w:t>
+        <w:t xml:space="preserve"> Fungsi ini bertujuan untuk mencetak elemen-elemen array ke layar. Fungsi ini sangat krusial untuk memantau perubahan data sebelum dan sesudah proses pengurutan.</w:t>
       </w:r>
-      <w:proofErr w:type="spellStart"/>
+    </w:p>
+    <w:p>
+      <w:pPr>
+        <w:numPr>
+          <w:ilvl w:val="0"/>
+          <w:numId w:val="5"/>
+        </w:numPr>
+        <w:spacing w:line="360" w:lineRule="auto"/>
+        <w:jc w:val="both"/>
+        <w:rPr>
+          <w:rFonts w:ascii="Times New Roman" w:hAnsi="Times New Roman" w:cs="Times New Roman"/>
+          <w:szCs w:val="24"/>
+        </w:rPr>
+      </w:pPr>
+      <w:r>
+        <w:rPr>
+          <w:rFonts w:ascii="Times New Roman" w:hAnsi="Times New Roman" w:cs="Times New Roman"/>
+          <w:b/>
+          <w:bCs/>
+          <w:szCs w:val="24"/>
+        </w:rPr>
+        <w:t xml:space="preserve">int </w:t>
+      </w:r>
+      <w:proofErr w:type="gramStart"/>
+      <w:r>
+        <w:rPr>
+          <w:rFonts w:ascii="Times New Roman" w:hAnsi="Times New Roman" w:cs="Times New Roman"/>
+          <w:b/>
+          <w:bCs/>
+          <w:szCs w:val="24"/>
+        </w:rPr>
+        <w:t>partisi(</w:t>
+      </w:r>
+      <w:proofErr w:type="gramEnd"/>
+      <w:r>
+        <w:rPr>
+          <w:rFonts w:ascii="Times New Roman" w:hAnsi="Times New Roman" w:cs="Times New Roman"/>
+          <w:b/>
+          <w:bCs/>
+          <w:szCs w:val="24"/>
+        </w:rPr>
+        <w:t xml:space="preserve">int </w:t>
+      </w:r>
+      <w:proofErr w:type="gramStart"/>
+      <w:r>
+        <w:rPr>
+          <w:rFonts w:ascii="Times New Roman" w:hAnsi="Times New Roman" w:cs="Times New Roman"/>
+          <w:b/>
+          <w:bCs/>
+          <w:szCs w:val="24"/>
+        </w:rPr>
+        <w:t>data[</w:t>
+      </w:r>
+      <w:proofErr w:type="gramEnd"/>
+      <w:r>
+        <w:rPr>
+          <w:rFonts w:ascii="Times New Roman" w:hAnsi="Times New Roman" w:cs="Times New Roman"/>
+          <w:b/>
+          <w:bCs/>
+          <w:szCs w:val="24"/>
+        </w:rPr>
+        <w:t>], int awal, int akhir</w:t>
+      </w:r>
+      <w:proofErr w:type="gramStart"/>
+      <w:r>
+        <w:rPr>
+          <w:rFonts w:ascii="Times New Roman" w:hAnsi="Times New Roman" w:cs="Times New Roman"/>
+          <w:b/>
+          <w:bCs/>
+          <w:szCs w:val="24"/>
+        </w:rPr>
+        <w:t>);</w:t>
+      </w:r>
       <w:r>
         <w:rPr>
           <w:rFonts w:ascii="Times New Roman" w:hAnsi="Times New Roman" w:cs="Times New Roman"/>
           <w:szCs w:val="24"/>
         </w:rPr>
-        <w:t>langkah</w:t>
+        <w:t>:</w:t>
       </w:r>
-      <w:proofErr w:type="spellEnd"/>
+      <w:proofErr w:type="gramEnd"/>
       <w:r>
         <w:rPr>
           <w:rFonts w:ascii="Times New Roman" w:hAnsi="Times New Roman" w:cs="Times New Roman"/>
           <w:szCs w:val="24"/>
         </w:rPr>
-        <w:t xml:space="preserve"> </w:t>
+        <w:t xml:space="preserve"> Fungsi ini merupakan inti logika dari algoritma </w:t>
       </w:r>
-      <w:proofErr w:type="spellStart"/>
+      <w:r>
+        <w:rPr>
+          <w:rFonts w:ascii="Times New Roman" w:hAnsi="Times New Roman" w:cs="Times New Roman"/>
+          <w:i/>
+          <w:iCs/>
+          <w:szCs w:val="24"/>
+        </w:rPr>
+        <w:t>Quick Sort</w:t>
+      </w:r>
       <w:r>
         <w:rPr>
           <w:rFonts w:ascii="Times New Roman" w:hAnsi="Times New Roman" w:cs="Times New Roman"/>
           <w:szCs w:val="24"/>
         </w:rPr>
-        <w:t>bertujuan</w:t>
+        <w:t xml:space="preserve">. Tugasnya adalah mengatur posisi elemen berdasarkan nilai </w:t>
       </w:r>
-      <w:proofErr w:type="spellEnd"/>
+      <w:r>
+        <w:rPr>
+          <w:rFonts w:ascii="Times New Roman" w:hAnsi="Times New Roman" w:cs="Times New Roman"/>
+          <w:i/>
+          <w:iCs/>
+          <w:szCs w:val="24"/>
+        </w:rPr>
+        <w:t>pivot</w:t>
+      </w:r>
       <w:r>
         <w:rPr>
           <w:rFonts w:ascii="Times New Roman" w:hAnsi="Times New Roman" w:cs="Times New Roman"/>
           <w:szCs w:val="24"/>
         </w:rPr>
-        <w:t xml:space="preserve"> </w:t>
+        <w:t xml:space="preserve"> dan mengembalikan posisi indeks (</w:t>
       </w:r>
-      <w:proofErr w:type="spellStart"/>
+      <w:r>
+        <w:rPr>
+          <w:rFonts w:ascii="Times New Roman" w:hAnsi="Times New Roman" w:cs="Times New Roman"/>
+          <w:i/>
+          <w:iCs/>
+          <w:szCs w:val="24"/>
+        </w:rPr>
+        <w:t>pivot point</w:t>
+      </w:r>
       <w:r>
         <w:rPr>
           <w:rFonts w:ascii="Times New Roman" w:hAnsi="Times New Roman" w:cs="Times New Roman"/>
           <w:szCs w:val="24"/>
         </w:rPr>
-        <w:t>untuk</w:t>
+        <w:t>) yang telah terurut.</w:t>
       </w:r>
-      <w:proofErr w:type="spellEnd"/>
+    </w:p>
+    <w:p>
+      <w:pPr>
+        <w:numPr>
+          <w:ilvl w:val="0"/>
+          <w:numId w:val="5"/>
+        </w:numPr>
+        <w:spacing w:line="360" w:lineRule="auto"/>
+        <w:jc w:val="both"/>
+        <w:rPr>
+          <w:rFonts w:ascii="Times New Roman" w:hAnsi="Times New Roman" w:cs="Times New Roman"/>
+          <w:szCs w:val="24"/>
+        </w:rPr>
+      </w:pPr>
+      <w:r>
+        <w:rPr>
+          <w:rFonts w:ascii="Times New Roman" w:hAnsi="Times New Roman" w:cs="Times New Roman"/>
+          <w:b/>
+          <w:bCs/>
+          <w:szCs w:val="24"/>
+        </w:rPr>
+        <w:t>void quick_</w:t>
+      </w:r>
+      <w:proofErr w:type="gramStart"/>
+      <w:r>
+        <w:rPr>
+          <w:rFonts w:ascii="Times New Roman" w:hAnsi="Times New Roman" w:cs="Times New Roman"/>
+          <w:b/>
+          <w:bCs/>
+          <w:szCs w:val="24"/>
+        </w:rPr>
+        <w:t>sort(</w:t>
+      </w:r>
+      <w:proofErr w:type="gramEnd"/>
+      <w:r>
+        <w:rPr>
+          <w:rFonts w:ascii="Times New Roman" w:hAnsi="Times New Roman" w:cs="Times New Roman"/>
+          <w:b/>
+          <w:bCs/>
+          <w:szCs w:val="24"/>
+        </w:rPr>
+        <w:t xml:space="preserve">int </w:t>
+      </w:r>
+      <w:proofErr w:type="gramStart"/>
+      <w:r>
+        <w:rPr>
+          <w:rFonts w:ascii="Times New Roman" w:hAnsi="Times New Roman" w:cs="Times New Roman"/>
+          <w:b/>
+          <w:bCs/>
+          <w:szCs w:val="24"/>
+        </w:rPr>
+        <w:t>data[</w:t>
+      </w:r>
+      <w:proofErr w:type="gramEnd"/>
+      <w:r>
+        <w:rPr>
+          <w:rFonts w:ascii="Times New Roman" w:hAnsi="Times New Roman" w:cs="Times New Roman"/>
+          <w:b/>
+          <w:bCs/>
+          <w:szCs w:val="24"/>
+        </w:rPr>
+        <w:t>], int awal, int akhir</w:t>
+      </w:r>
+      <w:proofErr w:type="gramStart"/>
+      <w:r>
+        <w:rPr>
+          <w:rFonts w:ascii="Times New Roman" w:hAnsi="Times New Roman" w:cs="Times New Roman"/>
+          <w:b/>
+          <w:bCs/>
+          <w:szCs w:val="24"/>
+        </w:rPr>
+        <w:t>);</w:t>
+      </w:r>
       <w:r>
         <w:rPr>
           <w:rFonts w:ascii="Times New Roman" w:hAnsi="Times New Roman" w:cs="Times New Roman"/>
           <w:szCs w:val="24"/>
         </w:rPr>
-        <w:t xml:space="preserve"> </w:t>
+        <w:t>:</w:t>
       </w:r>
-      <w:proofErr w:type="spellStart"/>
+      <w:proofErr w:type="gramEnd"/>
       <w:r>
         <w:rPr>
           <w:rFonts w:ascii="Times New Roman" w:hAnsi="Times New Roman" w:cs="Times New Roman"/>
           <w:szCs w:val="24"/>
         </w:rPr>
-        <w:t>menempatkan</w:t>
+        <w:t xml:space="preserve"> Fungsi ini mengimplementasikan logika </w:t>
       </w:r>
-      <w:proofErr w:type="spellEnd"/>
+      <w:r>
+        <w:rPr>
+          <w:rFonts w:ascii="Times New Roman" w:hAnsi="Times New Roman" w:cs="Times New Roman"/>
+          <w:i/>
+          <w:iCs/>
+          <w:szCs w:val="24"/>
+        </w:rPr>
+        <w:t>Quick Sort</w:t>
+      </w:r>
       <w:r>
         <w:rPr>
           <w:rFonts w:ascii="Times New Roman" w:hAnsi="Times New Roman" w:cs="Times New Roman"/>
           <w:szCs w:val="24"/>
         </w:rPr>
-        <w:t xml:space="preserve"> </w:t>
+        <w:t xml:space="preserve"> secara rekursif. Fungsi ini membagi array menjadi bagian-bagian yang lebih kecil secara bertahap hingga seluruh data mencapai kondisi terurut.</w:t>
       </w:r>
-      <w:proofErr w:type="spellStart"/>
-      <w:r>
+    </w:p>
+    <w:p>
+      <w:pPr>
+        <w:spacing w:line="360" w:lineRule="auto"/>
+        <w:jc w:val="both"/>
         <w:rPr>
           <w:rFonts w:ascii="Times New Roman" w:hAnsi="Times New Roman" w:cs="Times New Roman"/>
           <w:szCs w:val="24"/>
         </w:rPr>
-        <w:t>satu</w:t>
-      </w:r>
-      <w:proofErr w:type="spellEnd"/>
-      <w:r>
+      </w:pPr>
+    </w:p>
+    <w:p>
+      <w:pPr>
+        <w:spacing w:line="360" w:lineRule="auto"/>
+        <w:jc w:val="both"/>
         <w:rPr>
           <w:rFonts w:ascii="Times New Roman" w:hAnsi="Times New Roman" w:cs="Times New Roman"/>
           <w:szCs w:val="24"/>
         </w:rPr>
-        <w:t xml:space="preserve"> </w:t>
-      </w:r>
-      <w:proofErr w:type="spellStart"/>
-      <w:r>
-        <w:rPr>
-          <w:rFonts w:ascii="Times New Roman" w:hAnsi="Times New Roman" w:cs="Times New Roman"/>
-          <w:szCs w:val="24"/>
-        </w:rPr>
-        <w:t>atau</w:t>
-      </w:r>
-      <w:proofErr w:type="spellEnd"/>
-      <w:r>
-        <w:rPr>
-          <w:rFonts w:ascii="Times New Roman" w:hAnsi="Times New Roman" w:cs="Times New Roman"/>
-          <w:szCs w:val="24"/>
-        </w:rPr>
-        <w:t xml:space="preserve"> </w:t>
-      </w:r>
-      <w:proofErr w:type="spellStart"/>
-      <w:r>
-        <w:rPr>
-          <w:rFonts w:ascii="Times New Roman" w:hAnsi="Times New Roman" w:cs="Times New Roman"/>
-          <w:szCs w:val="24"/>
-        </w:rPr>
-        <w:t>lebih</w:t>
-      </w:r>
-      <w:proofErr w:type="spellEnd"/>
-      <w:r>
-        <w:rPr>
-          <w:rFonts w:ascii="Times New Roman" w:hAnsi="Times New Roman" w:cs="Times New Roman"/>
-          <w:szCs w:val="24"/>
-        </w:rPr>
-        <w:t xml:space="preserve"> </w:t>
-      </w:r>
-      <w:proofErr w:type="spellStart"/>
-      <w:r>
-        <w:rPr>
-          <w:rFonts w:ascii="Times New Roman" w:hAnsi="Times New Roman" w:cs="Times New Roman"/>
-          <w:szCs w:val="24"/>
-        </w:rPr>
-        <w:t>elemen</w:t>
-      </w:r>
-      <w:proofErr w:type="spellEnd"/>
-      <w:r>
-        <w:rPr>
-          <w:rFonts w:ascii="Times New Roman" w:hAnsi="Times New Roman" w:cs="Times New Roman"/>
-          <w:szCs w:val="24"/>
-        </w:rPr>
-        <w:t xml:space="preserve"> </w:t>
-      </w:r>
-      <w:proofErr w:type="spellStart"/>
-      <w:r>
-        <w:rPr>
-          <w:rFonts w:ascii="Times New Roman" w:hAnsi="Times New Roman" w:cs="Times New Roman"/>
-          <w:szCs w:val="24"/>
-        </w:rPr>
-        <w:t>ke</w:t>
-      </w:r>
-      <w:proofErr w:type="spellEnd"/>
-      <w:r>
-        <w:rPr>
-          <w:rFonts w:ascii="Times New Roman" w:hAnsi="Times New Roman" w:cs="Times New Roman"/>
-          <w:szCs w:val="24"/>
-        </w:rPr>
-        <w:t xml:space="preserve"> </w:t>
-      </w:r>
-      <w:proofErr w:type="spellStart"/>
-      <w:r>
-        <w:rPr>
-          <w:rFonts w:ascii="Times New Roman" w:hAnsi="Times New Roman" w:cs="Times New Roman"/>
-          <w:szCs w:val="24"/>
-        </w:rPr>
-        <w:t>posisi</w:t>
-      </w:r>
-      <w:proofErr w:type="spellEnd"/>
-      <w:r>
-        <w:rPr>
-          <w:rFonts w:ascii="Times New Roman" w:hAnsi="Times New Roman" w:cs="Times New Roman"/>
-          <w:szCs w:val="24"/>
-        </w:rPr>
-        <w:t xml:space="preserve"> yang </w:t>
-      </w:r>
-      <w:proofErr w:type="spellStart"/>
-      <w:r>
-        <w:rPr>
-          <w:rFonts w:ascii="Times New Roman" w:hAnsi="Times New Roman" w:cs="Times New Roman"/>
-          <w:szCs w:val="24"/>
-        </w:rPr>
-        <w:t>tepat</w:t>
-      </w:r>
-      <w:proofErr w:type="spellEnd"/>
-      <w:r>
-        <w:rPr>
-          <w:rFonts w:ascii="Times New Roman" w:hAnsi="Times New Roman" w:cs="Times New Roman"/>
-          <w:szCs w:val="24"/>
-        </w:rPr>
-        <w:t xml:space="preserve"> </w:t>
-      </w:r>
-      <w:proofErr w:type="spellStart"/>
-      <w:r>
-        <w:rPr>
-          <w:rFonts w:ascii="Times New Roman" w:hAnsi="Times New Roman" w:cs="Times New Roman"/>
-          <w:szCs w:val="24"/>
-        </w:rPr>
-        <w:t>sebelum</w:t>
-      </w:r>
-      <w:proofErr w:type="spellEnd"/>
-      <w:r>
-        <w:rPr>
-          <w:rFonts w:ascii="Times New Roman" w:hAnsi="Times New Roman" w:cs="Times New Roman"/>
-          <w:szCs w:val="24"/>
-        </w:rPr>
-        <w:t xml:space="preserve"> </w:t>
-      </w:r>
-      <w:proofErr w:type="spellStart"/>
-      <w:r>
-        <w:rPr>
-          <w:rFonts w:ascii="Times New Roman" w:hAnsi="Times New Roman" w:cs="Times New Roman"/>
-          <w:szCs w:val="24"/>
-        </w:rPr>
-        <w:t>memproses</w:t>
-      </w:r>
-      <w:proofErr w:type="spellEnd"/>
-      <w:r>
-        <w:rPr>
-          <w:rFonts w:ascii="Times New Roman" w:hAnsi="Times New Roman" w:cs="Times New Roman"/>
-          <w:szCs w:val="24"/>
-        </w:rPr>
-        <w:t xml:space="preserve"> </w:t>
-      </w:r>
-      <w:proofErr w:type="spellStart"/>
-      <w:r>
-        <w:rPr>
-          <w:rFonts w:ascii="Times New Roman" w:hAnsi="Times New Roman" w:cs="Times New Roman"/>
-          <w:szCs w:val="24"/>
-        </w:rPr>
-        <w:t>bagian</w:t>
-      </w:r>
-      <w:proofErr w:type="spellEnd"/>
-      <w:r>
-        <w:rPr>
-          <w:rFonts w:ascii="Times New Roman" w:hAnsi="Times New Roman" w:cs="Times New Roman"/>
-          <w:szCs w:val="24"/>
-        </w:rPr>
-        <w:t xml:space="preserve"> array yang </w:t>
-      </w:r>
-      <w:proofErr w:type="spellStart"/>
-      <w:r>
-        <w:rPr>
-          <w:rFonts w:ascii="Times New Roman" w:hAnsi="Times New Roman" w:cs="Times New Roman"/>
-          <w:szCs w:val="24"/>
-        </w:rPr>
-        <w:t>lebih</w:t>
-      </w:r>
-      <w:proofErr w:type="spellEnd"/>
-      <w:r>
-        <w:rPr>
-          <w:rFonts w:ascii="Times New Roman" w:hAnsi="Times New Roman" w:cs="Times New Roman"/>
-          <w:szCs w:val="24"/>
-        </w:rPr>
-        <w:t xml:space="preserve"> </w:t>
-      </w:r>
-      <w:proofErr w:type="spellStart"/>
-      <w:r>
-        <w:rPr>
-          <w:rFonts w:ascii="Times New Roman" w:hAnsi="Times New Roman" w:cs="Times New Roman"/>
-          <w:szCs w:val="24"/>
-        </w:rPr>
-        <w:t>kecil</w:t>
-      </w:r>
-      <w:proofErr w:type="spellEnd"/>
-      <w:r>
-        <w:rPr>
-          <w:rFonts w:ascii="Times New Roman" w:hAnsi="Times New Roman" w:cs="Times New Roman"/>
-          <w:szCs w:val="24"/>
-        </w:rPr>
-        <w:t>.</w:t>
-      </w:r>
+      </w:pPr>
     </w:p>
     <w:p>
       <w:pPr>
@@ -8193,11 +7097,11 @@
   <w:abstractNum w:abstractNumId="1" w15:restartNumberingAfterBreak="0">
     <w:nsid w:val="54353269"/>
     <w:multiLevelType w:val="multilevel"/>
-    <w:tmpl w:val="4A56448C"/>
+    <w:tmpl w:val="720821A0"/>
     <w:lvl w:ilvl="0">
       <w:start w:val="1"/>
-      <w:numFmt w:val="bullet"/>
-      <w:lvlText w:val=""/>
+      <w:numFmt w:val="decimal"/>
+      <w:lvlText w:val="%1."/>
       <w:lvlJc w:val="left"/>
       <w:pPr>
         <w:tabs>
@@ -8206,25 +7110,18 @@
         <w:ind w:left="720" w:hanging="360"/>
       </w:pPr>
       <w:rPr>
-        <w:rFonts w:ascii="Symbol" w:hAnsi="Symbol" w:hint="default"/>
+        <w:rFonts w:hint="default"/>
         <w:sz w:val="20"/>
       </w:rPr>
     </w:lvl>
     <w:lvl w:ilvl="1">
       <w:start w:val="1"/>
-      <w:numFmt w:val="bullet"/>
-      <w:lvlText w:val="o"/>
+      <w:numFmt w:val="lowerLetter"/>
+      <w:lvlText w:val="%2."/>
       <w:lvlJc w:val="left"/>
       <w:pPr>
-        <w:tabs>
-          <w:tab w:val="num" w:pos="1440"/>
-        </w:tabs>
         <w:ind w:left="1440" w:hanging="360"/>
       </w:pPr>
-      <w:rPr>
-        <w:rFonts w:ascii="Courier New" w:hAnsi="Courier New" w:hint="default"/>
-        <w:sz w:val="20"/>
-      </w:rPr>
     </w:lvl>
     <w:lvl w:ilvl="2" w:tentative="1">
       <w:start w:val="1"/>
@@ -8637,6 +7534,156 @@
       </w:rPr>
     </w:lvl>
   </w:abstractNum>
+  <w:abstractNum w:abstractNumId="4" w15:restartNumberingAfterBreak="0">
+    <w:nsid w:val="713B3F1C"/>
+    <w:multiLevelType w:val="multilevel"/>
+    <w:tmpl w:val="31FE5DAE"/>
+    <w:lvl w:ilvl="0">
+      <w:start w:val="1"/>
+      <w:numFmt w:val="decimal"/>
+      <w:lvlText w:val="%1."/>
+      <w:lvlJc w:val="left"/>
+      <w:pPr>
+        <w:tabs>
+          <w:tab w:val="num" w:pos="720"/>
+        </w:tabs>
+        <w:ind w:left="720" w:hanging="360"/>
+      </w:pPr>
+      <w:rPr>
+        <w:rFonts w:hint="default"/>
+        <w:sz w:val="24"/>
+        <w:szCs w:val="32"/>
+      </w:rPr>
+    </w:lvl>
+    <w:lvl w:ilvl="1" w:tentative="1">
+      <w:start w:val="1"/>
+      <w:numFmt w:val="bullet"/>
+      <w:lvlText w:val="o"/>
+      <w:lvlJc w:val="left"/>
+      <w:pPr>
+        <w:tabs>
+          <w:tab w:val="num" w:pos="1440"/>
+        </w:tabs>
+        <w:ind w:left="1440" w:hanging="360"/>
+      </w:pPr>
+      <w:rPr>
+        <w:rFonts w:ascii="Courier New" w:hAnsi="Courier New" w:hint="default"/>
+        <w:sz w:val="20"/>
+      </w:rPr>
+    </w:lvl>
+    <w:lvl w:ilvl="2" w:tentative="1">
+      <w:start w:val="1"/>
+      <w:numFmt w:val="bullet"/>
+      <w:lvlText w:val=""/>
+      <w:lvlJc w:val="left"/>
+      <w:pPr>
+        <w:tabs>
+          <w:tab w:val="num" w:pos="2160"/>
+        </w:tabs>
+        <w:ind w:left="2160" w:hanging="360"/>
+      </w:pPr>
+      <w:rPr>
+        <w:rFonts w:ascii="Wingdings" w:hAnsi="Wingdings" w:hint="default"/>
+        <w:sz w:val="20"/>
+      </w:rPr>
+    </w:lvl>
+    <w:lvl w:ilvl="3" w:tentative="1">
+      <w:start w:val="1"/>
+      <w:numFmt w:val="bullet"/>
+      <w:lvlText w:val=""/>
+      <w:lvlJc w:val="left"/>
+      <w:pPr>
+        <w:tabs>
+          <w:tab w:val="num" w:pos="2880"/>
+        </w:tabs>
+        <w:ind w:left="2880" w:hanging="360"/>
+      </w:pPr>
+      <w:rPr>
+        <w:rFonts w:ascii="Wingdings" w:hAnsi="Wingdings" w:hint="default"/>
+        <w:sz w:val="20"/>
+      </w:rPr>
+    </w:lvl>
+    <w:lvl w:ilvl="4" w:tentative="1">
+      <w:start w:val="1"/>
+      <w:numFmt w:val="bullet"/>
+      <w:lvlText w:val=""/>
+      <w:lvlJc w:val="left"/>
+      <w:pPr>
+        <w:tabs>
+          <w:tab w:val="num" w:pos="3600"/>
+        </w:tabs>
+        <w:ind w:left="3600" w:hanging="360"/>
+      </w:pPr>
+      <w:rPr>
+        <w:rFonts w:ascii="Wingdings" w:hAnsi="Wingdings" w:hint="default"/>
+        <w:sz w:val="20"/>
+      </w:rPr>
+    </w:lvl>
+    <w:lvl w:ilvl="5" w:tentative="1">
+      <w:start w:val="1"/>
+      <w:numFmt w:val="bullet"/>
+      <w:lvlText w:val=""/>
+      <w:lvlJc w:val="left"/>
+      <w:pPr>
+        <w:tabs>
+          <w:tab w:val="num" w:pos="4320"/>
+        </w:tabs>
+        <w:ind w:left="4320" w:hanging="360"/>
+      </w:pPr>
+      <w:rPr>
+        <w:rFonts w:ascii="Wingdings" w:hAnsi="Wingdings" w:hint="default"/>
+        <w:sz w:val="20"/>
+      </w:rPr>
+    </w:lvl>
+    <w:lvl w:ilvl="6" w:tentative="1">
+      <w:start w:val="1"/>
+      <w:numFmt w:val="bullet"/>
+      <w:lvlText w:val=""/>
+      <w:lvlJc w:val="left"/>
+      <w:pPr>
+        <w:tabs>
+          <w:tab w:val="num" w:pos="5040"/>
+        </w:tabs>
+        <w:ind w:left="5040" w:hanging="360"/>
+      </w:pPr>
+      <w:rPr>
+        <w:rFonts w:ascii="Wingdings" w:hAnsi="Wingdings" w:hint="default"/>
+        <w:sz w:val="20"/>
+      </w:rPr>
+    </w:lvl>
+    <w:lvl w:ilvl="7" w:tentative="1">
+      <w:start w:val="1"/>
+      <w:numFmt w:val="bullet"/>
+      <w:lvlText w:val=""/>
+      <w:lvlJc w:val="left"/>
+      <w:pPr>
+        <w:tabs>
+          <w:tab w:val="num" w:pos="5760"/>
+        </w:tabs>
+        <w:ind w:left="5760" w:hanging="360"/>
+      </w:pPr>
+      <w:rPr>
+        <w:rFonts w:ascii="Wingdings" w:hAnsi="Wingdings" w:hint="default"/>
+        <w:sz w:val="20"/>
+      </w:rPr>
+    </w:lvl>
+    <w:lvl w:ilvl="8" w:tentative="1">
+      <w:start w:val="1"/>
+      <w:numFmt w:val="bullet"/>
+      <w:lvlText w:val=""/>
+      <w:lvlJc w:val="left"/>
+      <w:pPr>
+        <w:tabs>
+          <w:tab w:val="num" w:pos="6480"/>
+        </w:tabs>
+        <w:ind w:left="6480" w:hanging="360"/>
+      </w:pPr>
+      <w:rPr>
+        <w:rFonts w:ascii="Wingdings" w:hAnsi="Wingdings" w:hint="default"/>
+        <w:sz w:val="20"/>
+      </w:rPr>
+    </w:lvl>
+  </w:abstractNum>
   <w:num w:numId="1" w16cid:durableId="440801600">
     <w:abstractNumId w:val="0"/>
   </w:num>
@@ -8648,6 +7695,9 @@
   </w:num>
   <w:num w:numId="4" w16cid:durableId="432940936">
     <w:abstractNumId w:val="1"/>
+  </w:num>
+  <w:num w:numId="5" w16cid:durableId="1137143970">
+    <w:abstractNumId w:val="4"/>
   </w:num>
 </w:numbering>
 </file>

</xml_diff>

<commit_message>
docs: menambahkan penjelasan alur program utama pada file main.cpp
</commit_message>
<xml_diff>
--- a/Laporan.docx
+++ b/Laporan.docx
@@ -12902,6 +12902,1672 @@
           <w:szCs w:val="24"/>
         </w:rPr>
       </w:pPr>
+      <w:r>
+        <w:rPr>
+          <w:rFonts w:ascii="Times New Roman" w:hAnsi="Times New Roman" w:cs="Times New Roman"/>
+          <w:szCs w:val="24"/>
+        </w:rPr>
+        <w:t xml:space="preserve">3. </w:t>
+      </w:r>
+      <w:proofErr w:type="spellStart"/>
+      <w:r>
+        <w:rPr>
+          <w:rFonts w:ascii="Times New Roman" w:hAnsi="Times New Roman" w:cs="Times New Roman"/>
+          <w:szCs w:val="24"/>
+        </w:rPr>
+        <w:t>Penjelasan</w:t>
+      </w:r>
+      <w:proofErr w:type="spellEnd"/>
+      <w:r>
+        <w:rPr>
+          <w:rFonts w:ascii="Times New Roman" w:hAnsi="Times New Roman" w:cs="Times New Roman"/>
+          <w:szCs w:val="24"/>
+        </w:rPr>
+        <w:t xml:space="preserve"> </w:t>
+      </w:r>
+      <w:r>
+        <w:rPr>
+          <w:rFonts w:ascii="Times New Roman" w:hAnsi="Times New Roman" w:cs="Times New Roman"/>
+          <w:i/>
+          <w:iCs/>
+          <w:szCs w:val="24"/>
+        </w:rPr>
+        <w:t>Main Program</w:t>
+      </w:r>
+      <w:r>
+        <w:rPr>
+          <w:rFonts w:ascii="Times New Roman" w:hAnsi="Times New Roman" w:cs="Times New Roman"/>
+          <w:szCs w:val="24"/>
+        </w:rPr>
+        <w:t xml:space="preserve"> (main.cpp)</w:t>
+      </w:r>
+    </w:p>
+    <w:p>
+      <w:pPr>
+        <w:spacing w:line="360" w:lineRule="auto"/>
+        <w:ind w:firstLine="720"/>
+        <w:jc w:val="both"/>
+        <w:rPr>
+          <w:rFonts w:ascii="Times New Roman" w:hAnsi="Times New Roman" w:cs="Times New Roman"/>
+          <w:szCs w:val="24"/>
+        </w:rPr>
+      </w:pPr>
+      <w:r>
+        <w:rPr>
+          <w:rFonts w:ascii="Times New Roman" w:hAnsi="Times New Roman" w:cs="Times New Roman"/>
+          <w:szCs w:val="24"/>
+        </w:rPr>
+        <w:t xml:space="preserve">File main.cpp </w:t>
+      </w:r>
+      <w:proofErr w:type="spellStart"/>
+      <w:r>
+        <w:rPr>
+          <w:rFonts w:ascii="Times New Roman" w:hAnsi="Times New Roman" w:cs="Times New Roman"/>
+          <w:szCs w:val="24"/>
+        </w:rPr>
+        <w:t>berfungsi</w:t>
+      </w:r>
+      <w:proofErr w:type="spellEnd"/>
+      <w:r>
+        <w:rPr>
+          <w:rFonts w:ascii="Times New Roman" w:hAnsi="Times New Roman" w:cs="Times New Roman"/>
+          <w:szCs w:val="24"/>
+        </w:rPr>
+        <w:t xml:space="preserve"> </w:t>
+      </w:r>
+      <w:proofErr w:type="spellStart"/>
+      <w:r>
+        <w:rPr>
+          <w:rFonts w:ascii="Times New Roman" w:hAnsi="Times New Roman" w:cs="Times New Roman"/>
+          <w:szCs w:val="24"/>
+        </w:rPr>
+        <w:t>sebagai</w:t>
+      </w:r>
+      <w:proofErr w:type="spellEnd"/>
+      <w:r>
+        <w:rPr>
+          <w:rFonts w:ascii="Times New Roman" w:hAnsi="Times New Roman" w:cs="Times New Roman"/>
+          <w:szCs w:val="24"/>
+        </w:rPr>
+        <w:t xml:space="preserve"> </w:t>
+      </w:r>
+      <w:proofErr w:type="spellStart"/>
+      <w:r>
+        <w:rPr>
+          <w:rFonts w:ascii="Times New Roman" w:hAnsi="Times New Roman" w:cs="Times New Roman"/>
+          <w:szCs w:val="24"/>
+        </w:rPr>
+        <w:t>titik</w:t>
+      </w:r>
+      <w:proofErr w:type="spellEnd"/>
+      <w:r>
+        <w:rPr>
+          <w:rFonts w:ascii="Times New Roman" w:hAnsi="Times New Roman" w:cs="Times New Roman"/>
+          <w:szCs w:val="24"/>
+        </w:rPr>
+        <w:t xml:space="preserve"> </w:t>
+      </w:r>
+      <w:proofErr w:type="spellStart"/>
+      <w:r>
+        <w:rPr>
+          <w:rFonts w:ascii="Times New Roman" w:hAnsi="Times New Roman" w:cs="Times New Roman"/>
+          <w:szCs w:val="24"/>
+        </w:rPr>
+        <w:t>awal</w:t>
+      </w:r>
+      <w:proofErr w:type="spellEnd"/>
+      <w:r>
+        <w:rPr>
+          <w:rFonts w:ascii="Times New Roman" w:hAnsi="Times New Roman" w:cs="Times New Roman"/>
+          <w:szCs w:val="24"/>
+        </w:rPr>
+        <w:t xml:space="preserve"> </w:t>
+      </w:r>
+      <w:proofErr w:type="spellStart"/>
+      <w:r>
+        <w:rPr>
+          <w:rFonts w:ascii="Times New Roman" w:hAnsi="Times New Roman" w:cs="Times New Roman"/>
+          <w:szCs w:val="24"/>
+        </w:rPr>
+        <w:t>eksekusi</w:t>
+      </w:r>
+      <w:proofErr w:type="spellEnd"/>
+      <w:r>
+        <w:rPr>
+          <w:rFonts w:ascii="Times New Roman" w:hAnsi="Times New Roman" w:cs="Times New Roman"/>
+          <w:szCs w:val="24"/>
+        </w:rPr>
+        <w:t xml:space="preserve"> program </w:t>
+      </w:r>
+      <w:proofErr w:type="spellStart"/>
+      <w:r>
+        <w:rPr>
+          <w:rFonts w:ascii="Times New Roman" w:hAnsi="Times New Roman" w:cs="Times New Roman"/>
+          <w:szCs w:val="24"/>
+        </w:rPr>
+        <w:t>sekaligus</w:t>
+      </w:r>
+      <w:proofErr w:type="spellEnd"/>
+      <w:r>
+        <w:rPr>
+          <w:rFonts w:ascii="Times New Roman" w:hAnsi="Times New Roman" w:cs="Times New Roman"/>
+          <w:szCs w:val="24"/>
+        </w:rPr>
+        <w:t xml:space="preserve"> </w:t>
+      </w:r>
+      <w:proofErr w:type="spellStart"/>
+      <w:r>
+        <w:rPr>
+          <w:rFonts w:ascii="Times New Roman" w:hAnsi="Times New Roman" w:cs="Times New Roman"/>
+          <w:szCs w:val="24"/>
+        </w:rPr>
+        <w:t>antarmuka</w:t>
+      </w:r>
+      <w:proofErr w:type="spellEnd"/>
+      <w:r>
+        <w:rPr>
+          <w:rFonts w:ascii="Times New Roman" w:hAnsi="Times New Roman" w:cs="Times New Roman"/>
+          <w:szCs w:val="24"/>
+        </w:rPr>
+        <w:t xml:space="preserve"> </w:t>
+      </w:r>
+      <w:proofErr w:type="spellStart"/>
+      <w:r>
+        <w:rPr>
+          <w:rFonts w:ascii="Times New Roman" w:hAnsi="Times New Roman" w:cs="Times New Roman"/>
+          <w:szCs w:val="24"/>
+        </w:rPr>
+        <w:t>interaksi</w:t>
+      </w:r>
+      <w:proofErr w:type="spellEnd"/>
+      <w:r>
+        <w:rPr>
+          <w:rFonts w:ascii="Times New Roman" w:hAnsi="Times New Roman" w:cs="Times New Roman"/>
+          <w:szCs w:val="24"/>
+        </w:rPr>
+        <w:t xml:space="preserve"> </w:t>
+      </w:r>
+      <w:proofErr w:type="spellStart"/>
+      <w:r>
+        <w:rPr>
+          <w:rFonts w:ascii="Times New Roman" w:hAnsi="Times New Roman" w:cs="Times New Roman"/>
+          <w:szCs w:val="24"/>
+        </w:rPr>
+        <w:t>antara</w:t>
+      </w:r>
+      <w:proofErr w:type="spellEnd"/>
+      <w:r>
+        <w:rPr>
+          <w:rFonts w:ascii="Times New Roman" w:hAnsi="Times New Roman" w:cs="Times New Roman"/>
+          <w:szCs w:val="24"/>
+        </w:rPr>
+        <w:t xml:space="preserve"> </w:t>
+      </w:r>
+      <w:proofErr w:type="spellStart"/>
+      <w:r>
+        <w:rPr>
+          <w:rFonts w:ascii="Times New Roman" w:hAnsi="Times New Roman" w:cs="Times New Roman"/>
+          <w:szCs w:val="24"/>
+        </w:rPr>
+        <w:t>pengguna</w:t>
+      </w:r>
+      <w:proofErr w:type="spellEnd"/>
+      <w:r>
+        <w:rPr>
+          <w:rFonts w:ascii="Times New Roman" w:hAnsi="Times New Roman" w:cs="Times New Roman"/>
+          <w:szCs w:val="24"/>
+        </w:rPr>
+        <w:t xml:space="preserve"> dan </w:t>
+      </w:r>
+      <w:proofErr w:type="spellStart"/>
+      <w:r>
+        <w:rPr>
+          <w:rFonts w:ascii="Times New Roman" w:hAnsi="Times New Roman" w:cs="Times New Roman"/>
+          <w:szCs w:val="24"/>
+        </w:rPr>
+        <w:t>sistem</w:t>
+      </w:r>
+      <w:proofErr w:type="spellEnd"/>
+      <w:r>
+        <w:rPr>
+          <w:rFonts w:ascii="Times New Roman" w:hAnsi="Times New Roman" w:cs="Times New Roman"/>
+          <w:szCs w:val="24"/>
+        </w:rPr>
+        <w:t xml:space="preserve">. </w:t>
+      </w:r>
+      <w:proofErr w:type="spellStart"/>
+      <w:r>
+        <w:rPr>
+          <w:rFonts w:ascii="Times New Roman" w:hAnsi="Times New Roman" w:cs="Times New Roman"/>
+          <w:szCs w:val="24"/>
+        </w:rPr>
+        <w:t>Berikut</w:t>
+      </w:r>
+      <w:proofErr w:type="spellEnd"/>
+      <w:r>
+        <w:rPr>
+          <w:rFonts w:ascii="Times New Roman" w:hAnsi="Times New Roman" w:cs="Times New Roman"/>
+          <w:szCs w:val="24"/>
+        </w:rPr>
+        <w:t xml:space="preserve"> </w:t>
+      </w:r>
+      <w:proofErr w:type="spellStart"/>
+      <w:r>
+        <w:rPr>
+          <w:rFonts w:ascii="Times New Roman" w:hAnsi="Times New Roman" w:cs="Times New Roman"/>
+          <w:szCs w:val="24"/>
+        </w:rPr>
+        <w:t>adalah</w:t>
+      </w:r>
+      <w:proofErr w:type="spellEnd"/>
+      <w:r>
+        <w:rPr>
+          <w:rFonts w:ascii="Times New Roman" w:hAnsi="Times New Roman" w:cs="Times New Roman"/>
+          <w:szCs w:val="24"/>
+        </w:rPr>
+        <w:t xml:space="preserve"> </w:t>
+      </w:r>
+      <w:proofErr w:type="spellStart"/>
+      <w:r>
+        <w:rPr>
+          <w:rFonts w:ascii="Times New Roman" w:hAnsi="Times New Roman" w:cs="Times New Roman"/>
+          <w:szCs w:val="24"/>
+        </w:rPr>
+        <w:t>alur</w:t>
+      </w:r>
+      <w:proofErr w:type="spellEnd"/>
+      <w:r>
+        <w:rPr>
+          <w:rFonts w:ascii="Times New Roman" w:hAnsi="Times New Roman" w:cs="Times New Roman"/>
+          <w:szCs w:val="24"/>
+        </w:rPr>
+        <w:t xml:space="preserve"> </w:t>
+      </w:r>
+      <w:proofErr w:type="spellStart"/>
+      <w:r>
+        <w:rPr>
+          <w:rFonts w:ascii="Times New Roman" w:hAnsi="Times New Roman" w:cs="Times New Roman"/>
+          <w:szCs w:val="24"/>
+        </w:rPr>
+        <w:t>kerja</w:t>
+      </w:r>
+      <w:proofErr w:type="spellEnd"/>
+      <w:r>
+        <w:rPr>
+          <w:rFonts w:ascii="Times New Roman" w:hAnsi="Times New Roman" w:cs="Times New Roman"/>
+          <w:szCs w:val="24"/>
+        </w:rPr>
+        <w:t xml:space="preserve"> </w:t>
+      </w:r>
+      <w:proofErr w:type="spellStart"/>
+      <w:r>
+        <w:rPr>
+          <w:rFonts w:ascii="Times New Roman" w:hAnsi="Times New Roman" w:cs="Times New Roman"/>
+          <w:szCs w:val="24"/>
+        </w:rPr>
+        <w:t>utama</w:t>
+      </w:r>
+      <w:proofErr w:type="spellEnd"/>
+      <w:r>
+        <w:rPr>
+          <w:rFonts w:ascii="Times New Roman" w:hAnsi="Times New Roman" w:cs="Times New Roman"/>
+          <w:szCs w:val="24"/>
+        </w:rPr>
+        <w:t xml:space="preserve"> </w:t>
+      </w:r>
+      <w:proofErr w:type="spellStart"/>
+      <w:r>
+        <w:rPr>
+          <w:rFonts w:ascii="Times New Roman" w:hAnsi="Times New Roman" w:cs="Times New Roman"/>
+          <w:szCs w:val="24"/>
+        </w:rPr>
+        <w:t>dalam</w:t>
+      </w:r>
+      <w:proofErr w:type="spellEnd"/>
+      <w:r>
+        <w:rPr>
+          <w:rFonts w:ascii="Times New Roman" w:hAnsi="Times New Roman" w:cs="Times New Roman"/>
+          <w:szCs w:val="24"/>
+        </w:rPr>
+        <w:t xml:space="preserve"> file </w:t>
+      </w:r>
+      <w:proofErr w:type="spellStart"/>
+      <w:r>
+        <w:rPr>
+          <w:rFonts w:ascii="Times New Roman" w:hAnsi="Times New Roman" w:cs="Times New Roman"/>
+          <w:szCs w:val="24"/>
+        </w:rPr>
+        <w:t>ini</w:t>
+      </w:r>
+      <w:proofErr w:type="spellEnd"/>
+      <w:r>
+        <w:rPr>
+          <w:rFonts w:ascii="Times New Roman" w:hAnsi="Times New Roman" w:cs="Times New Roman"/>
+          <w:szCs w:val="24"/>
+        </w:rPr>
+        <w:t>:</w:t>
+      </w:r>
+    </w:p>
+    <w:p>
+      <w:pPr>
+        <w:numPr>
+          <w:ilvl w:val="0"/>
+          <w:numId w:val="7"/>
+        </w:numPr>
+        <w:spacing w:line="360" w:lineRule="auto"/>
+        <w:jc w:val="both"/>
+        <w:rPr>
+          <w:rFonts w:ascii="Times New Roman" w:hAnsi="Times New Roman" w:cs="Times New Roman"/>
+          <w:szCs w:val="24"/>
+        </w:rPr>
+      </w:pPr>
+      <w:proofErr w:type="spellStart"/>
+      <w:r>
+        <w:rPr>
+          <w:rFonts w:ascii="Times New Roman" w:hAnsi="Times New Roman" w:cs="Times New Roman"/>
+          <w:b/>
+          <w:bCs/>
+          <w:szCs w:val="24"/>
+        </w:rPr>
+        <w:t>Inisialisasi</w:t>
+      </w:r>
+      <w:proofErr w:type="spellEnd"/>
+      <w:r>
+        <w:rPr>
+          <w:rFonts w:ascii="Times New Roman" w:hAnsi="Times New Roman" w:cs="Times New Roman"/>
+          <w:b/>
+          <w:bCs/>
+          <w:szCs w:val="24"/>
+        </w:rPr>
+        <w:t xml:space="preserve"> Data</w:t>
+      </w:r>
+      <w:r>
+        <w:rPr>
+          <w:rFonts w:ascii="Times New Roman" w:hAnsi="Times New Roman" w:cs="Times New Roman"/>
+          <w:szCs w:val="24"/>
+        </w:rPr>
+        <w:t xml:space="preserve">: Program </w:t>
+      </w:r>
+      <w:proofErr w:type="spellStart"/>
+      <w:r>
+        <w:rPr>
+          <w:rFonts w:ascii="Times New Roman" w:hAnsi="Times New Roman" w:cs="Times New Roman"/>
+          <w:szCs w:val="24"/>
+        </w:rPr>
+        <w:t>meminta</w:t>
+      </w:r>
+      <w:proofErr w:type="spellEnd"/>
+      <w:r>
+        <w:rPr>
+          <w:rFonts w:ascii="Times New Roman" w:hAnsi="Times New Roman" w:cs="Times New Roman"/>
+          <w:szCs w:val="24"/>
+        </w:rPr>
+        <w:t xml:space="preserve"> input </w:t>
+      </w:r>
+      <w:proofErr w:type="spellStart"/>
+      <w:r>
+        <w:rPr>
+          <w:rFonts w:ascii="Times New Roman" w:hAnsi="Times New Roman" w:cs="Times New Roman"/>
+          <w:szCs w:val="24"/>
+        </w:rPr>
+        <w:t>dari</w:t>
+      </w:r>
+      <w:proofErr w:type="spellEnd"/>
+      <w:r>
+        <w:rPr>
+          <w:rFonts w:ascii="Times New Roman" w:hAnsi="Times New Roman" w:cs="Times New Roman"/>
+          <w:szCs w:val="24"/>
+        </w:rPr>
+        <w:t xml:space="preserve"> </w:t>
+      </w:r>
+      <w:proofErr w:type="spellStart"/>
+      <w:r>
+        <w:rPr>
+          <w:rFonts w:ascii="Times New Roman" w:hAnsi="Times New Roman" w:cs="Times New Roman"/>
+          <w:szCs w:val="24"/>
+        </w:rPr>
+        <w:t>pengguna</w:t>
+      </w:r>
+      <w:proofErr w:type="spellEnd"/>
+      <w:r>
+        <w:rPr>
+          <w:rFonts w:ascii="Times New Roman" w:hAnsi="Times New Roman" w:cs="Times New Roman"/>
+          <w:szCs w:val="24"/>
+        </w:rPr>
+        <w:t xml:space="preserve"> </w:t>
+      </w:r>
+      <w:proofErr w:type="spellStart"/>
+      <w:r>
+        <w:rPr>
+          <w:rFonts w:ascii="Times New Roman" w:hAnsi="Times New Roman" w:cs="Times New Roman"/>
+          <w:szCs w:val="24"/>
+        </w:rPr>
+        <w:t>mengenai</w:t>
+      </w:r>
+      <w:proofErr w:type="spellEnd"/>
+      <w:r>
+        <w:rPr>
+          <w:rFonts w:ascii="Times New Roman" w:hAnsi="Times New Roman" w:cs="Times New Roman"/>
+          <w:szCs w:val="24"/>
+        </w:rPr>
+        <w:t xml:space="preserve"> </w:t>
+      </w:r>
+      <w:proofErr w:type="spellStart"/>
+      <w:r>
+        <w:rPr>
+          <w:rFonts w:ascii="Times New Roman" w:hAnsi="Times New Roman" w:cs="Times New Roman"/>
+          <w:szCs w:val="24"/>
+        </w:rPr>
+        <w:t>jumlah</w:t>
+      </w:r>
+      <w:proofErr w:type="spellEnd"/>
+      <w:r>
+        <w:rPr>
+          <w:rFonts w:ascii="Times New Roman" w:hAnsi="Times New Roman" w:cs="Times New Roman"/>
+          <w:szCs w:val="24"/>
+        </w:rPr>
+        <w:t xml:space="preserve"> data (n) yang </w:t>
+      </w:r>
+      <w:proofErr w:type="spellStart"/>
+      <w:r>
+        <w:rPr>
+          <w:rFonts w:ascii="Times New Roman" w:hAnsi="Times New Roman" w:cs="Times New Roman"/>
+          <w:szCs w:val="24"/>
+        </w:rPr>
+        <w:t>akan</w:t>
+      </w:r>
+      <w:proofErr w:type="spellEnd"/>
+      <w:r>
+        <w:rPr>
+          <w:rFonts w:ascii="Times New Roman" w:hAnsi="Times New Roman" w:cs="Times New Roman"/>
+          <w:szCs w:val="24"/>
+        </w:rPr>
+        <w:t xml:space="preserve"> </w:t>
+      </w:r>
+      <w:proofErr w:type="spellStart"/>
+      <w:r>
+        <w:rPr>
+          <w:rFonts w:ascii="Times New Roman" w:hAnsi="Times New Roman" w:cs="Times New Roman"/>
+          <w:szCs w:val="24"/>
+        </w:rPr>
+        <w:t>diurutkan</w:t>
+      </w:r>
+      <w:proofErr w:type="spellEnd"/>
+      <w:r>
+        <w:rPr>
+          <w:rFonts w:ascii="Times New Roman" w:hAnsi="Times New Roman" w:cs="Times New Roman"/>
+          <w:szCs w:val="24"/>
+        </w:rPr>
+        <w:t>.</w:t>
+      </w:r>
+    </w:p>
+    <w:p>
+      <w:pPr>
+        <w:numPr>
+          <w:ilvl w:val="0"/>
+          <w:numId w:val="7"/>
+        </w:numPr>
+        <w:spacing w:line="360" w:lineRule="auto"/>
+        <w:jc w:val="both"/>
+        <w:rPr>
+          <w:rFonts w:ascii="Times New Roman" w:hAnsi="Times New Roman" w:cs="Times New Roman"/>
+          <w:szCs w:val="24"/>
+        </w:rPr>
+      </w:pPr>
+      <w:proofErr w:type="spellStart"/>
+      <w:r>
+        <w:rPr>
+          <w:rFonts w:ascii="Times New Roman" w:hAnsi="Times New Roman" w:cs="Times New Roman"/>
+          <w:b/>
+          <w:bCs/>
+          <w:szCs w:val="24"/>
+        </w:rPr>
+        <w:t>Pengisian</w:t>
+      </w:r>
+      <w:proofErr w:type="spellEnd"/>
+      <w:r>
+        <w:rPr>
+          <w:rFonts w:ascii="Times New Roman" w:hAnsi="Times New Roman" w:cs="Times New Roman"/>
+          <w:b/>
+          <w:bCs/>
+          <w:szCs w:val="24"/>
+        </w:rPr>
+        <w:t xml:space="preserve"> </w:t>
+      </w:r>
+      <w:r>
+        <w:rPr>
+          <w:rFonts w:ascii="Times New Roman" w:hAnsi="Times New Roman" w:cs="Times New Roman"/>
+          <w:b/>
+          <w:bCs/>
+          <w:i/>
+          <w:iCs/>
+          <w:szCs w:val="24"/>
+        </w:rPr>
+        <w:t>Array</w:t>
+      </w:r>
+      <w:r>
+        <w:rPr>
+          <w:rFonts w:ascii="Times New Roman" w:hAnsi="Times New Roman" w:cs="Times New Roman"/>
+          <w:szCs w:val="24"/>
+        </w:rPr>
+        <w:t xml:space="preserve">: Program </w:t>
+      </w:r>
+      <w:proofErr w:type="spellStart"/>
+      <w:r>
+        <w:rPr>
+          <w:rFonts w:ascii="Times New Roman" w:hAnsi="Times New Roman" w:cs="Times New Roman"/>
+          <w:szCs w:val="24"/>
+        </w:rPr>
+        <w:t>melakukan</w:t>
+      </w:r>
+      <w:proofErr w:type="spellEnd"/>
+      <w:r>
+        <w:rPr>
+          <w:rFonts w:ascii="Times New Roman" w:hAnsi="Times New Roman" w:cs="Times New Roman"/>
+          <w:szCs w:val="24"/>
+        </w:rPr>
+        <w:t xml:space="preserve"> </w:t>
+      </w:r>
+      <w:proofErr w:type="spellStart"/>
+      <w:r>
+        <w:rPr>
+          <w:rFonts w:ascii="Times New Roman" w:hAnsi="Times New Roman" w:cs="Times New Roman"/>
+          <w:szCs w:val="24"/>
+        </w:rPr>
+        <w:t>perulangan</w:t>
+      </w:r>
+      <w:proofErr w:type="spellEnd"/>
+      <w:r>
+        <w:rPr>
+          <w:rFonts w:ascii="Times New Roman" w:hAnsi="Times New Roman" w:cs="Times New Roman"/>
+          <w:szCs w:val="24"/>
+        </w:rPr>
+        <w:t xml:space="preserve"> (</w:t>
+      </w:r>
+      <w:r>
+        <w:rPr>
+          <w:rFonts w:ascii="Times New Roman" w:hAnsi="Times New Roman" w:cs="Times New Roman"/>
+          <w:i/>
+          <w:iCs/>
+          <w:szCs w:val="24"/>
+        </w:rPr>
+        <w:t>looping</w:t>
+      </w:r>
+      <w:r>
+        <w:rPr>
+          <w:rFonts w:ascii="Times New Roman" w:hAnsi="Times New Roman" w:cs="Times New Roman"/>
+          <w:szCs w:val="24"/>
+        </w:rPr>
+        <w:t xml:space="preserve">) </w:t>
+      </w:r>
+      <w:proofErr w:type="spellStart"/>
+      <w:r>
+        <w:rPr>
+          <w:rFonts w:ascii="Times New Roman" w:hAnsi="Times New Roman" w:cs="Times New Roman"/>
+          <w:szCs w:val="24"/>
+        </w:rPr>
+        <w:t>untuk</w:t>
+      </w:r>
+      <w:proofErr w:type="spellEnd"/>
+      <w:r>
+        <w:rPr>
+          <w:rFonts w:ascii="Times New Roman" w:hAnsi="Times New Roman" w:cs="Times New Roman"/>
+          <w:szCs w:val="24"/>
+        </w:rPr>
+        <w:t xml:space="preserve"> </w:t>
+      </w:r>
+      <w:proofErr w:type="spellStart"/>
+      <w:r>
+        <w:rPr>
+          <w:rFonts w:ascii="Times New Roman" w:hAnsi="Times New Roman" w:cs="Times New Roman"/>
+          <w:szCs w:val="24"/>
+        </w:rPr>
+        <w:t>menginput</w:t>
+      </w:r>
+      <w:proofErr w:type="spellEnd"/>
+      <w:r>
+        <w:rPr>
+          <w:rFonts w:ascii="Times New Roman" w:hAnsi="Times New Roman" w:cs="Times New Roman"/>
+          <w:szCs w:val="24"/>
+        </w:rPr>
+        <w:t xml:space="preserve"> </w:t>
+      </w:r>
+      <w:proofErr w:type="spellStart"/>
+      <w:r>
+        <w:rPr>
+          <w:rFonts w:ascii="Times New Roman" w:hAnsi="Times New Roman" w:cs="Times New Roman"/>
+          <w:szCs w:val="24"/>
+        </w:rPr>
+        <w:t>nilai</w:t>
+      </w:r>
+      <w:proofErr w:type="spellEnd"/>
+      <w:r>
+        <w:rPr>
+          <w:rFonts w:ascii="Times New Roman" w:hAnsi="Times New Roman" w:cs="Times New Roman"/>
+          <w:szCs w:val="24"/>
+        </w:rPr>
+        <w:t xml:space="preserve"> </w:t>
+      </w:r>
+      <w:proofErr w:type="spellStart"/>
+      <w:r>
+        <w:rPr>
+          <w:rFonts w:ascii="Times New Roman" w:hAnsi="Times New Roman" w:cs="Times New Roman"/>
+          <w:szCs w:val="24"/>
+        </w:rPr>
+        <w:t>ke</w:t>
+      </w:r>
+      <w:proofErr w:type="spellEnd"/>
+      <w:r>
+        <w:rPr>
+          <w:rFonts w:ascii="Times New Roman" w:hAnsi="Times New Roman" w:cs="Times New Roman"/>
+          <w:szCs w:val="24"/>
+        </w:rPr>
+        <w:t xml:space="preserve"> </w:t>
+      </w:r>
+      <w:proofErr w:type="spellStart"/>
+      <w:r>
+        <w:rPr>
+          <w:rFonts w:ascii="Times New Roman" w:hAnsi="Times New Roman" w:cs="Times New Roman"/>
+          <w:szCs w:val="24"/>
+        </w:rPr>
+        <w:t>dalam</w:t>
+      </w:r>
+      <w:proofErr w:type="spellEnd"/>
+      <w:r>
+        <w:rPr>
+          <w:rFonts w:ascii="Times New Roman" w:hAnsi="Times New Roman" w:cs="Times New Roman"/>
+          <w:szCs w:val="24"/>
+        </w:rPr>
+        <w:t xml:space="preserve"> array. </w:t>
+      </w:r>
+      <w:proofErr w:type="spellStart"/>
+      <w:r>
+        <w:rPr>
+          <w:rFonts w:ascii="Times New Roman" w:hAnsi="Times New Roman" w:cs="Times New Roman"/>
+          <w:szCs w:val="24"/>
+        </w:rPr>
+        <w:t>Sesuai</w:t>
+      </w:r>
+      <w:proofErr w:type="spellEnd"/>
+      <w:r>
+        <w:rPr>
+          <w:rFonts w:ascii="Times New Roman" w:hAnsi="Times New Roman" w:cs="Times New Roman"/>
+          <w:szCs w:val="24"/>
+        </w:rPr>
+        <w:t xml:space="preserve"> </w:t>
+      </w:r>
+      <w:proofErr w:type="spellStart"/>
+      <w:r>
+        <w:rPr>
+          <w:rFonts w:ascii="Times New Roman" w:hAnsi="Times New Roman" w:cs="Times New Roman"/>
+          <w:szCs w:val="24"/>
+        </w:rPr>
+        <w:t>dengan</w:t>
+      </w:r>
+      <w:proofErr w:type="spellEnd"/>
+      <w:r>
+        <w:rPr>
+          <w:rFonts w:ascii="Times New Roman" w:hAnsi="Times New Roman" w:cs="Times New Roman"/>
+          <w:szCs w:val="24"/>
+        </w:rPr>
+        <w:t xml:space="preserve"> </w:t>
+      </w:r>
+      <w:proofErr w:type="spellStart"/>
+      <w:r>
+        <w:rPr>
+          <w:rFonts w:ascii="Times New Roman" w:hAnsi="Times New Roman" w:cs="Times New Roman"/>
+          <w:szCs w:val="24"/>
+        </w:rPr>
+        <w:t>spesifikasi</w:t>
+      </w:r>
+      <w:proofErr w:type="spellEnd"/>
+      <w:r>
+        <w:rPr>
+          <w:rFonts w:ascii="Times New Roman" w:hAnsi="Times New Roman" w:cs="Times New Roman"/>
+          <w:szCs w:val="24"/>
+        </w:rPr>
+        <w:t xml:space="preserve"> </w:t>
+      </w:r>
+      <w:proofErr w:type="spellStart"/>
+      <w:r>
+        <w:rPr>
+          <w:rFonts w:ascii="Times New Roman" w:hAnsi="Times New Roman" w:cs="Times New Roman"/>
+          <w:szCs w:val="24"/>
+        </w:rPr>
+        <w:t>tugas</w:t>
+      </w:r>
+      <w:proofErr w:type="spellEnd"/>
+      <w:r>
+        <w:rPr>
+          <w:rFonts w:ascii="Times New Roman" w:hAnsi="Times New Roman" w:cs="Times New Roman"/>
+          <w:szCs w:val="24"/>
+        </w:rPr>
+        <w:t xml:space="preserve">, </w:t>
+      </w:r>
+      <w:proofErr w:type="spellStart"/>
+      <w:r>
+        <w:rPr>
+          <w:rFonts w:ascii="Times New Roman" w:hAnsi="Times New Roman" w:cs="Times New Roman"/>
+          <w:szCs w:val="24"/>
+        </w:rPr>
+        <w:t>pengisian</w:t>
+      </w:r>
+      <w:proofErr w:type="spellEnd"/>
+      <w:r>
+        <w:rPr>
+          <w:rFonts w:ascii="Times New Roman" w:hAnsi="Times New Roman" w:cs="Times New Roman"/>
+          <w:szCs w:val="24"/>
+        </w:rPr>
+        <w:t xml:space="preserve"> </w:t>
+      </w:r>
+      <w:proofErr w:type="spellStart"/>
+      <w:r>
+        <w:rPr>
+          <w:rFonts w:ascii="Times New Roman" w:hAnsi="Times New Roman" w:cs="Times New Roman"/>
+          <w:szCs w:val="24"/>
+        </w:rPr>
+        <w:t>dimulai</w:t>
+      </w:r>
+      <w:proofErr w:type="spellEnd"/>
+      <w:r>
+        <w:rPr>
+          <w:rFonts w:ascii="Times New Roman" w:hAnsi="Times New Roman" w:cs="Times New Roman"/>
+          <w:szCs w:val="24"/>
+        </w:rPr>
+        <w:t xml:space="preserve"> </w:t>
+      </w:r>
+      <w:proofErr w:type="spellStart"/>
+      <w:r>
+        <w:rPr>
+          <w:rFonts w:ascii="Times New Roman" w:hAnsi="Times New Roman" w:cs="Times New Roman"/>
+          <w:szCs w:val="24"/>
+        </w:rPr>
+        <w:t>dari</w:t>
+      </w:r>
+      <w:proofErr w:type="spellEnd"/>
+      <w:r>
+        <w:rPr>
+          <w:rFonts w:ascii="Times New Roman" w:hAnsi="Times New Roman" w:cs="Times New Roman"/>
+          <w:szCs w:val="24"/>
+        </w:rPr>
+        <w:t xml:space="preserve"> </w:t>
+      </w:r>
+      <w:proofErr w:type="spellStart"/>
+      <w:r>
+        <w:rPr>
+          <w:rFonts w:ascii="Times New Roman" w:hAnsi="Times New Roman" w:cs="Times New Roman"/>
+          <w:szCs w:val="24"/>
+        </w:rPr>
+        <w:t>indeks</w:t>
+      </w:r>
+      <w:proofErr w:type="spellEnd"/>
+      <w:r>
+        <w:rPr>
+          <w:rFonts w:ascii="Times New Roman" w:hAnsi="Times New Roman" w:cs="Times New Roman"/>
+          <w:szCs w:val="24"/>
+        </w:rPr>
+        <w:t xml:space="preserve"> ke-1 </w:t>
+      </w:r>
+      <w:proofErr w:type="spellStart"/>
+      <w:r>
+        <w:rPr>
+          <w:rFonts w:ascii="Times New Roman" w:hAnsi="Times New Roman" w:cs="Times New Roman"/>
+          <w:szCs w:val="24"/>
+        </w:rPr>
+        <w:t>hingga</w:t>
+      </w:r>
+      <w:proofErr w:type="spellEnd"/>
+      <w:r>
+        <w:rPr>
+          <w:rFonts w:ascii="Times New Roman" w:hAnsi="Times New Roman" w:cs="Times New Roman"/>
+          <w:szCs w:val="24"/>
+        </w:rPr>
+        <w:t xml:space="preserve"> </w:t>
+      </w:r>
+      <w:proofErr w:type="spellStart"/>
+      <w:r>
+        <w:rPr>
+          <w:rFonts w:ascii="Times New Roman" w:hAnsi="Times New Roman" w:cs="Times New Roman"/>
+          <w:szCs w:val="24"/>
+        </w:rPr>
+        <w:t>indeks</w:t>
+      </w:r>
+      <w:proofErr w:type="spellEnd"/>
+      <w:r>
+        <w:rPr>
+          <w:rFonts w:ascii="Times New Roman" w:hAnsi="Times New Roman" w:cs="Times New Roman"/>
+          <w:szCs w:val="24"/>
+        </w:rPr>
+        <w:t xml:space="preserve"> </w:t>
+      </w:r>
+      <w:proofErr w:type="spellStart"/>
+      <w:r>
+        <w:rPr>
+          <w:rFonts w:ascii="Times New Roman" w:hAnsi="Times New Roman" w:cs="Times New Roman"/>
+          <w:szCs w:val="24"/>
+        </w:rPr>
+        <w:t>ke</w:t>
+      </w:r>
+      <w:proofErr w:type="spellEnd"/>
+      <w:r>
+        <w:rPr>
+          <w:rFonts w:ascii="Times New Roman" w:hAnsi="Times New Roman" w:cs="Times New Roman"/>
+          <w:szCs w:val="24"/>
+        </w:rPr>
+        <w:t>-n.</w:t>
+      </w:r>
+    </w:p>
+    <w:p>
+      <w:pPr>
+        <w:numPr>
+          <w:ilvl w:val="0"/>
+          <w:numId w:val="7"/>
+        </w:numPr>
+        <w:spacing w:line="360" w:lineRule="auto"/>
+        <w:jc w:val="both"/>
+        <w:rPr>
+          <w:rFonts w:ascii="Times New Roman" w:hAnsi="Times New Roman" w:cs="Times New Roman"/>
+          <w:szCs w:val="24"/>
+        </w:rPr>
+      </w:pPr>
+      <w:proofErr w:type="spellStart"/>
+      <w:r>
+        <w:rPr>
+          <w:rFonts w:ascii="Times New Roman" w:hAnsi="Times New Roman" w:cs="Times New Roman"/>
+          <w:b/>
+          <w:bCs/>
+          <w:szCs w:val="24"/>
+        </w:rPr>
+        <w:lastRenderedPageBreak/>
+        <w:t>Pemanggilan</w:t>
+      </w:r>
+      <w:proofErr w:type="spellEnd"/>
+      <w:r>
+        <w:rPr>
+          <w:rFonts w:ascii="Times New Roman" w:hAnsi="Times New Roman" w:cs="Times New Roman"/>
+          <w:b/>
+          <w:bCs/>
+          <w:szCs w:val="24"/>
+        </w:rPr>
+        <w:t xml:space="preserve"> </w:t>
+      </w:r>
+      <w:proofErr w:type="spellStart"/>
+      <w:r>
+        <w:rPr>
+          <w:rFonts w:ascii="Times New Roman" w:hAnsi="Times New Roman" w:cs="Times New Roman"/>
+          <w:b/>
+          <w:bCs/>
+          <w:szCs w:val="24"/>
+        </w:rPr>
+        <w:t>Fungsi</w:t>
+      </w:r>
+      <w:proofErr w:type="spellEnd"/>
+      <w:r>
+        <w:rPr>
+          <w:rFonts w:ascii="Times New Roman" w:hAnsi="Times New Roman" w:cs="Times New Roman"/>
+          <w:b/>
+          <w:bCs/>
+          <w:szCs w:val="24"/>
+        </w:rPr>
+        <w:t xml:space="preserve"> </w:t>
+      </w:r>
+      <w:proofErr w:type="spellStart"/>
+      <w:r>
+        <w:rPr>
+          <w:rFonts w:ascii="Times New Roman" w:hAnsi="Times New Roman" w:cs="Times New Roman"/>
+          <w:b/>
+          <w:bCs/>
+          <w:szCs w:val="24"/>
+        </w:rPr>
+        <w:t>Pengurutan</w:t>
+      </w:r>
+      <w:proofErr w:type="spellEnd"/>
+      <w:r>
+        <w:rPr>
+          <w:rFonts w:ascii="Times New Roman" w:hAnsi="Times New Roman" w:cs="Times New Roman"/>
+          <w:szCs w:val="24"/>
+        </w:rPr>
+        <w:t xml:space="preserve">: </w:t>
+      </w:r>
+      <w:proofErr w:type="spellStart"/>
+      <w:r>
+        <w:rPr>
+          <w:rFonts w:ascii="Times New Roman" w:hAnsi="Times New Roman" w:cs="Times New Roman"/>
+          <w:szCs w:val="24"/>
+        </w:rPr>
+        <w:t>Setelah</w:t>
+      </w:r>
+      <w:proofErr w:type="spellEnd"/>
+      <w:r>
+        <w:rPr>
+          <w:rFonts w:ascii="Times New Roman" w:hAnsi="Times New Roman" w:cs="Times New Roman"/>
+          <w:szCs w:val="24"/>
+        </w:rPr>
+        <w:t xml:space="preserve"> data </w:t>
+      </w:r>
+      <w:proofErr w:type="spellStart"/>
+      <w:r>
+        <w:rPr>
+          <w:rFonts w:ascii="Times New Roman" w:hAnsi="Times New Roman" w:cs="Times New Roman"/>
+          <w:szCs w:val="24"/>
+        </w:rPr>
+        <w:t>terkumpul</w:t>
+      </w:r>
+      <w:proofErr w:type="spellEnd"/>
+      <w:r>
+        <w:rPr>
+          <w:rFonts w:ascii="Times New Roman" w:hAnsi="Times New Roman" w:cs="Times New Roman"/>
+          <w:szCs w:val="24"/>
+        </w:rPr>
+        <w:t xml:space="preserve">, program </w:t>
+      </w:r>
+      <w:proofErr w:type="spellStart"/>
+      <w:r>
+        <w:rPr>
+          <w:rFonts w:ascii="Times New Roman" w:hAnsi="Times New Roman" w:cs="Times New Roman"/>
+          <w:szCs w:val="24"/>
+        </w:rPr>
+        <w:t>memanggil</w:t>
+      </w:r>
+      <w:proofErr w:type="spellEnd"/>
+      <w:r>
+        <w:rPr>
+          <w:rFonts w:ascii="Times New Roman" w:hAnsi="Times New Roman" w:cs="Times New Roman"/>
+          <w:szCs w:val="24"/>
+        </w:rPr>
+        <w:t xml:space="preserve"> </w:t>
+      </w:r>
+      <w:proofErr w:type="spellStart"/>
+      <w:r>
+        <w:rPr>
+          <w:rFonts w:ascii="Times New Roman" w:hAnsi="Times New Roman" w:cs="Times New Roman"/>
+          <w:szCs w:val="24"/>
+        </w:rPr>
+        <w:t>fungsi</w:t>
+      </w:r>
+      <w:proofErr w:type="spellEnd"/>
+      <w:r>
+        <w:rPr>
+          <w:rFonts w:ascii="Times New Roman" w:hAnsi="Times New Roman" w:cs="Times New Roman"/>
+          <w:szCs w:val="24"/>
+        </w:rPr>
+        <w:t xml:space="preserve"> </w:t>
+      </w:r>
+      <w:proofErr w:type="spellStart"/>
+      <w:r>
+        <w:rPr>
+          <w:rFonts w:ascii="Times New Roman" w:hAnsi="Times New Roman" w:cs="Times New Roman"/>
+          <w:szCs w:val="24"/>
+        </w:rPr>
+        <w:t>quick_sort</w:t>
+      </w:r>
+      <w:proofErr w:type="spellEnd"/>
+      <w:r>
+        <w:rPr>
+          <w:rFonts w:ascii="Times New Roman" w:hAnsi="Times New Roman" w:cs="Times New Roman"/>
+          <w:szCs w:val="24"/>
+        </w:rPr>
+        <w:t xml:space="preserve"> yang </w:t>
+      </w:r>
+      <w:proofErr w:type="spellStart"/>
+      <w:r>
+        <w:rPr>
+          <w:rFonts w:ascii="Times New Roman" w:hAnsi="Times New Roman" w:cs="Times New Roman"/>
+          <w:szCs w:val="24"/>
+        </w:rPr>
+        <w:t>telah</w:t>
+      </w:r>
+      <w:proofErr w:type="spellEnd"/>
+      <w:r>
+        <w:rPr>
+          <w:rFonts w:ascii="Times New Roman" w:hAnsi="Times New Roman" w:cs="Times New Roman"/>
+          <w:szCs w:val="24"/>
+        </w:rPr>
+        <w:t xml:space="preserve"> </w:t>
+      </w:r>
+      <w:proofErr w:type="spellStart"/>
+      <w:r>
+        <w:rPr>
+          <w:rFonts w:ascii="Times New Roman" w:hAnsi="Times New Roman" w:cs="Times New Roman"/>
+          <w:szCs w:val="24"/>
+        </w:rPr>
+        <w:t>diimpor</w:t>
+      </w:r>
+      <w:proofErr w:type="spellEnd"/>
+      <w:r>
+        <w:rPr>
+          <w:rFonts w:ascii="Times New Roman" w:hAnsi="Times New Roman" w:cs="Times New Roman"/>
+          <w:szCs w:val="24"/>
+        </w:rPr>
+        <w:t xml:space="preserve"> </w:t>
+      </w:r>
+      <w:proofErr w:type="spellStart"/>
+      <w:r>
+        <w:rPr>
+          <w:rFonts w:ascii="Times New Roman" w:hAnsi="Times New Roman" w:cs="Times New Roman"/>
+          <w:szCs w:val="24"/>
+        </w:rPr>
+        <w:t>dari</w:t>
+      </w:r>
+      <w:proofErr w:type="spellEnd"/>
+      <w:r>
+        <w:rPr>
+          <w:rFonts w:ascii="Times New Roman" w:hAnsi="Times New Roman" w:cs="Times New Roman"/>
+          <w:szCs w:val="24"/>
+        </w:rPr>
+        <w:t xml:space="preserve"> </w:t>
+      </w:r>
+      <w:proofErr w:type="spellStart"/>
+      <w:r>
+        <w:rPr>
+          <w:rFonts w:ascii="Times New Roman" w:hAnsi="Times New Roman" w:cs="Times New Roman"/>
+          <w:szCs w:val="24"/>
+        </w:rPr>
+        <w:t>sorting.h</w:t>
+      </w:r>
+      <w:proofErr w:type="spellEnd"/>
+      <w:r>
+        <w:rPr>
+          <w:rFonts w:ascii="Times New Roman" w:hAnsi="Times New Roman" w:cs="Times New Roman"/>
+          <w:szCs w:val="24"/>
+        </w:rPr>
+        <w:t xml:space="preserve">. Program </w:t>
+      </w:r>
+      <w:proofErr w:type="spellStart"/>
+      <w:r>
+        <w:rPr>
+          <w:rFonts w:ascii="Times New Roman" w:hAnsi="Times New Roman" w:cs="Times New Roman"/>
+          <w:szCs w:val="24"/>
+        </w:rPr>
+        <w:t>mengirimkan</w:t>
+      </w:r>
+      <w:proofErr w:type="spellEnd"/>
+      <w:r>
+        <w:rPr>
+          <w:rFonts w:ascii="Times New Roman" w:hAnsi="Times New Roman" w:cs="Times New Roman"/>
+          <w:szCs w:val="24"/>
+        </w:rPr>
+        <w:t xml:space="preserve"> parameter </w:t>
+      </w:r>
+      <w:proofErr w:type="spellStart"/>
+      <w:r>
+        <w:rPr>
+          <w:rFonts w:ascii="Times New Roman" w:hAnsi="Times New Roman" w:cs="Times New Roman"/>
+          <w:szCs w:val="24"/>
+        </w:rPr>
+        <w:t>berupa</w:t>
+      </w:r>
+      <w:proofErr w:type="spellEnd"/>
+      <w:r>
+        <w:rPr>
+          <w:rFonts w:ascii="Times New Roman" w:hAnsi="Times New Roman" w:cs="Times New Roman"/>
+          <w:szCs w:val="24"/>
+        </w:rPr>
+        <w:t xml:space="preserve"> array, </w:t>
+      </w:r>
+      <w:proofErr w:type="spellStart"/>
+      <w:r>
+        <w:rPr>
+          <w:rFonts w:ascii="Times New Roman" w:hAnsi="Times New Roman" w:cs="Times New Roman"/>
+          <w:szCs w:val="24"/>
+        </w:rPr>
+        <w:t>serta</w:t>
+      </w:r>
+      <w:proofErr w:type="spellEnd"/>
+      <w:r>
+        <w:rPr>
+          <w:rFonts w:ascii="Times New Roman" w:hAnsi="Times New Roman" w:cs="Times New Roman"/>
+          <w:szCs w:val="24"/>
+        </w:rPr>
+        <w:t xml:space="preserve"> batas </w:t>
+      </w:r>
+      <w:proofErr w:type="spellStart"/>
+      <w:r>
+        <w:rPr>
+          <w:rFonts w:ascii="Times New Roman" w:hAnsi="Times New Roman" w:cs="Times New Roman"/>
+          <w:szCs w:val="24"/>
+        </w:rPr>
+        <w:t>awal</w:t>
+      </w:r>
+      <w:proofErr w:type="spellEnd"/>
+      <w:r>
+        <w:rPr>
+          <w:rFonts w:ascii="Times New Roman" w:hAnsi="Times New Roman" w:cs="Times New Roman"/>
+          <w:szCs w:val="24"/>
+        </w:rPr>
+        <w:t xml:space="preserve"> (1) dan batas </w:t>
+      </w:r>
+      <w:proofErr w:type="spellStart"/>
+      <w:r>
+        <w:rPr>
+          <w:rFonts w:ascii="Times New Roman" w:hAnsi="Times New Roman" w:cs="Times New Roman"/>
+          <w:szCs w:val="24"/>
+        </w:rPr>
+        <w:t>akhir</w:t>
+      </w:r>
+      <w:proofErr w:type="spellEnd"/>
+      <w:r>
+        <w:rPr>
+          <w:rFonts w:ascii="Times New Roman" w:hAnsi="Times New Roman" w:cs="Times New Roman"/>
+          <w:szCs w:val="24"/>
+        </w:rPr>
+        <w:t xml:space="preserve"> (n) </w:t>
+      </w:r>
+      <w:proofErr w:type="spellStart"/>
+      <w:r>
+        <w:rPr>
+          <w:rFonts w:ascii="Times New Roman" w:hAnsi="Times New Roman" w:cs="Times New Roman"/>
+          <w:szCs w:val="24"/>
+        </w:rPr>
+        <w:t>sebagai</w:t>
+      </w:r>
+      <w:proofErr w:type="spellEnd"/>
+      <w:r>
+        <w:rPr>
+          <w:rFonts w:ascii="Times New Roman" w:hAnsi="Times New Roman" w:cs="Times New Roman"/>
+          <w:szCs w:val="24"/>
+        </w:rPr>
+        <w:t xml:space="preserve"> </w:t>
+      </w:r>
+      <w:proofErr w:type="spellStart"/>
+      <w:r>
+        <w:rPr>
+          <w:rFonts w:ascii="Times New Roman" w:hAnsi="Times New Roman" w:cs="Times New Roman"/>
+          <w:szCs w:val="24"/>
+        </w:rPr>
+        <w:t>acuan</w:t>
+      </w:r>
+      <w:proofErr w:type="spellEnd"/>
+      <w:r>
+        <w:rPr>
+          <w:rFonts w:ascii="Times New Roman" w:hAnsi="Times New Roman" w:cs="Times New Roman"/>
+          <w:szCs w:val="24"/>
+        </w:rPr>
+        <w:t xml:space="preserve"> proses </w:t>
+      </w:r>
+      <w:proofErr w:type="spellStart"/>
+      <w:r>
+        <w:rPr>
+          <w:rFonts w:ascii="Times New Roman" w:hAnsi="Times New Roman" w:cs="Times New Roman"/>
+          <w:szCs w:val="24"/>
+        </w:rPr>
+        <w:t>pengurutan</w:t>
+      </w:r>
+      <w:proofErr w:type="spellEnd"/>
+      <w:r>
+        <w:rPr>
+          <w:rFonts w:ascii="Times New Roman" w:hAnsi="Times New Roman" w:cs="Times New Roman"/>
+          <w:szCs w:val="24"/>
+        </w:rPr>
+        <w:t>.</w:t>
+      </w:r>
+    </w:p>
+    <w:p>
+      <w:pPr>
+        <w:numPr>
+          <w:ilvl w:val="0"/>
+          <w:numId w:val="7"/>
+        </w:numPr>
+        <w:spacing w:line="360" w:lineRule="auto"/>
+        <w:jc w:val="both"/>
+        <w:rPr>
+          <w:rFonts w:ascii="Times New Roman" w:hAnsi="Times New Roman" w:cs="Times New Roman"/>
+          <w:szCs w:val="24"/>
+        </w:rPr>
+      </w:pPr>
+      <w:proofErr w:type="spellStart"/>
+      <w:r>
+        <w:rPr>
+          <w:rFonts w:ascii="Times New Roman" w:hAnsi="Times New Roman" w:cs="Times New Roman"/>
+          <w:b/>
+          <w:bCs/>
+          <w:szCs w:val="24"/>
+        </w:rPr>
+        <w:t>Menampilkan</w:t>
+      </w:r>
+      <w:proofErr w:type="spellEnd"/>
+      <w:r>
+        <w:rPr>
+          <w:rFonts w:ascii="Times New Roman" w:hAnsi="Times New Roman" w:cs="Times New Roman"/>
+          <w:b/>
+          <w:bCs/>
+          <w:szCs w:val="24"/>
+        </w:rPr>
+        <w:t xml:space="preserve"> Hasil</w:t>
+      </w:r>
+      <w:r>
+        <w:rPr>
+          <w:rFonts w:ascii="Times New Roman" w:hAnsi="Times New Roman" w:cs="Times New Roman"/>
+          <w:szCs w:val="24"/>
+        </w:rPr>
+        <w:t xml:space="preserve">: </w:t>
+      </w:r>
+      <w:proofErr w:type="spellStart"/>
+      <w:r>
+        <w:rPr>
+          <w:rFonts w:ascii="Times New Roman" w:hAnsi="Times New Roman" w:cs="Times New Roman"/>
+          <w:szCs w:val="24"/>
+        </w:rPr>
+        <w:t>Setelah</w:t>
+      </w:r>
+      <w:proofErr w:type="spellEnd"/>
+      <w:r>
+        <w:rPr>
+          <w:rFonts w:ascii="Times New Roman" w:hAnsi="Times New Roman" w:cs="Times New Roman"/>
+          <w:szCs w:val="24"/>
+        </w:rPr>
+        <w:t xml:space="preserve"> proses </w:t>
+      </w:r>
+      <w:proofErr w:type="spellStart"/>
+      <w:r>
+        <w:rPr>
+          <w:rFonts w:ascii="Times New Roman" w:hAnsi="Times New Roman" w:cs="Times New Roman"/>
+          <w:szCs w:val="24"/>
+        </w:rPr>
+        <w:t>pengurutan</w:t>
+      </w:r>
+      <w:proofErr w:type="spellEnd"/>
+      <w:r>
+        <w:rPr>
+          <w:rFonts w:ascii="Times New Roman" w:hAnsi="Times New Roman" w:cs="Times New Roman"/>
+          <w:szCs w:val="24"/>
+        </w:rPr>
+        <w:t xml:space="preserve"> </w:t>
+      </w:r>
+      <w:proofErr w:type="spellStart"/>
+      <w:r>
+        <w:rPr>
+          <w:rFonts w:ascii="Times New Roman" w:hAnsi="Times New Roman" w:cs="Times New Roman"/>
+          <w:szCs w:val="24"/>
+        </w:rPr>
+        <w:t>selesai</w:t>
+      </w:r>
+      <w:proofErr w:type="spellEnd"/>
+      <w:r>
+        <w:rPr>
+          <w:rFonts w:ascii="Times New Roman" w:hAnsi="Times New Roman" w:cs="Times New Roman"/>
+          <w:szCs w:val="24"/>
+        </w:rPr>
+        <w:t xml:space="preserve">, program </w:t>
+      </w:r>
+      <w:proofErr w:type="spellStart"/>
+      <w:r>
+        <w:rPr>
+          <w:rFonts w:ascii="Times New Roman" w:hAnsi="Times New Roman" w:cs="Times New Roman"/>
+          <w:szCs w:val="24"/>
+        </w:rPr>
+        <w:t>memanggil</w:t>
+      </w:r>
+      <w:proofErr w:type="spellEnd"/>
+      <w:r>
+        <w:rPr>
+          <w:rFonts w:ascii="Times New Roman" w:hAnsi="Times New Roman" w:cs="Times New Roman"/>
+          <w:szCs w:val="24"/>
+        </w:rPr>
+        <w:t xml:space="preserve"> </w:t>
+      </w:r>
+      <w:proofErr w:type="spellStart"/>
+      <w:r>
+        <w:rPr>
+          <w:rFonts w:ascii="Times New Roman" w:hAnsi="Times New Roman" w:cs="Times New Roman"/>
+          <w:szCs w:val="24"/>
+        </w:rPr>
+        <w:t>fungsi</w:t>
+      </w:r>
+      <w:proofErr w:type="spellEnd"/>
+      <w:r>
+        <w:rPr>
+          <w:rFonts w:ascii="Times New Roman" w:hAnsi="Times New Roman" w:cs="Times New Roman"/>
+          <w:szCs w:val="24"/>
+        </w:rPr>
+        <w:t xml:space="preserve"> </w:t>
+      </w:r>
+      <w:proofErr w:type="spellStart"/>
+      <w:r>
+        <w:rPr>
+          <w:rFonts w:ascii="Times New Roman" w:hAnsi="Times New Roman" w:cs="Times New Roman"/>
+          <w:szCs w:val="24"/>
+        </w:rPr>
+        <w:t>tampilkan_larik</w:t>
+      </w:r>
+      <w:proofErr w:type="spellEnd"/>
+      <w:r>
+        <w:rPr>
+          <w:rFonts w:ascii="Times New Roman" w:hAnsi="Times New Roman" w:cs="Times New Roman"/>
+          <w:szCs w:val="24"/>
+        </w:rPr>
+        <w:t xml:space="preserve"> </w:t>
+      </w:r>
+      <w:proofErr w:type="spellStart"/>
+      <w:r>
+        <w:rPr>
+          <w:rFonts w:ascii="Times New Roman" w:hAnsi="Times New Roman" w:cs="Times New Roman"/>
+          <w:szCs w:val="24"/>
+        </w:rPr>
+        <w:t>untuk</w:t>
+      </w:r>
+      <w:proofErr w:type="spellEnd"/>
+      <w:r>
+        <w:rPr>
+          <w:rFonts w:ascii="Times New Roman" w:hAnsi="Times New Roman" w:cs="Times New Roman"/>
+          <w:szCs w:val="24"/>
+        </w:rPr>
+        <w:t xml:space="preserve"> </w:t>
+      </w:r>
+      <w:proofErr w:type="spellStart"/>
+      <w:r>
+        <w:rPr>
+          <w:rFonts w:ascii="Times New Roman" w:hAnsi="Times New Roman" w:cs="Times New Roman"/>
+          <w:szCs w:val="24"/>
+        </w:rPr>
+        <w:t>mencetak</w:t>
+      </w:r>
+      <w:proofErr w:type="spellEnd"/>
+      <w:r>
+        <w:rPr>
+          <w:rFonts w:ascii="Times New Roman" w:hAnsi="Times New Roman" w:cs="Times New Roman"/>
+          <w:szCs w:val="24"/>
+        </w:rPr>
+        <w:t xml:space="preserve"> </w:t>
+      </w:r>
+      <w:proofErr w:type="spellStart"/>
+      <w:r>
+        <w:rPr>
+          <w:rFonts w:ascii="Times New Roman" w:hAnsi="Times New Roman" w:cs="Times New Roman"/>
+          <w:szCs w:val="24"/>
+        </w:rPr>
+        <w:t>hasil</w:t>
+      </w:r>
+      <w:proofErr w:type="spellEnd"/>
+      <w:r>
+        <w:rPr>
+          <w:rFonts w:ascii="Times New Roman" w:hAnsi="Times New Roman" w:cs="Times New Roman"/>
+          <w:szCs w:val="24"/>
+        </w:rPr>
+        <w:t xml:space="preserve"> </w:t>
+      </w:r>
+      <w:proofErr w:type="spellStart"/>
+      <w:r>
+        <w:rPr>
+          <w:rFonts w:ascii="Times New Roman" w:hAnsi="Times New Roman" w:cs="Times New Roman"/>
+          <w:szCs w:val="24"/>
+        </w:rPr>
+        <w:t>akhir</w:t>
+      </w:r>
+      <w:proofErr w:type="spellEnd"/>
+      <w:r>
+        <w:rPr>
+          <w:rFonts w:ascii="Times New Roman" w:hAnsi="Times New Roman" w:cs="Times New Roman"/>
+          <w:szCs w:val="24"/>
+        </w:rPr>
+        <w:t xml:space="preserve"> </w:t>
+      </w:r>
+      <w:proofErr w:type="spellStart"/>
+      <w:r>
+        <w:rPr>
+          <w:rFonts w:ascii="Times New Roman" w:hAnsi="Times New Roman" w:cs="Times New Roman"/>
+          <w:szCs w:val="24"/>
+        </w:rPr>
+        <w:t>ke</w:t>
+      </w:r>
+      <w:proofErr w:type="spellEnd"/>
+      <w:r>
+        <w:rPr>
+          <w:rFonts w:ascii="Times New Roman" w:hAnsi="Times New Roman" w:cs="Times New Roman"/>
+          <w:szCs w:val="24"/>
+        </w:rPr>
+        <w:t xml:space="preserve"> </w:t>
+      </w:r>
+      <w:proofErr w:type="spellStart"/>
+      <w:r>
+        <w:rPr>
+          <w:rFonts w:ascii="Times New Roman" w:hAnsi="Times New Roman" w:cs="Times New Roman"/>
+          <w:szCs w:val="24"/>
+        </w:rPr>
+        <w:t>layar</w:t>
+      </w:r>
+      <w:proofErr w:type="spellEnd"/>
+      <w:r>
+        <w:rPr>
+          <w:rFonts w:ascii="Times New Roman" w:hAnsi="Times New Roman" w:cs="Times New Roman"/>
+          <w:szCs w:val="24"/>
+        </w:rPr>
+        <w:t xml:space="preserve">, </w:t>
+      </w:r>
+      <w:proofErr w:type="spellStart"/>
+      <w:r>
+        <w:rPr>
+          <w:rFonts w:ascii="Times New Roman" w:hAnsi="Times New Roman" w:cs="Times New Roman"/>
+          <w:szCs w:val="24"/>
+        </w:rPr>
+        <w:t>sehingga</w:t>
+      </w:r>
+      <w:proofErr w:type="spellEnd"/>
+      <w:r>
+        <w:rPr>
+          <w:rFonts w:ascii="Times New Roman" w:hAnsi="Times New Roman" w:cs="Times New Roman"/>
+          <w:szCs w:val="24"/>
+        </w:rPr>
+        <w:t xml:space="preserve"> </w:t>
+      </w:r>
+      <w:proofErr w:type="spellStart"/>
+      <w:r>
+        <w:rPr>
+          <w:rFonts w:ascii="Times New Roman" w:hAnsi="Times New Roman" w:cs="Times New Roman"/>
+          <w:szCs w:val="24"/>
+        </w:rPr>
+        <w:t>pengguna</w:t>
+      </w:r>
+      <w:proofErr w:type="spellEnd"/>
+      <w:r>
+        <w:rPr>
+          <w:rFonts w:ascii="Times New Roman" w:hAnsi="Times New Roman" w:cs="Times New Roman"/>
+          <w:szCs w:val="24"/>
+        </w:rPr>
+        <w:t xml:space="preserve"> </w:t>
+      </w:r>
+      <w:proofErr w:type="spellStart"/>
+      <w:r>
+        <w:rPr>
+          <w:rFonts w:ascii="Times New Roman" w:hAnsi="Times New Roman" w:cs="Times New Roman"/>
+          <w:szCs w:val="24"/>
+        </w:rPr>
+        <w:t>dapat</w:t>
+      </w:r>
+      <w:proofErr w:type="spellEnd"/>
+      <w:r>
+        <w:rPr>
+          <w:rFonts w:ascii="Times New Roman" w:hAnsi="Times New Roman" w:cs="Times New Roman"/>
+          <w:szCs w:val="24"/>
+        </w:rPr>
+        <w:t xml:space="preserve"> </w:t>
+      </w:r>
+      <w:proofErr w:type="spellStart"/>
+      <w:r>
+        <w:rPr>
+          <w:rFonts w:ascii="Times New Roman" w:hAnsi="Times New Roman" w:cs="Times New Roman"/>
+          <w:szCs w:val="24"/>
+        </w:rPr>
+        <w:t>melihat</w:t>
+      </w:r>
+      <w:proofErr w:type="spellEnd"/>
+      <w:r>
+        <w:rPr>
+          <w:rFonts w:ascii="Times New Roman" w:hAnsi="Times New Roman" w:cs="Times New Roman"/>
+          <w:szCs w:val="24"/>
+        </w:rPr>
+        <w:t xml:space="preserve"> </w:t>
+      </w:r>
+      <w:proofErr w:type="spellStart"/>
+      <w:r>
+        <w:rPr>
+          <w:rFonts w:ascii="Times New Roman" w:hAnsi="Times New Roman" w:cs="Times New Roman"/>
+          <w:szCs w:val="24"/>
+        </w:rPr>
+        <w:t>bahwa</w:t>
+      </w:r>
+      <w:proofErr w:type="spellEnd"/>
+      <w:r>
+        <w:rPr>
+          <w:rFonts w:ascii="Times New Roman" w:hAnsi="Times New Roman" w:cs="Times New Roman"/>
+          <w:szCs w:val="24"/>
+        </w:rPr>
+        <w:t xml:space="preserve"> data </w:t>
+      </w:r>
+      <w:proofErr w:type="spellStart"/>
+      <w:r>
+        <w:rPr>
+          <w:rFonts w:ascii="Times New Roman" w:hAnsi="Times New Roman" w:cs="Times New Roman"/>
+          <w:szCs w:val="24"/>
+        </w:rPr>
+        <w:t>telah</w:t>
+      </w:r>
+      <w:proofErr w:type="spellEnd"/>
+      <w:r>
+        <w:rPr>
+          <w:rFonts w:ascii="Times New Roman" w:hAnsi="Times New Roman" w:cs="Times New Roman"/>
+          <w:szCs w:val="24"/>
+        </w:rPr>
+        <w:t xml:space="preserve"> </w:t>
+      </w:r>
+      <w:proofErr w:type="spellStart"/>
+      <w:r>
+        <w:rPr>
+          <w:rFonts w:ascii="Times New Roman" w:hAnsi="Times New Roman" w:cs="Times New Roman"/>
+          <w:szCs w:val="24"/>
+        </w:rPr>
+        <w:t>terurut</w:t>
+      </w:r>
+      <w:proofErr w:type="spellEnd"/>
+      <w:r>
+        <w:rPr>
+          <w:rFonts w:ascii="Times New Roman" w:hAnsi="Times New Roman" w:cs="Times New Roman"/>
+          <w:szCs w:val="24"/>
+        </w:rPr>
+        <w:t xml:space="preserve"> </w:t>
+      </w:r>
+      <w:proofErr w:type="spellStart"/>
+      <w:r>
+        <w:rPr>
+          <w:rFonts w:ascii="Times New Roman" w:hAnsi="Times New Roman" w:cs="Times New Roman"/>
+          <w:szCs w:val="24"/>
+        </w:rPr>
+        <w:t>dengan</w:t>
+      </w:r>
+      <w:proofErr w:type="spellEnd"/>
+      <w:r>
+        <w:rPr>
+          <w:rFonts w:ascii="Times New Roman" w:hAnsi="Times New Roman" w:cs="Times New Roman"/>
+          <w:szCs w:val="24"/>
+        </w:rPr>
+        <w:t xml:space="preserve"> </w:t>
+      </w:r>
+      <w:proofErr w:type="spellStart"/>
+      <w:r>
+        <w:rPr>
+          <w:rFonts w:ascii="Times New Roman" w:hAnsi="Times New Roman" w:cs="Times New Roman"/>
+          <w:szCs w:val="24"/>
+        </w:rPr>
+        <w:t>benar</w:t>
+      </w:r>
+      <w:proofErr w:type="spellEnd"/>
+      <w:r>
+        <w:rPr>
+          <w:rFonts w:ascii="Times New Roman" w:hAnsi="Times New Roman" w:cs="Times New Roman"/>
+          <w:szCs w:val="24"/>
+        </w:rPr>
+        <w:t xml:space="preserve"> </w:t>
+      </w:r>
+      <w:proofErr w:type="spellStart"/>
+      <w:r>
+        <w:rPr>
+          <w:rFonts w:ascii="Times New Roman" w:hAnsi="Times New Roman" w:cs="Times New Roman"/>
+          <w:szCs w:val="24"/>
+        </w:rPr>
+        <w:t>dari</w:t>
+      </w:r>
+      <w:proofErr w:type="spellEnd"/>
+      <w:r>
+        <w:rPr>
+          <w:rFonts w:ascii="Times New Roman" w:hAnsi="Times New Roman" w:cs="Times New Roman"/>
+          <w:szCs w:val="24"/>
+        </w:rPr>
+        <w:t xml:space="preserve"> </w:t>
+      </w:r>
+      <w:proofErr w:type="spellStart"/>
+      <w:r>
+        <w:rPr>
+          <w:rFonts w:ascii="Times New Roman" w:hAnsi="Times New Roman" w:cs="Times New Roman"/>
+          <w:szCs w:val="24"/>
+        </w:rPr>
+        <w:t>nilai</w:t>
+      </w:r>
+      <w:proofErr w:type="spellEnd"/>
+      <w:r>
+        <w:rPr>
+          <w:rFonts w:ascii="Times New Roman" w:hAnsi="Times New Roman" w:cs="Times New Roman"/>
+          <w:szCs w:val="24"/>
+        </w:rPr>
+        <w:t xml:space="preserve"> </w:t>
+      </w:r>
+      <w:proofErr w:type="spellStart"/>
+      <w:r>
+        <w:rPr>
+          <w:rFonts w:ascii="Times New Roman" w:hAnsi="Times New Roman" w:cs="Times New Roman"/>
+          <w:szCs w:val="24"/>
+        </w:rPr>
+        <w:t>terkecil</w:t>
+      </w:r>
+      <w:proofErr w:type="spellEnd"/>
+      <w:r>
+        <w:rPr>
+          <w:rFonts w:ascii="Times New Roman" w:hAnsi="Times New Roman" w:cs="Times New Roman"/>
+          <w:szCs w:val="24"/>
+        </w:rPr>
+        <w:t xml:space="preserve"> </w:t>
+      </w:r>
+      <w:proofErr w:type="spellStart"/>
+      <w:r>
+        <w:rPr>
+          <w:rFonts w:ascii="Times New Roman" w:hAnsi="Times New Roman" w:cs="Times New Roman"/>
+          <w:szCs w:val="24"/>
+        </w:rPr>
+        <w:t>ke</w:t>
+      </w:r>
+      <w:proofErr w:type="spellEnd"/>
+      <w:r>
+        <w:rPr>
+          <w:rFonts w:ascii="Times New Roman" w:hAnsi="Times New Roman" w:cs="Times New Roman"/>
+          <w:szCs w:val="24"/>
+        </w:rPr>
+        <w:t xml:space="preserve"> </w:t>
+      </w:r>
+      <w:proofErr w:type="spellStart"/>
+      <w:r>
+        <w:rPr>
+          <w:rFonts w:ascii="Times New Roman" w:hAnsi="Times New Roman" w:cs="Times New Roman"/>
+          <w:szCs w:val="24"/>
+        </w:rPr>
+        <w:t>terbesar</w:t>
+      </w:r>
+      <w:proofErr w:type="spellEnd"/>
+      <w:r>
+        <w:rPr>
+          <w:rFonts w:ascii="Times New Roman" w:hAnsi="Times New Roman" w:cs="Times New Roman"/>
+          <w:szCs w:val="24"/>
+        </w:rPr>
+        <w:t>.</w:t>
+      </w:r>
+    </w:p>
+    <w:p>
+      <w:pPr>
+        <w:spacing w:line="360" w:lineRule="auto"/>
+        <w:jc w:val="both"/>
+        <w:rPr>
+          <w:rFonts w:ascii="Times New Roman" w:hAnsi="Times New Roman" w:cs="Times New Roman"/>
+          <w:szCs w:val="24"/>
+        </w:rPr>
+      </w:pPr>
     </w:p>
     <w:p>
       <w:pPr>
@@ -12956,6 +14622,152 @@
 <file path=word/numbering.xml><?xml version="1.0" encoding="utf-8"?>
 <w:numbering xmlns:wpc="http://schemas.microsoft.com/office/word/2010/wordprocessingCanvas" xmlns:cx="http://schemas.microsoft.com/office/drawing/2014/chartex" xmlns:cx1="http://schemas.microsoft.com/office/drawing/2015/9/8/chartex" xmlns:cx2="http://schemas.microsoft.com/office/drawing/2015/10/21/chartex" xmlns:cx3="http://schemas.microsoft.com/office/drawing/2016/5/9/chartex" xmlns:cx4="http://schemas.microsoft.com/office/drawing/2016/5/10/chartex" xmlns:cx5="http://schemas.microsoft.com/office/drawing/2016/5/11/chartex" xmlns:cx6="http://schemas.microsoft.com/office/drawing/2016/5/12/chartex" xmlns:cx7="http://schemas.microsoft.com/office/drawing/2016/5/13/chartex" xmlns:cx8="http://schemas.microsoft.com/office/drawing/2016/5/14/chartex" xmlns:mc="http://schemas.openxmlformats.org/markup-compatibility/2006" xmlns:aink="http://schemas.microsoft.com/office/drawing/2016/ink" xmlns:am3d="http://schemas.microsoft.com/office/drawing/2017/model3d" xmlns:o="urn:schemas-microsoft-com:office:office" xmlns:oel="http://schemas.microsoft.com/office/2019/extlst" xmlns:r="http://schemas.openxmlformats.org/officeDocument/2006/relationships" xmlns:m="http://schemas.openxmlformats.org/officeDocument/2006/math" xmlns:v="urn:schemas-microsoft-com:vml" xmlns:wp14="http://schemas.microsoft.com/office/word/2010/wordprocessingDrawing" xmlns:wp="http://schemas.openxmlformats.org/drawingml/2006/wordprocessingDrawing" xmlns:w10="urn:schemas-microsoft-com:office:word" xmlns:w="http://schemas.openxmlformats.org/wordprocessingml/2006/main" xmlns:w14="http://schemas.microsoft.com/office/word/2010/wordml" xmlns:w15="http://schemas.microsoft.com/office/word/2012/wordml" xmlns:w16cex="http://schemas.microsoft.com/office/word/2018/wordml/cex" xmlns:w16cid="http://schemas.microsoft.com/office/word/2016/wordml/cid" xmlns:w16="http://schemas.microsoft.com/office/word/2018/wordml" xmlns:w16du="http://schemas.microsoft.com/office/word/2023/wordml/word16du" xmlns:w16sdtdh="http://schemas.microsoft.com/office/word/2020/wordml/sdtdatahash" xmlns:w16sdtfl="http://schemas.microsoft.com/office/word/2024/wordml/sdtformatlock" xmlns:w16se="http://schemas.microsoft.com/office/word/2015/wordml/symex" xmlns:wpg="http://schemas.microsoft.com/office/word/2010/wordprocessingGroup" xmlns:wpi="http://schemas.microsoft.com/office/word/2010/wordprocessingInk" xmlns:wne="http://schemas.microsoft.com/office/word/2006/wordml" xmlns:wps="http://schemas.microsoft.com/office/word/2010/wordprocessingShape" mc:Ignorable="w14 w15 w16se w16cid w16 w16cex w16sdtdh w16sdtfl w16du wp14">
   <w:abstractNum w:abstractNumId="0" w15:restartNumberingAfterBreak="0">
+    <w:nsid w:val="12DE7932"/>
+    <w:multiLevelType w:val="multilevel"/>
+    <w:tmpl w:val="7AE4F580"/>
+    <w:lvl w:ilvl="0">
+      <w:start w:val="1"/>
+      <w:numFmt w:val="decimal"/>
+      <w:lvlText w:val="%1."/>
+      <w:lvlJc w:val="left"/>
+      <w:pPr>
+        <w:tabs>
+          <w:tab w:val="num" w:pos="720"/>
+        </w:tabs>
+        <w:ind w:left="720" w:hanging="360"/>
+      </w:pPr>
+      <w:rPr>
+        <w:rFonts w:hint="default"/>
+        <w:sz w:val="20"/>
+      </w:rPr>
+    </w:lvl>
+    <w:lvl w:ilvl="1">
+      <w:start w:val="1"/>
+      <w:numFmt w:val="lowerLetter"/>
+      <w:lvlText w:val="%2."/>
+      <w:lvlJc w:val="left"/>
+      <w:pPr>
+        <w:ind w:left="1440" w:hanging="360"/>
+      </w:pPr>
+      <w:rPr>
+        <w:rFonts w:hint="default"/>
+        <w:sz w:val="20"/>
+      </w:rPr>
+    </w:lvl>
+    <w:lvl w:ilvl="2" w:tentative="1">
+      <w:start w:val="1"/>
+      <w:numFmt w:val="bullet"/>
+      <w:lvlText w:val=""/>
+      <w:lvlJc w:val="left"/>
+      <w:pPr>
+        <w:tabs>
+          <w:tab w:val="num" w:pos="2160"/>
+        </w:tabs>
+        <w:ind w:left="2160" w:hanging="360"/>
+      </w:pPr>
+      <w:rPr>
+        <w:rFonts w:ascii="Wingdings" w:hAnsi="Wingdings" w:hint="default"/>
+        <w:sz w:val="20"/>
+      </w:rPr>
+    </w:lvl>
+    <w:lvl w:ilvl="3" w:tentative="1">
+      <w:start w:val="1"/>
+      <w:numFmt w:val="bullet"/>
+      <w:lvlText w:val=""/>
+      <w:lvlJc w:val="left"/>
+      <w:pPr>
+        <w:tabs>
+          <w:tab w:val="num" w:pos="2880"/>
+        </w:tabs>
+        <w:ind w:left="2880" w:hanging="360"/>
+      </w:pPr>
+      <w:rPr>
+        <w:rFonts w:ascii="Wingdings" w:hAnsi="Wingdings" w:hint="default"/>
+        <w:sz w:val="20"/>
+      </w:rPr>
+    </w:lvl>
+    <w:lvl w:ilvl="4" w:tentative="1">
+      <w:start w:val="1"/>
+      <w:numFmt w:val="bullet"/>
+      <w:lvlText w:val=""/>
+      <w:lvlJc w:val="left"/>
+      <w:pPr>
+        <w:tabs>
+          <w:tab w:val="num" w:pos="3600"/>
+        </w:tabs>
+        <w:ind w:left="3600" w:hanging="360"/>
+      </w:pPr>
+      <w:rPr>
+        <w:rFonts w:ascii="Wingdings" w:hAnsi="Wingdings" w:hint="default"/>
+        <w:sz w:val="20"/>
+      </w:rPr>
+    </w:lvl>
+    <w:lvl w:ilvl="5" w:tentative="1">
+      <w:start w:val="1"/>
+      <w:numFmt w:val="bullet"/>
+      <w:lvlText w:val=""/>
+      <w:lvlJc w:val="left"/>
+      <w:pPr>
+        <w:tabs>
+          <w:tab w:val="num" w:pos="4320"/>
+        </w:tabs>
+        <w:ind w:left="4320" w:hanging="360"/>
+      </w:pPr>
+      <w:rPr>
+        <w:rFonts w:ascii="Wingdings" w:hAnsi="Wingdings" w:hint="default"/>
+        <w:sz w:val="20"/>
+      </w:rPr>
+    </w:lvl>
+    <w:lvl w:ilvl="6" w:tentative="1">
+      <w:start w:val="1"/>
+      <w:numFmt w:val="bullet"/>
+      <w:lvlText w:val=""/>
+      <w:lvlJc w:val="left"/>
+      <w:pPr>
+        <w:tabs>
+          <w:tab w:val="num" w:pos="5040"/>
+        </w:tabs>
+        <w:ind w:left="5040" w:hanging="360"/>
+      </w:pPr>
+      <w:rPr>
+        <w:rFonts w:ascii="Wingdings" w:hAnsi="Wingdings" w:hint="default"/>
+        <w:sz w:val="20"/>
+      </w:rPr>
+    </w:lvl>
+    <w:lvl w:ilvl="7" w:tentative="1">
+      <w:start w:val="1"/>
+      <w:numFmt w:val="bullet"/>
+      <w:lvlText w:val=""/>
+      <w:lvlJc w:val="left"/>
+      <w:pPr>
+        <w:tabs>
+          <w:tab w:val="num" w:pos="5760"/>
+        </w:tabs>
+        <w:ind w:left="5760" w:hanging="360"/>
+      </w:pPr>
+      <w:rPr>
+        <w:rFonts w:ascii="Wingdings" w:hAnsi="Wingdings" w:hint="default"/>
+        <w:sz w:val="20"/>
+      </w:rPr>
+    </w:lvl>
+    <w:lvl w:ilvl="8" w:tentative="1">
+      <w:start w:val="1"/>
+      <w:numFmt w:val="bullet"/>
+      <w:lvlText w:val=""/>
+      <w:lvlJc w:val="left"/>
+      <w:pPr>
+        <w:tabs>
+          <w:tab w:val="num" w:pos="6480"/>
+        </w:tabs>
+        <w:ind w:left="6480" w:hanging="360"/>
+      </w:pPr>
+      <w:rPr>
+        <w:rFonts w:ascii="Wingdings" w:hAnsi="Wingdings" w:hint="default"/>
+        <w:sz w:val="20"/>
+      </w:rPr>
+    </w:lvl>
+  </w:abstractNum>
+  <w:abstractNum w:abstractNumId="1" w15:restartNumberingAfterBreak="0">
     <w:nsid w:val="449D046B"/>
     <w:multiLevelType w:val="multilevel"/>
     <w:tmpl w:val="7AE4F580"/>
@@ -13097,7 +14909,7 @@
       </w:rPr>
     </w:lvl>
   </w:abstractNum>
-  <w:abstractNum w:abstractNumId="1" w15:restartNumberingAfterBreak="0">
+  <w:abstractNum w:abstractNumId="2" w15:restartNumberingAfterBreak="0">
     <w:nsid w:val="46C24901"/>
     <w:multiLevelType w:val="multilevel"/>
     <w:tmpl w:val="F5EC21B2"/>
@@ -13246,7 +15058,7 @@
       </w:rPr>
     </w:lvl>
   </w:abstractNum>
-  <w:abstractNum w:abstractNumId="2" w15:restartNumberingAfterBreak="0">
+  <w:abstractNum w:abstractNumId="3" w15:restartNumberingAfterBreak="0">
     <w:nsid w:val="54353269"/>
     <w:multiLevelType w:val="multilevel"/>
     <w:tmpl w:val="720821A0"/>
@@ -13388,7 +15200,7 @@
       </w:rPr>
     </w:lvl>
   </w:abstractNum>
-  <w:abstractNum w:abstractNumId="3" w15:restartNumberingAfterBreak="0">
+  <w:abstractNum w:abstractNumId="4" w15:restartNumberingAfterBreak="0">
     <w:nsid w:val="5DAD7B79"/>
     <w:multiLevelType w:val="multilevel"/>
     <w:tmpl w:val="5DE817FE"/>
@@ -13537,7 +15349,7 @@
       </w:rPr>
     </w:lvl>
   </w:abstractNum>
-  <w:abstractNum w:abstractNumId="4" w15:restartNumberingAfterBreak="0">
+  <w:abstractNum w:abstractNumId="5" w15:restartNumberingAfterBreak="0">
     <w:nsid w:val="6BA1454F"/>
     <w:multiLevelType w:val="multilevel"/>
     <w:tmpl w:val="60306FD0"/>
@@ -13686,7 +15498,7 @@
       </w:rPr>
     </w:lvl>
   </w:abstractNum>
-  <w:abstractNum w:abstractNumId="5" w15:restartNumberingAfterBreak="0">
+  <w:abstractNum w:abstractNumId="6" w15:restartNumberingAfterBreak="0">
     <w:nsid w:val="713B3F1C"/>
     <w:multiLevelType w:val="multilevel"/>
     <w:tmpl w:val="31FE5DAE"/>
@@ -13837,21 +15649,24 @@
     </w:lvl>
   </w:abstractNum>
   <w:num w:numId="1" w16cid:durableId="440801600">
+    <w:abstractNumId w:val="2"/>
+  </w:num>
+  <w:num w:numId="2" w16cid:durableId="238904428">
+    <w:abstractNumId w:val="5"/>
+  </w:num>
+  <w:num w:numId="3" w16cid:durableId="1902015101">
+    <w:abstractNumId w:val="4"/>
+  </w:num>
+  <w:num w:numId="4" w16cid:durableId="432940936">
+    <w:abstractNumId w:val="3"/>
+  </w:num>
+  <w:num w:numId="5" w16cid:durableId="1137143970">
+    <w:abstractNumId w:val="6"/>
+  </w:num>
+  <w:num w:numId="6" w16cid:durableId="1036850259">
     <w:abstractNumId w:val="1"/>
   </w:num>
-  <w:num w:numId="2" w16cid:durableId="238904428">
-    <w:abstractNumId w:val="4"/>
-  </w:num>
-  <w:num w:numId="3" w16cid:durableId="1902015101">
-    <w:abstractNumId w:val="3"/>
-  </w:num>
-  <w:num w:numId="4" w16cid:durableId="432940936">
-    <w:abstractNumId w:val="2"/>
-  </w:num>
-  <w:num w:numId="5" w16cid:durableId="1137143970">
-    <w:abstractNumId w:val="5"/>
-  </w:num>
-  <w:num w:numId="6" w16cid:durableId="1036850259">
+  <w:num w:numId="7" w16cid:durableId="680863529">
     <w:abstractNumId w:val="0"/>
   </w:num>
 </w:numbering>

</xml_diff>

<commit_message>
docs: tambahkan hasil pengujian program ke laporan
</commit_message>
<xml_diff>
--- a/Laporan.docx
+++ b/Laporan.docx
@@ -8019,17 +8019,8 @@
           <w:szCs w:val="24"/>
         </w:rPr>
         <w:lastRenderedPageBreak/>
-        <w:t xml:space="preserve">PENJELASAN KODE </w:t>
-      </w:r>
-      <w:proofErr w:type="gramStart"/>
-      <w:r>
-        <w:rPr>
-          <w:rFonts w:ascii="Times New Roman" w:hAnsi="Times New Roman" w:cs="Times New Roman"/>
-          <w:szCs w:val="24"/>
-        </w:rPr>
-        <w:t>PROGRAMNYA :</w:t>
-      </w:r>
-      <w:proofErr w:type="gramEnd"/>
+        <w:t>PENJELASAN KODE PROGRAMNYA :</w:t>
+      </w:r>
     </w:p>
     <w:p>
       <w:pPr>
@@ -8776,9 +8767,9 @@
           <w:bCs/>
           <w:szCs w:val="24"/>
         </w:rPr>
-        <w:t>tampilkan_</w:t>
-      </w:r>
-      <w:proofErr w:type="gramStart"/>
+        <w:t>tampilkan_larik</w:t>
+      </w:r>
+      <w:proofErr w:type="spellEnd"/>
       <w:r>
         <w:rPr>
           <w:rFonts w:ascii="Times New Roman" w:hAnsi="Times New Roman" w:cs="Times New Roman"/>
@@ -8786,72 +8777,14 @@
           <w:bCs/>
           <w:szCs w:val="24"/>
         </w:rPr>
-        <w:t>larik</w:t>
-      </w:r>
-      <w:proofErr w:type="spellEnd"/>
-      <w:r>
-        <w:rPr>
-          <w:rFonts w:ascii="Times New Roman" w:hAnsi="Times New Roman" w:cs="Times New Roman"/>
-          <w:b/>
-          <w:bCs/>
-          <w:szCs w:val="24"/>
-        </w:rPr>
-        <w:t>(</w:t>
-      </w:r>
-      <w:proofErr w:type="gramEnd"/>
-      <w:r>
-        <w:rPr>
-          <w:rFonts w:ascii="Times New Roman" w:hAnsi="Times New Roman" w:cs="Times New Roman"/>
-          <w:b/>
-          <w:bCs/>
-          <w:szCs w:val="24"/>
-        </w:rPr>
-        <w:t xml:space="preserve">int </w:t>
-      </w:r>
-      <w:proofErr w:type="gramStart"/>
-      <w:r>
-        <w:rPr>
-          <w:rFonts w:ascii="Times New Roman" w:hAnsi="Times New Roman" w:cs="Times New Roman"/>
-          <w:b/>
-          <w:bCs/>
-          <w:szCs w:val="24"/>
-        </w:rPr>
-        <w:t>data[</w:t>
-      </w:r>
-      <w:proofErr w:type="gramEnd"/>
-      <w:r>
-        <w:rPr>
-          <w:rFonts w:ascii="Times New Roman" w:hAnsi="Times New Roman" w:cs="Times New Roman"/>
-          <w:b/>
-          <w:bCs/>
-          <w:szCs w:val="24"/>
-        </w:rPr>
-        <w:t>], int n</w:t>
-      </w:r>
-      <w:proofErr w:type="gramStart"/>
-      <w:r>
-        <w:rPr>
-          <w:rFonts w:ascii="Times New Roman" w:hAnsi="Times New Roman" w:cs="Times New Roman"/>
-          <w:b/>
-          <w:bCs/>
-          <w:szCs w:val="24"/>
-        </w:rPr>
-        <w:t>);</w:t>
-      </w:r>
-      <w:r>
-        <w:rPr>
-          <w:rFonts w:ascii="Times New Roman" w:hAnsi="Times New Roman" w:cs="Times New Roman"/>
-          <w:szCs w:val="24"/>
-        </w:rPr>
-        <w:t>:</w:t>
-      </w:r>
-      <w:proofErr w:type="gramEnd"/>
-      <w:r>
-        <w:rPr>
-          <w:rFonts w:ascii="Times New Roman" w:hAnsi="Times New Roman" w:cs="Times New Roman"/>
-          <w:szCs w:val="24"/>
-        </w:rPr>
-        <w:t xml:space="preserve"> </w:t>
+        <w:t>(int data[], int n);</w:t>
+      </w:r>
+      <w:r>
+        <w:rPr>
+          <w:rFonts w:ascii="Times New Roman" w:hAnsi="Times New Roman" w:cs="Times New Roman"/>
+          <w:szCs w:val="24"/>
+        </w:rPr>
+        <w:t xml:space="preserve">: </w:t>
       </w:r>
       <w:proofErr w:type="spellStart"/>
       <w:r>
@@ -9149,7 +9082,6 @@
         <w:t xml:space="preserve">int </w:t>
       </w:r>
       <w:proofErr w:type="spellStart"/>
-      <w:proofErr w:type="gramStart"/>
       <w:r>
         <w:rPr>
           <w:rFonts w:ascii="Times New Roman" w:hAnsi="Times New Roman" w:cs="Times New Roman"/>
@@ -9167,9 +9099,9 @@
           <w:bCs/>
           <w:szCs w:val="24"/>
         </w:rPr>
-        <w:t>(</w:t>
-      </w:r>
-      <w:proofErr w:type="gramEnd"/>
+        <w:t xml:space="preserve">(int data[], int </w:t>
+      </w:r>
+      <w:proofErr w:type="spellStart"/>
       <w:r>
         <w:rPr>
           <w:rFonts w:ascii="Times New Roman" w:hAnsi="Times New Roman" w:cs="Times New Roman"/>
@@ -9177,9 +9109,9 @@
           <w:bCs/>
           <w:szCs w:val="24"/>
         </w:rPr>
-        <w:t xml:space="preserve">int </w:t>
-      </w:r>
-      <w:proofErr w:type="gramStart"/>
+        <w:t>awal</w:t>
+      </w:r>
+      <w:proofErr w:type="spellEnd"/>
       <w:r>
         <w:rPr>
           <w:rFonts w:ascii="Times New Roman" w:hAnsi="Times New Roman" w:cs="Times New Roman"/>
@@ -9187,9 +9119,9 @@
           <w:bCs/>
           <w:szCs w:val="24"/>
         </w:rPr>
-        <w:t>data[</w:t>
-      </w:r>
-      <w:proofErr w:type="gramEnd"/>
+        <w:t xml:space="preserve">, int </w:t>
+      </w:r>
+      <w:proofErr w:type="spellStart"/>
       <w:r>
         <w:rPr>
           <w:rFonts w:ascii="Times New Roman" w:hAnsi="Times New Roman" w:cs="Times New Roman"/>
@@ -9197,9 +9129,9 @@
           <w:bCs/>
           <w:szCs w:val="24"/>
         </w:rPr>
-        <w:t xml:space="preserve">], int </w:t>
-      </w:r>
-      <w:proofErr w:type="spellStart"/>
+        <w:t>akhir</w:t>
+      </w:r>
+      <w:proofErr w:type="spellEnd"/>
       <w:r>
         <w:rPr>
           <w:rFonts w:ascii="Times New Roman" w:hAnsi="Times New Roman" w:cs="Times New Roman"/>
@@ -9207,37 +9139,6 @@
           <w:bCs/>
           <w:szCs w:val="24"/>
         </w:rPr>
-        <w:t>awal</w:t>
-      </w:r>
-      <w:proofErr w:type="spellEnd"/>
-      <w:r>
-        <w:rPr>
-          <w:rFonts w:ascii="Times New Roman" w:hAnsi="Times New Roman" w:cs="Times New Roman"/>
-          <w:b/>
-          <w:bCs/>
-          <w:szCs w:val="24"/>
-        </w:rPr>
-        <w:t xml:space="preserve">, int </w:t>
-      </w:r>
-      <w:proofErr w:type="spellStart"/>
-      <w:r>
-        <w:rPr>
-          <w:rFonts w:ascii="Times New Roman" w:hAnsi="Times New Roman" w:cs="Times New Roman"/>
-          <w:b/>
-          <w:bCs/>
-          <w:szCs w:val="24"/>
-        </w:rPr>
-        <w:t>akhir</w:t>
-      </w:r>
-      <w:proofErr w:type="spellEnd"/>
-      <w:proofErr w:type="gramStart"/>
-      <w:r>
-        <w:rPr>
-          <w:rFonts w:ascii="Times New Roman" w:hAnsi="Times New Roman" w:cs="Times New Roman"/>
-          <w:b/>
-          <w:bCs/>
-          <w:szCs w:val="24"/>
-        </w:rPr>
         <w:t>);</w:t>
       </w:r>
       <w:r>
@@ -9245,15 +9146,7 @@
           <w:rFonts w:ascii="Times New Roman" w:hAnsi="Times New Roman" w:cs="Times New Roman"/>
           <w:szCs w:val="24"/>
         </w:rPr>
-        <w:t>:</w:t>
-      </w:r>
-      <w:proofErr w:type="gramEnd"/>
-      <w:r>
-        <w:rPr>
-          <w:rFonts w:ascii="Times New Roman" w:hAnsi="Times New Roman" w:cs="Times New Roman"/>
-          <w:szCs w:val="24"/>
-        </w:rPr>
-        <w:t xml:space="preserve"> </w:t>
+        <w:t xml:space="preserve">: </w:t>
       </w:r>
       <w:proofErr w:type="spellStart"/>
       <w:r>
@@ -9622,9 +9515,9 @@
           <w:bCs/>
           <w:szCs w:val="24"/>
         </w:rPr>
-        <w:t>quick_</w:t>
-      </w:r>
-      <w:proofErr w:type="gramStart"/>
+        <w:t>quick_sort</w:t>
+      </w:r>
+      <w:proofErr w:type="spellEnd"/>
       <w:r>
         <w:rPr>
           <w:rFonts w:ascii="Times New Roman" w:hAnsi="Times New Roman" w:cs="Times New Roman"/>
@@ -9632,9 +9525,9 @@
           <w:bCs/>
           <w:szCs w:val="24"/>
         </w:rPr>
-        <w:t>sort</w:t>
-      </w:r>
-      <w:proofErr w:type="spellEnd"/>
+        <w:t xml:space="preserve">(int data[], int </w:t>
+      </w:r>
+      <w:proofErr w:type="spellStart"/>
       <w:r>
         <w:rPr>
           <w:rFonts w:ascii="Times New Roman" w:hAnsi="Times New Roman" w:cs="Times New Roman"/>
@@ -9642,9 +9535,9 @@
           <w:bCs/>
           <w:szCs w:val="24"/>
         </w:rPr>
-        <w:t>(</w:t>
-      </w:r>
-      <w:proofErr w:type="gramEnd"/>
+        <w:t>awal</w:t>
+      </w:r>
+      <w:proofErr w:type="spellEnd"/>
       <w:r>
         <w:rPr>
           <w:rFonts w:ascii="Times New Roman" w:hAnsi="Times New Roman" w:cs="Times New Roman"/>
@@ -9652,9 +9545,9 @@
           <w:bCs/>
           <w:szCs w:val="24"/>
         </w:rPr>
-        <w:t xml:space="preserve">int </w:t>
-      </w:r>
-      <w:proofErr w:type="gramStart"/>
+        <w:t xml:space="preserve">, int </w:t>
+      </w:r>
+      <w:proofErr w:type="spellStart"/>
       <w:r>
         <w:rPr>
           <w:rFonts w:ascii="Times New Roman" w:hAnsi="Times New Roman" w:cs="Times New Roman"/>
@@ -9662,9 +9555,9 @@
           <w:bCs/>
           <w:szCs w:val="24"/>
         </w:rPr>
-        <w:t>data[</w:t>
-      </w:r>
-      <w:proofErr w:type="gramEnd"/>
+        <w:t>akhir</w:t>
+      </w:r>
+      <w:proofErr w:type="spellEnd"/>
       <w:r>
         <w:rPr>
           <w:rFonts w:ascii="Times New Roman" w:hAnsi="Times New Roman" w:cs="Times New Roman"/>
@@ -9672,47 +9565,6 @@
           <w:bCs/>
           <w:szCs w:val="24"/>
         </w:rPr>
-        <w:t xml:space="preserve">], int </w:t>
-      </w:r>
-      <w:proofErr w:type="spellStart"/>
-      <w:r>
-        <w:rPr>
-          <w:rFonts w:ascii="Times New Roman" w:hAnsi="Times New Roman" w:cs="Times New Roman"/>
-          <w:b/>
-          <w:bCs/>
-          <w:szCs w:val="24"/>
-        </w:rPr>
-        <w:t>awal</w:t>
-      </w:r>
-      <w:proofErr w:type="spellEnd"/>
-      <w:r>
-        <w:rPr>
-          <w:rFonts w:ascii="Times New Roman" w:hAnsi="Times New Roman" w:cs="Times New Roman"/>
-          <w:b/>
-          <w:bCs/>
-          <w:szCs w:val="24"/>
-        </w:rPr>
-        <w:t xml:space="preserve">, int </w:t>
-      </w:r>
-      <w:proofErr w:type="spellStart"/>
-      <w:r>
-        <w:rPr>
-          <w:rFonts w:ascii="Times New Roman" w:hAnsi="Times New Roman" w:cs="Times New Roman"/>
-          <w:b/>
-          <w:bCs/>
-          <w:szCs w:val="24"/>
-        </w:rPr>
-        <w:t>akhir</w:t>
-      </w:r>
-      <w:proofErr w:type="spellEnd"/>
-      <w:proofErr w:type="gramStart"/>
-      <w:r>
-        <w:rPr>
-          <w:rFonts w:ascii="Times New Roman" w:hAnsi="Times New Roman" w:cs="Times New Roman"/>
-          <w:b/>
-          <w:bCs/>
-          <w:szCs w:val="24"/>
-        </w:rPr>
         <w:t>);</w:t>
       </w:r>
       <w:r>
@@ -9720,15 +9572,7 @@
           <w:rFonts w:ascii="Times New Roman" w:hAnsi="Times New Roman" w:cs="Times New Roman"/>
           <w:szCs w:val="24"/>
         </w:rPr>
-        <w:t>:</w:t>
-      </w:r>
-      <w:proofErr w:type="gramEnd"/>
-      <w:r>
-        <w:rPr>
-          <w:rFonts w:ascii="Times New Roman" w:hAnsi="Times New Roman" w:cs="Times New Roman"/>
-          <w:szCs w:val="24"/>
-        </w:rPr>
-        <w:t xml:space="preserve"> </w:t>
+        <w:t xml:space="preserve">: </w:t>
       </w:r>
       <w:proofErr w:type="spellStart"/>
       <w:r>
@@ -14568,6 +14412,1260 @@
           <w:szCs w:val="24"/>
         </w:rPr>
       </w:pPr>
+      <w:r>
+        <w:rPr>
+          <w:rFonts w:ascii="Times New Roman" w:hAnsi="Times New Roman" w:cs="Times New Roman"/>
+          <w:szCs w:val="24"/>
+        </w:rPr>
+        <w:t xml:space="preserve">4. </w:t>
+      </w:r>
+      <w:r>
+        <w:rPr>
+          <w:rFonts w:ascii="Times New Roman" w:hAnsi="Times New Roman" w:cs="Times New Roman"/>
+          <w:szCs w:val="24"/>
+        </w:rPr>
+        <w:t xml:space="preserve">Hasil </w:t>
+      </w:r>
+      <w:proofErr w:type="spellStart"/>
+      <w:r>
+        <w:rPr>
+          <w:rFonts w:ascii="Times New Roman" w:hAnsi="Times New Roman" w:cs="Times New Roman"/>
+          <w:szCs w:val="24"/>
+        </w:rPr>
+        <w:t>Pengujian</w:t>
+      </w:r>
+      <w:proofErr w:type="spellEnd"/>
+      <w:r>
+        <w:rPr>
+          <w:rFonts w:ascii="Times New Roman" w:hAnsi="Times New Roman" w:cs="Times New Roman"/>
+          <w:szCs w:val="24"/>
+        </w:rPr>
+        <w:t xml:space="preserve"> Program</w:t>
+      </w:r>
+    </w:p>
+    <w:p>
+      <w:pPr>
+        <w:spacing w:line="360" w:lineRule="auto"/>
+        <w:ind w:firstLine="720"/>
+        <w:jc w:val="both"/>
+        <w:rPr>
+          <w:rFonts w:ascii="Times New Roman" w:hAnsi="Times New Roman" w:cs="Times New Roman"/>
+          <w:szCs w:val="24"/>
+        </w:rPr>
+      </w:pPr>
+      <w:r>
+        <w:rPr>
+          <w:rFonts w:ascii="Times New Roman" w:hAnsi="Times New Roman" w:cs="Times New Roman"/>
+          <w:szCs w:val="24"/>
+        </w:rPr>
+        <w:t xml:space="preserve">Bagian </w:t>
+      </w:r>
+      <w:proofErr w:type="spellStart"/>
+      <w:r>
+        <w:rPr>
+          <w:rFonts w:ascii="Times New Roman" w:hAnsi="Times New Roman" w:cs="Times New Roman"/>
+          <w:szCs w:val="24"/>
+        </w:rPr>
+        <w:t>ini</w:t>
+      </w:r>
+      <w:proofErr w:type="spellEnd"/>
+      <w:r>
+        <w:rPr>
+          <w:rFonts w:ascii="Times New Roman" w:hAnsi="Times New Roman" w:cs="Times New Roman"/>
+          <w:szCs w:val="24"/>
+        </w:rPr>
+        <w:t xml:space="preserve"> </w:t>
+      </w:r>
+      <w:proofErr w:type="spellStart"/>
+      <w:r>
+        <w:rPr>
+          <w:rFonts w:ascii="Times New Roman" w:hAnsi="Times New Roman" w:cs="Times New Roman"/>
+          <w:szCs w:val="24"/>
+        </w:rPr>
+        <w:t>mendokumentasikan</w:t>
+      </w:r>
+      <w:proofErr w:type="spellEnd"/>
+      <w:r>
+        <w:rPr>
+          <w:rFonts w:ascii="Times New Roman" w:hAnsi="Times New Roman" w:cs="Times New Roman"/>
+          <w:szCs w:val="24"/>
+        </w:rPr>
+        <w:t xml:space="preserve"> </w:t>
+      </w:r>
+      <w:proofErr w:type="spellStart"/>
+      <w:r>
+        <w:rPr>
+          <w:rFonts w:ascii="Times New Roman" w:hAnsi="Times New Roman" w:cs="Times New Roman"/>
+          <w:szCs w:val="24"/>
+        </w:rPr>
+        <w:t>hasil</w:t>
+      </w:r>
+      <w:proofErr w:type="spellEnd"/>
+      <w:r>
+        <w:rPr>
+          <w:rFonts w:ascii="Times New Roman" w:hAnsi="Times New Roman" w:cs="Times New Roman"/>
+          <w:szCs w:val="24"/>
+        </w:rPr>
+        <w:t xml:space="preserve"> </w:t>
+      </w:r>
+      <w:proofErr w:type="spellStart"/>
+      <w:r>
+        <w:rPr>
+          <w:rFonts w:ascii="Times New Roman" w:hAnsi="Times New Roman" w:cs="Times New Roman"/>
+          <w:szCs w:val="24"/>
+        </w:rPr>
+        <w:t>eksekusi</w:t>
+      </w:r>
+      <w:proofErr w:type="spellEnd"/>
+      <w:r>
+        <w:rPr>
+          <w:rFonts w:ascii="Times New Roman" w:hAnsi="Times New Roman" w:cs="Times New Roman"/>
+          <w:szCs w:val="24"/>
+        </w:rPr>
+        <w:t xml:space="preserve"> program </w:t>
+      </w:r>
+      <w:proofErr w:type="spellStart"/>
+      <w:r>
+        <w:rPr>
+          <w:rFonts w:ascii="Times New Roman" w:hAnsi="Times New Roman" w:cs="Times New Roman"/>
+          <w:szCs w:val="24"/>
+        </w:rPr>
+        <w:t>setelah</w:t>
+      </w:r>
+      <w:proofErr w:type="spellEnd"/>
+      <w:r>
+        <w:rPr>
+          <w:rFonts w:ascii="Times New Roman" w:hAnsi="Times New Roman" w:cs="Times New Roman"/>
+          <w:szCs w:val="24"/>
+        </w:rPr>
+        <w:t xml:space="preserve"> </w:t>
+      </w:r>
+      <w:proofErr w:type="spellStart"/>
+      <w:r>
+        <w:rPr>
+          <w:rFonts w:ascii="Times New Roman" w:hAnsi="Times New Roman" w:cs="Times New Roman"/>
+          <w:szCs w:val="24"/>
+        </w:rPr>
+        <w:t>melalui</w:t>
+      </w:r>
+      <w:proofErr w:type="spellEnd"/>
+      <w:r>
+        <w:rPr>
+          <w:rFonts w:ascii="Times New Roman" w:hAnsi="Times New Roman" w:cs="Times New Roman"/>
+          <w:szCs w:val="24"/>
+        </w:rPr>
+        <w:t xml:space="preserve"> proses </w:t>
+      </w:r>
+      <w:proofErr w:type="spellStart"/>
+      <w:r>
+        <w:rPr>
+          <w:rFonts w:ascii="Times New Roman" w:hAnsi="Times New Roman" w:cs="Times New Roman"/>
+          <w:szCs w:val="24"/>
+        </w:rPr>
+        <w:t>kompilasi</w:t>
+      </w:r>
+      <w:proofErr w:type="spellEnd"/>
+      <w:r>
+        <w:rPr>
+          <w:rFonts w:ascii="Times New Roman" w:hAnsi="Times New Roman" w:cs="Times New Roman"/>
+          <w:szCs w:val="24"/>
+        </w:rPr>
+        <w:t xml:space="preserve">. </w:t>
+      </w:r>
+      <w:proofErr w:type="spellStart"/>
+      <w:r>
+        <w:rPr>
+          <w:rFonts w:ascii="Times New Roman" w:hAnsi="Times New Roman" w:cs="Times New Roman"/>
+          <w:szCs w:val="24"/>
+        </w:rPr>
+        <w:t>Pengujian</w:t>
+      </w:r>
+      <w:proofErr w:type="spellEnd"/>
+      <w:r>
+        <w:rPr>
+          <w:rFonts w:ascii="Times New Roman" w:hAnsi="Times New Roman" w:cs="Times New Roman"/>
+          <w:szCs w:val="24"/>
+        </w:rPr>
+        <w:t xml:space="preserve"> </w:t>
+      </w:r>
+      <w:proofErr w:type="spellStart"/>
+      <w:r>
+        <w:rPr>
+          <w:rFonts w:ascii="Times New Roman" w:hAnsi="Times New Roman" w:cs="Times New Roman"/>
+          <w:szCs w:val="24"/>
+        </w:rPr>
+        <w:t>dilakukan</w:t>
+      </w:r>
+      <w:proofErr w:type="spellEnd"/>
+      <w:r>
+        <w:rPr>
+          <w:rFonts w:ascii="Times New Roman" w:hAnsi="Times New Roman" w:cs="Times New Roman"/>
+          <w:szCs w:val="24"/>
+        </w:rPr>
+        <w:t xml:space="preserve"> </w:t>
+      </w:r>
+      <w:proofErr w:type="spellStart"/>
+      <w:r>
+        <w:rPr>
+          <w:rFonts w:ascii="Times New Roman" w:hAnsi="Times New Roman" w:cs="Times New Roman"/>
+          <w:szCs w:val="24"/>
+        </w:rPr>
+        <w:t>dengan</w:t>
+      </w:r>
+      <w:proofErr w:type="spellEnd"/>
+      <w:r>
+        <w:rPr>
+          <w:rFonts w:ascii="Times New Roman" w:hAnsi="Times New Roman" w:cs="Times New Roman"/>
+          <w:szCs w:val="24"/>
+        </w:rPr>
+        <w:t xml:space="preserve"> </w:t>
+      </w:r>
+      <w:proofErr w:type="spellStart"/>
+      <w:r>
+        <w:rPr>
+          <w:rFonts w:ascii="Times New Roman" w:hAnsi="Times New Roman" w:cs="Times New Roman"/>
+          <w:szCs w:val="24"/>
+        </w:rPr>
+        <w:t>memasukkan</w:t>
+      </w:r>
+      <w:proofErr w:type="spellEnd"/>
+      <w:r>
+        <w:rPr>
+          <w:rFonts w:ascii="Times New Roman" w:hAnsi="Times New Roman" w:cs="Times New Roman"/>
+          <w:szCs w:val="24"/>
+        </w:rPr>
+        <w:t xml:space="preserve"> </w:t>
+      </w:r>
+      <w:proofErr w:type="spellStart"/>
+      <w:r>
+        <w:rPr>
+          <w:rFonts w:ascii="Times New Roman" w:hAnsi="Times New Roman" w:cs="Times New Roman"/>
+          <w:szCs w:val="24"/>
+        </w:rPr>
+        <w:t>sekumpulan</w:t>
+      </w:r>
+      <w:proofErr w:type="spellEnd"/>
+      <w:r>
+        <w:rPr>
+          <w:rFonts w:ascii="Times New Roman" w:hAnsi="Times New Roman" w:cs="Times New Roman"/>
+          <w:szCs w:val="24"/>
+        </w:rPr>
+        <w:t xml:space="preserve"> data </w:t>
+      </w:r>
+      <w:proofErr w:type="spellStart"/>
+      <w:r>
+        <w:rPr>
+          <w:rFonts w:ascii="Times New Roman" w:hAnsi="Times New Roman" w:cs="Times New Roman"/>
+          <w:szCs w:val="24"/>
+        </w:rPr>
+        <w:t>acak</w:t>
+      </w:r>
+      <w:proofErr w:type="spellEnd"/>
+      <w:r>
+        <w:rPr>
+          <w:rFonts w:ascii="Times New Roman" w:hAnsi="Times New Roman" w:cs="Times New Roman"/>
+          <w:szCs w:val="24"/>
+        </w:rPr>
+        <w:t xml:space="preserve"> </w:t>
+      </w:r>
+      <w:proofErr w:type="spellStart"/>
+      <w:r>
+        <w:rPr>
+          <w:rFonts w:ascii="Times New Roman" w:hAnsi="Times New Roman" w:cs="Times New Roman"/>
+          <w:szCs w:val="24"/>
+        </w:rPr>
+        <w:t>untuk</w:t>
+      </w:r>
+      <w:proofErr w:type="spellEnd"/>
+      <w:r>
+        <w:rPr>
+          <w:rFonts w:ascii="Times New Roman" w:hAnsi="Times New Roman" w:cs="Times New Roman"/>
+          <w:szCs w:val="24"/>
+        </w:rPr>
+        <w:t xml:space="preserve"> </w:t>
+      </w:r>
+      <w:proofErr w:type="spellStart"/>
+      <w:r>
+        <w:rPr>
+          <w:rFonts w:ascii="Times New Roman" w:hAnsi="Times New Roman" w:cs="Times New Roman"/>
+          <w:szCs w:val="24"/>
+        </w:rPr>
+        <w:t>memastikan</w:t>
+      </w:r>
+      <w:proofErr w:type="spellEnd"/>
+      <w:r>
+        <w:rPr>
+          <w:rFonts w:ascii="Times New Roman" w:hAnsi="Times New Roman" w:cs="Times New Roman"/>
+          <w:szCs w:val="24"/>
+        </w:rPr>
+        <w:t xml:space="preserve"> </w:t>
+      </w:r>
+      <w:proofErr w:type="spellStart"/>
+      <w:r>
+        <w:rPr>
+          <w:rFonts w:ascii="Times New Roman" w:hAnsi="Times New Roman" w:cs="Times New Roman"/>
+          <w:szCs w:val="24"/>
+        </w:rPr>
+        <w:t>algoritma</w:t>
+      </w:r>
+      <w:proofErr w:type="spellEnd"/>
+      <w:r>
+        <w:rPr>
+          <w:rFonts w:ascii="Times New Roman" w:hAnsi="Times New Roman" w:cs="Times New Roman"/>
+          <w:szCs w:val="24"/>
+        </w:rPr>
+        <w:t xml:space="preserve"> </w:t>
+      </w:r>
+      <w:r>
+        <w:rPr>
+          <w:rFonts w:ascii="Times New Roman" w:hAnsi="Times New Roman" w:cs="Times New Roman"/>
+          <w:i/>
+          <w:iCs/>
+          <w:szCs w:val="24"/>
+        </w:rPr>
+        <w:t>Quick Sort</w:t>
+      </w:r>
+      <w:r>
+        <w:rPr>
+          <w:rFonts w:ascii="Times New Roman" w:hAnsi="Times New Roman" w:cs="Times New Roman"/>
+          <w:szCs w:val="24"/>
+        </w:rPr>
+        <w:t xml:space="preserve"> </w:t>
+      </w:r>
+      <w:proofErr w:type="spellStart"/>
+      <w:r>
+        <w:rPr>
+          <w:rFonts w:ascii="Times New Roman" w:hAnsi="Times New Roman" w:cs="Times New Roman"/>
+          <w:szCs w:val="24"/>
+        </w:rPr>
+        <w:t>bekerja</w:t>
+      </w:r>
+      <w:proofErr w:type="spellEnd"/>
+      <w:r>
+        <w:rPr>
+          <w:rFonts w:ascii="Times New Roman" w:hAnsi="Times New Roman" w:cs="Times New Roman"/>
+          <w:szCs w:val="24"/>
+        </w:rPr>
+        <w:t xml:space="preserve"> </w:t>
+      </w:r>
+      <w:proofErr w:type="spellStart"/>
+      <w:r>
+        <w:rPr>
+          <w:rFonts w:ascii="Times New Roman" w:hAnsi="Times New Roman" w:cs="Times New Roman"/>
+          <w:szCs w:val="24"/>
+        </w:rPr>
+        <w:t>dengan</w:t>
+      </w:r>
+      <w:proofErr w:type="spellEnd"/>
+      <w:r>
+        <w:rPr>
+          <w:rFonts w:ascii="Times New Roman" w:hAnsi="Times New Roman" w:cs="Times New Roman"/>
+          <w:szCs w:val="24"/>
+        </w:rPr>
+        <w:t xml:space="preserve"> </w:t>
+      </w:r>
+      <w:proofErr w:type="spellStart"/>
+      <w:r>
+        <w:rPr>
+          <w:rFonts w:ascii="Times New Roman" w:hAnsi="Times New Roman" w:cs="Times New Roman"/>
+          <w:szCs w:val="24"/>
+        </w:rPr>
+        <w:t>presisi</w:t>
+      </w:r>
+      <w:proofErr w:type="spellEnd"/>
+      <w:r>
+        <w:rPr>
+          <w:rFonts w:ascii="Times New Roman" w:hAnsi="Times New Roman" w:cs="Times New Roman"/>
+          <w:szCs w:val="24"/>
+        </w:rPr>
+        <w:t>.</w:t>
+      </w:r>
+    </w:p>
+    <w:p>
+      <w:pPr>
+        <w:spacing w:line="360" w:lineRule="auto"/>
+        <w:jc w:val="both"/>
+        <w:rPr>
+          <w:rFonts w:ascii="Times New Roman" w:hAnsi="Times New Roman" w:cs="Times New Roman"/>
+          <w:szCs w:val="24"/>
+        </w:rPr>
+      </w:pPr>
+      <w:proofErr w:type="spellStart"/>
+      <w:r>
+        <w:rPr>
+          <w:rFonts w:ascii="Times New Roman" w:hAnsi="Times New Roman" w:cs="Times New Roman"/>
+          <w:b/>
+          <w:bCs/>
+          <w:szCs w:val="24"/>
+        </w:rPr>
+        <w:t>Skenario</w:t>
+      </w:r>
+      <w:proofErr w:type="spellEnd"/>
+      <w:r>
+        <w:rPr>
+          <w:rFonts w:ascii="Times New Roman" w:hAnsi="Times New Roman" w:cs="Times New Roman"/>
+          <w:b/>
+          <w:bCs/>
+          <w:szCs w:val="24"/>
+        </w:rPr>
+        <w:t xml:space="preserve"> </w:t>
+      </w:r>
+      <w:proofErr w:type="spellStart"/>
+      <w:r>
+        <w:rPr>
+          <w:rFonts w:ascii="Times New Roman" w:hAnsi="Times New Roman" w:cs="Times New Roman"/>
+          <w:b/>
+          <w:bCs/>
+          <w:szCs w:val="24"/>
+        </w:rPr>
+        <w:t>Pengujian</w:t>
+      </w:r>
+      <w:proofErr w:type="spellEnd"/>
+      <w:r>
+        <w:rPr>
+          <w:rFonts w:ascii="Times New Roman" w:hAnsi="Times New Roman" w:cs="Times New Roman"/>
+          <w:b/>
+          <w:bCs/>
+          <w:szCs w:val="24"/>
+        </w:rPr>
+        <w:t>:</w:t>
+      </w:r>
+    </w:p>
+    <w:p>
+      <w:pPr>
+        <w:numPr>
+          <w:ilvl w:val="0"/>
+          <w:numId w:val="8"/>
+        </w:numPr>
+        <w:spacing w:line="360" w:lineRule="auto"/>
+        <w:jc w:val="both"/>
+        <w:rPr>
+          <w:rFonts w:ascii="Times New Roman" w:hAnsi="Times New Roman" w:cs="Times New Roman"/>
+          <w:szCs w:val="24"/>
+        </w:rPr>
+      </w:pPr>
+      <w:proofErr w:type="spellStart"/>
+      <w:r>
+        <w:rPr>
+          <w:rFonts w:ascii="Times New Roman" w:hAnsi="Times New Roman" w:cs="Times New Roman"/>
+          <w:b/>
+          <w:bCs/>
+          <w:szCs w:val="24"/>
+        </w:rPr>
+        <w:t>Jumlah</w:t>
+      </w:r>
+      <w:proofErr w:type="spellEnd"/>
+      <w:r>
+        <w:rPr>
+          <w:rFonts w:ascii="Times New Roman" w:hAnsi="Times New Roman" w:cs="Times New Roman"/>
+          <w:b/>
+          <w:bCs/>
+          <w:szCs w:val="24"/>
+        </w:rPr>
+        <w:t xml:space="preserve"> Data (n)</w:t>
+      </w:r>
+      <w:r>
+        <w:rPr>
+          <w:rFonts w:ascii="Times New Roman" w:hAnsi="Times New Roman" w:cs="Times New Roman"/>
+          <w:szCs w:val="24"/>
+        </w:rPr>
+        <w:t>: 5</w:t>
+      </w:r>
+    </w:p>
+    <w:p>
+      <w:pPr>
+        <w:numPr>
+          <w:ilvl w:val="0"/>
+          <w:numId w:val="8"/>
+        </w:numPr>
+        <w:spacing w:line="360" w:lineRule="auto"/>
+        <w:jc w:val="both"/>
+        <w:rPr>
+          <w:rFonts w:ascii="Times New Roman" w:hAnsi="Times New Roman" w:cs="Times New Roman"/>
+          <w:szCs w:val="24"/>
+        </w:rPr>
+      </w:pPr>
+      <w:r>
+        <w:rPr>
+          <w:rFonts w:ascii="Times New Roman" w:hAnsi="Times New Roman" w:cs="Times New Roman"/>
+          <w:b/>
+          <w:bCs/>
+          <w:szCs w:val="24"/>
+        </w:rPr>
+        <w:t>Input Data</w:t>
+      </w:r>
+      <w:r>
+        <w:rPr>
+          <w:rFonts w:ascii="Times New Roman" w:hAnsi="Times New Roman" w:cs="Times New Roman"/>
+          <w:szCs w:val="24"/>
+        </w:rPr>
+        <w:t>: 23, 12, 8</w:t>
+      </w:r>
+      <w:r>
+        <w:rPr>
+          <w:rFonts w:ascii="Times New Roman" w:hAnsi="Times New Roman" w:cs="Times New Roman"/>
+          <w:szCs w:val="24"/>
+        </w:rPr>
+        <w:t>5</w:t>
+      </w:r>
+      <w:r>
+        <w:rPr>
+          <w:rFonts w:ascii="Times New Roman" w:hAnsi="Times New Roman" w:cs="Times New Roman"/>
+          <w:szCs w:val="24"/>
+        </w:rPr>
+        <w:t>, 5, 10</w:t>
+      </w:r>
+    </w:p>
+    <w:p>
+      <w:pPr>
+        <w:numPr>
+          <w:ilvl w:val="0"/>
+          <w:numId w:val="8"/>
+        </w:numPr>
+        <w:spacing w:line="360" w:lineRule="auto"/>
+        <w:jc w:val="both"/>
+        <w:rPr>
+          <w:rFonts w:ascii="Times New Roman" w:hAnsi="Times New Roman" w:cs="Times New Roman"/>
+          <w:szCs w:val="24"/>
+        </w:rPr>
+      </w:pPr>
+      <w:r>
+        <w:rPr>
+          <w:rFonts w:ascii="Times New Roman" w:hAnsi="Times New Roman" w:cs="Times New Roman"/>
+          <w:b/>
+          <w:bCs/>
+          <w:szCs w:val="24"/>
+        </w:rPr>
+        <w:t xml:space="preserve">Hasil yang </w:t>
+      </w:r>
+      <w:proofErr w:type="spellStart"/>
+      <w:r>
+        <w:rPr>
+          <w:rFonts w:ascii="Times New Roman" w:hAnsi="Times New Roman" w:cs="Times New Roman"/>
+          <w:b/>
+          <w:bCs/>
+          <w:szCs w:val="24"/>
+        </w:rPr>
+        <w:t>Diharapkan</w:t>
+      </w:r>
+      <w:proofErr w:type="spellEnd"/>
+      <w:r>
+        <w:rPr>
+          <w:rFonts w:ascii="Times New Roman" w:hAnsi="Times New Roman" w:cs="Times New Roman"/>
+          <w:szCs w:val="24"/>
+        </w:rPr>
+        <w:t xml:space="preserve">: Data </w:t>
+      </w:r>
+      <w:proofErr w:type="spellStart"/>
+      <w:r>
+        <w:rPr>
+          <w:rFonts w:ascii="Times New Roman" w:hAnsi="Times New Roman" w:cs="Times New Roman"/>
+          <w:szCs w:val="24"/>
+        </w:rPr>
+        <w:t>terurut</w:t>
+      </w:r>
+      <w:proofErr w:type="spellEnd"/>
+      <w:r>
+        <w:rPr>
+          <w:rFonts w:ascii="Times New Roman" w:hAnsi="Times New Roman" w:cs="Times New Roman"/>
+          <w:szCs w:val="24"/>
+        </w:rPr>
+        <w:t xml:space="preserve"> </w:t>
+      </w:r>
+      <w:proofErr w:type="spellStart"/>
+      <w:r>
+        <w:rPr>
+          <w:rFonts w:ascii="Times New Roman" w:hAnsi="Times New Roman" w:cs="Times New Roman"/>
+          <w:szCs w:val="24"/>
+        </w:rPr>
+        <w:t>secara</w:t>
+      </w:r>
+      <w:proofErr w:type="spellEnd"/>
+      <w:r>
+        <w:rPr>
+          <w:rFonts w:ascii="Times New Roman" w:hAnsi="Times New Roman" w:cs="Times New Roman"/>
+          <w:szCs w:val="24"/>
+        </w:rPr>
+        <w:t xml:space="preserve"> </w:t>
+      </w:r>
+      <w:r>
+        <w:rPr>
+          <w:rFonts w:ascii="Times New Roman" w:hAnsi="Times New Roman" w:cs="Times New Roman"/>
+          <w:i/>
+          <w:iCs/>
+          <w:szCs w:val="24"/>
+        </w:rPr>
+        <w:t>ascending</w:t>
+      </w:r>
+      <w:r>
+        <w:rPr>
+          <w:rFonts w:ascii="Times New Roman" w:hAnsi="Times New Roman" w:cs="Times New Roman"/>
+          <w:szCs w:val="24"/>
+        </w:rPr>
+        <w:t xml:space="preserve"> (5, 10, 12, 23, 8</w:t>
+      </w:r>
+      <w:r>
+        <w:rPr>
+          <w:rFonts w:ascii="Times New Roman" w:hAnsi="Times New Roman" w:cs="Times New Roman"/>
+          <w:szCs w:val="24"/>
+        </w:rPr>
+        <w:t>5</w:t>
+      </w:r>
+      <w:r>
+        <w:rPr>
+          <w:rFonts w:ascii="Times New Roman" w:hAnsi="Times New Roman" w:cs="Times New Roman"/>
+          <w:szCs w:val="24"/>
+        </w:rPr>
+        <w:t>).</w:t>
+      </w:r>
+    </w:p>
+    <w:p>
+      <w:pPr>
+        <w:spacing w:line="360" w:lineRule="auto"/>
+        <w:jc w:val="both"/>
+        <w:rPr>
+          <w:rFonts w:ascii="Times New Roman" w:hAnsi="Times New Roman" w:cs="Times New Roman"/>
+          <w:szCs w:val="24"/>
+        </w:rPr>
+      </w:pPr>
+      <w:r>
+        <w:rPr>
+          <w:rFonts w:ascii="Times New Roman" w:hAnsi="Times New Roman" w:cs="Times New Roman"/>
+          <w:szCs w:val="24"/>
+        </w:rPr>
+        <w:drawing>
+          <wp:inline distT="0" distB="0" distL="0" distR="0" wp14:anchorId="2F44D6A1" wp14:editId="5DF1A435">
+            <wp:extent cx="5565775" cy="2291787"/>
+            <wp:effectExtent l="0" t="0" r="0" b="0"/>
+            <wp:docPr id="1550348964" name="Picture 1"/>
+            <wp:cNvGraphicFramePr>
+              <a:graphicFrameLocks xmlns:a="http://schemas.openxmlformats.org/drawingml/2006/main" noChangeAspect="1"/>
+            </wp:cNvGraphicFramePr>
+            <a:graphic xmlns:a="http://schemas.openxmlformats.org/drawingml/2006/main">
+              <a:graphicData uri="http://schemas.openxmlformats.org/drawingml/2006/picture">
+                <pic:pic xmlns:pic="http://schemas.openxmlformats.org/drawingml/2006/picture">
+                  <pic:nvPicPr>
+                    <pic:cNvPr id="1550348964" name=""/>
+                    <pic:cNvPicPr/>
+                  </pic:nvPicPr>
+                  <pic:blipFill>
+                    <a:blip r:embed="rId9"/>
+                    <a:stretch>
+                      <a:fillRect/>
+                    </a:stretch>
+                  </pic:blipFill>
+                  <pic:spPr>
+                    <a:xfrm>
+                      <a:off x="0" y="0"/>
+                      <a:ext cx="5574173" cy="2295245"/>
+                    </a:xfrm>
+                    <a:prstGeom prst="rect">
+                      <a:avLst/>
+                    </a:prstGeom>
+                  </pic:spPr>
+                </pic:pic>
+              </a:graphicData>
+            </a:graphic>
+          </wp:inline>
+        </w:drawing>
+      </w:r>
+    </w:p>
+    <w:p>
+      <w:pPr>
+        <w:spacing w:line="360" w:lineRule="auto"/>
+        <w:jc w:val="both"/>
+        <w:rPr>
+          <w:rFonts w:ascii="Times New Roman" w:hAnsi="Times New Roman" w:cs="Times New Roman"/>
+          <w:szCs w:val="24"/>
+        </w:rPr>
+      </w:pPr>
+      <w:proofErr w:type="spellStart"/>
+      <w:r>
+        <w:rPr>
+          <w:rFonts w:ascii="Times New Roman" w:hAnsi="Times New Roman" w:cs="Times New Roman"/>
+          <w:b/>
+          <w:bCs/>
+          <w:szCs w:val="24"/>
+        </w:rPr>
+        <w:t>Analisis</w:t>
+      </w:r>
+      <w:proofErr w:type="spellEnd"/>
+      <w:r>
+        <w:rPr>
+          <w:rFonts w:ascii="Times New Roman" w:hAnsi="Times New Roman" w:cs="Times New Roman"/>
+          <w:b/>
+          <w:bCs/>
+          <w:szCs w:val="24"/>
+        </w:rPr>
+        <w:t xml:space="preserve"> Hasil:</w:t>
+      </w:r>
+      <w:r>
+        <w:rPr>
+          <w:rFonts w:ascii="Times New Roman" w:hAnsi="Times New Roman" w:cs="Times New Roman"/>
+          <w:szCs w:val="24"/>
+        </w:rPr>
+        <w:t xml:space="preserve"> </w:t>
+      </w:r>
+      <w:proofErr w:type="spellStart"/>
+      <w:r>
+        <w:rPr>
+          <w:rFonts w:ascii="Times New Roman" w:hAnsi="Times New Roman" w:cs="Times New Roman"/>
+          <w:szCs w:val="24"/>
+        </w:rPr>
+        <w:t>Berdasarkan</w:t>
+      </w:r>
+      <w:proofErr w:type="spellEnd"/>
+      <w:r>
+        <w:rPr>
+          <w:rFonts w:ascii="Times New Roman" w:hAnsi="Times New Roman" w:cs="Times New Roman"/>
+          <w:szCs w:val="24"/>
+        </w:rPr>
+        <w:t xml:space="preserve"> </w:t>
+      </w:r>
+      <w:proofErr w:type="spellStart"/>
+      <w:r>
+        <w:rPr>
+          <w:rFonts w:ascii="Times New Roman" w:hAnsi="Times New Roman" w:cs="Times New Roman"/>
+          <w:szCs w:val="24"/>
+        </w:rPr>
+        <w:t>hasil</w:t>
+      </w:r>
+      <w:proofErr w:type="spellEnd"/>
+      <w:r>
+        <w:rPr>
+          <w:rFonts w:ascii="Times New Roman" w:hAnsi="Times New Roman" w:cs="Times New Roman"/>
+          <w:szCs w:val="24"/>
+        </w:rPr>
+        <w:t xml:space="preserve"> </w:t>
+      </w:r>
+      <w:proofErr w:type="spellStart"/>
+      <w:r>
+        <w:rPr>
+          <w:rFonts w:ascii="Times New Roman" w:hAnsi="Times New Roman" w:cs="Times New Roman"/>
+          <w:szCs w:val="24"/>
+        </w:rPr>
+        <w:t>pengujian</w:t>
+      </w:r>
+      <w:proofErr w:type="spellEnd"/>
+      <w:r>
+        <w:rPr>
+          <w:rFonts w:ascii="Times New Roman" w:hAnsi="Times New Roman" w:cs="Times New Roman"/>
+          <w:szCs w:val="24"/>
+        </w:rPr>
+        <w:t xml:space="preserve"> di </w:t>
+      </w:r>
+      <w:proofErr w:type="spellStart"/>
+      <w:r>
+        <w:rPr>
+          <w:rFonts w:ascii="Times New Roman" w:hAnsi="Times New Roman" w:cs="Times New Roman"/>
+          <w:szCs w:val="24"/>
+        </w:rPr>
+        <w:t>atas</w:t>
+      </w:r>
+      <w:proofErr w:type="spellEnd"/>
+      <w:r>
+        <w:rPr>
+          <w:rFonts w:ascii="Times New Roman" w:hAnsi="Times New Roman" w:cs="Times New Roman"/>
+          <w:szCs w:val="24"/>
+        </w:rPr>
+        <w:t xml:space="preserve">, program </w:t>
+      </w:r>
+      <w:proofErr w:type="spellStart"/>
+      <w:r>
+        <w:rPr>
+          <w:rFonts w:ascii="Times New Roman" w:hAnsi="Times New Roman" w:cs="Times New Roman"/>
+          <w:szCs w:val="24"/>
+        </w:rPr>
+        <w:t>berhasil</w:t>
+      </w:r>
+      <w:proofErr w:type="spellEnd"/>
+      <w:r>
+        <w:rPr>
+          <w:rFonts w:ascii="Times New Roman" w:hAnsi="Times New Roman" w:cs="Times New Roman"/>
+          <w:szCs w:val="24"/>
+        </w:rPr>
+        <w:t xml:space="preserve"> </w:t>
+      </w:r>
+      <w:proofErr w:type="spellStart"/>
+      <w:r>
+        <w:rPr>
+          <w:rFonts w:ascii="Times New Roman" w:hAnsi="Times New Roman" w:cs="Times New Roman"/>
+          <w:szCs w:val="24"/>
+        </w:rPr>
+        <w:t>mengurutkan</w:t>
+      </w:r>
+      <w:proofErr w:type="spellEnd"/>
+      <w:r>
+        <w:rPr>
+          <w:rFonts w:ascii="Times New Roman" w:hAnsi="Times New Roman" w:cs="Times New Roman"/>
+          <w:szCs w:val="24"/>
+        </w:rPr>
+        <w:t xml:space="preserve"> data </w:t>
+      </w:r>
+      <w:proofErr w:type="spellStart"/>
+      <w:r>
+        <w:rPr>
+          <w:rFonts w:ascii="Times New Roman" w:hAnsi="Times New Roman" w:cs="Times New Roman"/>
+          <w:szCs w:val="24"/>
+        </w:rPr>
+        <w:t>masukan</w:t>
+      </w:r>
+      <w:proofErr w:type="spellEnd"/>
+      <w:r>
+        <w:rPr>
+          <w:rFonts w:ascii="Times New Roman" w:hAnsi="Times New Roman" w:cs="Times New Roman"/>
+          <w:szCs w:val="24"/>
+        </w:rPr>
+        <w:t xml:space="preserve"> </w:t>
+      </w:r>
+      <w:proofErr w:type="spellStart"/>
+      <w:r>
+        <w:rPr>
+          <w:rFonts w:ascii="Times New Roman" w:hAnsi="Times New Roman" w:cs="Times New Roman"/>
+          <w:szCs w:val="24"/>
+        </w:rPr>
+        <w:t>dengan</w:t>
+      </w:r>
+      <w:proofErr w:type="spellEnd"/>
+      <w:r>
+        <w:rPr>
+          <w:rFonts w:ascii="Times New Roman" w:hAnsi="Times New Roman" w:cs="Times New Roman"/>
+          <w:szCs w:val="24"/>
+        </w:rPr>
+        <w:t xml:space="preserve"> </w:t>
+      </w:r>
+      <w:proofErr w:type="spellStart"/>
+      <w:r>
+        <w:rPr>
+          <w:rFonts w:ascii="Times New Roman" w:hAnsi="Times New Roman" w:cs="Times New Roman"/>
+          <w:szCs w:val="24"/>
+        </w:rPr>
+        <w:t>benar</w:t>
+      </w:r>
+      <w:proofErr w:type="spellEnd"/>
+      <w:r>
+        <w:rPr>
+          <w:rFonts w:ascii="Times New Roman" w:hAnsi="Times New Roman" w:cs="Times New Roman"/>
+          <w:szCs w:val="24"/>
+        </w:rPr>
+        <w:t xml:space="preserve"> </w:t>
+      </w:r>
+      <w:proofErr w:type="spellStart"/>
+      <w:r>
+        <w:rPr>
+          <w:rFonts w:ascii="Times New Roman" w:hAnsi="Times New Roman" w:cs="Times New Roman"/>
+          <w:szCs w:val="24"/>
+        </w:rPr>
+        <w:t>sesuai</w:t>
+      </w:r>
+      <w:proofErr w:type="spellEnd"/>
+      <w:r>
+        <w:rPr>
+          <w:rFonts w:ascii="Times New Roman" w:hAnsi="Times New Roman" w:cs="Times New Roman"/>
+          <w:szCs w:val="24"/>
+        </w:rPr>
+        <w:t xml:space="preserve"> </w:t>
+      </w:r>
+      <w:proofErr w:type="spellStart"/>
+      <w:r>
+        <w:rPr>
+          <w:rFonts w:ascii="Times New Roman" w:hAnsi="Times New Roman" w:cs="Times New Roman"/>
+          <w:szCs w:val="24"/>
+        </w:rPr>
+        <w:t>dengan</w:t>
+      </w:r>
+      <w:proofErr w:type="spellEnd"/>
+      <w:r>
+        <w:rPr>
+          <w:rFonts w:ascii="Times New Roman" w:hAnsi="Times New Roman" w:cs="Times New Roman"/>
+          <w:szCs w:val="24"/>
+        </w:rPr>
+        <w:t xml:space="preserve"> </w:t>
+      </w:r>
+      <w:proofErr w:type="spellStart"/>
+      <w:r>
+        <w:rPr>
+          <w:rFonts w:ascii="Times New Roman" w:hAnsi="Times New Roman" w:cs="Times New Roman"/>
+          <w:szCs w:val="24"/>
+        </w:rPr>
+        <w:t>logika</w:t>
+      </w:r>
+      <w:proofErr w:type="spellEnd"/>
+      <w:r>
+        <w:rPr>
+          <w:rFonts w:ascii="Times New Roman" w:hAnsi="Times New Roman" w:cs="Times New Roman"/>
+          <w:szCs w:val="24"/>
+        </w:rPr>
+        <w:t xml:space="preserve"> </w:t>
+      </w:r>
+      <w:r>
+        <w:rPr>
+          <w:rFonts w:ascii="Times New Roman" w:hAnsi="Times New Roman" w:cs="Times New Roman"/>
+          <w:i/>
+          <w:iCs/>
+          <w:szCs w:val="24"/>
+        </w:rPr>
+        <w:t>Quick Sort</w:t>
+      </w:r>
+      <w:r>
+        <w:rPr>
+          <w:rFonts w:ascii="Times New Roman" w:hAnsi="Times New Roman" w:cs="Times New Roman"/>
+          <w:szCs w:val="24"/>
+        </w:rPr>
+        <w:t xml:space="preserve">. </w:t>
+      </w:r>
+      <w:proofErr w:type="spellStart"/>
+      <w:r>
+        <w:rPr>
+          <w:rFonts w:ascii="Times New Roman" w:hAnsi="Times New Roman" w:cs="Times New Roman"/>
+          <w:szCs w:val="24"/>
+        </w:rPr>
+        <w:t>Indeks</w:t>
+      </w:r>
+      <w:proofErr w:type="spellEnd"/>
+      <w:r>
+        <w:rPr>
+          <w:rFonts w:ascii="Times New Roman" w:hAnsi="Times New Roman" w:cs="Times New Roman"/>
+          <w:szCs w:val="24"/>
+        </w:rPr>
+        <w:t xml:space="preserve"> array </w:t>
+      </w:r>
+      <w:proofErr w:type="spellStart"/>
+      <w:r>
+        <w:rPr>
+          <w:rFonts w:ascii="Times New Roman" w:hAnsi="Times New Roman" w:cs="Times New Roman"/>
+          <w:szCs w:val="24"/>
+        </w:rPr>
+        <w:t>dimulai</w:t>
+      </w:r>
+      <w:proofErr w:type="spellEnd"/>
+      <w:r>
+        <w:rPr>
+          <w:rFonts w:ascii="Times New Roman" w:hAnsi="Times New Roman" w:cs="Times New Roman"/>
+          <w:szCs w:val="24"/>
+        </w:rPr>
+        <w:t xml:space="preserve"> </w:t>
+      </w:r>
+      <w:proofErr w:type="spellStart"/>
+      <w:r>
+        <w:rPr>
+          <w:rFonts w:ascii="Times New Roman" w:hAnsi="Times New Roman" w:cs="Times New Roman"/>
+          <w:szCs w:val="24"/>
+        </w:rPr>
+        <w:t>dari</w:t>
+      </w:r>
+      <w:proofErr w:type="spellEnd"/>
+      <w:r>
+        <w:rPr>
+          <w:rFonts w:ascii="Times New Roman" w:hAnsi="Times New Roman" w:cs="Times New Roman"/>
+          <w:szCs w:val="24"/>
+        </w:rPr>
+        <w:t xml:space="preserve"> 1 </w:t>
+      </w:r>
+      <w:proofErr w:type="spellStart"/>
+      <w:r>
+        <w:rPr>
+          <w:rFonts w:ascii="Times New Roman" w:hAnsi="Times New Roman" w:cs="Times New Roman"/>
+          <w:szCs w:val="24"/>
+        </w:rPr>
+        <w:t>sebagaimana</w:t>
+      </w:r>
+      <w:proofErr w:type="spellEnd"/>
+      <w:r>
+        <w:rPr>
+          <w:rFonts w:ascii="Times New Roman" w:hAnsi="Times New Roman" w:cs="Times New Roman"/>
+          <w:szCs w:val="24"/>
+        </w:rPr>
+        <w:t xml:space="preserve"> </w:t>
+      </w:r>
+      <w:proofErr w:type="spellStart"/>
+      <w:r>
+        <w:rPr>
+          <w:rFonts w:ascii="Times New Roman" w:hAnsi="Times New Roman" w:cs="Times New Roman"/>
+          <w:szCs w:val="24"/>
+        </w:rPr>
+        <w:t>ditetapkan</w:t>
+      </w:r>
+      <w:proofErr w:type="spellEnd"/>
+      <w:r>
+        <w:rPr>
+          <w:rFonts w:ascii="Times New Roman" w:hAnsi="Times New Roman" w:cs="Times New Roman"/>
+          <w:szCs w:val="24"/>
+        </w:rPr>
+        <w:t xml:space="preserve"> </w:t>
+      </w:r>
+      <w:proofErr w:type="spellStart"/>
+      <w:r>
+        <w:rPr>
+          <w:rFonts w:ascii="Times New Roman" w:hAnsi="Times New Roman" w:cs="Times New Roman"/>
+          <w:szCs w:val="24"/>
+        </w:rPr>
+        <w:t>dalam</w:t>
+      </w:r>
+      <w:proofErr w:type="spellEnd"/>
+      <w:r>
+        <w:rPr>
+          <w:rFonts w:ascii="Times New Roman" w:hAnsi="Times New Roman" w:cs="Times New Roman"/>
+          <w:szCs w:val="24"/>
+        </w:rPr>
+        <w:t xml:space="preserve"> </w:t>
+      </w:r>
+      <w:proofErr w:type="spellStart"/>
+      <w:r>
+        <w:rPr>
+          <w:rFonts w:ascii="Times New Roman" w:hAnsi="Times New Roman" w:cs="Times New Roman"/>
+          <w:szCs w:val="24"/>
+        </w:rPr>
+        <w:t>spesifikasi</w:t>
+      </w:r>
+      <w:proofErr w:type="spellEnd"/>
+      <w:r>
+        <w:rPr>
+          <w:rFonts w:ascii="Times New Roman" w:hAnsi="Times New Roman" w:cs="Times New Roman"/>
+          <w:szCs w:val="24"/>
+        </w:rPr>
+        <w:t xml:space="preserve">, dan </w:t>
+      </w:r>
+      <w:proofErr w:type="spellStart"/>
+      <w:r>
+        <w:rPr>
+          <w:rFonts w:ascii="Times New Roman" w:hAnsi="Times New Roman" w:cs="Times New Roman"/>
+          <w:szCs w:val="24"/>
+        </w:rPr>
+        <w:t>fungsi</w:t>
+      </w:r>
+      <w:proofErr w:type="spellEnd"/>
+      <w:r>
+        <w:rPr>
+          <w:rFonts w:ascii="Times New Roman" w:hAnsi="Times New Roman" w:cs="Times New Roman"/>
+          <w:szCs w:val="24"/>
+        </w:rPr>
+        <w:t xml:space="preserve"> </w:t>
+      </w:r>
+      <w:proofErr w:type="spellStart"/>
+      <w:r>
+        <w:rPr>
+          <w:rFonts w:ascii="Times New Roman" w:hAnsi="Times New Roman" w:cs="Times New Roman"/>
+          <w:szCs w:val="24"/>
+        </w:rPr>
+        <w:t>tampilkan_larik</w:t>
+      </w:r>
+      <w:proofErr w:type="spellEnd"/>
+      <w:r>
+        <w:rPr>
+          <w:rFonts w:ascii="Times New Roman" w:hAnsi="Times New Roman" w:cs="Times New Roman"/>
+          <w:szCs w:val="24"/>
+        </w:rPr>
+        <w:t xml:space="preserve"> </w:t>
+      </w:r>
+      <w:proofErr w:type="spellStart"/>
+      <w:r>
+        <w:rPr>
+          <w:rFonts w:ascii="Times New Roman" w:hAnsi="Times New Roman" w:cs="Times New Roman"/>
+          <w:szCs w:val="24"/>
+        </w:rPr>
+        <w:t>berhasil</w:t>
+      </w:r>
+      <w:proofErr w:type="spellEnd"/>
+      <w:r>
+        <w:rPr>
+          <w:rFonts w:ascii="Times New Roman" w:hAnsi="Times New Roman" w:cs="Times New Roman"/>
+          <w:szCs w:val="24"/>
+        </w:rPr>
+        <w:t xml:space="preserve"> </w:t>
+      </w:r>
+      <w:proofErr w:type="spellStart"/>
+      <w:r>
+        <w:rPr>
+          <w:rFonts w:ascii="Times New Roman" w:hAnsi="Times New Roman" w:cs="Times New Roman"/>
+          <w:szCs w:val="24"/>
+        </w:rPr>
+        <w:t>menampilkan</w:t>
+      </w:r>
+      <w:proofErr w:type="spellEnd"/>
+      <w:r>
+        <w:rPr>
+          <w:rFonts w:ascii="Times New Roman" w:hAnsi="Times New Roman" w:cs="Times New Roman"/>
+          <w:szCs w:val="24"/>
+        </w:rPr>
+        <w:t xml:space="preserve"> </w:t>
+      </w:r>
+      <w:proofErr w:type="spellStart"/>
+      <w:r>
+        <w:rPr>
+          <w:rFonts w:ascii="Times New Roman" w:hAnsi="Times New Roman" w:cs="Times New Roman"/>
+          <w:szCs w:val="24"/>
+        </w:rPr>
+        <w:t>urutan</w:t>
+      </w:r>
+      <w:proofErr w:type="spellEnd"/>
+      <w:r>
+        <w:rPr>
+          <w:rFonts w:ascii="Times New Roman" w:hAnsi="Times New Roman" w:cs="Times New Roman"/>
+          <w:szCs w:val="24"/>
+        </w:rPr>
+        <w:t xml:space="preserve"> data yang </w:t>
+      </w:r>
+      <w:proofErr w:type="spellStart"/>
+      <w:r>
+        <w:rPr>
+          <w:rFonts w:ascii="Times New Roman" w:hAnsi="Times New Roman" w:cs="Times New Roman"/>
+          <w:szCs w:val="24"/>
+        </w:rPr>
+        <w:t>telah</w:t>
+      </w:r>
+      <w:proofErr w:type="spellEnd"/>
+      <w:r>
+        <w:rPr>
+          <w:rFonts w:ascii="Times New Roman" w:hAnsi="Times New Roman" w:cs="Times New Roman"/>
+          <w:szCs w:val="24"/>
+        </w:rPr>
+        <w:t xml:space="preserve"> </w:t>
+      </w:r>
+      <w:proofErr w:type="spellStart"/>
+      <w:r>
+        <w:rPr>
+          <w:rFonts w:ascii="Times New Roman" w:hAnsi="Times New Roman" w:cs="Times New Roman"/>
+          <w:szCs w:val="24"/>
+        </w:rPr>
+        <w:t>terorganisir</w:t>
+      </w:r>
+      <w:proofErr w:type="spellEnd"/>
+      <w:r>
+        <w:rPr>
+          <w:rFonts w:ascii="Times New Roman" w:hAnsi="Times New Roman" w:cs="Times New Roman"/>
+          <w:szCs w:val="24"/>
+        </w:rPr>
+        <w:t xml:space="preserve"> </w:t>
+      </w:r>
+      <w:proofErr w:type="spellStart"/>
+      <w:r>
+        <w:rPr>
+          <w:rFonts w:ascii="Times New Roman" w:hAnsi="Times New Roman" w:cs="Times New Roman"/>
+          <w:szCs w:val="24"/>
+        </w:rPr>
+        <w:t>dengan</w:t>
+      </w:r>
+      <w:proofErr w:type="spellEnd"/>
+      <w:r>
+        <w:rPr>
+          <w:rFonts w:ascii="Times New Roman" w:hAnsi="Times New Roman" w:cs="Times New Roman"/>
+          <w:szCs w:val="24"/>
+        </w:rPr>
+        <w:t xml:space="preserve"> </w:t>
+      </w:r>
+      <w:proofErr w:type="spellStart"/>
+      <w:r>
+        <w:rPr>
+          <w:rFonts w:ascii="Times New Roman" w:hAnsi="Times New Roman" w:cs="Times New Roman"/>
+          <w:szCs w:val="24"/>
+        </w:rPr>
+        <w:t>baik</w:t>
+      </w:r>
+      <w:proofErr w:type="spellEnd"/>
+      <w:r>
+        <w:rPr>
+          <w:rFonts w:ascii="Times New Roman" w:hAnsi="Times New Roman" w:cs="Times New Roman"/>
+          <w:szCs w:val="24"/>
+        </w:rPr>
+        <w:t xml:space="preserve"> </w:t>
+      </w:r>
+      <w:proofErr w:type="spellStart"/>
+      <w:r>
+        <w:rPr>
+          <w:rFonts w:ascii="Times New Roman" w:hAnsi="Times New Roman" w:cs="Times New Roman"/>
+          <w:szCs w:val="24"/>
+        </w:rPr>
+        <w:t>dari</w:t>
+      </w:r>
+      <w:proofErr w:type="spellEnd"/>
+      <w:r>
+        <w:rPr>
+          <w:rFonts w:ascii="Times New Roman" w:hAnsi="Times New Roman" w:cs="Times New Roman"/>
+          <w:szCs w:val="24"/>
+        </w:rPr>
+        <w:t xml:space="preserve"> </w:t>
+      </w:r>
+      <w:proofErr w:type="spellStart"/>
+      <w:r>
+        <w:rPr>
+          <w:rFonts w:ascii="Times New Roman" w:hAnsi="Times New Roman" w:cs="Times New Roman"/>
+          <w:szCs w:val="24"/>
+        </w:rPr>
+        <w:t>nilai</w:t>
+      </w:r>
+      <w:proofErr w:type="spellEnd"/>
+      <w:r>
+        <w:rPr>
+          <w:rFonts w:ascii="Times New Roman" w:hAnsi="Times New Roman" w:cs="Times New Roman"/>
+          <w:szCs w:val="24"/>
+        </w:rPr>
+        <w:t xml:space="preserve"> </w:t>
+      </w:r>
+      <w:proofErr w:type="spellStart"/>
+      <w:r>
+        <w:rPr>
+          <w:rFonts w:ascii="Times New Roman" w:hAnsi="Times New Roman" w:cs="Times New Roman"/>
+          <w:szCs w:val="24"/>
+        </w:rPr>
+        <w:t>terkecil</w:t>
+      </w:r>
+      <w:proofErr w:type="spellEnd"/>
+      <w:r>
+        <w:rPr>
+          <w:rFonts w:ascii="Times New Roman" w:hAnsi="Times New Roman" w:cs="Times New Roman"/>
+          <w:szCs w:val="24"/>
+        </w:rPr>
+        <w:t xml:space="preserve"> </w:t>
+      </w:r>
+      <w:proofErr w:type="spellStart"/>
+      <w:r>
+        <w:rPr>
+          <w:rFonts w:ascii="Times New Roman" w:hAnsi="Times New Roman" w:cs="Times New Roman"/>
+          <w:szCs w:val="24"/>
+        </w:rPr>
+        <w:t>ke</w:t>
+      </w:r>
+      <w:proofErr w:type="spellEnd"/>
+      <w:r>
+        <w:rPr>
+          <w:rFonts w:ascii="Times New Roman" w:hAnsi="Times New Roman" w:cs="Times New Roman"/>
+          <w:szCs w:val="24"/>
+        </w:rPr>
+        <w:t xml:space="preserve"> </w:t>
+      </w:r>
+      <w:proofErr w:type="spellStart"/>
+      <w:r>
+        <w:rPr>
+          <w:rFonts w:ascii="Times New Roman" w:hAnsi="Times New Roman" w:cs="Times New Roman"/>
+          <w:szCs w:val="24"/>
+        </w:rPr>
+        <w:t>nilai</w:t>
+      </w:r>
+      <w:proofErr w:type="spellEnd"/>
+      <w:r>
+        <w:rPr>
+          <w:rFonts w:ascii="Times New Roman" w:hAnsi="Times New Roman" w:cs="Times New Roman"/>
+          <w:szCs w:val="24"/>
+        </w:rPr>
+        <w:t xml:space="preserve"> </w:t>
+      </w:r>
+      <w:proofErr w:type="spellStart"/>
+      <w:r>
+        <w:rPr>
+          <w:rFonts w:ascii="Times New Roman" w:hAnsi="Times New Roman" w:cs="Times New Roman"/>
+          <w:szCs w:val="24"/>
+        </w:rPr>
+        <w:t>terbesar</w:t>
+      </w:r>
+      <w:proofErr w:type="spellEnd"/>
+      <w:r>
+        <w:rPr>
+          <w:rFonts w:ascii="Times New Roman" w:hAnsi="Times New Roman" w:cs="Times New Roman"/>
+          <w:szCs w:val="24"/>
+        </w:rPr>
+        <w:t>.</w:t>
+      </w:r>
     </w:p>
     <w:p>
       <w:pPr>
@@ -15648,6 +16746,152 @@
       </w:rPr>
     </w:lvl>
   </w:abstractNum>
+  <w:abstractNum w:abstractNumId="7" w15:restartNumberingAfterBreak="0">
+    <w:nsid w:val="74EB2174"/>
+    <w:multiLevelType w:val="multilevel"/>
+    <w:tmpl w:val="7AE4F580"/>
+    <w:lvl w:ilvl="0">
+      <w:start w:val="1"/>
+      <w:numFmt w:val="decimal"/>
+      <w:lvlText w:val="%1."/>
+      <w:lvlJc w:val="left"/>
+      <w:pPr>
+        <w:tabs>
+          <w:tab w:val="num" w:pos="720"/>
+        </w:tabs>
+        <w:ind w:left="720" w:hanging="360"/>
+      </w:pPr>
+      <w:rPr>
+        <w:rFonts w:hint="default"/>
+        <w:sz w:val="20"/>
+      </w:rPr>
+    </w:lvl>
+    <w:lvl w:ilvl="1">
+      <w:start w:val="1"/>
+      <w:numFmt w:val="lowerLetter"/>
+      <w:lvlText w:val="%2."/>
+      <w:lvlJc w:val="left"/>
+      <w:pPr>
+        <w:ind w:left="1440" w:hanging="360"/>
+      </w:pPr>
+      <w:rPr>
+        <w:rFonts w:hint="default"/>
+        <w:sz w:val="20"/>
+      </w:rPr>
+    </w:lvl>
+    <w:lvl w:ilvl="2" w:tentative="1">
+      <w:start w:val="1"/>
+      <w:numFmt w:val="bullet"/>
+      <w:lvlText w:val=""/>
+      <w:lvlJc w:val="left"/>
+      <w:pPr>
+        <w:tabs>
+          <w:tab w:val="num" w:pos="2160"/>
+        </w:tabs>
+        <w:ind w:left="2160" w:hanging="360"/>
+      </w:pPr>
+      <w:rPr>
+        <w:rFonts w:ascii="Wingdings" w:hAnsi="Wingdings" w:hint="default"/>
+        <w:sz w:val="20"/>
+      </w:rPr>
+    </w:lvl>
+    <w:lvl w:ilvl="3" w:tentative="1">
+      <w:start w:val="1"/>
+      <w:numFmt w:val="bullet"/>
+      <w:lvlText w:val=""/>
+      <w:lvlJc w:val="left"/>
+      <w:pPr>
+        <w:tabs>
+          <w:tab w:val="num" w:pos="2880"/>
+        </w:tabs>
+        <w:ind w:left="2880" w:hanging="360"/>
+      </w:pPr>
+      <w:rPr>
+        <w:rFonts w:ascii="Wingdings" w:hAnsi="Wingdings" w:hint="default"/>
+        <w:sz w:val="20"/>
+      </w:rPr>
+    </w:lvl>
+    <w:lvl w:ilvl="4" w:tentative="1">
+      <w:start w:val="1"/>
+      <w:numFmt w:val="bullet"/>
+      <w:lvlText w:val=""/>
+      <w:lvlJc w:val="left"/>
+      <w:pPr>
+        <w:tabs>
+          <w:tab w:val="num" w:pos="3600"/>
+        </w:tabs>
+        <w:ind w:left="3600" w:hanging="360"/>
+      </w:pPr>
+      <w:rPr>
+        <w:rFonts w:ascii="Wingdings" w:hAnsi="Wingdings" w:hint="default"/>
+        <w:sz w:val="20"/>
+      </w:rPr>
+    </w:lvl>
+    <w:lvl w:ilvl="5" w:tentative="1">
+      <w:start w:val="1"/>
+      <w:numFmt w:val="bullet"/>
+      <w:lvlText w:val=""/>
+      <w:lvlJc w:val="left"/>
+      <w:pPr>
+        <w:tabs>
+          <w:tab w:val="num" w:pos="4320"/>
+        </w:tabs>
+        <w:ind w:left="4320" w:hanging="360"/>
+      </w:pPr>
+      <w:rPr>
+        <w:rFonts w:ascii="Wingdings" w:hAnsi="Wingdings" w:hint="default"/>
+        <w:sz w:val="20"/>
+      </w:rPr>
+    </w:lvl>
+    <w:lvl w:ilvl="6" w:tentative="1">
+      <w:start w:val="1"/>
+      <w:numFmt w:val="bullet"/>
+      <w:lvlText w:val=""/>
+      <w:lvlJc w:val="left"/>
+      <w:pPr>
+        <w:tabs>
+          <w:tab w:val="num" w:pos="5040"/>
+        </w:tabs>
+        <w:ind w:left="5040" w:hanging="360"/>
+      </w:pPr>
+      <w:rPr>
+        <w:rFonts w:ascii="Wingdings" w:hAnsi="Wingdings" w:hint="default"/>
+        <w:sz w:val="20"/>
+      </w:rPr>
+    </w:lvl>
+    <w:lvl w:ilvl="7" w:tentative="1">
+      <w:start w:val="1"/>
+      <w:numFmt w:val="bullet"/>
+      <w:lvlText w:val=""/>
+      <w:lvlJc w:val="left"/>
+      <w:pPr>
+        <w:tabs>
+          <w:tab w:val="num" w:pos="5760"/>
+        </w:tabs>
+        <w:ind w:left="5760" w:hanging="360"/>
+      </w:pPr>
+      <w:rPr>
+        <w:rFonts w:ascii="Wingdings" w:hAnsi="Wingdings" w:hint="default"/>
+        <w:sz w:val="20"/>
+      </w:rPr>
+    </w:lvl>
+    <w:lvl w:ilvl="8" w:tentative="1">
+      <w:start w:val="1"/>
+      <w:numFmt w:val="bullet"/>
+      <w:lvlText w:val=""/>
+      <w:lvlJc w:val="left"/>
+      <w:pPr>
+        <w:tabs>
+          <w:tab w:val="num" w:pos="6480"/>
+        </w:tabs>
+        <w:ind w:left="6480" w:hanging="360"/>
+      </w:pPr>
+      <w:rPr>
+        <w:rFonts w:ascii="Wingdings" w:hAnsi="Wingdings" w:hint="default"/>
+        <w:sz w:val="20"/>
+      </w:rPr>
+    </w:lvl>
+  </w:abstractNum>
   <w:num w:numId="1" w16cid:durableId="440801600">
     <w:abstractNumId w:val="2"/>
   </w:num>
@@ -15668,6 +16912,9 @@
   </w:num>
   <w:num w:numId="7" w16cid:durableId="680863529">
     <w:abstractNumId w:val="0"/>
+  </w:num>
+  <w:num w:numId="8" w16cid:durableId="689065370">
+    <w:abstractNumId w:val="7"/>
   </w:num>
 </w:numbering>
 </file>

</xml_diff>